<commit_message>
Understanding Java Primitive Data Types and Their Usage  #7
</commit_message>
<xml_diff>
--- a/Chapter3/CH3.docx
+++ b/Chapter3/CH3.docx
@@ -134,9 +134,1113 @@
         <w:t xml:space="preserve"> Arrays</w:t>
       </w:r>
     </w:p>
+    <w:p/>
+    <w:p>
+      <w:pPr>
+        <w:rPr>
+          <w:sz w:val="24"/>
+          <w:szCs w:val="24"/>
+        </w:rPr>
+      </w:pPr>
+      <w:r>
+        <w:rPr>
+          <w:b/>
+          <w:bCs/>
+          <w:sz w:val="24"/>
+          <w:szCs w:val="24"/>
+        </w:rPr>
+        <w:t>3.1 Data Types</w:t>
+      </w:r>
+      <w:r>
+        <w:rPr>
+          <w:b/>
+          <w:bCs/>
+          <w:sz w:val="24"/>
+          <w:szCs w:val="24"/>
+        </w:rPr>
+        <w:t xml:space="preserve">: </w:t>
+      </w:r>
+      <w:r>
+        <w:rPr>
+          <w:sz w:val="24"/>
+          <w:szCs w:val="24"/>
+        </w:rPr>
+        <w:t>are classifications that specify what type of data a variable can store, whether it is a basic value like a number or character (primitive) or a reference to an object (non-primitive).</w:t>
+      </w:r>
+      <w:r>
+        <w:rPr>
+          <w:sz w:val="24"/>
+          <w:szCs w:val="24"/>
+        </w:rPr>
+        <w:t xml:space="preserve"> </w:t>
+      </w:r>
+    </w:p>
+    <w:p>
+      <w:pPr>
+        <w:pStyle w:val="ListParagraph"/>
+        <w:numPr>
+          <w:ilvl w:val="0"/>
+          <w:numId w:val="5"/>
+        </w:numPr>
+        <w:rPr>
+          <w:sz w:val="24"/>
+          <w:szCs w:val="24"/>
+        </w:rPr>
+      </w:pPr>
+      <w:r>
+        <w:rPr>
+          <w:sz w:val="24"/>
+          <w:szCs w:val="24"/>
+        </w:rPr>
+        <w:t xml:space="preserve">Used for </w:t>
+      </w:r>
+      <w:r>
+        <w:rPr>
+          <w:sz w:val="24"/>
+          <w:szCs w:val="24"/>
+        </w:rPr>
+        <w:t xml:space="preserve">to allocate memory and define operations that can be performed on data. </w:t>
+      </w:r>
+    </w:p>
+    <w:p>
+      <w:pPr>
+        <w:pStyle w:val="ListParagraph"/>
+        <w:numPr>
+          <w:ilvl w:val="0"/>
+          <w:numId w:val="5"/>
+        </w:numPr>
+        <w:rPr>
+          <w:sz w:val="24"/>
+          <w:szCs w:val="24"/>
+        </w:rPr>
+      </w:pPr>
+      <w:r>
+        <w:rPr>
+          <w:sz w:val="24"/>
+          <w:szCs w:val="24"/>
+        </w:rPr>
+        <w:t xml:space="preserve">Proper use of data </w:t>
+      </w:r>
+      <w:r>
+        <w:rPr>
+          <w:sz w:val="24"/>
+          <w:szCs w:val="24"/>
+        </w:rPr>
+        <w:t>types leads</w:t>
+      </w:r>
+      <w:r>
+        <w:rPr>
+          <w:sz w:val="24"/>
+          <w:szCs w:val="24"/>
+        </w:rPr>
+        <w:t xml:space="preserve"> </w:t>
+      </w:r>
+      <w:r>
+        <w:rPr>
+          <w:sz w:val="24"/>
+          <w:szCs w:val="24"/>
+        </w:rPr>
+        <w:t>to more</w:t>
+      </w:r>
+      <w:r>
+        <w:rPr>
+          <w:sz w:val="24"/>
+          <w:szCs w:val="24"/>
+        </w:rPr>
+        <w:t xml:space="preserve"> efficient and error-free</w:t>
+      </w:r>
+      <w:r>
+        <w:rPr>
+          <w:sz w:val="24"/>
+          <w:szCs w:val="24"/>
+        </w:rPr>
+        <w:t xml:space="preserve"> code.</w:t>
+      </w:r>
+      <w:r>
+        <w:rPr>
+          <w:sz w:val="24"/>
+          <w:szCs w:val="24"/>
+        </w:rPr>
+        <w:t xml:space="preserve"> </w:t>
+      </w:r>
+    </w:p>
+    <w:p>
+      <w:pPr>
+        <w:rPr>
+          <w:b/>
+          <w:bCs/>
+          <w:sz w:val="24"/>
+          <w:szCs w:val="24"/>
+        </w:rPr>
+      </w:pPr>
+      <w:r>
+        <w:rPr>
+          <w:b/>
+          <w:bCs/>
+          <w:sz w:val="24"/>
+          <w:szCs w:val="24"/>
+        </w:rPr>
+        <w:t>Dynamically</w:t>
+      </w:r>
+      <w:r>
+        <w:rPr>
+          <w:b/>
+          <w:bCs/>
+          <w:sz w:val="24"/>
+          <w:szCs w:val="24"/>
+        </w:rPr>
+        <w:t xml:space="preserve"> </w:t>
+      </w:r>
+      <w:r>
+        <w:rPr>
+          <w:b/>
+          <w:bCs/>
+          <w:sz w:val="24"/>
+          <w:szCs w:val="24"/>
+        </w:rPr>
+        <w:t xml:space="preserve">vs Statically typed languages: </w:t>
+      </w:r>
+    </w:p>
+    <w:p>
+      <w:pPr>
+        <w:pStyle w:val="ListParagraph"/>
+        <w:numPr>
+          <w:ilvl w:val="0"/>
+          <w:numId w:val="6"/>
+        </w:numPr>
+        <w:rPr>
+          <w:b/>
+          <w:bCs/>
+        </w:rPr>
+      </w:pPr>
+      <w:r>
+        <w:rPr>
+          <w:b/>
+          <w:bCs/>
+        </w:rPr>
+        <w:t>Dynamically</w:t>
+      </w:r>
+      <w:r>
+        <w:rPr>
+          <w:b/>
+          <w:bCs/>
+        </w:rPr>
+        <w:t xml:space="preserve">: </w:t>
+      </w:r>
+      <w:r>
+        <w:t>the variable type can be change during run time like Python</w:t>
+      </w:r>
+      <w:r>
+        <w:t>.</w:t>
+      </w:r>
+    </w:p>
+    <w:p>
+      <w:pPr>
+        <w:pStyle w:val="ListParagraph"/>
+        <w:numPr>
+          <w:ilvl w:val="0"/>
+          <w:numId w:val="6"/>
+        </w:numPr>
+        <w:rPr>
+          <w:b/>
+          <w:bCs/>
+        </w:rPr>
+      </w:pPr>
+      <w:r>
+        <w:rPr>
+          <w:b/>
+          <w:bCs/>
+        </w:rPr>
+        <w:t>Statically</w:t>
+      </w:r>
+      <w:r>
+        <w:rPr>
+          <w:b/>
+          <w:bCs/>
+        </w:rPr>
+        <w:t xml:space="preserve">: </w:t>
+      </w:r>
+      <w:r>
+        <w:t xml:space="preserve">the variable most be declared the specified data type </w:t>
+      </w:r>
+      <w:r>
+        <w:t>like Java.</w:t>
+      </w:r>
+    </w:p>
+    <w:p>
+      <w:pPr>
+        <w:rPr>
+          <w:u w:val="single"/>
+        </w:rPr>
+      </w:pPr>
+      <w:r>
+        <w:rPr>
+          <w:u w:val="single"/>
+        </w:rPr>
+        <w:t xml:space="preserve">As </w:t>
+      </w:r>
+      <w:r>
+        <w:rPr>
+          <w:u w:val="single"/>
+        </w:rPr>
+        <w:t xml:space="preserve">java is statically typed if we </w:t>
+      </w:r>
+      <w:r>
+        <w:rPr>
+          <w:u w:val="single"/>
+        </w:rPr>
+        <w:t>stated (</w:t>
+      </w:r>
+      <w:r>
+        <w:rPr>
+          <w:u w:val="single"/>
+        </w:rPr>
+        <w:t>int x = 10</w:t>
+      </w:r>
+      <w:r>
+        <w:rPr>
+          <w:u w:val="single"/>
+        </w:rPr>
+        <w:t>;)</w:t>
+      </w:r>
+      <w:r>
+        <w:rPr>
+          <w:u w:val="single"/>
+        </w:rPr>
+        <w:t xml:space="preserve">, if later in the code </w:t>
+      </w:r>
+      <w:r>
+        <w:rPr>
+          <w:u w:val="single"/>
+        </w:rPr>
+        <w:t xml:space="preserve">we typed (x = “string”) </w:t>
+      </w:r>
+      <w:r>
+        <w:rPr>
+          <w:u w:val="single"/>
+        </w:rPr>
+        <w:t xml:space="preserve">java complier will Flage an error </w:t>
+      </w:r>
+    </w:p>
+    <w:p>
+      <w:pPr>
+        <w:rPr>
+          <w:u w:val="single"/>
+        </w:rPr>
+      </w:pPr>
+      <w:r>
+        <w:rPr>
+          <w:noProof/>
+        </w:rPr>
+        <w:drawing>
+          <wp:inline distT="0" distB="0" distL="0" distR="0" wp14:anchorId="6B4B4A54" wp14:editId="3A0FB559">
+            <wp:extent cx="6480810" cy="1778635"/>
+            <wp:effectExtent l="0" t="0" r="0" b="0"/>
+            <wp:docPr id="1577304973" name="Picture 1"/>
+            <wp:cNvGraphicFramePr>
+              <a:graphicFrameLocks xmlns:a="http://schemas.openxmlformats.org/drawingml/2006/main" noChangeAspect="1"/>
+            </wp:cNvGraphicFramePr>
+            <a:graphic xmlns:a="http://schemas.openxmlformats.org/drawingml/2006/main">
+              <a:graphicData uri="http://schemas.openxmlformats.org/drawingml/2006/picture">
+                <pic:pic xmlns:pic="http://schemas.openxmlformats.org/drawingml/2006/picture">
+                  <pic:nvPicPr>
+                    <pic:cNvPr id="1577304973" name=""/>
+                    <pic:cNvPicPr/>
+                  </pic:nvPicPr>
+                  <pic:blipFill>
+                    <a:blip r:embed="rId7"/>
+                    <a:stretch>
+                      <a:fillRect/>
+                    </a:stretch>
+                  </pic:blipFill>
+                  <pic:spPr>
+                    <a:xfrm>
+                      <a:off x="0" y="0"/>
+                      <a:ext cx="6480810" cy="1778635"/>
+                    </a:xfrm>
+                    <a:prstGeom prst="rect">
+                      <a:avLst/>
+                    </a:prstGeom>
+                  </pic:spPr>
+                </pic:pic>
+              </a:graphicData>
+            </a:graphic>
+          </wp:inline>
+        </w:drawing>
+      </w:r>
+    </w:p>
+    <w:p>
+      <w:r>
+        <w:t>A</w:t>
+      </w:r>
+      <w:r>
+        <w:t xml:space="preserve">s </w:t>
+      </w:r>
+      <w:r>
+        <w:t xml:space="preserve">you see the compiler </w:t>
+      </w:r>
+      <w:r>
+        <w:t>raised</w:t>
+      </w:r>
+      <w:r>
+        <w:t xml:space="preserve"> “</w:t>
+      </w:r>
+      <w:r>
+        <w:t xml:space="preserve">Type mismatch: cannot convert from String to </w:t>
+      </w:r>
+      <w:proofErr w:type="spellStart"/>
+      <w:proofErr w:type="gramStart"/>
+      <w:r>
+        <w:t>intJava</w:t>
+      </w:r>
+      <w:proofErr w:type="spellEnd"/>
+      <w:r>
+        <w:t>(</w:t>
+      </w:r>
+      <w:proofErr w:type="gramEnd"/>
+      <w:r>
+        <w:t>16777233)</w:t>
+      </w:r>
+      <w:r>
+        <w:t>” Error.</w:t>
+      </w:r>
+    </w:p>
+    <w:p>
+      <w:pPr>
+        <w:rPr>
+          <w:b/>
+          <w:bCs/>
+          <w:sz w:val="24"/>
+          <w:szCs w:val="24"/>
+        </w:rPr>
+      </w:pPr>
+      <w:r>
+        <w:rPr>
+          <w:b/>
+          <w:bCs/>
+          <w:sz w:val="24"/>
+          <w:szCs w:val="24"/>
+        </w:rPr>
+        <w:t xml:space="preserve">There </w:t>
+      </w:r>
+      <w:r>
+        <w:rPr>
+          <w:b/>
+          <w:bCs/>
+          <w:sz w:val="24"/>
+          <w:szCs w:val="24"/>
+        </w:rPr>
+        <w:t>are</w:t>
+      </w:r>
+      <w:r>
+        <w:rPr>
+          <w:b/>
+          <w:bCs/>
+          <w:sz w:val="24"/>
+          <w:szCs w:val="24"/>
+        </w:rPr>
+        <w:t xml:space="preserve"> </w:t>
+      </w:r>
+      <w:r>
+        <w:rPr>
+          <w:b/>
+          <w:bCs/>
+          <w:sz w:val="24"/>
+          <w:szCs w:val="24"/>
+        </w:rPr>
+        <w:t>two</w:t>
+      </w:r>
+      <w:r>
+        <w:rPr>
+          <w:b/>
+          <w:bCs/>
+          <w:sz w:val="24"/>
+          <w:szCs w:val="24"/>
+        </w:rPr>
+        <w:t xml:space="preserve"> java </w:t>
+      </w:r>
+      <w:r>
+        <w:rPr>
+          <w:b/>
+          <w:bCs/>
+          <w:sz w:val="24"/>
+          <w:szCs w:val="24"/>
+        </w:rPr>
+        <w:t xml:space="preserve">data types: </w:t>
+      </w:r>
+    </w:p>
+    <w:p>
+      <w:pPr>
+        <w:pStyle w:val="ListParagraph"/>
+        <w:numPr>
+          <w:ilvl w:val="0"/>
+          <w:numId w:val="4"/>
+        </w:numPr>
+        <w:rPr>
+          <w:b/>
+          <w:bCs/>
+        </w:rPr>
+      </w:pPr>
+      <w:r>
+        <w:rPr>
+          <w:b/>
+          <w:bCs/>
+        </w:rPr>
+        <w:t>Primitive Data Types</w:t>
+      </w:r>
+      <w:r>
+        <w:rPr>
+          <w:b/>
+          <w:bCs/>
+        </w:rPr>
+        <w:t>:</w:t>
+      </w:r>
+      <w:r>
+        <w:t xml:space="preserve"> </w:t>
+      </w:r>
+      <w:r>
+        <w:t>the most basic built-in types that store simple values directly in memory.</w:t>
+      </w:r>
+    </w:p>
+    <w:p>
+      <w:pPr>
+        <w:pStyle w:val="ListParagraph"/>
+        <w:rPr>
+          <w:b/>
+          <w:bCs/>
+        </w:rPr>
+      </w:pPr>
+      <w:r>
+        <w:rPr>
+          <w:b/>
+          <w:bCs/>
+        </w:rPr>
+        <w:t>In java we have 8 primitive data types:</w:t>
+      </w:r>
+    </w:p>
+    <w:p>
+      <w:pPr>
+        <w:pStyle w:val="ListParagraph"/>
+        <w:numPr>
+          <w:ilvl w:val="0"/>
+          <w:numId w:val="7"/>
+        </w:numPr>
+        <w:rPr>
+          <w:b/>
+          <w:bCs/>
+          <w:u w:val="single"/>
+        </w:rPr>
+      </w:pPr>
+      <w:r>
+        <w:rPr>
+          <w:b/>
+          <w:bCs/>
+          <w:u w:val="single"/>
+        </w:rPr>
+        <w:t>Boolean</w:t>
+      </w:r>
+    </w:p>
+    <w:p>
+      <w:pPr>
+        <w:pStyle w:val="ListParagraph"/>
+        <w:ind w:left="1440"/>
+        <w:rPr>
+          <w:b/>
+          <w:bCs/>
+        </w:rPr>
+      </w:pPr>
+    </w:p>
+    <w:p>
+      <w:pPr>
+        <w:pStyle w:val="ListParagraph"/>
+        <w:numPr>
+          <w:ilvl w:val="0"/>
+          <w:numId w:val="7"/>
+        </w:numPr>
+        <w:rPr>
+          <w:b/>
+          <w:bCs/>
+          <w:u w:val="single"/>
+        </w:rPr>
+      </w:pPr>
+      <w:r>
+        <w:rPr>
+          <w:b/>
+          <w:bCs/>
+          <w:u w:val="single"/>
+        </w:rPr>
+        <w:t xml:space="preserve">Number </w:t>
+      </w:r>
+    </w:p>
+    <w:p>
+      <w:pPr>
+        <w:pStyle w:val="ListParagraph"/>
+        <w:numPr>
+          <w:ilvl w:val="0"/>
+          <w:numId w:val="4"/>
+        </w:numPr>
+        <w:ind w:firstLine="414"/>
+        <w:rPr>
+          <w:b/>
+          <w:bCs/>
+        </w:rPr>
+      </w:pPr>
+      <w:r>
+        <w:rPr>
+          <w:b/>
+          <w:bCs/>
+        </w:rPr>
+        <w:t>Integer</w:t>
+      </w:r>
+      <w:r>
+        <w:rPr>
+          <w:b/>
+          <w:bCs/>
+        </w:rPr>
+        <w:t xml:space="preserve"> </w:t>
+      </w:r>
+    </w:p>
+    <w:p>
+      <w:pPr>
+        <w:pStyle w:val="ListParagraph"/>
+        <w:ind w:left="1134"/>
+      </w:pPr>
+      <w:r>
+        <w:rPr>
+          <w:b/>
+          <w:bCs/>
+        </w:rPr>
+        <w:t xml:space="preserve">      </w:t>
+      </w:r>
+      <w:r>
+        <w:rPr>
+          <w:b/>
+          <w:bCs/>
+          <w:sz w:val="20"/>
+          <w:szCs w:val="20"/>
+        </w:rPr>
+        <w:t>Byte</w:t>
+      </w:r>
+      <w:r>
+        <w:rPr>
+          <w:b/>
+          <w:bCs/>
+          <w:sz w:val="20"/>
+          <w:szCs w:val="20"/>
+        </w:rPr>
+        <w:t xml:space="preserve">: </w:t>
+      </w:r>
+      <w:r>
+        <w:rPr>
+          <w:b/>
+          <w:bCs/>
+          <w:sz w:val="20"/>
+          <w:szCs w:val="20"/>
+        </w:rPr>
+        <w:t xml:space="preserve"> </w:t>
+      </w:r>
+      <w:r>
+        <w:t xml:space="preserve">the size required is 8 bits </w:t>
+      </w:r>
+      <w:r>
+        <w:t>(2</w:t>
+      </w:r>
+      <w:r>
+        <w:t>^7 to 2</w:t>
+      </w:r>
+      <w:r>
+        <w:t>^7 – 1)</w:t>
+      </w:r>
+      <w:r>
+        <w:t xml:space="preserve"> -128 to </w:t>
+      </w:r>
+      <w:r>
+        <w:t>127.</w:t>
+      </w:r>
+      <w:r>
+        <w:t xml:space="preserve"> Uses </w:t>
+      </w:r>
+      <w:r>
+        <w:t xml:space="preserve">2 compliment to present    negative </w:t>
+      </w:r>
+    </w:p>
+    <w:p>
+      <w:pPr>
+        <w:pStyle w:val="ListParagraph"/>
+        <w:ind w:left="1134"/>
+      </w:pPr>
+    </w:p>
+    <w:p>
+      <w:pPr>
+        <w:pStyle w:val="ListParagraph"/>
+        <w:ind w:left="1134"/>
+      </w:pPr>
+    </w:p>
+    <w:p>
+      <w:pPr>
+        <w:pStyle w:val="ListParagraph"/>
+        <w:ind w:left="1134"/>
+      </w:pPr>
+      <w:r>
+        <w:lastRenderedPageBreak/>
+        <w:t xml:space="preserve">      </w:t>
+      </w:r>
+      <w:r>
+        <w:t>S</w:t>
+      </w:r>
+      <w:r>
+        <w:t>hort</w:t>
+      </w:r>
+      <w:r>
+        <w:t>:</w:t>
+      </w:r>
+      <w:r>
+        <w:t xml:space="preserve"> </w:t>
+      </w:r>
+      <w:r>
+        <w:t xml:space="preserve">the size required is </w:t>
+      </w:r>
+      <w:r>
+        <w:t>16</w:t>
+      </w:r>
+      <w:r>
+        <w:t xml:space="preserve"> bits</w:t>
+      </w:r>
+      <w:r>
+        <w:t xml:space="preserve"> </w:t>
+      </w:r>
+      <w:r>
+        <w:t>(2^</w:t>
+      </w:r>
+      <w:r>
+        <w:t>15</w:t>
+      </w:r>
+      <w:r>
+        <w:t xml:space="preserve"> to 2^</w:t>
+      </w:r>
+      <w:r>
+        <w:t>15</w:t>
+      </w:r>
+      <w:r>
+        <w:t xml:space="preserve"> – 1</w:t>
+      </w:r>
+      <w:r>
+        <w:t>)</w:t>
+      </w:r>
+      <w:r>
+        <w:t>.</w:t>
+      </w:r>
+      <w:r>
+        <w:t xml:space="preserve"> 32768 </w:t>
+      </w:r>
+      <w:r>
+        <w:t>to 32767</w:t>
+      </w:r>
+    </w:p>
+    <w:p>
+      <w:pPr>
+        <w:pStyle w:val="ListParagraph"/>
+        <w:ind w:left="1134"/>
+      </w:pPr>
+      <w:r>
+        <w:t xml:space="preserve">     </w:t>
+      </w:r>
+      <w:r>
+        <w:t xml:space="preserve"> </w:t>
+      </w:r>
+      <w:r>
+        <w:t>I</w:t>
+      </w:r>
+      <w:r>
+        <w:t>nt</w:t>
+      </w:r>
+      <w:r>
+        <w:t xml:space="preserve">: </w:t>
+      </w:r>
+      <w:r>
+        <w:t xml:space="preserve">the size required is </w:t>
+      </w:r>
+      <w:r>
+        <w:t>32</w:t>
+      </w:r>
+      <w:r>
+        <w:t xml:space="preserve"> bits (2^</w:t>
+      </w:r>
+      <w:r>
+        <w:t>31</w:t>
+      </w:r>
+      <w:r>
+        <w:t xml:space="preserve"> to 2^</w:t>
+      </w:r>
+      <w:r>
+        <w:t>31</w:t>
+      </w:r>
+      <w:r>
+        <w:t xml:space="preserve"> – 1).</w:t>
+      </w:r>
+      <w:r>
+        <w:t xml:space="preserve"> </w:t>
+      </w:r>
+      <w:r>
+        <w:t>-2,147,483,648</w:t>
+      </w:r>
+      <w:r>
+        <w:t xml:space="preserve"> to </w:t>
+      </w:r>
+      <w:r>
+        <w:t>2,147,483,647</w:t>
+      </w:r>
+      <w:r>
+        <w:t xml:space="preserve"> the default type </w:t>
+      </w:r>
+    </w:p>
+    <w:p>
+      <w:pPr>
+        <w:pStyle w:val="ListParagraph"/>
+        <w:ind w:left="1134"/>
+      </w:pPr>
+      <w:r>
+        <w:t xml:space="preserve">     </w:t>
+      </w:r>
+      <w:r>
+        <w:t xml:space="preserve"> </w:t>
+      </w:r>
+      <w:r>
+        <w:t>L</w:t>
+      </w:r>
+      <w:r>
+        <w:t>ong</w:t>
+      </w:r>
+      <w:r>
+        <w:t>:</w:t>
+      </w:r>
+      <w:r>
+        <w:t xml:space="preserve">  </w:t>
+      </w:r>
+      <w:r>
+        <w:t xml:space="preserve">the size required is </w:t>
+      </w:r>
+      <w:r>
+        <w:t>64</w:t>
+      </w:r>
+      <w:r>
+        <w:t xml:space="preserve"> bits (2^</w:t>
+      </w:r>
+      <w:r>
+        <w:t>63</w:t>
+      </w:r>
+      <w:r>
+        <w:t xml:space="preserve"> to 2^</w:t>
+      </w:r>
+      <w:r>
+        <w:t>63</w:t>
+      </w:r>
+      <w:r>
+        <w:t xml:space="preserve"> – 1).</w:t>
+      </w:r>
+    </w:p>
+    <w:p>
+      <w:pPr>
+        <w:pStyle w:val="ListParagraph"/>
+        <w:ind w:left="1134"/>
+      </w:pPr>
+      <w:r>
+        <w:rPr>
+          <w:b/>
+          <w:bCs/>
+        </w:rPr>
+        <w:t>Implicit casting</w:t>
+      </w:r>
+      <w:r>
+        <w:t xml:space="preserve"> happens automatically when Java converts a smaller data type → larger data type.</w:t>
+      </w:r>
+    </w:p>
+    <w:p>
+      <w:pPr>
+        <w:pStyle w:val="ListParagraph"/>
+        <w:ind w:left="1134"/>
+      </w:pPr>
+      <w:r>
+        <w:rPr>
+          <w:b/>
+          <w:bCs/>
+        </w:rPr>
+        <w:t>Explicit casting</w:t>
+      </w:r>
+      <w:r>
+        <w:t xml:space="preserve"> happens when you manually convert a </w:t>
+      </w:r>
+      <w:r>
+        <w:rPr>
+          <w:b/>
+          <w:bCs/>
+        </w:rPr>
+        <w:t>larger data type → smaller data type</w:t>
+      </w:r>
+      <w:r>
+        <w:t>.</w:t>
+      </w:r>
+    </w:p>
+    <w:p>
+      <w:pPr>
+        <w:pStyle w:val="ListParagraph"/>
+        <w:ind w:left="1134"/>
+      </w:pPr>
+    </w:p>
+    <w:p>
+      <w:pPr>
+        <w:pStyle w:val="ListParagraph"/>
+        <w:ind w:left="1134"/>
+      </w:pPr>
+      <w:r>
+        <w:t xml:space="preserve">When </w:t>
+      </w:r>
+      <w:r>
+        <w:t>expression</w:t>
+      </w:r>
+      <w:r>
+        <w:t xml:space="preserve"> like a + 1 </w:t>
+      </w:r>
+      <w:r>
+        <w:t xml:space="preserve">if the type is out of range will not rase </w:t>
+      </w:r>
+      <w:r>
+        <w:t xml:space="preserve">error </w:t>
+      </w:r>
+      <w:r>
+        <w:t>even</w:t>
+      </w:r>
+      <w:r>
+        <w:t xml:space="preserve"> the value </w:t>
+      </w:r>
+      <w:r>
+        <w:t>exceeds the what the result st</w:t>
+      </w:r>
+      <w:r>
+        <w:t xml:space="preserve">oring </w:t>
+      </w:r>
+      <w:r>
+        <w:t>variable</w:t>
+      </w:r>
+      <w:r>
+        <w:t xml:space="preserve"> type and java will do byte </w:t>
+      </w:r>
+      <w:r>
+        <w:t>wraps around</w:t>
+      </w:r>
+      <w:r>
+        <w:t>, maybe we go int loop or overflow</w:t>
+      </w:r>
+      <w:r>
+        <w:t>.</w:t>
+      </w:r>
+    </w:p>
+    <w:p>
+      <w:pPr>
+        <w:pStyle w:val="ListParagraph"/>
+        <w:ind w:left="1134"/>
+      </w:pPr>
+    </w:p>
+    <w:p>
+      <w:pPr>
+        <w:pStyle w:val="ListParagraph"/>
+        <w:ind w:left="1134"/>
+      </w:pPr>
+      <w:r>
+        <w:rPr>
+          <w:b/>
+          <w:bCs/>
+        </w:rPr>
+        <w:t>W</w:t>
+      </w:r>
+      <w:r>
+        <w:rPr>
+          <w:b/>
+          <w:bCs/>
+        </w:rPr>
+        <w:t>raps around</w:t>
+      </w:r>
+      <w:r>
+        <w:rPr>
+          <w:b/>
+          <w:bCs/>
+        </w:rPr>
+        <w:t xml:space="preserve">: </w:t>
+      </w:r>
+      <w:r>
+        <w:t xml:space="preserve">when an arithmetic result goes beyond the maximum or minimum value of a primitive type, it does not throw an error (for most integer types). Instead, it wraps around using something called overflow </w:t>
+      </w:r>
+      <w:r>
+        <w:t>behaviour</w:t>
+      </w:r>
+      <w:r>
+        <w:t>.</w:t>
+      </w:r>
+    </w:p>
+    <w:p>
+      <w:pPr>
+        <w:pStyle w:val="ListParagraph"/>
+        <w:ind w:left="1134"/>
+      </w:pPr>
+    </w:p>
+    <w:p>
+      <w:pPr>
+        <w:pStyle w:val="ListParagraph"/>
+        <w:numPr>
+          <w:ilvl w:val="0"/>
+          <w:numId w:val="4"/>
+        </w:numPr>
+        <w:ind w:firstLine="414"/>
+        <w:rPr>
+          <w:b/>
+          <w:bCs/>
+        </w:rPr>
+      </w:pPr>
+      <w:r>
+        <w:rPr>
+          <w:b/>
+          <w:bCs/>
+        </w:rPr>
+        <w:t>F</w:t>
+      </w:r>
+      <w:r>
+        <w:rPr>
+          <w:b/>
+          <w:bCs/>
+        </w:rPr>
+        <w:t>lot</w:t>
+      </w:r>
+      <w:r>
+        <w:rPr>
+          <w:b/>
+          <w:bCs/>
+        </w:rPr>
+        <w:t xml:space="preserve"> point</w:t>
+      </w:r>
+      <w:r>
+        <w:rPr>
+          <w:b/>
+          <w:bCs/>
+        </w:rPr>
+        <w:t xml:space="preserve"> </w:t>
+      </w:r>
+      <w:r>
+        <w:t>(Flot and d</w:t>
+      </w:r>
+      <w:r>
+        <w:t>ouble</w:t>
+      </w:r>
+      <w:r>
+        <w:t>)</w:t>
+      </w:r>
+      <w:r>
+        <w:t xml:space="preserve"> </w:t>
+      </w:r>
+      <w:r>
+        <w:t xml:space="preserve"> </w:t>
+      </w:r>
+    </w:p>
+    <w:p>
+      <w:pPr>
+        <w:pStyle w:val="ListParagraph"/>
+        <w:numPr>
+          <w:ilvl w:val="0"/>
+          <w:numId w:val="4"/>
+        </w:numPr>
+        <w:ind w:firstLine="414"/>
+        <w:rPr>
+          <w:b/>
+          <w:bCs/>
+        </w:rPr>
+      </w:pPr>
+      <w:r>
+        <w:rPr>
+          <w:b/>
+          <w:bCs/>
+        </w:rPr>
+        <w:t xml:space="preserve">Character </w:t>
+      </w:r>
+    </w:p>
+    <w:p>
+      <w:r>
+        <w:rPr>
+          <w:b/>
+          <w:bCs/>
+        </w:rPr>
+        <w:t xml:space="preserve">             </w:t>
+      </w:r>
+      <w:r>
+        <w:rPr>
+          <w:b/>
+          <w:bCs/>
+        </w:rPr>
+        <w:t>A wrapper class</w:t>
+      </w:r>
+      <w:r>
+        <w:rPr>
+          <w:b/>
+          <w:bCs/>
+        </w:rPr>
+        <w:t>:</w:t>
+      </w:r>
+      <w:r>
+        <w:rPr>
+          <w:b/>
+          <w:bCs/>
+        </w:rPr>
+        <w:t xml:space="preserve"> </w:t>
+      </w:r>
+      <w:r>
+        <w:t>in Java is a class that converts a primitive data type into an object.</w:t>
+      </w:r>
+    </w:p>
+    <w:p>
+      <w:pPr>
+        <w:rPr>
+          <w:b/>
+          <w:bCs/>
+        </w:rPr>
+      </w:pPr>
+    </w:p>
+    <w:p>
+      <w:pPr>
+        <w:pStyle w:val="ListParagraph"/>
+        <w:numPr>
+          <w:ilvl w:val="0"/>
+          <w:numId w:val="4"/>
+        </w:numPr>
+      </w:pPr>
+      <w:r>
+        <w:rPr>
+          <w:b/>
+          <w:bCs/>
+        </w:rPr>
+        <w:t>Non-Primitive (Reference) Data Types</w:t>
+      </w:r>
+      <w:r>
+        <w:rPr>
+          <w:b/>
+          <w:bCs/>
+        </w:rPr>
+        <w:t xml:space="preserve">: </w:t>
+      </w:r>
+      <w:r>
+        <w:t>These store references (addresses) to objects rather than the actual value.</w:t>
+      </w:r>
+    </w:p>
+    <w:p>
+      <w:pPr>
+        <w:rPr>
+          <w:sz w:val="24"/>
+          <w:szCs w:val="24"/>
+        </w:rPr>
+      </w:pPr>
+    </w:p>
+    <w:p/>
+    <w:p/>
     <w:sectPr>
       <w:pgSz w:w="11906" w:h="16838"/>
-      <w:pgMar w:top="568" w:right="849" w:bottom="1440" w:left="851" w:header="708" w:footer="708" w:gutter="0"/>
+      <w:pgMar w:top="568" w:right="849" w:bottom="709" w:left="851" w:header="708" w:footer="708" w:gutter="0"/>
       <w:cols w:space="708"/>
       <w:docGrid w:linePitch="360"/>
     </w:sectPr>
@@ -197,6 +1301,92 @@
 <file path=word/numbering.xml><?xml version="1.0" encoding="utf-8"?>
 <w:numbering xmlns:wpc="http://schemas.microsoft.com/office/word/2010/wordprocessingCanvas" xmlns:cx="http://schemas.microsoft.com/office/drawing/2014/chartex" xmlns:cx1="http://schemas.microsoft.com/office/drawing/2015/9/8/chartex" xmlns:cx2="http://schemas.microsoft.com/office/drawing/2015/10/21/chartex" xmlns:cx3="http://schemas.microsoft.com/office/drawing/2016/5/9/chartex" xmlns:cx4="http://schemas.microsoft.com/office/drawing/2016/5/10/chartex" xmlns:cx5="http://schemas.microsoft.com/office/drawing/2016/5/11/chartex" xmlns:cx6="http://schemas.microsoft.com/office/drawing/2016/5/12/chartex" xmlns:cx7="http://schemas.microsoft.com/office/drawing/2016/5/13/chartex" xmlns:cx8="http://schemas.microsoft.com/office/drawing/2016/5/14/chartex" xmlns:mc="http://schemas.openxmlformats.org/markup-compatibility/2006" xmlns:aink="http://schemas.microsoft.com/office/drawing/2016/ink" xmlns:am3d="http://schemas.microsoft.com/office/drawing/2017/model3d" xmlns:o="urn:schemas-microsoft-com:office:office" xmlns:oel="http://schemas.microsoft.com/office/2019/extlst" xmlns:r="http://schemas.openxmlformats.org/officeDocument/2006/relationships" xmlns:m="http://schemas.openxmlformats.org/officeDocument/2006/math" xmlns:v="urn:schemas-microsoft-com:vml" xmlns:wp14="http://schemas.microsoft.com/office/word/2010/wordprocessingDrawing" xmlns:wp="http://schemas.openxmlformats.org/drawingml/2006/wordprocessingDrawing" xmlns:w10="urn:schemas-microsoft-com:office:word" xmlns:w="http://schemas.openxmlformats.org/wordprocessingml/2006/main" xmlns:w14="http://schemas.microsoft.com/office/word/2010/wordml" xmlns:w15="http://schemas.microsoft.com/office/word/2012/wordml" xmlns:w16cex="http://schemas.microsoft.com/office/word/2018/wordml/cex" xmlns:w16cid="http://schemas.microsoft.com/office/word/2016/wordml/cid" xmlns:w16="http://schemas.microsoft.com/office/word/2018/wordml" xmlns:w16du="http://schemas.microsoft.com/office/word/2023/wordml/word16du" xmlns:w16sdtdh="http://schemas.microsoft.com/office/word/2020/wordml/sdtdatahash" xmlns:w16sdtfl="http://schemas.microsoft.com/office/word/2024/wordml/sdtformatlock" xmlns:w16se="http://schemas.microsoft.com/office/word/2015/wordml/symex" xmlns:wpg="http://schemas.microsoft.com/office/word/2010/wordprocessingGroup" xmlns:wpi="http://schemas.microsoft.com/office/word/2010/wordprocessingInk" xmlns:wne="http://schemas.microsoft.com/office/word/2006/wordml" xmlns:wps="http://schemas.microsoft.com/office/word/2010/wordprocessingShape" mc:Ignorable="w14 w15 w16se w16cid w16 w16cex w16sdtdh w16sdtfl w16du wp14">
   <w:abstractNum w:abstractNumId="0" w15:restartNumberingAfterBreak="0">
+    <w:nsid w:val="095A6A34"/>
+    <w:multiLevelType w:val="hybridMultilevel"/>
+    <w:tmpl w:val="46B021AE"/>
+    <w:lvl w:ilvl="0" w:tplc="4C09000F">
+      <w:start w:val="1"/>
+      <w:numFmt w:val="decimal"/>
+      <w:lvlText w:val="%1."/>
+      <w:lvlJc w:val="left"/>
+      <w:pPr>
+        <w:ind w:left="1440" w:hanging="360"/>
+      </w:pPr>
+    </w:lvl>
+    <w:lvl w:ilvl="1" w:tplc="4C090019" w:tentative="1">
+      <w:start w:val="1"/>
+      <w:numFmt w:val="lowerLetter"/>
+      <w:lvlText w:val="%2."/>
+      <w:lvlJc w:val="left"/>
+      <w:pPr>
+        <w:ind w:left="2160" w:hanging="360"/>
+      </w:pPr>
+    </w:lvl>
+    <w:lvl w:ilvl="2" w:tplc="4C09001B" w:tentative="1">
+      <w:start w:val="1"/>
+      <w:numFmt w:val="lowerRoman"/>
+      <w:lvlText w:val="%3."/>
+      <w:lvlJc w:val="right"/>
+      <w:pPr>
+        <w:ind w:left="2880" w:hanging="180"/>
+      </w:pPr>
+    </w:lvl>
+    <w:lvl w:ilvl="3" w:tplc="4C09000F" w:tentative="1">
+      <w:start w:val="1"/>
+      <w:numFmt w:val="decimal"/>
+      <w:lvlText w:val="%4."/>
+      <w:lvlJc w:val="left"/>
+      <w:pPr>
+        <w:ind w:left="3600" w:hanging="360"/>
+      </w:pPr>
+    </w:lvl>
+    <w:lvl w:ilvl="4" w:tplc="4C090019" w:tentative="1">
+      <w:start w:val="1"/>
+      <w:numFmt w:val="lowerLetter"/>
+      <w:lvlText w:val="%5."/>
+      <w:lvlJc w:val="left"/>
+      <w:pPr>
+        <w:ind w:left="4320" w:hanging="360"/>
+      </w:pPr>
+    </w:lvl>
+    <w:lvl w:ilvl="5" w:tplc="4C09001B" w:tentative="1">
+      <w:start w:val="1"/>
+      <w:numFmt w:val="lowerRoman"/>
+      <w:lvlText w:val="%6."/>
+      <w:lvlJc w:val="right"/>
+      <w:pPr>
+        <w:ind w:left="5040" w:hanging="180"/>
+      </w:pPr>
+    </w:lvl>
+    <w:lvl w:ilvl="6" w:tplc="4C09000F" w:tentative="1">
+      <w:start w:val="1"/>
+      <w:numFmt w:val="decimal"/>
+      <w:lvlText w:val="%7."/>
+      <w:lvlJc w:val="left"/>
+      <w:pPr>
+        <w:ind w:left="5760" w:hanging="360"/>
+      </w:pPr>
+    </w:lvl>
+    <w:lvl w:ilvl="7" w:tplc="4C090019" w:tentative="1">
+      <w:start w:val="1"/>
+      <w:numFmt w:val="lowerLetter"/>
+      <w:lvlText w:val="%8."/>
+      <w:lvlJc w:val="left"/>
+      <w:pPr>
+        <w:ind w:left="6480" w:hanging="360"/>
+      </w:pPr>
+    </w:lvl>
+    <w:lvl w:ilvl="8" w:tplc="4C09001B" w:tentative="1">
+      <w:start w:val="1"/>
+      <w:numFmt w:val="lowerRoman"/>
+      <w:lvlText w:val="%9."/>
+      <w:lvlJc w:val="right"/>
+      <w:pPr>
+        <w:ind w:left="7200" w:hanging="180"/>
+      </w:pPr>
+    </w:lvl>
+  </w:abstractNum>
+  <w:abstractNum w:abstractNumId="1" w15:restartNumberingAfterBreak="0">
     <w:nsid w:val="14D0182F"/>
     <w:multiLevelType w:val="hybridMultilevel"/>
     <w:tmpl w:val="A0C29CB6"/>
@@ -309,7 +1499,7 @@
       </w:rPr>
     </w:lvl>
   </w:abstractNum>
-  <w:abstractNum w:abstractNumId="1" w15:restartNumberingAfterBreak="0">
+  <w:abstractNum w:abstractNumId="2" w15:restartNumberingAfterBreak="0">
     <w:nsid w:val="230A73D6"/>
     <w:multiLevelType w:val="hybridMultilevel"/>
     <w:tmpl w:val="B20ABC0A"/>
@@ -398,7 +1588,120 @@
       </w:pPr>
     </w:lvl>
   </w:abstractNum>
-  <w:abstractNum w:abstractNumId="2" w15:restartNumberingAfterBreak="0">
+  <w:abstractNum w:abstractNumId="3" w15:restartNumberingAfterBreak="0">
+    <w:nsid w:val="3A923EF0"/>
+    <w:multiLevelType w:val="hybridMultilevel"/>
+    <w:tmpl w:val="A544AB08"/>
+    <w:lvl w:ilvl="0" w:tplc="4C090001">
+      <w:start w:val="1"/>
+      <w:numFmt w:val="bullet"/>
+      <w:lvlText w:val=""/>
+      <w:lvlJc w:val="left"/>
+      <w:pPr>
+        <w:ind w:left="720" w:hanging="360"/>
+      </w:pPr>
+      <w:rPr>
+        <w:rFonts w:ascii="Symbol" w:hAnsi="Symbol" w:hint="default"/>
+      </w:rPr>
+    </w:lvl>
+    <w:lvl w:ilvl="1" w:tplc="4C090003" w:tentative="1">
+      <w:start w:val="1"/>
+      <w:numFmt w:val="bullet"/>
+      <w:lvlText w:val="o"/>
+      <w:lvlJc w:val="left"/>
+      <w:pPr>
+        <w:ind w:left="1440" w:hanging="360"/>
+      </w:pPr>
+      <w:rPr>
+        <w:rFonts w:ascii="Courier New" w:hAnsi="Courier New" w:cs="Courier New" w:hint="default"/>
+      </w:rPr>
+    </w:lvl>
+    <w:lvl w:ilvl="2" w:tplc="4C090005" w:tentative="1">
+      <w:start w:val="1"/>
+      <w:numFmt w:val="bullet"/>
+      <w:lvlText w:val=""/>
+      <w:lvlJc w:val="left"/>
+      <w:pPr>
+        <w:ind w:left="2160" w:hanging="360"/>
+      </w:pPr>
+      <w:rPr>
+        <w:rFonts w:ascii="Wingdings" w:hAnsi="Wingdings" w:hint="default"/>
+      </w:rPr>
+    </w:lvl>
+    <w:lvl w:ilvl="3" w:tplc="4C090001" w:tentative="1">
+      <w:start w:val="1"/>
+      <w:numFmt w:val="bullet"/>
+      <w:lvlText w:val=""/>
+      <w:lvlJc w:val="left"/>
+      <w:pPr>
+        <w:ind w:left="2880" w:hanging="360"/>
+      </w:pPr>
+      <w:rPr>
+        <w:rFonts w:ascii="Symbol" w:hAnsi="Symbol" w:hint="default"/>
+      </w:rPr>
+    </w:lvl>
+    <w:lvl w:ilvl="4" w:tplc="4C090003" w:tentative="1">
+      <w:start w:val="1"/>
+      <w:numFmt w:val="bullet"/>
+      <w:lvlText w:val="o"/>
+      <w:lvlJc w:val="left"/>
+      <w:pPr>
+        <w:ind w:left="3600" w:hanging="360"/>
+      </w:pPr>
+      <w:rPr>
+        <w:rFonts w:ascii="Courier New" w:hAnsi="Courier New" w:cs="Courier New" w:hint="default"/>
+      </w:rPr>
+    </w:lvl>
+    <w:lvl w:ilvl="5" w:tplc="4C090005" w:tentative="1">
+      <w:start w:val="1"/>
+      <w:numFmt w:val="bullet"/>
+      <w:lvlText w:val=""/>
+      <w:lvlJc w:val="left"/>
+      <w:pPr>
+        <w:ind w:left="4320" w:hanging="360"/>
+      </w:pPr>
+      <w:rPr>
+        <w:rFonts w:ascii="Wingdings" w:hAnsi="Wingdings" w:hint="default"/>
+      </w:rPr>
+    </w:lvl>
+    <w:lvl w:ilvl="6" w:tplc="4C090001" w:tentative="1">
+      <w:start w:val="1"/>
+      <w:numFmt w:val="bullet"/>
+      <w:lvlText w:val=""/>
+      <w:lvlJc w:val="left"/>
+      <w:pPr>
+        <w:ind w:left="5040" w:hanging="360"/>
+      </w:pPr>
+      <w:rPr>
+        <w:rFonts w:ascii="Symbol" w:hAnsi="Symbol" w:hint="default"/>
+      </w:rPr>
+    </w:lvl>
+    <w:lvl w:ilvl="7" w:tplc="4C090003" w:tentative="1">
+      <w:start w:val="1"/>
+      <w:numFmt w:val="bullet"/>
+      <w:lvlText w:val="o"/>
+      <w:lvlJc w:val="left"/>
+      <w:pPr>
+        <w:ind w:left="5760" w:hanging="360"/>
+      </w:pPr>
+      <w:rPr>
+        <w:rFonts w:ascii="Courier New" w:hAnsi="Courier New" w:cs="Courier New" w:hint="default"/>
+      </w:rPr>
+    </w:lvl>
+    <w:lvl w:ilvl="8" w:tplc="4C090005" w:tentative="1">
+      <w:start w:val="1"/>
+      <w:numFmt w:val="bullet"/>
+      <w:lvlText w:val=""/>
+      <w:lvlJc w:val="left"/>
+      <w:pPr>
+        <w:ind w:left="6480" w:hanging="360"/>
+      </w:pPr>
+      <w:rPr>
+        <w:rFonts w:ascii="Wingdings" w:hAnsi="Wingdings" w:hint="default"/>
+      </w:rPr>
+    </w:lvl>
+  </w:abstractNum>
+  <w:abstractNum w:abstractNumId="4" w15:restartNumberingAfterBreak="0">
     <w:nsid w:val="4E71180A"/>
     <w:multiLevelType w:val="hybridMultilevel"/>
     <w:tmpl w:val="9DB477EA"/>
@@ -487,13 +1790,251 @@
       </w:pPr>
     </w:lvl>
   </w:abstractNum>
+  <w:abstractNum w:abstractNumId="5" w15:restartNumberingAfterBreak="0">
+    <w:nsid w:val="770B2AED"/>
+    <w:multiLevelType w:val="hybridMultilevel"/>
+    <w:tmpl w:val="E334FAA2"/>
+    <w:lvl w:ilvl="0" w:tplc="4C090001">
+      <w:start w:val="1"/>
+      <w:numFmt w:val="bullet"/>
+      <w:lvlText w:val=""/>
+      <w:lvlJc w:val="left"/>
+      <w:pPr>
+        <w:ind w:left="720" w:hanging="360"/>
+      </w:pPr>
+      <w:rPr>
+        <w:rFonts w:ascii="Symbol" w:hAnsi="Symbol" w:hint="default"/>
+      </w:rPr>
+    </w:lvl>
+    <w:lvl w:ilvl="1" w:tplc="4C090003" w:tentative="1">
+      <w:start w:val="1"/>
+      <w:numFmt w:val="bullet"/>
+      <w:lvlText w:val="o"/>
+      <w:lvlJc w:val="left"/>
+      <w:pPr>
+        <w:ind w:left="1440" w:hanging="360"/>
+      </w:pPr>
+      <w:rPr>
+        <w:rFonts w:ascii="Courier New" w:hAnsi="Courier New" w:cs="Courier New" w:hint="default"/>
+      </w:rPr>
+    </w:lvl>
+    <w:lvl w:ilvl="2" w:tplc="4C090005" w:tentative="1">
+      <w:start w:val="1"/>
+      <w:numFmt w:val="bullet"/>
+      <w:lvlText w:val=""/>
+      <w:lvlJc w:val="left"/>
+      <w:pPr>
+        <w:ind w:left="2160" w:hanging="360"/>
+      </w:pPr>
+      <w:rPr>
+        <w:rFonts w:ascii="Wingdings" w:hAnsi="Wingdings" w:hint="default"/>
+      </w:rPr>
+    </w:lvl>
+    <w:lvl w:ilvl="3" w:tplc="4C090001" w:tentative="1">
+      <w:start w:val="1"/>
+      <w:numFmt w:val="bullet"/>
+      <w:lvlText w:val=""/>
+      <w:lvlJc w:val="left"/>
+      <w:pPr>
+        <w:ind w:left="2880" w:hanging="360"/>
+      </w:pPr>
+      <w:rPr>
+        <w:rFonts w:ascii="Symbol" w:hAnsi="Symbol" w:hint="default"/>
+      </w:rPr>
+    </w:lvl>
+    <w:lvl w:ilvl="4" w:tplc="4C090003" w:tentative="1">
+      <w:start w:val="1"/>
+      <w:numFmt w:val="bullet"/>
+      <w:lvlText w:val="o"/>
+      <w:lvlJc w:val="left"/>
+      <w:pPr>
+        <w:ind w:left="3600" w:hanging="360"/>
+      </w:pPr>
+      <w:rPr>
+        <w:rFonts w:ascii="Courier New" w:hAnsi="Courier New" w:cs="Courier New" w:hint="default"/>
+      </w:rPr>
+    </w:lvl>
+    <w:lvl w:ilvl="5" w:tplc="4C090005" w:tentative="1">
+      <w:start w:val="1"/>
+      <w:numFmt w:val="bullet"/>
+      <w:lvlText w:val=""/>
+      <w:lvlJc w:val="left"/>
+      <w:pPr>
+        <w:ind w:left="4320" w:hanging="360"/>
+      </w:pPr>
+      <w:rPr>
+        <w:rFonts w:ascii="Wingdings" w:hAnsi="Wingdings" w:hint="default"/>
+      </w:rPr>
+    </w:lvl>
+    <w:lvl w:ilvl="6" w:tplc="4C090001" w:tentative="1">
+      <w:start w:val="1"/>
+      <w:numFmt w:val="bullet"/>
+      <w:lvlText w:val=""/>
+      <w:lvlJc w:val="left"/>
+      <w:pPr>
+        <w:ind w:left="5040" w:hanging="360"/>
+      </w:pPr>
+      <w:rPr>
+        <w:rFonts w:ascii="Symbol" w:hAnsi="Symbol" w:hint="default"/>
+      </w:rPr>
+    </w:lvl>
+    <w:lvl w:ilvl="7" w:tplc="4C090003" w:tentative="1">
+      <w:start w:val="1"/>
+      <w:numFmt w:val="bullet"/>
+      <w:lvlText w:val="o"/>
+      <w:lvlJc w:val="left"/>
+      <w:pPr>
+        <w:ind w:left="5760" w:hanging="360"/>
+      </w:pPr>
+      <w:rPr>
+        <w:rFonts w:ascii="Courier New" w:hAnsi="Courier New" w:cs="Courier New" w:hint="default"/>
+      </w:rPr>
+    </w:lvl>
+    <w:lvl w:ilvl="8" w:tplc="4C090005" w:tentative="1">
+      <w:start w:val="1"/>
+      <w:numFmt w:val="bullet"/>
+      <w:lvlText w:val=""/>
+      <w:lvlJc w:val="left"/>
+      <w:pPr>
+        <w:ind w:left="6480" w:hanging="360"/>
+      </w:pPr>
+      <w:rPr>
+        <w:rFonts w:ascii="Wingdings" w:hAnsi="Wingdings" w:hint="default"/>
+      </w:rPr>
+    </w:lvl>
+  </w:abstractNum>
+  <w:abstractNum w:abstractNumId="6" w15:restartNumberingAfterBreak="0">
+    <w:nsid w:val="7BE67E43"/>
+    <w:multiLevelType w:val="hybridMultilevel"/>
+    <w:tmpl w:val="4F446838"/>
+    <w:lvl w:ilvl="0" w:tplc="4C090001">
+      <w:start w:val="1"/>
+      <w:numFmt w:val="bullet"/>
+      <w:lvlText w:val=""/>
+      <w:lvlJc w:val="left"/>
+      <w:pPr>
+        <w:ind w:left="720" w:hanging="360"/>
+      </w:pPr>
+      <w:rPr>
+        <w:rFonts w:ascii="Symbol" w:hAnsi="Symbol" w:hint="default"/>
+      </w:rPr>
+    </w:lvl>
+    <w:lvl w:ilvl="1" w:tplc="4C090003" w:tentative="1">
+      <w:start w:val="1"/>
+      <w:numFmt w:val="bullet"/>
+      <w:lvlText w:val="o"/>
+      <w:lvlJc w:val="left"/>
+      <w:pPr>
+        <w:ind w:left="1440" w:hanging="360"/>
+      </w:pPr>
+      <w:rPr>
+        <w:rFonts w:ascii="Courier New" w:hAnsi="Courier New" w:cs="Courier New" w:hint="default"/>
+      </w:rPr>
+    </w:lvl>
+    <w:lvl w:ilvl="2" w:tplc="4C090005" w:tentative="1">
+      <w:start w:val="1"/>
+      <w:numFmt w:val="bullet"/>
+      <w:lvlText w:val=""/>
+      <w:lvlJc w:val="left"/>
+      <w:pPr>
+        <w:ind w:left="2160" w:hanging="360"/>
+      </w:pPr>
+      <w:rPr>
+        <w:rFonts w:ascii="Wingdings" w:hAnsi="Wingdings" w:hint="default"/>
+      </w:rPr>
+    </w:lvl>
+    <w:lvl w:ilvl="3" w:tplc="4C090001" w:tentative="1">
+      <w:start w:val="1"/>
+      <w:numFmt w:val="bullet"/>
+      <w:lvlText w:val=""/>
+      <w:lvlJc w:val="left"/>
+      <w:pPr>
+        <w:ind w:left="2880" w:hanging="360"/>
+      </w:pPr>
+      <w:rPr>
+        <w:rFonts w:ascii="Symbol" w:hAnsi="Symbol" w:hint="default"/>
+      </w:rPr>
+    </w:lvl>
+    <w:lvl w:ilvl="4" w:tplc="4C090003" w:tentative="1">
+      <w:start w:val="1"/>
+      <w:numFmt w:val="bullet"/>
+      <w:lvlText w:val="o"/>
+      <w:lvlJc w:val="left"/>
+      <w:pPr>
+        <w:ind w:left="3600" w:hanging="360"/>
+      </w:pPr>
+      <w:rPr>
+        <w:rFonts w:ascii="Courier New" w:hAnsi="Courier New" w:cs="Courier New" w:hint="default"/>
+      </w:rPr>
+    </w:lvl>
+    <w:lvl w:ilvl="5" w:tplc="4C090005" w:tentative="1">
+      <w:start w:val="1"/>
+      <w:numFmt w:val="bullet"/>
+      <w:lvlText w:val=""/>
+      <w:lvlJc w:val="left"/>
+      <w:pPr>
+        <w:ind w:left="4320" w:hanging="360"/>
+      </w:pPr>
+      <w:rPr>
+        <w:rFonts w:ascii="Wingdings" w:hAnsi="Wingdings" w:hint="default"/>
+      </w:rPr>
+    </w:lvl>
+    <w:lvl w:ilvl="6" w:tplc="4C090001" w:tentative="1">
+      <w:start w:val="1"/>
+      <w:numFmt w:val="bullet"/>
+      <w:lvlText w:val=""/>
+      <w:lvlJc w:val="left"/>
+      <w:pPr>
+        <w:ind w:left="5040" w:hanging="360"/>
+      </w:pPr>
+      <w:rPr>
+        <w:rFonts w:ascii="Symbol" w:hAnsi="Symbol" w:hint="default"/>
+      </w:rPr>
+    </w:lvl>
+    <w:lvl w:ilvl="7" w:tplc="4C090003" w:tentative="1">
+      <w:start w:val="1"/>
+      <w:numFmt w:val="bullet"/>
+      <w:lvlText w:val="o"/>
+      <w:lvlJc w:val="left"/>
+      <w:pPr>
+        <w:ind w:left="5760" w:hanging="360"/>
+      </w:pPr>
+      <w:rPr>
+        <w:rFonts w:ascii="Courier New" w:hAnsi="Courier New" w:cs="Courier New" w:hint="default"/>
+      </w:rPr>
+    </w:lvl>
+    <w:lvl w:ilvl="8" w:tplc="4C090005" w:tentative="1">
+      <w:start w:val="1"/>
+      <w:numFmt w:val="bullet"/>
+      <w:lvlText w:val=""/>
+      <w:lvlJc w:val="left"/>
+      <w:pPr>
+        <w:ind w:left="6480" w:hanging="360"/>
+      </w:pPr>
+      <w:rPr>
+        <w:rFonts w:ascii="Wingdings" w:hAnsi="Wingdings" w:hint="default"/>
+      </w:rPr>
+    </w:lvl>
+  </w:abstractNum>
   <w:num w:numId="1" w16cid:durableId="1995210616">
+    <w:abstractNumId w:val="4"/>
+  </w:num>
+  <w:num w:numId="2" w16cid:durableId="1510365078">
     <w:abstractNumId w:val="2"/>
   </w:num>
-  <w:num w:numId="2" w16cid:durableId="1510365078">
+  <w:num w:numId="3" w16cid:durableId="1455252089">
     <w:abstractNumId w:val="1"/>
   </w:num>
-  <w:num w:numId="3" w16cid:durableId="1455252089">
+  <w:num w:numId="4" w16cid:durableId="1045134569">
+    <w:abstractNumId w:val="3"/>
+  </w:num>
+  <w:num w:numId="5" w16cid:durableId="1167330143">
+    <w:abstractNumId w:val="6"/>
+  </w:num>
+  <w:num w:numId="6" w16cid:durableId="2061400478">
+    <w:abstractNumId w:val="5"/>
+  </w:num>
+  <w:num w:numId="7" w16cid:durableId="1402633030">
     <w:abstractNumId w:val="0"/>
   </w:num>
 </w:numbering>

</xml_diff>

<commit_message>
Learn Java Floating-Point and Character Data Types  #10
</commit_message>
<xml_diff>
--- a/Chapter3/CH3.docx
+++ b/Chapter3/CH3.docx
@@ -479,7 +479,20 @@
         <w:t xml:space="preserve"> “</w:t>
       </w:r>
       <w:r>
-        <w:t>Type mismatch: cannot convert from String to intJava(16777233)</w:t>
+        <w:t xml:space="preserve">Type mismatch: cannot convert from String to </w:t>
+      </w:r>
+      <w:proofErr w:type="spellStart"/>
+      <w:proofErr w:type="gramStart"/>
+      <w:r>
+        <w:t>intJava</w:t>
+      </w:r>
+      <w:proofErr w:type="spellEnd"/>
+      <w:r>
+        <w:t>(</w:t>
+      </w:r>
+      <w:proofErr w:type="gramEnd"/>
+      <w:r>
+        <w:t>16777233)</w:t>
       </w:r>
       <w:r>
         <w:t>” Error.</w:t>
@@ -1085,13 +1098,16 @@
         <w:ind w:left="1134"/>
       </w:pPr>
       <w:r>
-        <w:t>Java will NOT automatically convert when</w:t>
-      </w:r>
-      <w:r>
-        <w:t xml:space="preserve">  </w:t>
-      </w:r>
-      <w:r>
-        <w:t>larger type → smaller type</w:t>
+        <w:t xml:space="preserve">Java will NOT automatically convert </w:t>
+      </w:r>
+      <w:r>
+        <w:t>when</w:t>
+      </w:r>
+      <w:r>
+        <w:t xml:space="preserve"> larger</w:t>
+      </w:r>
+      <w:r>
+        <w:t xml:space="preserve"> type → smaller type</w:t>
       </w:r>
       <w:r>
         <w:t xml:space="preserve"> </w:t>
@@ -1111,6 +1127,59 @@
       </w:r>
       <w:r>
         <w:t>.</w:t>
+      </w:r>
+    </w:p>
+    <w:p>
+      <w:pPr>
+        <w:pStyle w:val="ListParagraph"/>
+        <w:ind w:left="1134"/>
+      </w:pPr>
+    </w:p>
+    <w:p>
+      <w:pPr>
+        <w:pStyle w:val="ListParagraph"/>
+        <w:ind w:left="426"/>
+        <w:jc w:val="center"/>
+      </w:pPr>
+      <w:r>
+        <w:rPr>
+          <w:noProof/>
+        </w:rPr>
+        <w:drawing>
+          <wp:inline distT="0" distB="0" distL="0" distR="0" wp14:anchorId="1884732A" wp14:editId="3AABDC9B">
+            <wp:extent cx="6210935" cy="3377493"/>
+            <wp:effectExtent l="0" t="0" r="0" b="0"/>
+            <wp:docPr id="746660975" name="Picture 1"/>
+            <wp:cNvGraphicFramePr>
+              <a:graphicFrameLocks xmlns:a="http://schemas.openxmlformats.org/drawingml/2006/main" noChangeAspect="1"/>
+            </wp:cNvGraphicFramePr>
+            <a:graphic xmlns:a="http://schemas.openxmlformats.org/drawingml/2006/main">
+              <a:graphicData uri="http://schemas.openxmlformats.org/drawingml/2006/picture">
+                <pic:pic xmlns:pic="http://schemas.openxmlformats.org/drawingml/2006/picture">
+                  <pic:nvPicPr>
+                    <pic:cNvPr id="746660975" name=""/>
+                    <pic:cNvPicPr/>
+                  </pic:nvPicPr>
+                  <pic:blipFill>
+                    <a:blip r:embed="rId8"/>
+                    <a:stretch>
+                      <a:fillRect/>
+                    </a:stretch>
+                  </pic:blipFill>
+                  <pic:spPr>
+                    <a:xfrm>
+                      <a:off x="0" y="0"/>
+                      <a:ext cx="6210935" cy="3377493"/>
+                    </a:xfrm>
+                    <a:prstGeom prst="rect">
+                      <a:avLst/>
+                    </a:prstGeom>
+                  </pic:spPr>
+                </pic:pic>
+              </a:graphicData>
+            </a:graphic>
+          </wp:inline>
+        </w:drawing>
       </w:r>
     </w:p>
     <w:p>
@@ -1151,29 +1220,282 @@
           <w:b/>
           <w:bCs/>
         </w:rPr>
-        <w:t xml:space="preserve"> point</w:t>
-      </w:r>
-      <w:r>
-        <w:rPr>
-          <w:b/>
-          <w:bCs/>
-        </w:rPr>
         <w:t xml:space="preserve"> </w:t>
       </w:r>
       <w:r>
-        <w:t>(Flot and d</w:t>
-      </w:r>
-      <w:r>
+        <w:rPr>
+          <w:b/>
+          <w:bCs/>
+        </w:rPr>
+        <w:t>point:</w:t>
+      </w:r>
+    </w:p>
+    <w:p>
+      <w:pPr>
+        <w:pStyle w:val="ListParagraph"/>
+        <w:numPr>
+          <w:ilvl w:val="0"/>
+          <w:numId w:val="8"/>
+        </w:numPr>
+      </w:pPr>
+      <w:r>
+        <w:rPr>
+          <w:b/>
+          <w:bCs/>
+        </w:rPr>
+        <w:t>Flot</w:t>
+      </w:r>
+      <w:r>
+        <w:rPr>
+          <w:b/>
+          <w:bCs/>
+        </w:rPr>
+        <w:t xml:space="preserve">: </w:t>
+      </w:r>
+      <w:r>
+        <w:t>is a 32-bit primitive data type in Java used to store single-precision decimal (floating-point)</w:t>
+      </w:r>
+      <w:r>
+        <w:t>.</w:t>
+      </w:r>
+      <w:r>
+        <w:t xml:space="preserve"> The range </w:t>
+      </w:r>
+      <w:r>
+        <w:t>3.4e38 to 3.4e38</w:t>
+      </w:r>
+      <w:r>
+        <w:t xml:space="preserve"> and de def</w:t>
+      </w:r>
+      <w:r>
+        <w:t>ault value is 0.0f</w:t>
+      </w:r>
+    </w:p>
+    <w:p>
+      <w:pPr>
+        <w:pStyle w:val="ListParagraph"/>
+        <w:ind w:left="1854"/>
+      </w:pPr>
+      <w:r>
+        <w:t>A float stores only about 7 decimal digits of precision, so any extra digits are rounded or discarded.</w:t>
+      </w:r>
+    </w:p>
+    <w:p>
+      <w:pPr>
+        <w:pStyle w:val="ListParagraph"/>
+        <w:ind w:left="1854"/>
+      </w:pPr>
+      <w:r>
+        <w:t>Therefore, 1.1234567124587f is stored and printed as 1.1234567 because the remaining digits cannot be represented accurately in a 32-bit float.</w:t>
+      </w:r>
+    </w:p>
+    <w:p>
+      <w:pPr>
+        <w:pStyle w:val="ListParagraph"/>
+        <w:numPr>
+          <w:ilvl w:val="0"/>
+          <w:numId w:val="8"/>
+        </w:numPr>
+      </w:pPr>
+      <w:r>
+        <w:rPr>
+          <w:b/>
+          <w:bCs/>
+        </w:rPr>
+        <w:t>D</w:t>
+      </w:r>
+      <w:r>
+        <w:rPr>
+          <w:b/>
+          <w:bCs/>
+        </w:rPr>
         <w:t>ouble</w:t>
       </w:r>
       <w:r>
-        <w:t>)</w:t>
+        <w:rPr>
+          <w:b/>
+          <w:bCs/>
+        </w:rPr>
+        <w:t xml:space="preserve">: </w:t>
+      </w:r>
+      <w:r>
+        <w:t xml:space="preserve">is a 64-bit primitive data type in Java used to store double-precision decimal (floating-point) numbers. It provides greater precision than float and is the default type </w:t>
+      </w:r>
+      <w:r>
+        <w:lastRenderedPageBreak/>
+        <w:t>for decimal values in Java.</w:t>
+      </w:r>
+      <w:r>
+        <w:t xml:space="preserve"> The range is -1.7</w:t>
+      </w:r>
+      <w:r>
+        <w:t xml:space="preserve">e308 </w:t>
+      </w:r>
+      <w:r>
+        <w:t>to and</w:t>
+      </w:r>
+      <w:r>
+        <w:t xml:space="preserve"> default value is 0.0d </w:t>
+      </w:r>
+      <w:r>
+        <w:t xml:space="preserve">1.7e308 and it </w:t>
+      </w:r>
+      <w:r>
+        <w:t xml:space="preserve">provides 15-16 decimal digits of </w:t>
+      </w:r>
+      <w:r>
+        <w:t>precision</w:t>
+      </w:r>
+    </w:p>
+    <w:p>
+      <w:pPr>
+        <w:pStyle w:val="ListParagraph"/>
+        <w:ind w:left="1854"/>
+      </w:pPr>
+      <w:r>
+        <w:t>J</w:t>
+      </w:r>
+      <w:r>
+        <w:t>ava treats decimal literals like 98.99 as double by default, and because converting a double to a float may lose precision, it requires an explicit f suffix or cast.</w:t>
       </w:r>
       <w:r>
         <w:t xml:space="preserve"> </w:t>
       </w:r>
       <w:r>
+        <w:t>Java automatically converts an int to a double because it is a safe widening conversion with no loss of data, whereas converting a double to a float requires an explicit cast because it may lose precision.</w:t>
+      </w:r>
+    </w:p>
+    <w:p>
+      <w:pPr>
+        <w:pStyle w:val="ListParagraph"/>
+        <w:ind w:left="1854"/>
+      </w:pPr>
+    </w:p>
+    <w:p>
+      <w:pPr>
+        <w:pStyle w:val="ListParagraph"/>
+        <w:ind w:left="1854"/>
+      </w:pPr>
+    </w:p>
+    <w:p>
+      <w:pPr>
+        <w:pStyle w:val="ListParagraph"/>
+        <w:ind w:left="1854"/>
+      </w:pPr>
+      <w:r>
+        <w:t>j</w:t>
+      </w:r>
+      <w:r>
+        <w:t>ava displays very small or very large double values in scientific notation to make them shorter and easier to read.</w:t>
+      </w:r>
+      <w:r>
+        <w:t xml:space="preserve"> For </w:t>
+      </w:r>
+      <w:r>
+        <w:t xml:space="preserve">example: </w:t>
+      </w:r>
+      <w:r>
+        <w:t xml:space="preserve">1.5E-19 means </w:t>
+      </w:r>
+      <m:oMath>
+        <m:r>
+          <w:rPr>
+            <w:rFonts w:ascii="Cambria Math" w:hAnsi="Cambria Math"/>
+          </w:rPr>
+          <m:t>1.5×</m:t>
+        </m:r>
+        <m:sSup>
+          <m:sSupPr>
+            <m:ctrlPr>
+              <w:rPr>
+                <w:rFonts w:ascii="Cambria Math" w:hAnsi="Cambria Math"/>
+              </w:rPr>
+            </m:ctrlPr>
+          </m:sSupPr>
+          <m:e>
+            <m:r>
+              <w:rPr>
+                <w:rFonts w:ascii="Cambria Math" w:hAnsi="Cambria Math"/>
+              </w:rPr>
+              <m:t>10</m:t>
+            </m:r>
+          </m:e>
+          <m:sup>
+            <m:r>
+              <w:rPr>
+                <w:rFonts w:ascii="Cambria Math" w:hAnsi="Cambria Math"/>
+              </w:rPr>
+              <m:t>-19</m:t>
+            </m:r>
+          </m:sup>
+        </m:sSup>
+      </m:oMath>
+      <w:r>
+        <w:t>, which is equal to 0.00000000000000000015.</w:t>
+      </w:r>
+    </w:p>
+    <w:p>
+      <w:pPr>
+        <w:pStyle w:val="ListParagraph"/>
+        <w:ind w:left="1854"/>
+      </w:pPr>
+    </w:p>
+    <w:p>
+      <w:pPr>
+        <w:pStyle w:val="ListParagraph"/>
+        <w:ind w:left="1854"/>
+      </w:pPr>
+      <w:r>
+        <w:t>A double provides about 15–17 significant decimal digits of precision, so digits beyond that limit cannot be stored exactly.</w:t>
+      </w:r>
+    </w:p>
+    <w:p>
+      <w:pPr>
+        <w:pStyle w:val="ListParagraph"/>
+        <w:ind w:left="1854"/>
+      </w:pPr>
+      <w:r>
+        <w:t>As a result, 1.1234567124584512452125411245125457d is rounded to the nearest representable value and prints as 1.1234567124584511.</w:t>
+      </w:r>
+    </w:p>
+    <w:p>
+      <w:pPr>
+        <w:pStyle w:val="ListParagraph"/>
+        <w:ind w:left="1854"/>
+      </w:pPr>
+    </w:p>
+    <w:p>
+      <w:pPr>
+        <w:pStyle w:val="ListParagraph"/>
+        <w:ind w:left="1854"/>
+      </w:pPr>
+      <w:proofErr w:type="spellStart"/>
+      <w:r>
+        <w:rPr>
+          <w:b/>
+          <w:bCs/>
+        </w:rPr>
+        <w:t>BigDecimal</w:t>
+      </w:r>
+      <w:proofErr w:type="spellEnd"/>
+      <w:r>
+        <w:rPr>
+          <w:b/>
+          <w:bCs/>
+        </w:rPr>
         <w:t xml:space="preserve"> </w:t>
+      </w:r>
+      <w:r>
+        <w:t>stores decimal numbers with arbitrary precision, avoiding the rounding errors that can occur with float and double.</w:t>
+      </w:r>
+    </w:p>
+    <w:p>
+      <w:pPr>
+        <w:pStyle w:val="ListParagraph"/>
+        <w:ind w:left="1854"/>
+      </w:pPr>
+      <w:r>
+        <w:t>It is ideal for financial, scientific, and high-precision calculations where exact decimal values, such as currency amounts, must be preserved.</w:t>
       </w:r>
     </w:p>
     <w:p>
@@ -1194,7 +1516,85 @@
           <w:b/>
           <w:bCs/>
         </w:rPr>
-        <w:t xml:space="preserve">Character </w:t>
+        <w:t>Character:</w:t>
+      </w:r>
+      <w:r>
+        <w:rPr>
+          <w:b/>
+          <w:bCs/>
+        </w:rPr>
+        <w:t xml:space="preserve"> </w:t>
+      </w:r>
+      <w:r>
+        <w:t xml:space="preserve">used to store </w:t>
+      </w:r>
+      <w:r>
+        <w:t>a s</w:t>
+      </w:r>
+      <w:r>
+        <w:t>ingle letter</w:t>
+      </w:r>
+      <w:r>
+        <w:rPr>
+          <w:b/>
+          <w:bCs/>
+        </w:rPr>
+        <w:t>.</w:t>
+      </w:r>
+    </w:p>
+    <w:p>
+      <w:pPr>
+        <w:pStyle w:val="ListParagraph"/>
+        <w:ind w:left="1134"/>
+      </w:pPr>
+      <w:r>
+        <w:t>a char is stored as a 16-bit unsigned integer representing a Unicode value, which allows characters like 'A' to be internally stored as numbers such as 65.</w:t>
+      </w:r>
+    </w:p>
+    <w:p>
+      <w:pPr>
+        <w:pStyle w:val="ListParagraph"/>
+        <w:ind w:left="1134"/>
+      </w:pPr>
+    </w:p>
+    <w:p>
+      <w:pPr>
+        <w:pStyle w:val="ListParagraph"/>
+        <w:ind w:left="1134"/>
+      </w:pPr>
+      <w:r>
+        <w:rPr>
+          <w:b/>
+          <w:bCs/>
+        </w:rPr>
+        <w:t xml:space="preserve">   </w:t>
+      </w:r>
+      <w:r>
+        <w:t>Char o</w:t>
+      </w:r>
+      <w:r>
+        <w:t xml:space="preserve">ccupies </w:t>
+      </w:r>
+      <w:r>
+        <w:t>16 bits</w:t>
+      </w:r>
+      <w:r>
+        <w:t xml:space="preserve"> (2 bytes) in memory. The range </w:t>
+      </w:r>
+      <w:r>
+        <w:t xml:space="preserve">is 0 to 65.535, the </w:t>
+      </w:r>
+      <w:r>
+        <w:t>default</w:t>
+      </w:r>
+      <w:r>
+        <w:t xml:space="preserve"> value is ‘\u0000’</w:t>
+      </w:r>
+      <w:r>
+        <w:t xml:space="preserve"> and it is stored as 16 bits </w:t>
+      </w:r>
+      <w:r>
+        <w:t>in Unicode.</w:t>
       </w:r>
     </w:p>
     <w:p>
@@ -1276,7 +1676,7 @@
     <w:p/>
     <w:sectPr>
       <w:pgSz w:w="11906" w:h="16838"/>
-      <w:pgMar w:top="709" w:right="849" w:bottom="709" w:left="851" w:header="708" w:footer="708" w:gutter="0"/>
+      <w:pgMar w:top="709" w:right="1274" w:bottom="709" w:left="851" w:header="708" w:footer="708" w:gutter="0"/>
       <w:cols w:space="708"/>
       <w:docGrid w:linePitch="360"/>
     </w:sectPr>
@@ -1337,6 +1737,92 @@
 <file path=word/numbering.xml><?xml version="1.0" encoding="utf-8"?>
 <w:numbering xmlns:wpc="http://schemas.microsoft.com/office/word/2010/wordprocessingCanvas" xmlns:cx="http://schemas.microsoft.com/office/drawing/2014/chartex" xmlns:cx1="http://schemas.microsoft.com/office/drawing/2015/9/8/chartex" xmlns:cx2="http://schemas.microsoft.com/office/drawing/2015/10/21/chartex" xmlns:cx3="http://schemas.microsoft.com/office/drawing/2016/5/9/chartex" xmlns:cx4="http://schemas.microsoft.com/office/drawing/2016/5/10/chartex" xmlns:cx5="http://schemas.microsoft.com/office/drawing/2016/5/11/chartex" xmlns:cx6="http://schemas.microsoft.com/office/drawing/2016/5/12/chartex" xmlns:cx7="http://schemas.microsoft.com/office/drawing/2016/5/13/chartex" xmlns:cx8="http://schemas.microsoft.com/office/drawing/2016/5/14/chartex" xmlns:mc="http://schemas.openxmlformats.org/markup-compatibility/2006" xmlns:aink="http://schemas.microsoft.com/office/drawing/2016/ink" xmlns:am3d="http://schemas.microsoft.com/office/drawing/2017/model3d" xmlns:o="urn:schemas-microsoft-com:office:office" xmlns:oel="http://schemas.microsoft.com/office/2019/extlst" xmlns:r="http://schemas.openxmlformats.org/officeDocument/2006/relationships" xmlns:m="http://schemas.openxmlformats.org/officeDocument/2006/math" xmlns:v="urn:schemas-microsoft-com:vml" xmlns:wp14="http://schemas.microsoft.com/office/word/2010/wordprocessingDrawing" xmlns:wp="http://schemas.openxmlformats.org/drawingml/2006/wordprocessingDrawing" xmlns:w10="urn:schemas-microsoft-com:office:word" xmlns:w="http://schemas.openxmlformats.org/wordprocessingml/2006/main" xmlns:w14="http://schemas.microsoft.com/office/word/2010/wordml" xmlns:w15="http://schemas.microsoft.com/office/word/2012/wordml" xmlns:w16cex="http://schemas.microsoft.com/office/word/2018/wordml/cex" xmlns:w16cid="http://schemas.microsoft.com/office/word/2016/wordml/cid" xmlns:w16="http://schemas.microsoft.com/office/word/2018/wordml" xmlns:w16du="http://schemas.microsoft.com/office/word/2023/wordml/word16du" xmlns:w16sdtdh="http://schemas.microsoft.com/office/word/2020/wordml/sdtdatahash" xmlns:w16sdtfl="http://schemas.microsoft.com/office/word/2024/wordml/sdtformatlock" xmlns:w16se="http://schemas.microsoft.com/office/word/2015/wordml/symex" xmlns:wpg="http://schemas.microsoft.com/office/word/2010/wordprocessingGroup" xmlns:wpi="http://schemas.microsoft.com/office/word/2010/wordprocessingInk" xmlns:wne="http://schemas.microsoft.com/office/word/2006/wordml" xmlns:wps="http://schemas.microsoft.com/office/word/2010/wordprocessingShape" mc:Ignorable="w14 w15 w16se w16cid w16 w16cex w16sdtdh w16sdtfl w16du wp14">
   <w:abstractNum w:abstractNumId="0" w15:restartNumberingAfterBreak="0">
+    <w:nsid w:val="09094C6D"/>
+    <w:multiLevelType w:val="hybridMultilevel"/>
+    <w:tmpl w:val="519AD40C"/>
+    <w:lvl w:ilvl="0" w:tplc="4C09000F">
+      <w:start w:val="1"/>
+      <w:numFmt w:val="decimal"/>
+      <w:lvlText w:val="%1."/>
+      <w:lvlJc w:val="left"/>
+      <w:pPr>
+        <w:ind w:left="1854" w:hanging="360"/>
+      </w:pPr>
+    </w:lvl>
+    <w:lvl w:ilvl="1" w:tplc="4C090019" w:tentative="1">
+      <w:start w:val="1"/>
+      <w:numFmt w:val="lowerLetter"/>
+      <w:lvlText w:val="%2."/>
+      <w:lvlJc w:val="left"/>
+      <w:pPr>
+        <w:ind w:left="2574" w:hanging="360"/>
+      </w:pPr>
+    </w:lvl>
+    <w:lvl w:ilvl="2" w:tplc="4C09001B" w:tentative="1">
+      <w:start w:val="1"/>
+      <w:numFmt w:val="lowerRoman"/>
+      <w:lvlText w:val="%3."/>
+      <w:lvlJc w:val="right"/>
+      <w:pPr>
+        <w:ind w:left="3294" w:hanging="180"/>
+      </w:pPr>
+    </w:lvl>
+    <w:lvl w:ilvl="3" w:tplc="4C09000F" w:tentative="1">
+      <w:start w:val="1"/>
+      <w:numFmt w:val="decimal"/>
+      <w:lvlText w:val="%4."/>
+      <w:lvlJc w:val="left"/>
+      <w:pPr>
+        <w:ind w:left="4014" w:hanging="360"/>
+      </w:pPr>
+    </w:lvl>
+    <w:lvl w:ilvl="4" w:tplc="4C090019" w:tentative="1">
+      <w:start w:val="1"/>
+      <w:numFmt w:val="lowerLetter"/>
+      <w:lvlText w:val="%5."/>
+      <w:lvlJc w:val="left"/>
+      <w:pPr>
+        <w:ind w:left="4734" w:hanging="360"/>
+      </w:pPr>
+    </w:lvl>
+    <w:lvl w:ilvl="5" w:tplc="4C09001B" w:tentative="1">
+      <w:start w:val="1"/>
+      <w:numFmt w:val="lowerRoman"/>
+      <w:lvlText w:val="%6."/>
+      <w:lvlJc w:val="right"/>
+      <w:pPr>
+        <w:ind w:left="5454" w:hanging="180"/>
+      </w:pPr>
+    </w:lvl>
+    <w:lvl w:ilvl="6" w:tplc="4C09000F" w:tentative="1">
+      <w:start w:val="1"/>
+      <w:numFmt w:val="decimal"/>
+      <w:lvlText w:val="%7."/>
+      <w:lvlJc w:val="left"/>
+      <w:pPr>
+        <w:ind w:left="6174" w:hanging="360"/>
+      </w:pPr>
+    </w:lvl>
+    <w:lvl w:ilvl="7" w:tplc="4C090019" w:tentative="1">
+      <w:start w:val="1"/>
+      <w:numFmt w:val="lowerLetter"/>
+      <w:lvlText w:val="%8."/>
+      <w:lvlJc w:val="left"/>
+      <w:pPr>
+        <w:ind w:left="6894" w:hanging="360"/>
+      </w:pPr>
+    </w:lvl>
+    <w:lvl w:ilvl="8" w:tplc="4C09001B" w:tentative="1">
+      <w:start w:val="1"/>
+      <w:numFmt w:val="lowerRoman"/>
+      <w:lvlText w:val="%9."/>
+      <w:lvlJc w:val="right"/>
+      <w:pPr>
+        <w:ind w:left="7614" w:hanging="180"/>
+      </w:pPr>
+    </w:lvl>
+  </w:abstractNum>
+  <w:abstractNum w:abstractNumId="1" w15:restartNumberingAfterBreak="0">
     <w:nsid w:val="095A6A34"/>
     <w:multiLevelType w:val="hybridMultilevel"/>
     <w:tmpl w:val="46B021AE"/>
@@ -1422,7 +1908,7 @@
       </w:pPr>
     </w:lvl>
   </w:abstractNum>
-  <w:abstractNum w:abstractNumId="1" w15:restartNumberingAfterBreak="0">
+  <w:abstractNum w:abstractNumId="2" w15:restartNumberingAfterBreak="0">
     <w:nsid w:val="14D0182F"/>
     <w:multiLevelType w:val="hybridMultilevel"/>
     <w:tmpl w:val="A0C29CB6"/>
@@ -1535,7 +2021,7 @@
       </w:rPr>
     </w:lvl>
   </w:abstractNum>
-  <w:abstractNum w:abstractNumId="2" w15:restartNumberingAfterBreak="0">
+  <w:abstractNum w:abstractNumId="3" w15:restartNumberingAfterBreak="0">
     <w:nsid w:val="230A73D6"/>
     <w:multiLevelType w:val="hybridMultilevel"/>
     <w:tmpl w:val="B20ABC0A"/>
@@ -1624,7 +2110,7 @@
       </w:pPr>
     </w:lvl>
   </w:abstractNum>
-  <w:abstractNum w:abstractNumId="3" w15:restartNumberingAfterBreak="0">
+  <w:abstractNum w:abstractNumId="4" w15:restartNumberingAfterBreak="0">
     <w:nsid w:val="3A923EF0"/>
     <w:multiLevelType w:val="hybridMultilevel"/>
     <w:tmpl w:val="A544AB08"/>
@@ -1737,7 +2223,7 @@
       </w:rPr>
     </w:lvl>
   </w:abstractNum>
-  <w:abstractNum w:abstractNumId="4" w15:restartNumberingAfterBreak="0">
+  <w:abstractNum w:abstractNumId="5" w15:restartNumberingAfterBreak="0">
     <w:nsid w:val="4E71180A"/>
     <w:multiLevelType w:val="hybridMultilevel"/>
     <w:tmpl w:val="9DB477EA"/>
@@ -1826,7 +2312,7 @@
       </w:pPr>
     </w:lvl>
   </w:abstractNum>
-  <w:abstractNum w:abstractNumId="5" w15:restartNumberingAfterBreak="0">
+  <w:abstractNum w:abstractNumId="6" w15:restartNumberingAfterBreak="0">
     <w:nsid w:val="770B2AED"/>
     <w:multiLevelType w:val="hybridMultilevel"/>
     <w:tmpl w:val="E334FAA2"/>
@@ -1939,7 +2425,7 @@
       </w:rPr>
     </w:lvl>
   </w:abstractNum>
-  <w:abstractNum w:abstractNumId="6" w15:restartNumberingAfterBreak="0">
+  <w:abstractNum w:abstractNumId="7" w15:restartNumberingAfterBreak="0">
     <w:nsid w:val="7BE67E43"/>
     <w:multiLevelType w:val="hybridMultilevel"/>
     <w:tmpl w:val="4F446838"/>
@@ -2053,24 +2539,27 @@
     </w:lvl>
   </w:abstractNum>
   <w:num w:numId="1" w16cid:durableId="1995210616">
+    <w:abstractNumId w:val="5"/>
+  </w:num>
+  <w:num w:numId="2" w16cid:durableId="1510365078">
+    <w:abstractNumId w:val="3"/>
+  </w:num>
+  <w:num w:numId="3" w16cid:durableId="1455252089">
+    <w:abstractNumId w:val="2"/>
+  </w:num>
+  <w:num w:numId="4" w16cid:durableId="1045134569">
     <w:abstractNumId w:val="4"/>
   </w:num>
-  <w:num w:numId="2" w16cid:durableId="1510365078">
-    <w:abstractNumId w:val="2"/>
+  <w:num w:numId="5" w16cid:durableId="1167330143">
+    <w:abstractNumId w:val="7"/>
   </w:num>
-  <w:num w:numId="3" w16cid:durableId="1455252089">
+  <w:num w:numId="6" w16cid:durableId="2061400478">
+    <w:abstractNumId w:val="6"/>
+  </w:num>
+  <w:num w:numId="7" w16cid:durableId="1402633030">
     <w:abstractNumId w:val="1"/>
   </w:num>
-  <w:num w:numId="4" w16cid:durableId="1045134569">
-    <w:abstractNumId w:val="3"/>
-  </w:num>
-  <w:num w:numId="5" w16cid:durableId="1167330143">
-    <w:abstractNumId w:val="6"/>
-  </w:num>
-  <w:num w:numId="6" w16cid:durableId="2061400478">
-    <w:abstractNumId w:val="5"/>
-  </w:num>
-  <w:num w:numId="7" w16cid:durableId="1402633030">
+  <w:num w:numId="8" w16cid:durableId="308097594">
     <w:abstractNumId w:val="0"/>
   </w:num>
 </w:numbering>

</xml_diff>

<commit_message>
Java Non-Primitive (Reference) Data Types #12
</commit_message>
<xml_diff>
--- a/Chapter3/CH3.docx
+++ b/Chapter3/CH3.docx
@@ -36,120 +36,90 @@
     </w:p>
     <w:p>
       <w:r>
+        <w:t xml:space="preserve"> 1</w:t>
+      </w:r>
+      <w:r>
+        <w:t>.</w:t>
+      </w:r>
+      <w:r>
+        <w:t xml:space="preserve"> Data Types</w:t>
+      </w:r>
+      <w:r>
+        <w:t xml:space="preserve">, </w:t>
+      </w:r>
+      <w:r>
+        <w:t>Variables and Constants</w:t>
+      </w:r>
+    </w:p>
+    <w:p>
+      <w:r>
+        <w:t xml:space="preserve"> 2.</w:t>
+      </w:r>
+      <w:r>
+        <w:t xml:space="preserve"> Operators</w:t>
+      </w:r>
+    </w:p>
+    <w:p>
+      <w:r>
+        <w:t xml:space="preserve"> 3.</w:t>
+      </w:r>
+      <w:r>
+        <w:t xml:space="preserve"> Input and Output</w:t>
+      </w:r>
+    </w:p>
+    <w:p>
+      <w:r>
         <w:t xml:space="preserve"> </w:t>
       </w:r>
       <w:r>
-        <w:t>3.</w:t>
-      </w:r>
-      <w:r>
+        <w:t>4.</w:t>
+      </w:r>
+      <w:r>
+        <w:t xml:space="preserve"> Control Flow</w:t>
+      </w:r>
+    </w:p>
+    <w:p>
+      <w:r>
+        <w:t xml:space="preserve"> 5.</w:t>
+      </w:r>
+      <w:r>
+        <w:t xml:space="preserve"> Arrays</w:t>
+      </w:r>
+    </w:p>
+    <w:p/>
+    <w:p>
+      <w:pPr>
+        <w:rPr>
+          <w:sz w:val="24"/>
+          <w:szCs w:val="24"/>
+        </w:rPr>
+      </w:pPr>
+      <w:r>
+        <w:rPr>
+          <w:b/>
+          <w:bCs/>
+          <w:sz w:val="24"/>
+          <w:szCs w:val="24"/>
+        </w:rPr>
         <w:t>1</w:t>
       </w:r>
       <w:r>
+        <w:rPr>
+          <w:b/>
+          <w:bCs/>
+          <w:sz w:val="24"/>
+          <w:szCs w:val="24"/>
+        </w:rPr>
+        <w:t>.</w:t>
+      </w:r>
+      <w:r>
+        <w:rPr>
+          <w:b/>
+          <w:bCs/>
+          <w:sz w:val="24"/>
+          <w:szCs w:val="24"/>
+        </w:rPr>
         <w:t xml:space="preserve"> Data Types</w:t>
-      </w:r>
-    </w:p>
-    <w:p>
-      <w:r>
-        <w:t xml:space="preserve"> 3.</w:t>
-      </w:r>
-      <w:r>
-        <w:t>2</w:t>
-      </w:r>
-      <w:r>
-        <w:t xml:space="preserve"> Variables and Constants</w:t>
-      </w:r>
-    </w:p>
-    <w:p>
-      <w:r>
-        <w:t xml:space="preserve"> </w:t>
-      </w:r>
-      <w:r>
-        <w:t>3.</w:t>
-      </w:r>
-      <w:r>
-        <w:t>3</w:t>
-      </w:r>
-      <w:r>
-        <w:t xml:space="preserve"> Operators</w:t>
-      </w:r>
-    </w:p>
-    <w:p>
-      <w:r>
-        <w:t xml:space="preserve"> 3.</w:t>
-      </w:r>
-      <w:r>
-        <w:t>4</w:t>
-      </w:r>
-      <w:r>
-        <w:t xml:space="preserve"> Strings</w:t>
-      </w:r>
-    </w:p>
-    <w:p>
-      <w:r>
-        <w:t xml:space="preserve"> 3.</w:t>
-      </w:r>
-      <w:r>
-        <w:t>5</w:t>
-      </w:r>
-      <w:r>
-        <w:t xml:space="preserve"> Input and Output</w:t>
-      </w:r>
-    </w:p>
-    <w:p>
-      <w:r>
-        <w:t xml:space="preserve"> 3.</w:t>
-      </w:r>
-      <w:r>
-        <w:t>6</w:t>
-      </w:r>
-      <w:r>
-        <w:t xml:space="preserve"> Control Flow</w:t>
-      </w:r>
-    </w:p>
-    <w:p>
-      <w:r>
-        <w:t xml:space="preserve"> </w:t>
-      </w:r>
-      <w:r>
-        <w:t>3.</w:t>
-      </w:r>
-      <w:r>
-        <w:t>7</w:t>
-      </w:r>
-      <w:r>
-        <w:t xml:space="preserve"> Big Numbers</w:t>
-      </w:r>
-    </w:p>
-    <w:p>
-      <w:r>
-        <w:t xml:space="preserve"> </w:t>
-      </w:r>
-      <w:r>
-        <w:t>3.</w:t>
-      </w:r>
-      <w:r>
-        <w:t>8</w:t>
-      </w:r>
-      <w:r>
-        <w:t xml:space="preserve"> Arrays</w:t>
-      </w:r>
-    </w:p>
-    <w:p/>
-    <w:p>
-      <w:pPr>
-        <w:rPr>
-          <w:sz w:val="24"/>
-          <w:szCs w:val="24"/>
-        </w:rPr>
-      </w:pPr>
-      <w:r>
-        <w:rPr>
-          <w:b/>
-          <w:bCs/>
-          <w:sz w:val="24"/>
-          <w:szCs w:val="24"/>
-        </w:rPr>
-        <w:t>3.1 Data Types</w:t>
       </w:r>
       <w:r>
         <w:rPr>
@@ -481,14 +451,9 @@
       <w:r>
         <w:t xml:space="preserve">Type mismatch: cannot convert from String to </w:t>
       </w:r>
-      <w:proofErr w:type="spellStart"/>
       <w:proofErr w:type="gramStart"/>
       <w:r>
-        <w:t>intJava</w:t>
-      </w:r>
-      <w:proofErr w:type="spellEnd"/>
-      <w:r>
-        <w:t>(</w:t>
+        <w:t>intJava(</w:t>
       </w:r>
       <w:proofErr w:type="gramEnd"/>
       <w:r>
@@ -775,140 +740,140 @@
         <w:ind w:left="1134"/>
       </w:pPr>
       <w:r>
+        <w:t xml:space="preserve">      </w:t>
+      </w:r>
+      <w:r>
+        <w:t>S</w:t>
+      </w:r>
+      <w:r>
+        <w:t>hort</w:t>
+      </w:r>
+      <w:r>
+        <w:t>:</w:t>
+      </w:r>
+      <w:r>
+        <w:t xml:space="preserve"> the size required is 16 bits</w:t>
+      </w:r>
+      <w:r>
+        <w:t xml:space="preserve"> (2^15 to 2^15 – 1</w:t>
+      </w:r>
+      <w:r>
+        <w:t>)</w:t>
+      </w:r>
+      <w:r>
+        <w:t>.</w:t>
+      </w:r>
+      <w:r>
+        <w:t xml:space="preserve"> 32768 </w:t>
+      </w:r>
+      <w:r>
+        <w:t>to 32767</w:t>
+      </w:r>
+    </w:p>
+    <w:p>
+      <w:pPr>
+        <w:pStyle w:val="ListParagraph"/>
+        <w:ind w:left="1134"/>
+      </w:pPr>
+      <w:r>
+        <w:t xml:space="preserve">     </w:t>
+      </w:r>
+      <w:r>
+        <w:t xml:space="preserve"> </w:t>
+      </w:r>
+      <w:r>
+        <w:t>I</w:t>
+      </w:r>
+      <w:r>
+        <w:t>nt</w:t>
+      </w:r>
+      <w:r>
+        <w:t xml:space="preserve">: </w:t>
+      </w:r>
+      <w:r>
+        <w:t>the size required is 32 bits (2^</w:t>
+      </w:r>
+      <w:r>
+        <w:t>31</w:t>
+      </w:r>
+      <w:r>
+        <w:t xml:space="preserve"> to 2^</w:t>
+      </w:r>
+      <w:r>
+        <w:t>31</w:t>
+      </w:r>
+      <w:r>
+        <w:t xml:space="preserve"> – 1).</w:t>
+      </w:r>
+      <w:r>
+        <w:t xml:space="preserve"> </w:t>
+      </w:r>
+      <w:r>
+        <w:t>-2,147,483,648</w:t>
+      </w:r>
+      <w:r>
+        <w:t xml:space="preserve"> to </w:t>
+      </w:r>
+      <w:r>
+        <w:t>2,147,483,647</w:t>
+      </w:r>
+      <w:r>
+        <w:t xml:space="preserve"> the default type </w:t>
+      </w:r>
+    </w:p>
+    <w:p>
+      <w:pPr>
+        <w:pStyle w:val="ListParagraph"/>
+        <w:ind w:left="1134"/>
+      </w:pPr>
+      <w:r>
+        <w:t xml:space="preserve">     </w:t>
+      </w:r>
+      <w:r>
+        <w:t xml:space="preserve"> </w:t>
+      </w:r>
+      <w:r>
+        <w:t>L</w:t>
+      </w:r>
+      <w:r>
+        <w:t>ong</w:t>
+      </w:r>
+      <w:r>
+        <w:t>:</w:t>
+      </w:r>
+      <w:r>
+        <w:t xml:space="preserve">  the size required is </w:t>
+      </w:r>
+      <w:r>
+        <w:t>64</w:t>
+      </w:r>
+      <w:r>
+        <w:t xml:space="preserve"> bits (2^</w:t>
+      </w:r>
+      <w:r>
+        <w:t>63</w:t>
+      </w:r>
+      <w:r>
+        <w:t xml:space="preserve"> to 2^</w:t>
+      </w:r>
+      <w:r>
+        <w:t>63</w:t>
+      </w:r>
+      <w:r>
+        <w:t xml:space="preserve"> – 1).</w:t>
+      </w:r>
+    </w:p>
+    <w:p>
+      <w:pPr>
+        <w:pStyle w:val="ListParagraph"/>
+        <w:ind w:left="1134"/>
+      </w:pPr>
+      <w:r>
+        <w:rPr>
+          <w:b/>
+          <w:bCs/>
+        </w:rPr>
         <w:lastRenderedPageBreak/>
-        <w:t xml:space="preserve">      </w:t>
-      </w:r>
-      <w:r>
-        <w:t>S</w:t>
-      </w:r>
-      <w:r>
-        <w:t>hort</w:t>
-      </w:r>
-      <w:r>
-        <w:t>:</w:t>
-      </w:r>
-      <w:r>
-        <w:t xml:space="preserve"> the size required is 16 bits</w:t>
-      </w:r>
-      <w:r>
-        <w:t xml:space="preserve"> (2^15 to 2^15 – 1</w:t>
-      </w:r>
-      <w:r>
-        <w:t>)</w:t>
-      </w:r>
-      <w:r>
-        <w:t>.</w:t>
-      </w:r>
-      <w:r>
-        <w:t xml:space="preserve"> 32768 </w:t>
-      </w:r>
-      <w:r>
-        <w:t>to 32767</w:t>
-      </w:r>
-    </w:p>
-    <w:p>
-      <w:pPr>
-        <w:pStyle w:val="ListParagraph"/>
-        <w:ind w:left="1134"/>
-      </w:pPr>
-      <w:r>
-        <w:t xml:space="preserve">     </w:t>
-      </w:r>
-      <w:r>
-        <w:t xml:space="preserve"> </w:t>
-      </w:r>
-      <w:r>
-        <w:t>I</w:t>
-      </w:r>
-      <w:r>
-        <w:t>nt</w:t>
-      </w:r>
-      <w:r>
-        <w:t xml:space="preserve">: </w:t>
-      </w:r>
-      <w:r>
-        <w:t>the size required is 32 bits (2^</w:t>
-      </w:r>
-      <w:r>
-        <w:t>31</w:t>
-      </w:r>
-      <w:r>
-        <w:t xml:space="preserve"> to 2^</w:t>
-      </w:r>
-      <w:r>
-        <w:t>31</w:t>
-      </w:r>
-      <w:r>
-        <w:t xml:space="preserve"> – 1).</w:t>
-      </w:r>
-      <w:r>
-        <w:t xml:space="preserve"> </w:t>
-      </w:r>
-      <w:r>
-        <w:t>-2,147,483,648</w:t>
-      </w:r>
-      <w:r>
-        <w:t xml:space="preserve"> to </w:t>
-      </w:r>
-      <w:r>
-        <w:t>2,147,483,647</w:t>
-      </w:r>
-      <w:r>
-        <w:t xml:space="preserve"> the default type </w:t>
-      </w:r>
-    </w:p>
-    <w:p>
-      <w:pPr>
-        <w:pStyle w:val="ListParagraph"/>
-        <w:ind w:left="1134"/>
-      </w:pPr>
-      <w:r>
-        <w:t xml:space="preserve">     </w:t>
-      </w:r>
-      <w:r>
-        <w:t xml:space="preserve"> </w:t>
-      </w:r>
-      <w:r>
-        <w:t>L</w:t>
-      </w:r>
-      <w:r>
-        <w:t>ong</w:t>
-      </w:r>
-      <w:r>
-        <w:t>:</w:t>
-      </w:r>
-      <w:r>
-        <w:t xml:space="preserve">  the size required is </w:t>
-      </w:r>
-      <w:r>
-        <w:t>64</w:t>
-      </w:r>
-      <w:r>
-        <w:t xml:space="preserve"> bits (2^</w:t>
-      </w:r>
-      <w:r>
-        <w:t>63</w:t>
-      </w:r>
-      <w:r>
-        <w:t xml:space="preserve"> to 2^</w:t>
-      </w:r>
-      <w:r>
-        <w:t>63</w:t>
-      </w:r>
-      <w:r>
-        <w:t xml:space="preserve"> – 1).</w:t>
-      </w:r>
-    </w:p>
-    <w:p>
-      <w:pPr>
-        <w:pStyle w:val="ListParagraph"/>
-        <w:ind w:left="1134"/>
-      </w:pPr>
-      <w:r>
-        <w:rPr>
-          <w:b/>
-          <w:bCs/>
-        </w:rPr>
         <w:t>Implicit casting</w:t>
       </w:r>
       <w:r>
@@ -1319,50 +1284,50 @@
         <w:t xml:space="preserve">: </w:t>
       </w:r>
       <w:r>
-        <w:t xml:space="preserve">is a 64-bit primitive data type in Java used to store double-precision decimal (floating-point) numbers. It provides greater precision than float and is the default type </w:t>
+        <w:t>is a 64-bit primitive data type in Java used to store double-precision decimal (floating-point) numbers. It provides greater precision than float and is the default type for decimal values in Java.</w:t>
+      </w:r>
+      <w:r>
+        <w:t xml:space="preserve"> The range is -1.7</w:t>
+      </w:r>
+      <w:r>
+        <w:t xml:space="preserve">e308 </w:t>
+      </w:r>
+      <w:r>
+        <w:t>to and</w:t>
+      </w:r>
+      <w:r>
+        <w:t xml:space="preserve"> default value is 0.0d </w:t>
+      </w:r>
+      <w:r>
+        <w:t xml:space="preserve">1.7e308 and it </w:t>
+      </w:r>
+      <w:r>
+        <w:t xml:space="preserve">provides 15-16 decimal digits of </w:t>
+      </w:r>
+      <w:r>
+        <w:t>precision</w:t>
+      </w:r>
+    </w:p>
+    <w:p>
+      <w:pPr>
+        <w:pStyle w:val="ListParagraph"/>
+        <w:ind w:left="1854"/>
+      </w:pPr>
+      <w:r>
+        <w:t>J</w:t>
+      </w:r>
+      <w:r>
+        <w:t>ava treats decimal literals like 98.99 as double by default, and because converting a double to a float may lose precision, it requires an explicit f suffix or cast.</w:t>
+      </w:r>
+      <w:r>
+        <w:t xml:space="preserve"> </w:t>
+      </w:r>
+      <w:r>
+        <w:t xml:space="preserve">Java </w:t>
       </w:r>
       <w:r>
         <w:lastRenderedPageBreak/>
-        <w:t>for decimal values in Java.</w:t>
-      </w:r>
-      <w:r>
-        <w:t xml:space="preserve"> The range is -1.7</w:t>
-      </w:r>
-      <w:r>
-        <w:t xml:space="preserve">e308 </w:t>
-      </w:r>
-      <w:r>
-        <w:t>to and</w:t>
-      </w:r>
-      <w:r>
-        <w:t xml:space="preserve"> default value is 0.0d </w:t>
-      </w:r>
-      <w:r>
-        <w:t xml:space="preserve">1.7e308 and it </w:t>
-      </w:r>
-      <w:r>
-        <w:t xml:space="preserve">provides 15-16 decimal digits of </w:t>
-      </w:r>
-      <w:r>
-        <w:t>precision</w:t>
-      </w:r>
-    </w:p>
-    <w:p>
-      <w:pPr>
-        <w:pStyle w:val="ListParagraph"/>
-        <w:ind w:left="1854"/>
-      </w:pPr>
-      <w:r>
-        <w:t>J</w:t>
-      </w:r>
-      <w:r>
-        <w:t>ava treats decimal literals like 98.99 as double by default, and because converting a double to a float may lose precision, it requires an explicit f suffix or cast.</w:t>
-      </w:r>
-      <w:r>
-        <w:t xml:space="preserve"> </w:t>
-      </w:r>
-      <w:r>
-        <w:t>Java automatically converts an int to a double because it is a safe widening conversion with no loss of data, whereas converting a double to a float requires an explicit cast because it may lose precision.</w:t>
+        <w:t>automatically converts an int to a double because it is a safe widening conversion with no loss of data, whereas converting a double to a float requires an explicit cast because it may lose precision.</w:t>
       </w:r>
     </w:p>
     <w:p>
@@ -1469,21 +1434,12 @@
         <w:pStyle w:val="ListParagraph"/>
         <w:ind w:left="1854"/>
       </w:pPr>
-      <w:proofErr w:type="spellStart"/>
-      <w:r>
-        <w:rPr>
-          <w:b/>
-          <w:bCs/>
-        </w:rPr>
-        <w:t>BigDecimal</w:t>
-      </w:r>
-      <w:proofErr w:type="spellEnd"/>
-      <w:r>
-        <w:rPr>
-          <w:b/>
-          <w:bCs/>
-        </w:rPr>
-        <w:t xml:space="preserve"> </w:t>
+      <w:r>
+        <w:rPr>
+          <w:b/>
+          <w:bCs/>
+        </w:rPr>
+        <w:t xml:space="preserve">BigDecimal </w:t>
       </w:r>
       <w:r>
         <w:t>stores decimal numbers with arbitrary precision, avoiding the rounding errors that can occur with float and double.</w:t>
@@ -1599,6 +1555,67 @@
     </w:p>
     <w:p>
       <w:r>
+        <w:t xml:space="preserve">                       </w:t>
+      </w:r>
+      <w:r>
+        <w:rPr>
+          <w:b/>
+          <w:bCs/>
+        </w:rPr>
+        <w:t>UTF-16</w:t>
+      </w:r>
+      <w:r>
+        <w:rPr>
+          <w:b/>
+          <w:bCs/>
+        </w:rPr>
+        <w:t xml:space="preserve"> Encoding</w:t>
+      </w:r>
+      <w:r>
+        <w:rPr>
+          <w:b/>
+          <w:bCs/>
+        </w:rPr>
+        <w:t xml:space="preserve">: </w:t>
+      </w:r>
+      <w:r>
+        <w:t>is a character encoding that represents text using 16-bit code units. It is designed to handle a wide range of characters from different languages by combining one or two 16-bit units per character. Basic Latin characters (like English letters and digits) are stored using a single 16-bit unit, while more complex characters, such as emojis or less common scripts, are represented using surrogate pairs (two 16-bit units).</w:t>
+      </w:r>
+    </w:p>
+    <w:p>
+      <w:r>
+        <w:t>In Java, char is based on UTF-16 encoding. Each char in Java is a 16-bit value, which means it can directly represent most common characters but not all Unicode characters. For characters outside the Basic Multilingual Plane (BMP), Java uses two char values (a surrogate pair) to represent a single character.</w:t>
+      </w:r>
+    </w:p>
+    <w:p>
+      <w:r>
+        <w:t>This design allows Java to maintain compatibility with Unicode while keeping memory usage efficient for most text. However, it also means developers must be careful when working with characters like emojis or certain international symbols, since they may not fit into a single char and require special handling when iterating over strings.</w:t>
+      </w:r>
+    </w:p>
+    <w:p>
+      <w:r>
+        <w:rPr>
+          <w:b/>
+          <w:bCs/>
+        </w:rPr>
+        <w:t>C</w:t>
+      </w:r>
+      <w:r>
+        <w:rPr>
+          <w:b/>
+          <w:bCs/>
+        </w:rPr>
+        <w:t>ode point</w:t>
+      </w:r>
+      <w:r>
+        <w:t>:</w:t>
+      </w:r>
+      <w:r>
+        <w:t xml:space="preserve"> a UTF-16 code unit (16 bits). A Unicode code point is the actual character in the Unicode standard.</w:t>
+      </w:r>
+    </w:p>
+    <w:p>
+      <w:r>
         <w:rPr>
           <w:b/>
           <w:bCs/>
@@ -1628,6 +1645,207 @@
       </w:r>
       <w:r>
         <w:t>in Java is a class that converts a primitive data type into an object.</w:t>
+      </w:r>
+    </w:p>
+    <w:p>
+      <w:r>
+        <w:rPr>
+          <w:b/>
+          <w:bCs/>
+        </w:rPr>
+        <w:t>Boolean:</w:t>
+      </w:r>
+      <w:r>
+        <w:rPr>
+          <w:b/>
+          <w:bCs/>
+        </w:rPr>
+        <w:t xml:space="preserve"> </w:t>
+      </w:r>
+      <w:r>
+        <w:t>it has only to possible</w:t>
+      </w:r>
+      <w:r>
+        <w:rPr>
+          <w:b/>
+          <w:bCs/>
+        </w:rPr>
+        <w:t xml:space="preserve"> values TRUE OR FALSE, </w:t>
+      </w:r>
+      <w:r>
+        <w:t xml:space="preserve">the size </w:t>
+      </w:r>
+      <w:r>
+        <w:t>depends</w:t>
+      </w:r>
+      <w:r>
+        <w:t xml:space="preserve"> on the </w:t>
+      </w:r>
+      <w:r>
+        <w:t>JVM but usually 1 bit</w:t>
+      </w:r>
+      <w:r>
+        <w:t xml:space="preserve"> and the </w:t>
+      </w:r>
+      <w:r>
+        <w:t>default</w:t>
+      </w:r>
+      <w:r>
+        <w:t xml:space="preserve"> value is FALSE.</w:t>
+      </w:r>
+      <w:r>
+        <w:t xml:space="preserve">  </w:t>
+      </w:r>
+    </w:p>
+    <w:p/>
+    <w:p/>
+    <w:p/>
+    <w:p/>
+    <w:p>
+      <w:pPr>
+        <w:rPr>
+          <w:b/>
+          <w:bCs/>
+          <w:u w:val="single"/>
+        </w:rPr>
+      </w:pPr>
+      <w:r>
+        <w:rPr>
+          <w:b/>
+          <w:bCs/>
+          <w:u w:val="single"/>
+        </w:rPr>
+        <w:t>D</w:t>
+      </w:r>
+      <w:r>
+        <w:rPr>
+          <w:b/>
+          <w:bCs/>
+          <w:u w:val="single"/>
+        </w:rPr>
+        <w:t xml:space="preserve">ata </w:t>
+      </w:r>
+      <w:r>
+        <w:rPr>
+          <w:b/>
+          <w:bCs/>
+          <w:u w:val="single"/>
+        </w:rPr>
+        <w:t>T</w:t>
+      </w:r>
+      <w:r>
+        <w:rPr>
+          <w:b/>
+          <w:bCs/>
+          <w:u w:val="single"/>
+        </w:rPr>
+        <w:t>ypes default values</w:t>
+      </w:r>
+      <w:r>
+        <w:rPr>
+          <w:b/>
+          <w:bCs/>
+          <w:u w:val="single"/>
+        </w:rPr>
+        <w:t xml:space="preserve"> (</w:t>
+      </w:r>
+      <w:r>
+        <w:rPr>
+          <w:b/>
+          <w:bCs/>
+          <w:u w:val="single"/>
+        </w:rPr>
+        <w:t>Instance variables only</w:t>
+      </w:r>
+      <w:r>
+        <w:rPr>
+          <w:b/>
+          <w:bCs/>
+          <w:u w:val="single"/>
+        </w:rPr>
+        <w:t xml:space="preserve"> and not for </w:t>
+      </w:r>
+      <w:r>
+        <w:rPr>
+          <w:b/>
+          <w:bCs/>
+          <w:u w:val="single"/>
+        </w:rPr>
+        <w:t>uninitialized</w:t>
+      </w:r>
+      <w:r>
+        <w:rPr>
+          <w:b/>
+          <w:bCs/>
+          <w:u w:val="single"/>
+        </w:rPr>
+        <w:t xml:space="preserve"> local variables, just class level</w:t>
+      </w:r>
+      <w:r>
+        <w:rPr>
+          <w:b/>
+          <w:bCs/>
+          <w:u w:val="single"/>
+        </w:rPr>
+        <w:t>):</w:t>
+      </w:r>
+    </w:p>
+    <w:p>
+      <w:pPr>
+        <w:jc w:val="center"/>
+        <w:rPr>
+          <w:b/>
+          <w:bCs/>
+        </w:rPr>
+      </w:pPr>
+      <w:r>
+        <w:rPr>
+          <w:b/>
+          <w:bCs/>
+          <w:noProof/>
+        </w:rPr>
+        <w:lastRenderedPageBreak/>
+        <w:drawing>
+          <wp:inline distT="0" distB="0" distL="0" distR="0" wp14:anchorId="6A75DCB9" wp14:editId="22CF6B99">
+            <wp:extent cx="6210935" cy="3868420"/>
+            <wp:effectExtent l="0" t="0" r="0" b="0"/>
+            <wp:docPr id="1774444732" name="Picture 1"/>
+            <wp:cNvGraphicFramePr>
+              <a:graphicFrameLocks xmlns:a="http://schemas.openxmlformats.org/drawingml/2006/main" noChangeAspect="1"/>
+            </wp:cNvGraphicFramePr>
+            <a:graphic xmlns:a="http://schemas.openxmlformats.org/drawingml/2006/main">
+              <a:graphicData uri="http://schemas.openxmlformats.org/drawingml/2006/picture">
+                <pic:pic xmlns:pic="http://schemas.openxmlformats.org/drawingml/2006/picture">
+                  <pic:nvPicPr>
+                    <pic:cNvPr id="1774444732" name="Picture 1774444732"/>
+                    <pic:cNvPicPr/>
+                  </pic:nvPicPr>
+                  <pic:blipFill>
+                    <a:blip r:embed="rId9">
+                      <a:extLst>
+                        <a:ext uri="{28A0092B-C50C-407E-A947-70E740481C1C}">
+                          <a14:useLocalDpi xmlns:a14="http://schemas.microsoft.com/office/drawing/2010/main" val="0"/>
+                        </a:ext>
+                      </a:extLst>
+                    </a:blip>
+                    <a:stretch>
+                      <a:fillRect/>
+                    </a:stretch>
+                  </pic:blipFill>
+                  <pic:spPr>
+                    <a:xfrm>
+                      <a:off x="0" y="0"/>
+                      <a:ext cx="6210935" cy="3868420"/>
+                    </a:xfrm>
+                    <a:prstGeom prst="rect">
+                      <a:avLst/>
+                    </a:prstGeom>
+                  </pic:spPr>
+                </pic:pic>
+              </a:graphicData>
+            </a:graphic>
+          </wp:inline>
+        </w:drawing>
       </w:r>
     </w:p>
     <w:p>
@@ -1645,6 +1863,10 @@
           <w:ilvl w:val="0"/>
           <w:numId w:val="4"/>
         </w:numPr>
+        <w:rPr>
+          <w:sz w:val="24"/>
+          <w:szCs w:val="24"/>
+        </w:rPr>
       </w:pPr>
       <w:r>
         <w:rPr>
@@ -1661,19 +1883,408 @@
         <w:t xml:space="preserve">: </w:t>
       </w:r>
       <w:r>
-        <w:t>These store references (addresses) to objects rather than the actual value.</w:t>
-      </w:r>
-    </w:p>
-    <w:p>
-      <w:pPr>
-        <w:rPr>
-          <w:sz w:val="24"/>
-          <w:szCs w:val="24"/>
-        </w:rPr>
-      </w:pPr>
+        <w:t>Data types that store references (memory addresses) to objects rather than the actual data. Examples include String, arrays, classes, and interfaces.</w:t>
+      </w:r>
+    </w:p>
+    <w:p>
+      <w:pPr>
+        <w:pStyle w:val="ListParagraph"/>
+        <w:rPr>
+          <w:sz w:val="24"/>
+          <w:szCs w:val="24"/>
+        </w:rPr>
+      </w:pPr>
+    </w:p>
+    <w:p>
+      <w:pPr>
+        <w:pStyle w:val="ListParagraph"/>
+        <w:rPr>
+          <w:sz w:val="24"/>
+          <w:szCs w:val="24"/>
+        </w:rPr>
+      </w:pPr>
+      <w:r>
+        <w:rPr>
+          <w:sz w:val="24"/>
+          <w:szCs w:val="24"/>
+        </w:rPr>
+        <w:t>Unlike primitive data types, which store their actual values directly, non-primitive data types store a reference (memory address) to objects that the JVM typically allocates on the heap. The JVM uses these references to access and manage the object's data, methods, and memory through automatic garbage collection.</w:t>
+      </w:r>
+      <w:r>
+        <w:rPr>
+          <w:sz w:val="24"/>
+          <w:szCs w:val="24"/>
+        </w:rPr>
+        <w:t xml:space="preserve">   </w:t>
+      </w:r>
+    </w:p>
+    <w:p>
+      <w:pPr>
+        <w:pStyle w:val="ListParagraph"/>
+        <w:rPr>
+          <w:sz w:val="24"/>
+          <w:szCs w:val="24"/>
+        </w:rPr>
+      </w:pPr>
+    </w:p>
+    <w:p>
+      <w:pPr>
+        <w:pStyle w:val="ListParagraph"/>
+        <w:rPr>
+          <w:b/>
+          <w:bCs/>
+          <w:sz w:val="24"/>
+          <w:szCs w:val="24"/>
+        </w:rPr>
+      </w:pPr>
+      <w:r>
+        <w:rPr>
+          <w:b/>
+          <w:bCs/>
+          <w:sz w:val="24"/>
+          <w:szCs w:val="24"/>
+        </w:rPr>
+        <w:t>String</w:t>
+      </w:r>
+      <w:r>
+        <w:rPr>
+          <w:b/>
+          <w:bCs/>
+          <w:sz w:val="24"/>
+          <w:szCs w:val="24"/>
+        </w:rPr>
+        <w:t xml:space="preserve">: </w:t>
+      </w:r>
+      <w:r>
+        <w:rPr>
+          <w:sz w:val="24"/>
+          <w:szCs w:val="24"/>
+        </w:rPr>
+        <w:t>Stores a sequence of characters used to represent text.</w:t>
+      </w:r>
+    </w:p>
+    <w:p>
+      <w:pPr>
+        <w:pStyle w:val="ListParagraph"/>
+        <w:rPr>
+          <w:b/>
+          <w:bCs/>
+          <w:sz w:val="24"/>
+          <w:szCs w:val="24"/>
+        </w:rPr>
+      </w:pPr>
+      <w:r>
+        <w:rPr>
+          <w:b/>
+          <w:bCs/>
+          <w:sz w:val="24"/>
+          <w:szCs w:val="24"/>
+        </w:rPr>
+        <w:t>Array</w:t>
+      </w:r>
+      <w:r>
+        <w:rPr>
+          <w:b/>
+          <w:bCs/>
+          <w:sz w:val="24"/>
+          <w:szCs w:val="24"/>
+        </w:rPr>
+        <w:t xml:space="preserve">: </w:t>
+      </w:r>
+      <w:r>
+        <w:rPr>
+          <w:b/>
+          <w:bCs/>
+          <w:sz w:val="24"/>
+          <w:szCs w:val="24"/>
+        </w:rPr>
+        <w:t xml:space="preserve"> </w:t>
+      </w:r>
+      <w:r>
+        <w:rPr>
+          <w:sz w:val="24"/>
+          <w:szCs w:val="24"/>
+        </w:rPr>
+        <w:t>Stores multiple values of the same data type in a fixed-size collection.</w:t>
+      </w:r>
+    </w:p>
+    <w:p>
+      <w:pPr>
+        <w:pStyle w:val="ListParagraph"/>
+        <w:rPr>
+          <w:sz w:val="24"/>
+          <w:szCs w:val="24"/>
+        </w:rPr>
+      </w:pPr>
+      <w:r>
+        <w:rPr>
+          <w:b/>
+          <w:bCs/>
+          <w:sz w:val="24"/>
+          <w:szCs w:val="24"/>
+        </w:rPr>
+        <w:t>Class</w:t>
+      </w:r>
+      <w:r>
+        <w:rPr>
+          <w:b/>
+          <w:bCs/>
+          <w:sz w:val="24"/>
+          <w:szCs w:val="24"/>
+        </w:rPr>
+        <w:t xml:space="preserve">: </w:t>
+      </w:r>
+      <w:r>
+        <w:rPr>
+          <w:b/>
+          <w:bCs/>
+          <w:sz w:val="24"/>
+          <w:szCs w:val="24"/>
+        </w:rPr>
+        <w:t xml:space="preserve">  </w:t>
+      </w:r>
+      <w:r>
+        <w:rPr>
+          <w:sz w:val="24"/>
+          <w:szCs w:val="24"/>
+        </w:rPr>
+        <w:t xml:space="preserve">A blueprint for creating objects that define data (fields) and </w:t>
+      </w:r>
+      <w:r>
+        <w:rPr>
+          <w:sz w:val="24"/>
+          <w:szCs w:val="24"/>
+        </w:rPr>
+        <w:t>behaviour</w:t>
+      </w:r>
+      <w:r>
+        <w:rPr>
+          <w:sz w:val="24"/>
+          <w:szCs w:val="24"/>
+        </w:rPr>
+        <w:t xml:space="preserve"> (methods).</w:t>
+      </w:r>
+      <w:r>
+        <w:rPr>
+          <w:sz w:val="24"/>
+          <w:szCs w:val="24"/>
+        </w:rPr>
+        <w:t xml:space="preserve"> </w:t>
+      </w:r>
+    </w:p>
+    <w:p>
+      <w:pPr>
+        <w:pStyle w:val="ListParagraph"/>
+        <w:rPr>
+          <w:b/>
+          <w:bCs/>
+          <w:sz w:val="24"/>
+          <w:szCs w:val="24"/>
+        </w:rPr>
+      </w:pPr>
+      <w:r>
+        <w:rPr>
+          <w:b/>
+          <w:bCs/>
+          <w:sz w:val="24"/>
+          <w:szCs w:val="24"/>
+        </w:rPr>
+        <w:t>Object</w:t>
+      </w:r>
+      <w:r>
+        <w:rPr>
+          <w:b/>
+          <w:bCs/>
+          <w:sz w:val="24"/>
+          <w:szCs w:val="24"/>
+        </w:rPr>
+        <w:t xml:space="preserve">: </w:t>
+      </w:r>
+      <w:r>
+        <w:rPr>
+          <w:sz w:val="24"/>
+          <w:szCs w:val="24"/>
+        </w:rPr>
+        <w:t>An instance of a class that contains data and methods.</w:t>
+      </w:r>
+    </w:p>
+    <w:p>
+      <w:pPr>
+        <w:pStyle w:val="ListParagraph"/>
+        <w:rPr>
+          <w:b/>
+          <w:bCs/>
+          <w:sz w:val="24"/>
+          <w:szCs w:val="24"/>
+        </w:rPr>
+      </w:pPr>
+      <w:r>
+        <w:rPr>
+          <w:b/>
+          <w:bCs/>
+          <w:sz w:val="24"/>
+          <w:szCs w:val="24"/>
+        </w:rPr>
+        <w:t>Interface</w:t>
+      </w:r>
+      <w:r>
+        <w:rPr>
+          <w:b/>
+          <w:bCs/>
+          <w:sz w:val="24"/>
+          <w:szCs w:val="24"/>
+        </w:rPr>
+        <w:t xml:space="preserve">: </w:t>
+      </w:r>
+      <w:r>
+        <w:rPr>
+          <w:sz w:val="24"/>
+          <w:szCs w:val="24"/>
+        </w:rPr>
+        <w:t>A reference type that defines a set of methods a class must implement.</w:t>
+      </w:r>
+    </w:p>
+    <w:p>
+      <w:pPr>
+        <w:pStyle w:val="ListParagraph"/>
+        <w:rPr>
+          <w:sz w:val="24"/>
+          <w:szCs w:val="24"/>
+        </w:rPr>
+      </w:pPr>
+      <w:r>
+        <w:rPr>
+          <w:b/>
+          <w:bCs/>
+          <w:sz w:val="24"/>
+          <w:szCs w:val="24"/>
+        </w:rPr>
+        <w:t>Enum</w:t>
+      </w:r>
+      <w:r>
+        <w:rPr>
+          <w:b/>
+          <w:bCs/>
+          <w:sz w:val="24"/>
+          <w:szCs w:val="24"/>
+        </w:rPr>
+        <w:t xml:space="preserve">: </w:t>
+      </w:r>
+      <w:r>
+        <w:rPr>
+          <w:sz w:val="24"/>
+          <w:szCs w:val="24"/>
+        </w:rPr>
+        <w:t>A special type used to define a fixed set of named constants.</w:t>
+      </w:r>
+    </w:p>
+    <w:p>
+      <w:pPr>
+        <w:pStyle w:val="ListParagraph"/>
+        <w:rPr>
+          <w:b/>
+          <w:bCs/>
+          <w:sz w:val="24"/>
+          <w:szCs w:val="24"/>
+        </w:rPr>
+      </w:pPr>
+      <w:r>
+        <w:rPr>
+          <w:b/>
+          <w:bCs/>
+          <w:sz w:val="24"/>
+          <w:szCs w:val="24"/>
+        </w:rPr>
+        <w:t xml:space="preserve">Record </w:t>
+      </w:r>
+      <w:r>
+        <w:rPr>
+          <w:b/>
+          <w:bCs/>
+          <w:i/>
+          <w:iCs/>
+          <w:sz w:val="24"/>
+          <w:szCs w:val="24"/>
+        </w:rPr>
+        <w:t>(Java 16+</w:t>
+      </w:r>
+      <w:r>
+        <w:rPr>
+          <w:b/>
+          <w:bCs/>
+          <w:i/>
+          <w:iCs/>
+          <w:sz w:val="24"/>
+          <w:szCs w:val="24"/>
+        </w:rPr>
+        <w:t>)</w:t>
+      </w:r>
+      <w:r>
+        <w:rPr>
+          <w:b/>
+          <w:bCs/>
+          <w:i/>
+          <w:iCs/>
+          <w:sz w:val="24"/>
+          <w:szCs w:val="24"/>
+        </w:rPr>
+        <w:t xml:space="preserve">: </w:t>
+      </w:r>
+      <w:r>
+        <w:rPr>
+          <w:i/>
+          <w:iCs/>
+          <w:sz w:val="24"/>
+          <w:szCs w:val="24"/>
+        </w:rPr>
+        <w:t>A special class used to create immutable data objects with minimal</w:t>
+      </w:r>
+      <w:r>
+        <w:rPr>
+          <w:b/>
+          <w:bCs/>
+          <w:i/>
+          <w:iCs/>
+          <w:sz w:val="24"/>
+          <w:szCs w:val="24"/>
+        </w:rPr>
+        <w:t xml:space="preserve"> </w:t>
+      </w:r>
+      <w:r>
+        <w:rPr>
+          <w:i/>
+          <w:iCs/>
+          <w:sz w:val="24"/>
+          <w:szCs w:val="24"/>
+        </w:rPr>
+        <w:t>code.</w:t>
+      </w:r>
+      <w:r>
+        <w:rPr>
+          <w:b/>
+          <w:bCs/>
+          <w:sz w:val="24"/>
+          <w:szCs w:val="24"/>
+        </w:rPr>
+        <w:t xml:space="preserve">    </w:t>
+      </w:r>
     </w:p>
     <w:p/>
-    <w:p/>
+    <w:p>
+      <w:pPr>
+        <w:rPr>
+          <w:b/>
+          <w:bCs/>
+        </w:rPr>
+      </w:pPr>
+      <w:r>
+        <w:rPr>
+          <w:b/>
+          <w:bCs/>
+        </w:rPr>
+        <w:t>4. Control Flow</w:t>
+      </w:r>
+    </w:p>
     <w:sectPr>
       <w:pgSz w:w="11906" w:h="16838"/>
       <w:pgMar w:top="709" w:right="1274" w:bottom="709" w:left="851" w:header="708" w:footer="708" w:gutter="0"/>

</xml_diff>

<commit_message>
Learn Java String Data Type and String Handling  #14
</commit_message>
<xml_diff>
--- a/Chapter3/CH3.docx
+++ b/Chapter3/CH3.docx
@@ -35,100 +35,151 @@
       </w:r>
     </w:p>
     <w:p>
-      <w:r>
-        <w:t xml:space="preserve"> 1</w:t>
-      </w:r>
-      <w:r>
+      <w:pPr>
+        <w:pStyle w:val="ListParagraph"/>
+        <w:numPr>
+          <w:ilvl w:val="0"/>
+          <w:numId w:val="9"/>
+        </w:numPr>
+      </w:pPr>
+      <w:r>
+        <w:t>Data Types</w:t>
+      </w:r>
+    </w:p>
+    <w:p>
+      <w:pPr>
+        <w:pStyle w:val="ListParagraph"/>
+        <w:ind w:left="405"/>
+      </w:pPr>
+    </w:p>
+    <w:p>
+      <w:pPr>
+        <w:pStyle w:val="ListParagraph"/>
+        <w:numPr>
+          <w:ilvl w:val="0"/>
+          <w:numId w:val="9"/>
+        </w:numPr>
+      </w:pPr>
+      <w:r>
+        <w:t xml:space="preserve">Modifiers, </w:t>
+      </w:r>
+      <w:r>
+        <w:t>Variables and Constants</w:t>
+      </w:r>
+    </w:p>
+    <w:p>
+      <w:pPr>
+        <w:pStyle w:val="ListParagraph"/>
+      </w:pPr>
+    </w:p>
+    <w:p>
+      <w:pPr>
+        <w:pStyle w:val="ListParagraph"/>
+        <w:numPr>
+          <w:ilvl w:val="0"/>
+          <w:numId w:val="9"/>
+        </w:numPr>
+      </w:pPr>
+      <w:r>
+        <w:t>Operators</w:t>
+      </w:r>
+    </w:p>
+    <w:p>
+      <w:pPr>
+        <w:pStyle w:val="ListParagraph"/>
+      </w:pPr>
+    </w:p>
+    <w:p>
+      <w:pPr>
+        <w:pStyle w:val="ListParagraph"/>
+        <w:numPr>
+          <w:ilvl w:val="0"/>
+          <w:numId w:val="9"/>
+        </w:numPr>
+      </w:pPr>
+      <w:r>
+        <w:t>Input and Output</w:t>
+      </w:r>
+    </w:p>
+    <w:p>
+      <w:pPr>
+        <w:pStyle w:val="ListParagraph"/>
+      </w:pPr>
+    </w:p>
+    <w:p>
+      <w:pPr>
+        <w:pStyle w:val="ListParagraph"/>
+        <w:numPr>
+          <w:ilvl w:val="0"/>
+          <w:numId w:val="9"/>
+        </w:numPr>
+      </w:pPr>
+      <w:r>
+        <w:t>Control Flow</w:t>
+      </w:r>
+    </w:p>
+    <w:p>
+      <w:pPr>
+        <w:rPr>
+          <w:sz w:val="24"/>
+          <w:szCs w:val="24"/>
+        </w:rPr>
+      </w:pPr>
+      <w:r>
+        <w:rPr>
+          <w:b/>
+          <w:bCs/>
+          <w:sz w:val="24"/>
+          <w:szCs w:val="24"/>
+        </w:rPr>
+        <w:t>1</w:t>
+      </w:r>
+      <w:r>
+        <w:rPr>
+          <w:b/>
+          <w:bCs/>
+          <w:sz w:val="24"/>
+          <w:szCs w:val="24"/>
+        </w:rPr>
         <w:t>.</w:t>
       </w:r>
       <w:r>
-        <w:t xml:space="preserve"> Data Types</w:t>
-      </w:r>
-      <w:r>
-        <w:t xml:space="preserve">, </w:t>
-      </w:r>
-      <w:r>
-        <w:t>Variables and Constants</w:t>
-      </w:r>
-    </w:p>
-    <w:p>
-      <w:r>
-        <w:t xml:space="preserve"> 2.</w:t>
-      </w:r>
-      <w:r>
-        <w:t xml:space="preserve"> Operators</w:t>
-      </w:r>
-    </w:p>
-    <w:p>
-      <w:r>
-        <w:t xml:space="preserve"> 3.</w:t>
-      </w:r>
-      <w:r>
-        <w:t xml:space="preserve"> Input and Output</w:t>
-      </w:r>
-    </w:p>
-    <w:p>
-      <w:r>
+        <w:rPr>
+          <w:b/>
+          <w:bCs/>
+          <w:sz w:val="24"/>
+          <w:szCs w:val="24"/>
+        </w:rPr>
         <w:t xml:space="preserve"> </w:t>
       </w:r>
       <w:r>
-        <w:t>4.</w:t>
-      </w:r>
-      <w:r>
-        <w:t xml:space="preserve"> Control Flow</w:t>
-      </w:r>
-    </w:p>
-    <w:p>
-      <w:r>
-        <w:t xml:space="preserve"> 5.</w:t>
-      </w:r>
-      <w:r>
-        <w:t xml:space="preserve"> Arrays</w:t>
-      </w:r>
-    </w:p>
-    <w:p/>
-    <w:p>
-      <w:pPr>
-        <w:rPr>
-          <w:sz w:val="24"/>
-          <w:szCs w:val="24"/>
-        </w:rPr>
-      </w:pPr>
-      <w:r>
-        <w:rPr>
-          <w:b/>
-          <w:bCs/>
-          <w:sz w:val="24"/>
-          <w:szCs w:val="24"/>
-        </w:rPr>
-        <w:t>1</w:t>
-      </w:r>
-      <w:r>
-        <w:rPr>
-          <w:b/>
-          <w:bCs/>
-          <w:sz w:val="24"/>
-          <w:szCs w:val="24"/>
-        </w:rPr>
-        <w:t>.</w:t>
-      </w:r>
-      <w:r>
-        <w:rPr>
-          <w:b/>
-          <w:bCs/>
-          <w:sz w:val="24"/>
-          <w:szCs w:val="24"/>
-        </w:rPr>
-        <w:t xml:space="preserve"> Data Types</w:t>
-      </w:r>
-      <w:r>
-        <w:rPr>
-          <w:b/>
-          <w:bCs/>
-          <w:sz w:val="24"/>
-          <w:szCs w:val="24"/>
-        </w:rPr>
-        <w:t xml:space="preserve">: </w:t>
+        <w:rPr>
+          <w:b/>
+          <w:bCs/>
+          <w:sz w:val="24"/>
+          <w:szCs w:val="24"/>
+          <w:u w:val="single"/>
+        </w:rPr>
+        <w:t>Data Types</w:t>
+      </w:r>
+      <w:r>
+        <w:rPr>
+          <w:b/>
+          <w:bCs/>
+          <w:sz w:val="24"/>
+          <w:szCs w:val="24"/>
+          <w:u w:val="single"/>
+        </w:rPr>
+        <w:t>:</w:t>
+      </w:r>
+      <w:r>
+        <w:rPr>
+          <w:b/>
+          <w:bCs/>
+          <w:sz w:val="24"/>
+          <w:szCs w:val="24"/>
+        </w:rPr>
+        <w:t xml:space="preserve"> </w:t>
       </w:r>
       <w:r>
         <w:rPr>
@@ -451,9 +502,14 @@
       <w:r>
         <w:t xml:space="preserve">Type mismatch: cannot convert from String to </w:t>
       </w:r>
+      <w:proofErr w:type="spellStart"/>
       <w:proofErr w:type="gramStart"/>
       <w:r>
-        <w:t>intJava(</w:t>
+        <w:t>intJava</w:t>
+      </w:r>
+      <w:proofErr w:type="spellEnd"/>
+      <w:r>
+        <w:t>(</w:t>
       </w:r>
       <w:proofErr w:type="gramEnd"/>
       <w:r>
@@ -1434,12 +1490,21 @@
         <w:pStyle w:val="ListParagraph"/>
         <w:ind w:left="1854"/>
       </w:pPr>
-      <w:r>
-        <w:rPr>
-          <w:b/>
-          <w:bCs/>
-        </w:rPr>
-        <w:t xml:space="preserve">BigDecimal </w:t>
+      <w:proofErr w:type="spellStart"/>
+      <w:r>
+        <w:rPr>
+          <w:b/>
+          <w:bCs/>
+        </w:rPr>
+        <w:t>BigDecimal</w:t>
+      </w:r>
+      <w:proofErr w:type="spellEnd"/>
+      <w:r>
+        <w:rPr>
+          <w:b/>
+          <w:bCs/>
+        </w:rPr>
+        <w:t xml:space="preserve"> </w:t>
       </w:r>
       <w:r>
         <w:t>stores decimal numbers with arbitrary precision, avoiding the rounding errors that can occur with float and double.</w:t>
@@ -1562,14 +1627,7 @@
           <w:b/>
           <w:bCs/>
         </w:rPr>
-        <w:t>UTF-16</w:t>
-      </w:r>
-      <w:r>
-        <w:rPr>
-          <w:b/>
-          <w:bCs/>
-        </w:rPr>
-        <w:t xml:space="preserve"> Encoding</w:t>
+        <w:t>UTF-16 Encoding</w:t>
       </w:r>
       <w:r>
         <w:rPr>
@@ -1715,31 +1773,7 @@
           <w:bCs/>
           <w:u w:val="single"/>
         </w:rPr>
-        <w:t>D</w:t>
-      </w:r>
-      <w:r>
-        <w:rPr>
-          <w:b/>
-          <w:bCs/>
-          <w:u w:val="single"/>
-        </w:rPr>
-        <w:t xml:space="preserve">ata </w:t>
-      </w:r>
-      <w:r>
-        <w:rPr>
-          <w:b/>
-          <w:bCs/>
-          <w:u w:val="single"/>
-        </w:rPr>
-        <w:t>T</w:t>
-      </w:r>
-      <w:r>
-        <w:rPr>
-          <w:b/>
-          <w:bCs/>
-          <w:u w:val="single"/>
-        </w:rPr>
-        <w:t>ypes default values</w:t>
+        <w:t>Data Types default values</w:t>
       </w:r>
       <w:r>
         <w:rPr>
@@ -1885,6 +1919,39 @@
       <w:r>
         <w:t>Data types that store references (memory addresses) to objects rather than the actual data. Examples include String, arrays, classes, and interfaces.</w:t>
       </w:r>
+      <w:r>
+        <w:t xml:space="preserve"> </w:t>
+      </w:r>
+      <w:r>
+        <w:t>represented</w:t>
+      </w:r>
+      <w:r>
+        <w:t xml:space="preserve"> using a class</w:t>
+      </w:r>
+      <w:r>
+        <w:t xml:space="preserve">, so for every </w:t>
+      </w:r>
+      <w:r>
+        <w:t>primitive</w:t>
+      </w:r>
+      <w:r>
+        <w:t xml:space="preserve"> there is </w:t>
+      </w:r>
+      <w:r>
+        <w:t>class to represented as non-primitive type</w:t>
+      </w:r>
+      <w:r>
+        <w:t>.</w:t>
+      </w:r>
+    </w:p>
+    <w:p>
+      <w:pPr>
+        <w:pStyle w:val="ListParagraph"/>
+        <w:rPr>
+          <w:sz w:val="24"/>
+          <w:szCs w:val="24"/>
+        </w:rPr>
+      </w:pPr>
     </w:p>
     <w:p>
       <w:pPr>
@@ -1931,8 +1998,6 @@
       <w:pPr>
         <w:pStyle w:val="ListParagraph"/>
         <w:rPr>
-          <w:b/>
-          <w:bCs/>
           <w:sz w:val="24"/>
           <w:szCs w:val="24"/>
         </w:rPr>
@@ -1967,19 +2032,3463 @@
       <w:pPr>
         <w:pStyle w:val="ListParagraph"/>
         <w:rPr>
-          <w:b/>
-          <w:bCs/>
-          <w:sz w:val="24"/>
-          <w:szCs w:val="24"/>
-        </w:rPr>
-      </w:pPr>
-      <w:r>
-        <w:rPr>
-          <w:b/>
-          <w:bCs/>
-          <w:sz w:val="24"/>
-          <w:szCs w:val="24"/>
-        </w:rPr>
+          <w:sz w:val="24"/>
+          <w:szCs w:val="24"/>
+        </w:rPr>
+      </w:pPr>
+      <w:r>
+        <w:rPr>
+          <w:sz w:val="24"/>
+          <w:szCs w:val="24"/>
+        </w:rPr>
+        <w:t xml:space="preserve">Strings </w:t>
+      </w:r>
+      <w:r>
+        <w:rPr>
+          <w:sz w:val="24"/>
+          <w:szCs w:val="24"/>
+        </w:rPr>
+        <w:t>not fully primitive, nether non-</w:t>
+      </w:r>
+      <w:r>
+        <w:rPr>
+          <w:sz w:val="24"/>
+          <w:szCs w:val="24"/>
+        </w:rPr>
+        <w:t>primitive</w:t>
+      </w:r>
+      <w:r>
+        <w:rPr>
+          <w:sz w:val="24"/>
+          <w:szCs w:val="24"/>
+        </w:rPr>
+        <w:t xml:space="preserve"> and e</w:t>
+      </w:r>
+      <w:r>
+        <w:rPr>
+          <w:sz w:val="24"/>
+          <w:szCs w:val="24"/>
+        </w:rPr>
+        <w:t>ach string is an object of the String class</w:t>
+      </w:r>
+      <w:r>
+        <w:rPr>
+          <w:sz w:val="24"/>
+          <w:szCs w:val="24"/>
+        </w:rPr>
+        <w:t xml:space="preserve">. </w:t>
+      </w:r>
+    </w:p>
+    <w:p>
+      <w:pPr>
+        <w:pStyle w:val="ListParagraph"/>
+        <w:rPr>
+          <w:sz w:val="24"/>
+          <w:szCs w:val="24"/>
+        </w:rPr>
+      </w:pPr>
+      <w:r>
+        <w:rPr>
+          <w:sz w:val="24"/>
+          <w:szCs w:val="24"/>
+        </w:rPr>
+        <w:t>Java stores strings in two places</w:t>
+      </w:r>
+      <w:r>
+        <w:rPr>
+          <w:sz w:val="24"/>
+          <w:szCs w:val="24"/>
+        </w:rPr>
+        <w:t xml:space="preserve"> in </w:t>
+      </w:r>
+      <w:r>
+        <w:rPr>
+          <w:sz w:val="24"/>
+          <w:szCs w:val="24"/>
+        </w:rPr>
+        <w:t xml:space="preserve">The </w:t>
+      </w:r>
+      <w:r>
+        <w:rPr>
+          <w:b/>
+          <w:bCs/>
+          <w:sz w:val="24"/>
+          <w:szCs w:val="24"/>
+        </w:rPr>
+        <w:t>String Pool</w:t>
+      </w:r>
+      <w:r>
+        <w:rPr>
+          <w:b/>
+          <w:bCs/>
+          <w:sz w:val="24"/>
+          <w:szCs w:val="24"/>
+        </w:rPr>
+        <w:t xml:space="preserve"> </w:t>
+      </w:r>
+      <w:r>
+        <w:rPr>
+          <w:sz w:val="24"/>
+          <w:szCs w:val="24"/>
+        </w:rPr>
+        <w:t xml:space="preserve">or </w:t>
+      </w:r>
+      <w:r>
+        <w:rPr>
+          <w:sz w:val="24"/>
+          <w:szCs w:val="24"/>
+        </w:rPr>
+        <w:t>Heap</w:t>
+      </w:r>
+      <w:r>
+        <w:rPr>
+          <w:sz w:val="24"/>
+          <w:szCs w:val="24"/>
+        </w:rPr>
+        <w:t xml:space="preserve">, </w:t>
+      </w:r>
+      <w:r>
+        <w:rPr>
+          <w:sz w:val="24"/>
+          <w:szCs w:val="24"/>
+        </w:rPr>
+        <w:t>Strings are Immutable</w:t>
+      </w:r>
+      <w:r>
+        <w:rPr>
+          <w:sz w:val="24"/>
+          <w:szCs w:val="24"/>
+        </w:rPr>
+        <w:t xml:space="preserve"> and </w:t>
+      </w:r>
+      <w:r>
+        <w:rPr>
+          <w:sz w:val="24"/>
+          <w:szCs w:val="24"/>
+        </w:rPr>
+        <w:t>e</w:t>
+      </w:r>
+      <w:r>
+        <w:rPr>
+          <w:sz w:val="24"/>
+          <w:szCs w:val="24"/>
+        </w:rPr>
+        <w:t>very Modification Creates a New Object</w:t>
+      </w:r>
+    </w:p>
+    <w:p>
+      <w:pPr>
+        <w:pStyle w:val="ListParagraph"/>
+        <w:rPr>
+          <w:sz w:val="24"/>
+          <w:szCs w:val="24"/>
+        </w:rPr>
+      </w:pPr>
+    </w:p>
+    <w:p>
+      <w:pPr>
+        <w:pStyle w:val="ListParagraph"/>
+        <w:rPr>
+          <w:b/>
+          <w:bCs/>
+          <w:sz w:val="24"/>
+          <w:szCs w:val="24"/>
+        </w:rPr>
+      </w:pPr>
+      <w:r>
+        <w:rPr>
+          <w:b/>
+          <w:bCs/>
+          <w:sz w:val="24"/>
+          <w:szCs w:val="24"/>
+        </w:rPr>
+        <w:t>The String Pool</w:t>
+      </w:r>
+    </w:p>
+    <w:p>
+      <w:pPr>
+        <w:pStyle w:val="ListParagraph"/>
+        <w:rPr>
+          <w:sz w:val="24"/>
+          <w:szCs w:val="24"/>
+        </w:rPr>
+      </w:pPr>
+      <w:r>
+        <w:rPr>
+          <w:sz w:val="24"/>
+          <w:szCs w:val="24"/>
+        </w:rPr>
+        <w:t xml:space="preserve">The </w:t>
+      </w:r>
+      <w:r>
+        <w:rPr>
+          <w:b/>
+          <w:bCs/>
+          <w:sz w:val="24"/>
+          <w:szCs w:val="24"/>
+        </w:rPr>
+        <w:t>String Pool</w:t>
+      </w:r>
+      <w:r>
+        <w:rPr>
+          <w:sz w:val="24"/>
+          <w:szCs w:val="24"/>
+        </w:rPr>
+        <w:t xml:space="preserve"> is a special area of memory where Java stores </w:t>
+      </w:r>
+      <w:r>
+        <w:rPr>
+          <w:b/>
+          <w:bCs/>
+          <w:sz w:val="24"/>
+          <w:szCs w:val="24"/>
+        </w:rPr>
+        <w:t>string literals</w:t>
+      </w:r>
+      <w:r>
+        <w:rPr>
+          <w:sz w:val="24"/>
+          <w:szCs w:val="24"/>
+        </w:rPr>
+        <w:t xml:space="preserve"> (strings written directly in the code). Before creating a new string, Java checks whether the same value already exists in the pool. If it does, Java reuses the existing object instead of creating a new one, which saves memory.</w:t>
+      </w:r>
+    </w:p>
+    <w:p>
+      <w:pPr>
+        <w:pStyle w:val="ListParagraph"/>
+        <w:rPr>
+          <w:sz w:val="24"/>
+          <w:szCs w:val="24"/>
+        </w:rPr>
+      </w:pPr>
+    </w:p>
+    <w:p>
+      <w:pPr>
+        <w:pStyle w:val="ListParagraph"/>
+        <w:rPr>
+          <w:sz w:val="24"/>
+          <w:szCs w:val="24"/>
+        </w:rPr>
+      </w:pPr>
+      <w:r>
+        <w:rPr>
+          <w:sz w:val="24"/>
+          <w:szCs w:val="24"/>
+        </w:rPr>
+        <w:t>when you create a string using a literal, like String name = "Java</w:t>
+      </w:r>
+      <w:proofErr w:type="gramStart"/>
+      <w:r>
+        <w:rPr>
+          <w:sz w:val="24"/>
+          <w:szCs w:val="24"/>
+        </w:rPr>
+        <w:t>";,</w:t>
+      </w:r>
+      <w:proofErr w:type="gramEnd"/>
+      <w:r>
+        <w:rPr>
+          <w:sz w:val="24"/>
+          <w:szCs w:val="24"/>
+        </w:rPr>
+        <w:t xml:space="preserve"> allowing Java to reuse existing string objects and save memory. Java stores strings in the </w:t>
+      </w:r>
+      <w:r>
+        <w:rPr>
+          <w:b/>
+          <w:bCs/>
+          <w:sz w:val="24"/>
+          <w:szCs w:val="24"/>
+        </w:rPr>
+        <w:t>Heap</w:t>
+      </w:r>
+      <w:r>
+        <w:rPr>
+          <w:sz w:val="24"/>
+          <w:szCs w:val="24"/>
+        </w:rPr>
+        <w:t xml:space="preserve"> when you create them using new, like String name = new </w:t>
+      </w:r>
+      <w:proofErr w:type="gramStart"/>
+      <w:r>
+        <w:rPr>
+          <w:sz w:val="24"/>
+          <w:szCs w:val="24"/>
+        </w:rPr>
+        <w:t>String(</w:t>
+      </w:r>
+      <w:proofErr w:type="gramEnd"/>
+      <w:r>
+        <w:rPr>
+          <w:sz w:val="24"/>
+          <w:szCs w:val="24"/>
+        </w:rPr>
+        <w:t>"Java"</w:t>
+      </w:r>
+      <w:proofErr w:type="gramStart"/>
+      <w:r>
+        <w:rPr>
+          <w:sz w:val="24"/>
+          <w:szCs w:val="24"/>
+        </w:rPr>
+        <w:t>);,</w:t>
+      </w:r>
+      <w:proofErr w:type="gramEnd"/>
+      <w:r>
+        <w:rPr>
+          <w:sz w:val="24"/>
+          <w:szCs w:val="24"/>
+        </w:rPr>
+        <w:t xml:space="preserve"> which creates a separate string object even if the same value already exists in the pool.</w:t>
+      </w:r>
+    </w:p>
+    <w:p>
+      <w:pPr>
+        <w:pStyle w:val="ListParagraph"/>
+        <w:rPr>
+          <w:sz w:val="24"/>
+          <w:szCs w:val="24"/>
+        </w:rPr>
+      </w:pPr>
+    </w:p>
+    <w:p>
+      <w:pPr>
+        <w:pStyle w:val="ListParagraph"/>
+        <w:rPr>
+          <w:b/>
+          <w:bCs/>
+          <w:sz w:val="24"/>
+          <w:szCs w:val="24"/>
+        </w:rPr>
+      </w:pPr>
+      <w:r>
+        <w:rPr>
+          <w:b/>
+          <w:bCs/>
+          <w:sz w:val="24"/>
+          <w:szCs w:val="24"/>
+        </w:rPr>
+        <w:lastRenderedPageBreak/>
+        <w:t>StringBuilder</w:t>
+      </w:r>
+    </w:p>
+    <w:p>
+      <w:pPr>
+        <w:pStyle w:val="ListParagraph"/>
+        <w:rPr>
+          <w:sz w:val="24"/>
+          <w:szCs w:val="24"/>
+        </w:rPr>
+      </w:pPr>
+      <w:r>
+        <w:rPr>
+          <w:sz w:val="24"/>
+          <w:szCs w:val="24"/>
+        </w:rPr>
+        <w:t xml:space="preserve">StringBuilder is a </w:t>
+      </w:r>
+      <w:r>
+        <w:rPr>
+          <w:b/>
+          <w:bCs/>
+          <w:sz w:val="24"/>
+          <w:szCs w:val="24"/>
+        </w:rPr>
+        <w:t>mutable</w:t>
+      </w:r>
+      <w:r>
+        <w:rPr>
+          <w:sz w:val="24"/>
+          <w:szCs w:val="24"/>
+        </w:rPr>
+        <w:t xml:space="preserve"> class in Java used to create and modify strings without creating many new objects. Since normal String objects are immutable, every change creates a new object, but StringBuilder changes the same object, making it faster for frequent string modifications.</w:t>
+      </w:r>
+    </w:p>
+    <w:p>
+      <w:pPr>
+        <w:pStyle w:val="ListParagraph"/>
+        <w:rPr>
+          <w:sz w:val="24"/>
+          <w:szCs w:val="24"/>
+        </w:rPr>
+      </w:pPr>
+    </w:p>
+    <w:p>
+      <w:pPr>
+        <w:pStyle w:val="ListParagraph"/>
+        <w:rPr>
+          <w:b/>
+          <w:bCs/>
+          <w:sz w:val="24"/>
+          <w:szCs w:val="24"/>
+        </w:rPr>
+      </w:pPr>
+      <w:proofErr w:type="spellStart"/>
+      <w:r>
+        <w:rPr>
+          <w:b/>
+          <w:bCs/>
+          <w:sz w:val="24"/>
+          <w:szCs w:val="24"/>
+        </w:rPr>
+        <w:t>StringBuffer</w:t>
+      </w:r>
+      <w:proofErr w:type="spellEnd"/>
+    </w:p>
+    <w:p>
+      <w:pPr>
+        <w:pStyle w:val="ListParagraph"/>
+        <w:rPr>
+          <w:sz w:val="24"/>
+          <w:szCs w:val="24"/>
+        </w:rPr>
+      </w:pPr>
+      <w:proofErr w:type="spellStart"/>
+      <w:r>
+        <w:rPr>
+          <w:sz w:val="24"/>
+          <w:szCs w:val="24"/>
+        </w:rPr>
+        <w:t>StringBuffer</w:t>
+      </w:r>
+      <w:proofErr w:type="spellEnd"/>
+      <w:r>
+        <w:rPr>
+          <w:sz w:val="24"/>
+          <w:szCs w:val="24"/>
+        </w:rPr>
+        <w:t xml:space="preserve"> is similar to StringBuilder because it also allows strings to be modified without creating new objects. The difference is that </w:t>
+      </w:r>
+      <w:proofErr w:type="spellStart"/>
+      <w:r>
+        <w:rPr>
+          <w:sz w:val="24"/>
+          <w:szCs w:val="24"/>
+        </w:rPr>
+        <w:t>StringBuffer</w:t>
+      </w:r>
+      <w:proofErr w:type="spellEnd"/>
+      <w:r>
+        <w:rPr>
+          <w:sz w:val="24"/>
+          <w:szCs w:val="24"/>
+        </w:rPr>
+        <w:t xml:space="preserve"> is </w:t>
+      </w:r>
+      <w:r>
+        <w:rPr>
+          <w:b/>
+          <w:bCs/>
+          <w:sz w:val="24"/>
+          <w:szCs w:val="24"/>
+        </w:rPr>
+        <w:t>thread-safe</w:t>
+      </w:r>
+      <w:r>
+        <w:rPr>
+          <w:sz w:val="24"/>
+          <w:szCs w:val="24"/>
+        </w:rPr>
+        <w:t xml:space="preserve"> because its methods are synchronized, making it safer when multiple threads access the same object, but slightly slower than StringBuilder.</w:t>
+      </w:r>
+    </w:p>
+    <w:p>
+      <w:pPr>
+        <w:pStyle w:val="ListParagraph"/>
+        <w:rPr>
+          <w:b/>
+          <w:bCs/>
+          <w:sz w:val="24"/>
+          <w:szCs w:val="24"/>
+        </w:rPr>
+      </w:pPr>
+    </w:p>
+    <w:p>
+      <w:pPr>
+        <w:pStyle w:val="ListParagraph"/>
+        <w:rPr>
+          <w:b/>
+          <w:bCs/>
+          <w:sz w:val="24"/>
+          <w:szCs w:val="24"/>
+        </w:rPr>
+      </w:pPr>
+      <w:r>
+        <w:rPr>
+          <w:b/>
+          <w:bCs/>
+          <w:sz w:val="24"/>
+          <w:szCs w:val="24"/>
+        </w:rPr>
+        <w:t>Common String Methods</w:t>
+      </w:r>
+    </w:p>
+    <w:p>
+      <w:pPr>
+        <w:pStyle w:val="ListParagraph"/>
+        <w:rPr>
+          <w:sz w:val="24"/>
+          <w:szCs w:val="24"/>
+        </w:rPr>
+      </w:pPr>
+    </w:p>
+    <w:tbl>
+      <w:tblPr>
+        <w:tblStyle w:val="PlainTable1"/>
+        <w:tblW w:w="0" w:type="auto"/>
+        <w:tblLook w:val="04A0" w:firstRow="1" w:lastRow="0" w:firstColumn="1" w:lastColumn="0" w:noHBand="0" w:noVBand="1"/>
+      </w:tblPr>
+      <w:tblGrid>
+        <w:gridCol w:w="2328"/>
+        <w:gridCol w:w="2466"/>
+        <w:gridCol w:w="3389"/>
+        <w:gridCol w:w="1588"/>
+      </w:tblGrid>
+      <w:tr>
+        <w:trPr>
+          <w:cnfStyle w:val="100000000000" w:firstRow="1" w:lastRow="0" w:firstColumn="0" w:lastColumn="0" w:oddVBand="0" w:evenVBand="0" w:oddHBand="0" w:evenHBand="0" w:firstRowFirstColumn="0" w:firstRowLastColumn="0" w:lastRowFirstColumn="0" w:lastRowLastColumn="0"/>
+        </w:trPr>
+        <w:tc>
+          <w:tcPr>
+            <w:cnfStyle w:val="001000000000" w:firstRow="0" w:lastRow="0" w:firstColumn="1" w:lastColumn="0" w:oddVBand="0" w:evenVBand="0" w:oddHBand="0" w:evenHBand="0" w:firstRowFirstColumn="0" w:firstRowLastColumn="0" w:lastRowFirstColumn="0" w:lastRowLastColumn="0"/>
+            <w:tcW w:w="0" w:type="auto"/>
+            <w:hideMark/>
+          </w:tcPr>
+          <w:p>
+            <w:pPr>
+              <w:pStyle w:val="ListParagraph"/>
+              <w:spacing w:after="160" w:line="259" w:lineRule="auto"/>
+              <w:rPr>
+                <w:sz w:val="24"/>
+                <w:szCs w:val="24"/>
+              </w:rPr>
+            </w:pPr>
+            <w:r>
+              <w:rPr>
+                <w:sz w:val="24"/>
+                <w:szCs w:val="24"/>
+              </w:rPr>
+              <w:t>Method</w:t>
+            </w:r>
+          </w:p>
+        </w:tc>
+        <w:tc>
+          <w:tcPr>
+            <w:tcW w:w="2466" w:type="dxa"/>
+            <w:hideMark/>
+          </w:tcPr>
+          <w:p>
+            <w:pPr>
+              <w:pStyle w:val="ListParagraph"/>
+              <w:spacing w:after="160" w:line="259" w:lineRule="auto"/>
+              <w:cnfStyle w:val="100000000000" w:firstRow="1" w:lastRow="0" w:firstColumn="0" w:lastColumn="0" w:oddVBand="0" w:evenVBand="0" w:oddHBand="0" w:evenHBand="0" w:firstRowFirstColumn="0" w:firstRowLastColumn="0" w:lastRowFirstColumn="0" w:lastRowLastColumn="0"/>
+              <w:rPr>
+                <w:sz w:val="24"/>
+                <w:szCs w:val="24"/>
+              </w:rPr>
+            </w:pPr>
+            <w:r>
+              <w:rPr>
+                <w:sz w:val="24"/>
+                <w:szCs w:val="24"/>
+              </w:rPr>
+              <w:t>Description</w:t>
+            </w:r>
+          </w:p>
+        </w:tc>
+        <w:tc>
+          <w:tcPr>
+            <w:tcW w:w="3848" w:type="dxa"/>
+            <w:hideMark/>
+          </w:tcPr>
+          <w:p>
+            <w:pPr>
+              <w:pStyle w:val="ListParagraph"/>
+              <w:spacing w:after="160" w:line="259" w:lineRule="auto"/>
+              <w:cnfStyle w:val="100000000000" w:firstRow="1" w:lastRow="0" w:firstColumn="0" w:lastColumn="0" w:oddVBand="0" w:evenVBand="0" w:oddHBand="0" w:evenHBand="0" w:firstRowFirstColumn="0" w:firstRowLastColumn="0" w:lastRowFirstColumn="0" w:lastRowLastColumn="0"/>
+              <w:rPr>
+                <w:sz w:val="24"/>
+                <w:szCs w:val="24"/>
+              </w:rPr>
+            </w:pPr>
+            <w:r>
+              <w:rPr>
+                <w:sz w:val="24"/>
+                <w:szCs w:val="24"/>
+              </w:rPr>
+              <w:t>Example</w:t>
+            </w:r>
+          </w:p>
+        </w:tc>
+        <w:tc>
+          <w:tcPr>
+            <w:tcW w:w="1129" w:type="dxa"/>
+            <w:hideMark/>
+          </w:tcPr>
+          <w:p>
+            <w:pPr>
+              <w:pStyle w:val="ListParagraph"/>
+              <w:spacing w:after="160" w:line="259" w:lineRule="auto"/>
+              <w:cnfStyle w:val="100000000000" w:firstRow="1" w:lastRow="0" w:firstColumn="0" w:lastColumn="0" w:oddVBand="0" w:evenVBand="0" w:oddHBand="0" w:evenHBand="0" w:firstRowFirstColumn="0" w:firstRowLastColumn="0" w:lastRowFirstColumn="0" w:lastRowLastColumn="0"/>
+              <w:rPr>
+                <w:sz w:val="24"/>
+                <w:szCs w:val="24"/>
+              </w:rPr>
+            </w:pPr>
+            <w:r>
+              <w:rPr>
+                <w:sz w:val="24"/>
+                <w:szCs w:val="24"/>
+              </w:rPr>
+              <w:t>Output</w:t>
+            </w:r>
+          </w:p>
+        </w:tc>
+      </w:tr>
+      <w:tr>
+        <w:trPr>
+          <w:cnfStyle w:val="000000100000" w:firstRow="0" w:lastRow="0" w:firstColumn="0" w:lastColumn="0" w:oddVBand="0" w:evenVBand="0" w:oddHBand="1" w:evenHBand="0" w:firstRowFirstColumn="0" w:firstRowLastColumn="0" w:lastRowFirstColumn="0" w:lastRowLastColumn="0"/>
+        </w:trPr>
+        <w:tc>
+          <w:tcPr>
+            <w:cnfStyle w:val="001000000000" w:firstRow="0" w:lastRow="0" w:firstColumn="1" w:lastColumn="0" w:oddVBand="0" w:evenVBand="0" w:oddHBand="0" w:evenHBand="0" w:firstRowFirstColumn="0" w:firstRowLastColumn="0" w:lastRowFirstColumn="0" w:lastRowLastColumn="0"/>
+            <w:tcW w:w="0" w:type="auto"/>
+            <w:hideMark/>
+          </w:tcPr>
+          <w:p>
+            <w:pPr>
+              <w:pStyle w:val="ListParagraph"/>
+              <w:spacing w:after="160" w:line="259" w:lineRule="auto"/>
+              <w:rPr>
+                <w:sz w:val="24"/>
+                <w:szCs w:val="24"/>
+              </w:rPr>
+            </w:pPr>
+            <w:proofErr w:type="gramStart"/>
+            <w:r>
+              <w:rPr>
+                <w:sz w:val="24"/>
+                <w:szCs w:val="24"/>
+              </w:rPr>
+              <w:t>length(</w:t>
+            </w:r>
+            <w:proofErr w:type="gramEnd"/>
+            <w:r>
+              <w:rPr>
+                <w:sz w:val="24"/>
+                <w:szCs w:val="24"/>
+              </w:rPr>
+              <w:t>)</w:t>
+            </w:r>
+          </w:p>
+        </w:tc>
+        <w:tc>
+          <w:tcPr>
+            <w:tcW w:w="2466" w:type="dxa"/>
+            <w:hideMark/>
+          </w:tcPr>
+          <w:p>
+            <w:pPr>
+              <w:pStyle w:val="ListParagraph"/>
+              <w:spacing w:after="160" w:line="259" w:lineRule="auto"/>
+              <w:cnfStyle w:val="000000100000" w:firstRow="0" w:lastRow="0" w:firstColumn="0" w:lastColumn="0" w:oddVBand="0" w:evenVBand="0" w:oddHBand="1" w:evenHBand="0" w:firstRowFirstColumn="0" w:firstRowLastColumn="0" w:lastRowFirstColumn="0" w:lastRowLastColumn="0"/>
+              <w:rPr>
+                <w:sz w:val="24"/>
+                <w:szCs w:val="24"/>
+              </w:rPr>
+            </w:pPr>
+            <w:r>
+              <w:rPr>
+                <w:sz w:val="24"/>
+                <w:szCs w:val="24"/>
+              </w:rPr>
+              <w:t>Returns the number of characters in a string</w:t>
+            </w:r>
+          </w:p>
+        </w:tc>
+        <w:tc>
+          <w:tcPr>
+            <w:tcW w:w="3848" w:type="dxa"/>
+            <w:hideMark/>
+          </w:tcPr>
+          <w:p>
+            <w:pPr>
+              <w:pStyle w:val="ListParagraph"/>
+              <w:spacing w:after="160" w:line="259" w:lineRule="auto"/>
+              <w:cnfStyle w:val="000000100000" w:firstRow="0" w:lastRow="0" w:firstColumn="0" w:lastColumn="0" w:oddVBand="0" w:evenVBand="0" w:oddHBand="1" w:evenHBand="0" w:firstRowFirstColumn="0" w:firstRowLastColumn="0" w:lastRowFirstColumn="0" w:lastRowLastColumn="0"/>
+              <w:rPr>
+                <w:sz w:val="24"/>
+                <w:szCs w:val="24"/>
+              </w:rPr>
+            </w:pPr>
+            <w:r>
+              <w:rPr>
+                <w:sz w:val="24"/>
+                <w:szCs w:val="24"/>
+              </w:rPr>
+              <w:t>"</w:t>
+            </w:r>
+            <w:proofErr w:type="spellStart"/>
+            <w:r>
+              <w:rPr>
+                <w:sz w:val="24"/>
+                <w:szCs w:val="24"/>
+              </w:rPr>
+              <w:t>Java</w:t>
+            </w:r>
+            <w:proofErr w:type="gramStart"/>
+            <w:r>
+              <w:rPr>
+                <w:sz w:val="24"/>
+                <w:szCs w:val="24"/>
+              </w:rPr>
+              <w:t>".length</w:t>
+            </w:r>
+            <w:proofErr w:type="spellEnd"/>
+            <w:proofErr w:type="gramEnd"/>
+            <w:r>
+              <w:rPr>
+                <w:sz w:val="24"/>
+                <w:szCs w:val="24"/>
+              </w:rPr>
+              <w:t>()</w:t>
+            </w:r>
+          </w:p>
+        </w:tc>
+        <w:tc>
+          <w:tcPr>
+            <w:tcW w:w="1129" w:type="dxa"/>
+            <w:hideMark/>
+          </w:tcPr>
+          <w:p>
+            <w:pPr>
+              <w:pStyle w:val="ListParagraph"/>
+              <w:spacing w:after="160" w:line="259" w:lineRule="auto"/>
+              <w:cnfStyle w:val="000000100000" w:firstRow="0" w:lastRow="0" w:firstColumn="0" w:lastColumn="0" w:oddVBand="0" w:evenVBand="0" w:oddHBand="1" w:evenHBand="0" w:firstRowFirstColumn="0" w:firstRowLastColumn="0" w:lastRowFirstColumn="0" w:lastRowLastColumn="0"/>
+              <w:rPr>
+                <w:sz w:val="24"/>
+                <w:szCs w:val="24"/>
+              </w:rPr>
+            </w:pPr>
+            <w:r>
+              <w:rPr>
+                <w:sz w:val="24"/>
+                <w:szCs w:val="24"/>
+              </w:rPr>
+              <w:t>4</w:t>
+            </w:r>
+          </w:p>
+        </w:tc>
+      </w:tr>
+      <w:tr>
+        <w:tc>
+          <w:tcPr>
+            <w:cnfStyle w:val="001000000000" w:firstRow="0" w:lastRow="0" w:firstColumn="1" w:lastColumn="0" w:oddVBand="0" w:evenVBand="0" w:oddHBand="0" w:evenHBand="0" w:firstRowFirstColumn="0" w:firstRowLastColumn="0" w:lastRowFirstColumn="0" w:lastRowLastColumn="0"/>
+            <w:tcW w:w="0" w:type="auto"/>
+            <w:hideMark/>
+          </w:tcPr>
+          <w:p>
+            <w:pPr>
+              <w:pStyle w:val="ListParagraph"/>
+              <w:spacing w:after="160" w:line="259" w:lineRule="auto"/>
+              <w:rPr>
+                <w:sz w:val="24"/>
+                <w:szCs w:val="24"/>
+              </w:rPr>
+            </w:pPr>
+            <w:proofErr w:type="spellStart"/>
+            <w:r>
+              <w:rPr>
+                <w:sz w:val="24"/>
+                <w:szCs w:val="24"/>
+              </w:rPr>
+              <w:t>charAt</w:t>
+            </w:r>
+            <w:proofErr w:type="spellEnd"/>
+            <w:r>
+              <w:rPr>
+                <w:sz w:val="24"/>
+                <w:szCs w:val="24"/>
+              </w:rPr>
+              <w:t>(index)</w:t>
+            </w:r>
+          </w:p>
+        </w:tc>
+        <w:tc>
+          <w:tcPr>
+            <w:tcW w:w="2466" w:type="dxa"/>
+            <w:hideMark/>
+          </w:tcPr>
+          <w:p>
+            <w:pPr>
+              <w:pStyle w:val="ListParagraph"/>
+              <w:spacing w:after="160" w:line="259" w:lineRule="auto"/>
+              <w:cnfStyle w:val="000000000000" w:firstRow="0" w:lastRow="0" w:firstColumn="0" w:lastColumn="0" w:oddVBand="0" w:evenVBand="0" w:oddHBand="0" w:evenHBand="0" w:firstRowFirstColumn="0" w:firstRowLastColumn="0" w:lastRowFirstColumn="0" w:lastRowLastColumn="0"/>
+              <w:rPr>
+                <w:sz w:val="24"/>
+                <w:szCs w:val="24"/>
+              </w:rPr>
+            </w:pPr>
+            <w:r>
+              <w:rPr>
+                <w:sz w:val="24"/>
+                <w:szCs w:val="24"/>
+              </w:rPr>
+              <w:t>Returns the character at a specific position</w:t>
+            </w:r>
+          </w:p>
+        </w:tc>
+        <w:tc>
+          <w:tcPr>
+            <w:tcW w:w="3848" w:type="dxa"/>
+            <w:hideMark/>
+          </w:tcPr>
+          <w:p>
+            <w:pPr>
+              <w:pStyle w:val="ListParagraph"/>
+              <w:spacing w:after="160" w:line="259" w:lineRule="auto"/>
+              <w:cnfStyle w:val="000000000000" w:firstRow="0" w:lastRow="0" w:firstColumn="0" w:lastColumn="0" w:oddVBand="0" w:evenVBand="0" w:oddHBand="0" w:evenHBand="0" w:firstRowFirstColumn="0" w:firstRowLastColumn="0" w:lastRowFirstColumn="0" w:lastRowLastColumn="0"/>
+              <w:rPr>
+                <w:sz w:val="24"/>
+                <w:szCs w:val="24"/>
+              </w:rPr>
+            </w:pPr>
+            <w:r>
+              <w:rPr>
+                <w:sz w:val="24"/>
+                <w:szCs w:val="24"/>
+              </w:rPr>
+              <w:t>"Java</w:t>
+            </w:r>
+            <w:proofErr w:type="gramStart"/>
+            <w:r>
+              <w:rPr>
+                <w:sz w:val="24"/>
+                <w:szCs w:val="24"/>
+              </w:rPr>
+              <w:t>".</w:t>
+            </w:r>
+            <w:proofErr w:type="spellStart"/>
+            <w:r>
+              <w:rPr>
+                <w:sz w:val="24"/>
+                <w:szCs w:val="24"/>
+              </w:rPr>
+              <w:t>charAt</w:t>
+            </w:r>
+            <w:proofErr w:type="spellEnd"/>
+            <w:proofErr w:type="gramEnd"/>
+            <w:r>
+              <w:rPr>
+                <w:sz w:val="24"/>
+                <w:szCs w:val="24"/>
+              </w:rPr>
+              <w:t>(2)</w:t>
+            </w:r>
+          </w:p>
+        </w:tc>
+        <w:tc>
+          <w:tcPr>
+            <w:tcW w:w="1129" w:type="dxa"/>
+            <w:hideMark/>
+          </w:tcPr>
+          <w:p>
+            <w:pPr>
+              <w:pStyle w:val="ListParagraph"/>
+              <w:spacing w:after="160" w:line="259" w:lineRule="auto"/>
+              <w:cnfStyle w:val="000000000000" w:firstRow="0" w:lastRow="0" w:firstColumn="0" w:lastColumn="0" w:oddVBand="0" w:evenVBand="0" w:oddHBand="0" w:evenHBand="0" w:firstRowFirstColumn="0" w:firstRowLastColumn="0" w:lastRowFirstColumn="0" w:lastRowLastColumn="0"/>
+              <w:rPr>
+                <w:sz w:val="24"/>
+                <w:szCs w:val="24"/>
+              </w:rPr>
+            </w:pPr>
+            <w:r>
+              <w:rPr>
+                <w:sz w:val="24"/>
+                <w:szCs w:val="24"/>
+              </w:rPr>
+              <w:t>v</w:t>
+            </w:r>
+          </w:p>
+        </w:tc>
+      </w:tr>
+      <w:tr>
+        <w:trPr>
+          <w:cnfStyle w:val="000000100000" w:firstRow="0" w:lastRow="0" w:firstColumn="0" w:lastColumn="0" w:oddVBand="0" w:evenVBand="0" w:oddHBand="1" w:evenHBand="0" w:firstRowFirstColumn="0" w:firstRowLastColumn="0" w:lastRowFirstColumn="0" w:lastRowLastColumn="0"/>
+        </w:trPr>
+        <w:tc>
+          <w:tcPr>
+            <w:cnfStyle w:val="001000000000" w:firstRow="0" w:lastRow="0" w:firstColumn="1" w:lastColumn="0" w:oddVBand="0" w:evenVBand="0" w:oddHBand="0" w:evenHBand="0" w:firstRowFirstColumn="0" w:firstRowLastColumn="0" w:lastRowFirstColumn="0" w:lastRowLastColumn="0"/>
+            <w:tcW w:w="0" w:type="auto"/>
+            <w:hideMark/>
+          </w:tcPr>
+          <w:p>
+            <w:pPr>
+              <w:pStyle w:val="ListParagraph"/>
+              <w:spacing w:after="160" w:line="259" w:lineRule="auto"/>
+              <w:rPr>
+                <w:sz w:val="24"/>
+                <w:szCs w:val="24"/>
+              </w:rPr>
+            </w:pPr>
+            <w:r>
+              <w:rPr>
+                <w:sz w:val="24"/>
+                <w:szCs w:val="24"/>
+              </w:rPr>
+              <w:t>substring(start)</w:t>
+            </w:r>
+          </w:p>
+        </w:tc>
+        <w:tc>
+          <w:tcPr>
+            <w:tcW w:w="2466" w:type="dxa"/>
+            <w:hideMark/>
+          </w:tcPr>
+          <w:p>
+            <w:pPr>
+              <w:pStyle w:val="ListParagraph"/>
+              <w:spacing w:after="160" w:line="259" w:lineRule="auto"/>
+              <w:cnfStyle w:val="000000100000" w:firstRow="0" w:lastRow="0" w:firstColumn="0" w:lastColumn="0" w:oddVBand="0" w:evenVBand="0" w:oddHBand="1" w:evenHBand="0" w:firstRowFirstColumn="0" w:firstRowLastColumn="0" w:lastRowFirstColumn="0" w:lastRowLastColumn="0"/>
+              <w:rPr>
+                <w:sz w:val="24"/>
+                <w:szCs w:val="24"/>
+              </w:rPr>
+            </w:pPr>
+            <w:r>
+              <w:rPr>
+                <w:sz w:val="24"/>
+                <w:szCs w:val="24"/>
+              </w:rPr>
+              <w:t>Returns part of a string from the given index</w:t>
+            </w:r>
+          </w:p>
+        </w:tc>
+        <w:tc>
+          <w:tcPr>
+            <w:tcW w:w="3848" w:type="dxa"/>
+            <w:hideMark/>
+          </w:tcPr>
+          <w:p>
+            <w:pPr>
+              <w:pStyle w:val="ListParagraph"/>
+              <w:spacing w:after="160" w:line="259" w:lineRule="auto"/>
+              <w:cnfStyle w:val="000000100000" w:firstRow="0" w:lastRow="0" w:firstColumn="0" w:lastColumn="0" w:oddVBand="0" w:evenVBand="0" w:oddHBand="1" w:evenHBand="0" w:firstRowFirstColumn="0" w:firstRowLastColumn="0" w:lastRowFirstColumn="0" w:lastRowLastColumn="0"/>
+              <w:rPr>
+                <w:sz w:val="24"/>
+                <w:szCs w:val="24"/>
+              </w:rPr>
+            </w:pPr>
+            <w:r>
+              <w:rPr>
+                <w:sz w:val="24"/>
+                <w:szCs w:val="24"/>
+              </w:rPr>
+              <w:t>"</w:t>
+            </w:r>
+            <w:proofErr w:type="spellStart"/>
+            <w:r>
+              <w:rPr>
+                <w:sz w:val="24"/>
+                <w:szCs w:val="24"/>
+              </w:rPr>
+              <w:t>Programming</w:t>
+            </w:r>
+            <w:proofErr w:type="gramStart"/>
+            <w:r>
+              <w:rPr>
+                <w:sz w:val="24"/>
+                <w:szCs w:val="24"/>
+              </w:rPr>
+              <w:t>".substring</w:t>
+            </w:r>
+            <w:proofErr w:type="spellEnd"/>
+            <w:proofErr w:type="gramEnd"/>
+            <w:r>
+              <w:rPr>
+                <w:sz w:val="24"/>
+                <w:szCs w:val="24"/>
+              </w:rPr>
+              <w:t>(3)</w:t>
+            </w:r>
+          </w:p>
+        </w:tc>
+        <w:tc>
+          <w:tcPr>
+            <w:tcW w:w="1129" w:type="dxa"/>
+            <w:hideMark/>
+          </w:tcPr>
+          <w:p>
+            <w:pPr>
+              <w:pStyle w:val="ListParagraph"/>
+              <w:spacing w:after="160" w:line="259" w:lineRule="auto"/>
+              <w:cnfStyle w:val="000000100000" w:firstRow="0" w:lastRow="0" w:firstColumn="0" w:lastColumn="0" w:oddVBand="0" w:evenVBand="0" w:oddHBand="1" w:evenHBand="0" w:firstRowFirstColumn="0" w:firstRowLastColumn="0" w:lastRowFirstColumn="0" w:lastRowLastColumn="0"/>
+              <w:rPr>
+                <w:sz w:val="24"/>
+                <w:szCs w:val="24"/>
+              </w:rPr>
+            </w:pPr>
+            <w:proofErr w:type="spellStart"/>
+            <w:r>
+              <w:rPr>
+                <w:sz w:val="24"/>
+                <w:szCs w:val="24"/>
+              </w:rPr>
+              <w:t>gramming</w:t>
+            </w:r>
+            <w:proofErr w:type="spellEnd"/>
+          </w:p>
+        </w:tc>
+      </w:tr>
+      <w:tr>
+        <w:tc>
+          <w:tcPr>
+            <w:cnfStyle w:val="001000000000" w:firstRow="0" w:lastRow="0" w:firstColumn="1" w:lastColumn="0" w:oddVBand="0" w:evenVBand="0" w:oddHBand="0" w:evenHBand="0" w:firstRowFirstColumn="0" w:firstRowLastColumn="0" w:lastRowFirstColumn="0" w:lastRowLastColumn="0"/>
+            <w:tcW w:w="0" w:type="auto"/>
+            <w:hideMark/>
+          </w:tcPr>
+          <w:p>
+            <w:pPr>
+              <w:pStyle w:val="ListParagraph"/>
+              <w:spacing w:after="160" w:line="259" w:lineRule="auto"/>
+              <w:rPr>
+                <w:sz w:val="24"/>
+                <w:szCs w:val="24"/>
+              </w:rPr>
+            </w:pPr>
+            <w:proofErr w:type="gramStart"/>
+            <w:r>
+              <w:rPr>
+                <w:sz w:val="24"/>
+                <w:szCs w:val="24"/>
+              </w:rPr>
+              <w:t>substring(</w:t>
+            </w:r>
+            <w:proofErr w:type="gramEnd"/>
+            <w:r>
+              <w:rPr>
+                <w:sz w:val="24"/>
+                <w:szCs w:val="24"/>
+              </w:rPr>
+              <w:t>start, end)</w:t>
+            </w:r>
+          </w:p>
+        </w:tc>
+        <w:tc>
+          <w:tcPr>
+            <w:tcW w:w="2466" w:type="dxa"/>
+            <w:hideMark/>
+          </w:tcPr>
+          <w:p>
+            <w:pPr>
+              <w:pStyle w:val="ListParagraph"/>
+              <w:spacing w:after="160" w:line="259" w:lineRule="auto"/>
+              <w:cnfStyle w:val="000000000000" w:firstRow="0" w:lastRow="0" w:firstColumn="0" w:lastColumn="0" w:oddVBand="0" w:evenVBand="0" w:oddHBand="0" w:evenHBand="0" w:firstRowFirstColumn="0" w:firstRowLastColumn="0" w:lastRowFirstColumn="0" w:lastRowLastColumn="0"/>
+              <w:rPr>
+                <w:sz w:val="24"/>
+                <w:szCs w:val="24"/>
+              </w:rPr>
+            </w:pPr>
+            <w:r>
+              <w:rPr>
+                <w:sz w:val="24"/>
+                <w:szCs w:val="24"/>
+              </w:rPr>
+              <w:t>Returns characters between two indexes</w:t>
+            </w:r>
+          </w:p>
+        </w:tc>
+        <w:tc>
+          <w:tcPr>
+            <w:tcW w:w="3848" w:type="dxa"/>
+            <w:hideMark/>
+          </w:tcPr>
+          <w:p>
+            <w:pPr>
+              <w:pStyle w:val="ListParagraph"/>
+              <w:spacing w:after="160" w:line="259" w:lineRule="auto"/>
+              <w:cnfStyle w:val="000000000000" w:firstRow="0" w:lastRow="0" w:firstColumn="0" w:lastColumn="0" w:oddVBand="0" w:evenVBand="0" w:oddHBand="0" w:evenHBand="0" w:firstRowFirstColumn="0" w:firstRowLastColumn="0" w:lastRowFirstColumn="0" w:lastRowLastColumn="0"/>
+              <w:rPr>
+                <w:sz w:val="24"/>
+                <w:szCs w:val="24"/>
+              </w:rPr>
+            </w:pPr>
+            <w:r>
+              <w:rPr>
+                <w:sz w:val="24"/>
+                <w:szCs w:val="24"/>
+              </w:rPr>
+              <w:t>"</w:t>
+            </w:r>
+            <w:proofErr w:type="spellStart"/>
+            <w:r>
+              <w:rPr>
+                <w:sz w:val="24"/>
+                <w:szCs w:val="24"/>
+              </w:rPr>
+              <w:t>Programming</w:t>
+            </w:r>
+            <w:proofErr w:type="gramStart"/>
+            <w:r>
+              <w:rPr>
+                <w:sz w:val="24"/>
+                <w:szCs w:val="24"/>
+              </w:rPr>
+              <w:t>".substring</w:t>
+            </w:r>
+            <w:proofErr w:type="spellEnd"/>
+            <w:proofErr w:type="gramEnd"/>
+            <w:r>
+              <w:rPr>
+                <w:sz w:val="24"/>
+                <w:szCs w:val="24"/>
+              </w:rPr>
+              <w:t>(3,7)</w:t>
+            </w:r>
+          </w:p>
+        </w:tc>
+        <w:tc>
+          <w:tcPr>
+            <w:tcW w:w="1129" w:type="dxa"/>
+            <w:hideMark/>
+          </w:tcPr>
+          <w:p>
+            <w:pPr>
+              <w:pStyle w:val="ListParagraph"/>
+              <w:spacing w:after="160" w:line="259" w:lineRule="auto"/>
+              <w:cnfStyle w:val="000000000000" w:firstRow="0" w:lastRow="0" w:firstColumn="0" w:lastColumn="0" w:oddVBand="0" w:evenVBand="0" w:oddHBand="0" w:evenHBand="0" w:firstRowFirstColumn="0" w:firstRowLastColumn="0" w:lastRowFirstColumn="0" w:lastRowLastColumn="0"/>
+              <w:rPr>
+                <w:sz w:val="24"/>
+                <w:szCs w:val="24"/>
+              </w:rPr>
+            </w:pPr>
+            <w:r>
+              <w:rPr>
+                <w:sz w:val="24"/>
+                <w:szCs w:val="24"/>
+              </w:rPr>
+              <w:t>gram</w:t>
+            </w:r>
+          </w:p>
+        </w:tc>
+      </w:tr>
+      <w:tr>
+        <w:trPr>
+          <w:cnfStyle w:val="000000100000" w:firstRow="0" w:lastRow="0" w:firstColumn="0" w:lastColumn="0" w:oddVBand="0" w:evenVBand="0" w:oddHBand="1" w:evenHBand="0" w:firstRowFirstColumn="0" w:firstRowLastColumn="0" w:lastRowFirstColumn="0" w:lastRowLastColumn="0"/>
+        </w:trPr>
+        <w:tc>
+          <w:tcPr>
+            <w:cnfStyle w:val="001000000000" w:firstRow="0" w:lastRow="0" w:firstColumn="1" w:lastColumn="0" w:oddVBand="0" w:evenVBand="0" w:oddHBand="0" w:evenHBand="0" w:firstRowFirstColumn="0" w:firstRowLastColumn="0" w:lastRowFirstColumn="0" w:lastRowLastColumn="0"/>
+            <w:tcW w:w="0" w:type="auto"/>
+            <w:hideMark/>
+          </w:tcPr>
+          <w:p>
+            <w:pPr>
+              <w:pStyle w:val="ListParagraph"/>
+              <w:spacing w:after="160" w:line="259" w:lineRule="auto"/>
+              <w:rPr>
+                <w:sz w:val="24"/>
+                <w:szCs w:val="24"/>
+              </w:rPr>
+            </w:pPr>
+            <w:proofErr w:type="spellStart"/>
+            <w:proofErr w:type="gramStart"/>
+            <w:r>
+              <w:rPr>
+                <w:sz w:val="24"/>
+                <w:szCs w:val="24"/>
+              </w:rPr>
+              <w:t>toUpperCase</w:t>
+            </w:r>
+            <w:proofErr w:type="spellEnd"/>
+            <w:r>
+              <w:rPr>
+                <w:sz w:val="24"/>
+                <w:szCs w:val="24"/>
+              </w:rPr>
+              <w:t>(</w:t>
+            </w:r>
+            <w:proofErr w:type="gramEnd"/>
+            <w:r>
+              <w:rPr>
+                <w:sz w:val="24"/>
+                <w:szCs w:val="24"/>
+              </w:rPr>
+              <w:t>)</w:t>
+            </w:r>
+          </w:p>
+        </w:tc>
+        <w:tc>
+          <w:tcPr>
+            <w:tcW w:w="2466" w:type="dxa"/>
+            <w:hideMark/>
+          </w:tcPr>
+          <w:p>
+            <w:pPr>
+              <w:pStyle w:val="ListParagraph"/>
+              <w:spacing w:after="160" w:line="259" w:lineRule="auto"/>
+              <w:cnfStyle w:val="000000100000" w:firstRow="0" w:lastRow="0" w:firstColumn="0" w:lastColumn="0" w:oddVBand="0" w:evenVBand="0" w:oddHBand="1" w:evenHBand="0" w:firstRowFirstColumn="0" w:firstRowLastColumn="0" w:lastRowFirstColumn="0" w:lastRowLastColumn="0"/>
+              <w:rPr>
+                <w:sz w:val="24"/>
+                <w:szCs w:val="24"/>
+              </w:rPr>
+            </w:pPr>
+            <w:r>
+              <w:rPr>
+                <w:sz w:val="24"/>
+                <w:szCs w:val="24"/>
+              </w:rPr>
+              <w:t>Converts all characters to uppercase</w:t>
+            </w:r>
+          </w:p>
+        </w:tc>
+        <w:tc>
+          <w:tcPr>
+            <w:tcW w:w="3848" w:type="dxa"/>
+            <w:hideMark/>
+          </w:tcPr>
+          <w:p>
+            <w:pPr>
+              <w:pStyle w:val="ListParagraph"/>
+              <w:spacing w:after="160" w:line="259" w:lineRule="auto"/>
+              <w:cnfStyle w:val="000000100000" w:firstRow="0" w:lastRow="0" w:firstColumn="0" w:lastColumn="0" w:oddVBand="0" w:evenVBand="0" w:oddHBand="1" w:evenHBand="0" w:firstRowFirstColumn="0" w:firstRowLastColumn="0" w:lastRowFirstColumn="0" w:lastRowLastColumn="0"/>
+              <w:rPr>
+                <w:sz w:val="24"/>
+                <w:szCs w:val="24"/>
+              </w:rPr>
+            </w:pPr>
+            <w:r>
+              <w:rPr>
+                <w:sz w:val="24"/>
+                <w:szCs w:val="24"/>
+              </w:rPr>
+              <w:t>"java</w:t>
+            </w:r>
+            <w:proofErr w:type="gramStart"/>
+            <w:r>
+              <w:rPr>
+                <w:sz w:val="24"/>
+                <w:szCs w:val="24"/>
+              </w:rPr>
+              <w:t>".</w:t>
+            </w:r>
+            <w:proofErr w:type="spellStart"/>
+            <w:r>
+              <w:rPr>
+                <w:sz w:val="24"/>
+                <w:szCs w:val="24"/>
+              </w:rPr>
+              <w:t>toUpperCase</w:t>
+            </w:r>
+            <w:proofErr w:type="spellEnd"/>
+            <w:proofErr w:type="gramEnd"/>
+            <w:r>
+              <w:rPr>
+                <w:sz w:val="24"/>
+                <w:szCs w:val="24"/>
+              </w:rPr>
+              <w:t>()</w:t>
+            </w:r>
+          </w:p>
+        </w:tc>
+        <w:tc>
+          <w:tcPr>
+            <w:tcW w:w="1129" w:type="dxa"/>
+            <w:hideMark/>
+          </w:tcPr>
+          <w:p>
+            <w:pPr>
+              <w:pStyle w:val="ListParagraph"/>
+              <w:spacing w:after="160" w:line="259" w:lineRule="auto"/>
+              <w:cnfStyle w:val="000000100000" w:firstRow="0" w:lastRow="0" w:firstColumn="0" w:lastColumn="0" w:oddVBand="0" w:evenVBand="0" w:oddHBand="1" w:evenHBand="0" w:firstRowFirstColumn="0" w:firstRowLastColumn="0" w:lastRowFirstColumn="0" w:lastRowLastColumn="0"/>
+              <w:rPr>
+                <w:sz w:val="24"/>
+                <w:szCs w:val="24"/>
+              </w:rPr>
+            </w:pPr>
+            <w:r>
+              <w:rPr>
+                <w:sz w:val="24"/>
+                <w:szCs w:val="24"/>
+              </w:rPr>
+              <w:t>JAVA</w:t>
+            </w:r>
+          </w:p>
+        </w:tc>
+      </w:tr>
+      <w:tr>
+        <w:tc>
+          <w:tcPr>
+            <w:cnfStyle w:val="001000000000" w:firstRow="0" w:lastRow="0" w:firstColumn="1" w:lastColumn="0" w:oddVBand="0" w:evenVBand="0" w:oddHBand="0" w:evenHBand="0" w:firstRowFirstColumn="0" w:firstRowLastColumn="0" w:lastRowFirstColumn="0" w:lastRowLastColumn="0"/>
+            <w:tcW w:w="0" w:type="auto"/>
+            <w:hideMark/>
+          </w:tcPr>
+          <w:p>
+            <w:pPr>
+              <w:pStyle w:val="ListParagraph"/>
+              <w:spacing w:after="160" w:line="259" w:lineRule="auto"/>
+              <w:rPr>
+                <w:sz w:val="24"/>
+                <w:szCs w:val="24"/>
+              </w:rPr>
+            </w:pPr>
+            <w:proofErr w:type="spellStart"/>
+            <w:proofErr w:type="gramStart"/>
+            <w:r>
+              <w:rPr>
+                <w:sz w:val="24"/>
+                <w:szCs w:val="24"/>
+              </w:rPr>
+              <w:t>toLowerCase</w:t>
+            </w:r>
+            <w:proofErr w:type="spellEnd"/>
+            <w:r>
+              <w:rPr>
+                <w:sz w:val="24"/>
+                <w:szCs w:val="24"/>
+              </w:rPr>
+              <w:t>(</w:t>
+            </w:r>
+            <w:proofErr w:type="gramEnd"/>
+            <w:r>
+              <w:rPr>
+                <w:sz w:val="24"/>
+                <w:szCs w:val="24"/>
+              </w:rPr>
+              <w:t>)</w:t>
+            </w:r>
+          </w:p>
+        </w:tc>
+        <w:tc>
+          <w:tcPr>
+            <w:tcW w:w="2466" w:type="dxa"/>
+            <w:hideMark/>
+          </w:tcPr>
+          <w:p>
+            <w:pPr>
+              <w:pStyle w:val="ListParagraph"/>
+              <w:spacing w:after="160" w:line="259" w:lineRule="auto"/>
+              <w:cnfStyle w:val="000000000000" w:firstRow="0" w:lastRow="0" w:firstColumn="0" w:lastColumn="0" w:oddVBand="0" w:evenVBand="0" w:oddHBand="0" w:evenHBand="0" w:firstRowFirstColumn="0" w:firstRowLastColumn="0" w:lastRowFirstColumn="0" w:lastRowLastColumn="0"/>
+              <w:rPr>
+                <w:sz w:val="24"/>
+                <w:szCs w:val="24"/>
+              </w:rPr>
+            </w:pPr>
+            <w:r>
+              <w:rPr>
+                <w:sz w:val="24"/>
+                <w:szCs w:val="24"/>
+              </w:rPr>
+              <w:t>Converts all characters to lowercase</w:t>
+            </w:r>
+          </w:p>
+        </w:tc>
+        <w:tc>
+          <w:tcPr>
+            <w:tcW w:w="3848" w:type="dxa"/>
+            <w:hideMark/>
+          </w:tcPr>
+          <w:p>
+            <w:pPr>
+              <w:pStyle w:val="ListParagraph"/>
+              <w:spacing w:after="160" w:line="259" w:lineRule="auto"/>
+              <w:cnfStyle w:val="000000000000" w:firstRow="0" w:lastRow="0" w:firstColumn="0" w:lastColumn="0" w:oddVBand="0" w:evenVBand="0" w:oddHBand="0" w:evenHBand="0" w:firstRowFirstColumn="0" w:firstRowLastColumn="0" w:lastRowFirstColumn="0" w:lastRowLastColumn="0"/>
+              <w:rPr>
+                <w:sz w:val="24"/>
+                <w:szCs w:val="24"/>
+              </w:rPr>
+            </w:pPr>
+            <w:r>
+              <w:rPr>
+                <w:sz w:val="24"/>
+                <w:szCs w:val="24"/>
+              </w:rPr>
+              <w:t>"JAVA</w:t>
+            </w:r>
+            <w:proofErr w:type="gramStart"/>
+            <w:r>
+              <w:rPr>
+                <w:sz w:val="24"/>
+                <w:szCs w:val="24"/>
+              </w:rPr>
+              <w:t>".</w:t>
+            </w:r>
+            <w:proofErr w:type="spellStart"/>
+            <w:r>
+              <w:rPr>
+                <w:sz w:val="24"/>
+                <w:szCs w:val="24"/>
+              </w:rPr>
+              <w:t>toLowerCase</w:t>
+            </w:r>
+            <w:proofErr w:type="spellEnd"/>
+            <w:proofErr w:type="gramEnd"/>
+            <w:r>
+              <w:rPr>
+                <w:sz w:val="24"/>
+                <w:szCs w:val="24"/>
+              </w:rPr>
+              <w:t>()</w:t>
+            </w:r>
+          </w:p>
+        </w:tc>
+        <w:tc>
+          <w:tcPr>
+            <w:tcW w:w="1129" w:type="dxa"/>
+            <w:hideMark/>
+          </w:tcPr>
+          <w:p>
+            <w:pPr>
+              <w:pStyle w:val="ListParagraph"/>
+              <w:spacing w:after="160" w:line="259" w:lineRule="auto"/>
+              <w:cnfStyle w:val="000000000000" w:firstRow="0" w:lastRow="0" w:firstColumn="0" w:lastColumn="0" w:oddVBand="0" w:evenVBand="0" w:oddHBand="0" w:evenHBand="0" w:firstRowFirstColumn="0" w:firstRowLastColumn="0" w:lastRowFirstColumn="0" w:lastRowLastColumn="0"/>
+              <w:rPr>
+                <w:sz w:val="24"/>
+                <w:szCs w:val="24"/>
+              </w:rPr>
+            </w:pPr>
+            <w:r>
+              <w:rPr>
+                <w:sz w:val="24"/>
+                <w:szCs w:val="24"/>
+              </w:rPr>
+              <w:t>java</w:t>
+            </w:r>
+          </w:p>
+        </w:tc>
+      </w:tr>
+      <w:tr>
+        <w:trPr>
+          <w:cnfStyle w:val="000000100000" w:firstRow="0" w:lastRow="0" w:firstColumn="0" w:lastColumn="0" w:oddVBand="0" w:evenVBand="0" w:oddHBand="1" w:evenHBand="0" w:firstRowFirstColumn="0" w:firstRowLastColumn="0" w:lastRowFirstColumn="0" w:lastRowLastColumn="0"/>
+        </w:trPr>
+        <w:tc>
+          <w:tcPr>
+            <w:cnfStyle w:val="001000000000" w:firstRow="0" w:lastRow="0" w:firstColumn="1" w:lastColumn="0" w:oddVBand="0" w:evenVBand="0" w:oddHBand="0" w:evenHBand="0" w:firstRowFirstColumn="0" w:firstRowLastColumn="0" w:lastRowFirstColumn="0" w:lastRowLastColumn="0"/>
+            <w:tcW w:w="0" w:type="auto"/>
+            <w:hideMark/>
+          </w:tcPr>
+          <w:p>
+            <w:pPr>
+              <w:pStyle w:val="ListParagraph"/>
+              <w:spacing w:after="160" w:line="259" w:lineRule="auto"/>
+              <w:rPr>
+                <w:sz w:val="24"/>
+                <w:szCs w:val="24"/>
+              </w:rPr>
+            </w:pPr>
+            <w:proofErr w:type="gramStart"/>
+            <w:r>
+              <w:rPr>
+                <w:sz w:val="24"/>
+                <w:szCs w:val="24"/>
+              </w:rPr>
+              <w:t>equals(</w:t>
+            </w:r>
+            <w:proofErr w:type="gramEnd"/>
+            <w:r>
+              <w:rPr>
+                <w:sz w:val="24"/>
+                <w:szCs w:val="24"/>
+              </w:rPr>
+              <w:t>)</w:t>
+            </w:r>
+          </w:p>
+        </w:tc>
+        <w:tc>
+          <w:tcPr>
+            <w:tcW w:w="2466" w:type="dxa"/>
+            <w:hideMark/>
+          </w:tcPr>
+          <w:p>
+            <w:pPr>
+              <w:pStyle w:val="ListParagraph"/>
+              <w:spacing w:after="160" w:line="259" w:lineRule="auto"/>
+              <w:cnfStyle w:val="000000100000" w:firstRow="0" w:lastRow="0" w:firstColumn="0" w:lastColumn="0" w:oddVBand="0" w:evenVBand="0" w:oddHBand="1" w:evenHBand="0" w:firstRowFirstColumn="0" w:firstRowLastColumn="0" w:lastRowFirstColumn="0" w:lastRowLastColumn="0"/>
+              <w:rPr>
+                <w:sz w:val="24"/>
+                <w:szCs w:val="24"/>
+              </w:rPr>
+            </w:pPr>
+            <w:r>
+              <w:rPr>
+                <w:sz w:val="24"/>
+                <w:szCs w:val="24"/>
+              </w:rPr>
+              <w:t>Compares two strings by their content</w:t>
+            </w:r>
+          </w:p>
+        </w:tc>
+        <w:tc>
+          <w:tcPr>
+            <w:tcW w:w="3848" w:type="dxa"/>
+            <w:hideMark/>
+          </w:tcPr>
+          <w:p>
+            <w:pPr>
+              <w:pStyle w:val="ListParagraph"/>
+              <w:spacing w:after="160" w:line="259" w:lineRule="auto"/>
+              <w:cnfStyle w:val="000000100000" w:firstRow="0" w:lastRow="0" w:firstColumn="0" w:lastColumn="0" w:oddVBand="0" w:evenVBand="0" w:oddHBand="1" w:evenHBand="0" w:firstRowFirstColumn="0" w:firstRowLastColumn="0" w:lastRowFirstColumn="0" w:lastRowLastColumn="0"/>
+              <w:rPr>
+                <w:sz w:val="24"/>
+                <w:szCs w:val="24"/>
+              </w:rPr>
+            </w:pPr>
+            <w:r>
+              <w:rPr>
+                <w:sz w:val="24"/>
+                <w:szCs w:val="24"/>
+              </w:rPr>
+              <w:t>"</w:t>
+            </w:r>
+            <w:proofErr w:type="spellStart"/>
+            <w:r>
+              <w:rPr>
+                <w:sz w:val="24"/>
+                <w:szCs w:val="24"/>
+              </w:rPr>
+              <w:t>Java</w:t>
+            </w:r>
+            <w:proofErr w:type="gramStart"/>
+            <w:r>
+              <w:rPr>
+                <w:sz w:val="24"/>
+                <w:szCs w:val="24"/>
+              </w:rPr>
+              <w:t>".equals</w:t>
+            </w:r>
+            <w:proofErr w:type="spellEnd"/>
+            <w:proofErr w:type="gramEnd"/>
+            <w:r>
+              <w:rPr>
+                <w:sz w:val="24"/>
+                <w:szCs w:val="24"/>
+              </w:rPr>
+              <w:t>("Java")</w:t>
+            </w:r>
+          </w:p>
+        </w:tc>
+        <w:tc>
+          <w:tcPr>
+            <w:tcW w:w="1129" w:type="dxa"/>
+            <w:hideMark/>
+          </w:tcPr>
+          <w:p>
+            <w:pPr>
+              <w:pStyle w:val="ListParagraph"/>
+              <w:spacing w:after="160" w:line="259" w:lineRule="auto"/>
+              <w:cnfStyle w:val="000000100000" w:firstRow="0" w:lastRow="0" w:firstColumn="0" w:lastColumn="0" w:oddVBand="0" w:evenVBand="0" w:oddHBand="1" w:evenHBand="0" w:firstRowFirstColumn="0" w:firstRowLastColumn="0" w:lastRowFirstColumn="0" w:lastRowLastColumn="0"/>
+              <w:rPr>
+                <w:sz w:val="24"/>
+                <w:szCs w:val="24"/>
+              </w:rPr>
+            </w:pPr>
+            <w:r>
+              <w:rPr>
+                <w:sz w:val="24"/>
+                <w:szCs w:val="24"/>
+              </w:rPr>
+              <w:t>true</w:t>
+            </w:r>
+          </w:p>
+        </w:tc>
+      </w:tr>
+      <w:tr>
+        <w:tc>
+          <w:tcPr>
+            <w:cnfStyle w:val="001000000000" w:firstRow="0" w:lastRow="0" w:firstColumn="1" w:lastColumn="0" w:oddVBand="0" w:evenVBand="0" w:oddHBand="0" w:evenHBand="0" w:firstRowFirstColumn="0" w:firstRowLastColumn="0" w:lastRowFirstColumn="0" w:lastRowLastColumn="0"/>
+            <w:tcW w:w="0" w:type="auto"/>
+            <w:hideMark/>
+          </w:tcPr>
+          <w:p>
+            <w:pPr>
+              <w:pStyle w:val="ListParagraph"/>
+              <w:spacing w:after="160" w:line="259" w:lineRule="auto"/>
+              <w:rPr>
+                <w:sz w:val="24"/>
+                <w:szCs w:val="24"/>
+              </w:rPr>
+            </w:pPr>
+            <w:proofErr w:type="spellStart"/>
+            <w:proofErr w:type="gramStart"/>
+            <w:r>
+              <w:rPr>
+                <w:sz w:val="24"/>
+                <w:szCs w:val="24"/>
+              </w:rPr>
+              <w:t>equalsIgnoreCase</w:t>
+            </w:r>
+            <w:proofErr w:type="spellEnd"/>
+            <w:r>
+              <w:rPr>
+                <w:sz w:val="24"/>
+                <w:szCs w:val="24"/>
+              </w:rPr>
+              <w:t>(</w:t>
+            </w:r>
+            <w:proofErr w:type="gramEnd"/>
+            <w:r>
+              <w:rPr>
+                <w:sz w:val="24"/>
+                <w:szCs w:val="24"/>
+              </w:rPr>
+              <w:t>)</w:t>
+            </w:r>
+          </w:p>
+        </w:tc>
+        <w:tc>
+          <w:tcPr>
+            <w:tcW w:w="2466" w:type="dxa"/>
+            <w:hideMark/>
+          </w:tcPr>
+          <w:p>
+            <w:pPr>
+              <w:pStyle w:val="ListParagraph"/>
+              <w:spacing w:after="160" w:line="259" w:lineRule="auto"/>
+              <w:cnfStyle w:val="000000000000" w:firstRow="0" w:lastRow="0" w:firstColumn="0" w:lastColumn="0" w:oddVBand="0" w:evenVBand="0" w:oddHBand="0" w:evenHBand="0" w:firstRowFirstColumn="0" w:firstRowLastColumn="0" w:lastRowFirstColumn="0" w:lastRowLastColumn="0"/>
+              <w:rPr>
+                <w:sz w:val="24"/>
+                <w:szCs w:val="24"/>
+              </w:rPr>
+            </w:pPr>
+            <w:r>
+              <w:rPr>
+                <w:sz w:val="24"/>
+                <w:szCs w:val="24"/>
+              </w:rPr>
+              <w:t>Compares strings ignoring uppercase/lowercase differences</w:t>
+            </w:r>
+          </w:p>
+        </w:tc>
+        <w:tc>
+          <w:tcPr>
+            <w:tcW w:w="3848" w:type="dxa"/>
+            <w:hideMark/>
+          </w:tcPr>
+          <w:p>
+            <w:pPr>
+              <w:pStyle w:val="ListParagraph"/>
+              <w:spacing w:after="160" w:line="259" w:lineRule="auto"/>
+              <w:cnfStyle w:val="000000000000" w:firstRow="0" w:lastRow="0" w:firstColumn="0" w:lastColumn="0" w:oddVBand="0" w:evenVBand="0" w:oddHBand="0" w:evenHBand="0" w:firstRowFirstColumn="0" w:firstRowLastColumn="0" w:lastRowFirstColumn="0" w:lastRowLastColumn="0"/>
+              <w:rPr>
+                <w:sz w:val="24"/>
+                <w:szCs w:val="24"/>
+              </w:rPr>
+            </w:pPr>
+            <w:r>
+              <w:rPr>
+                <w:sz w:val="24"/>
+                <w:szCs w:val="24"/>
+              </w:rPr>
+              <w:t>"java</w:t>
+            </w:r>
+            <w:proofErr w:type="gramStart"/>
+            <w:r>
+              <w:rPr>
+                <w:sz w:val="24"/>
+                <w:szCs w:val="24"/>
+              </w:rPr>
+              <w:t>".</w:t>
+            </w:r>
+            <w:proofErr w:type="spellStart"/>
+            <w:r>
+              <w:rPr>
+                <w:sz w:val="24"/>
+                <w:szCs w:val="24"/>
+              </w:rPr>
+              <w:t>equalsIgnoreCase</w:t>
+            </w:r>
+            <w:proofErr w:type="spellEnd"/>
+            <w:proofErr w:type="gramEnd"/>
+            <w:r>
+              <w:rPr>
+                <w:sz w:val="24"/>
+                <w:szCs w:val="24"/>
+              </w:rPr>
+              <w:t>("JAVA")</w:t>
+            </w:r>
+          </w:p>
+        </w:tc>
+        <w:tc>
+          <w:tcPr>
+            <w:tcW w:w="1129" w:type="dxa"/>
+            <w:hideMark/>
+          </w:tcPr>
+          <w:p>
+            <w:pPr>
+              <w:pStyle w:val="ListParagraph"/>
+              <w:spacing w:after="160" w:line="259" w:lineRule="auto"/>
+              <w:cnfStyle w:val="000000000000" w:firstRow="0" w:lastRow="0" w:firstColumn="0" w:lastColumn="0" w:oddVBand="0" w:evenVBand="0" w:oddHBand="0" w:evenHBand="0" w:firstRowFirstColumn="0" w:firstRowLastColumn="0" w:lastRowFirstColumn="0" w:lastRowLastColumn="0"/>
+              <w:rPr>
+                <w:sz w:val="24"/>
+                <w:szCs w:val="24"/>
+              </w:rPr>
+            </w:pPr>
+            <w:r>
+              <w:rPr>
+                <w:sz w:val="24"/>
+                <w:szCs w:val="24"/>
+              </w:rPr>
+              <w:t>true</w:t>
+            </w:r>
+          </w:p>
+        </w:tc>
+      </w:tr>
+      <w:tr>
+        <w:trPr>
+          <w:cnfStyle w:val="000000100000" w:firstRow="0" w:lastRow="0" w:firstColumn="0" w:lastColumn="0" w:oddVBand="0" w:evenVBand="0" w:oddHBand="1" w:evenHBand="0" w:firstRowFirstColumn="0" w:firstRowLastColumn="0" w:lastRowFirstColumn="0" w:lastRowLastColumn="0"/>
+        </w:trPr>
+        <w:tc>
+          <w:tcPr>
+            <w:cnfStyle w:val="001000000000" w:firstRow="0" w:lastRow="0" w:firstColumn="1" w:lastColumn="0" w:oddVBand="0" w:evenVBand="0" w:oddHBand="0" w:evenHBand="0" w:firstRowFirstColumn="0" w:firstRowLastColumn="0" w:lastRowFirstColumn="0" w:lastRowLastColumn="0"/>
+            <w:tcW w:w="0" w:type="auto"/>
+            <w:hideMark/>
+          </w:tcPr>
+          <w:p>
+            <w:pPr>
+              <w:pStyle w:val="ListParagraph"/>
+              <w:spacing w:after="160" w:line="259" w:lineRule="auto"/>
+              <w:rPr>
+                <w:sz w:val="24"/>
+                <w:szCs w:val="24"/>
+              </w:rPr>
+            </w:pPr>
+            <w:proofErr w:type="gramStart"/>
+            <w:r>
+              <w:rPr>
+                <w:sz w:val="24"/>
+                <w:szCs w:val="24"/>
+              </w:rPr>
+              <w:t>contains(</w:t>
+            </w:r>
+            <w:proofErr w:type="gramEnd"/>
+            <w:r>
+              <w:rPr>
+                <w:sz w:val="24"/>
+                <w:szCs w:val="24"/>
+              </w:rPr>
+              <w:t>)</w:t>
+            </w:r>
+          </w:p>
+        </w:tc>
+        <w:tc>
+          <w:tcPr>
+            <w:tcW w:w="2466" w:type="dxa"/>
+            <w:hideMark/>
+          </w:tcPr>
+          <w:p>
+            <w:pPr>
+              <w:pStyle w:val="ListParagraph"/>
+              <w:spacing w:after="160" w:line="259" w:lineRule="auto"/>
+              <w:cnfStyle w:val="000000100000" w:firstRow="0" w:lastRow="0" w:firstColumn="0" w:lastColumn="0" w:oddVBand="0" w:evenVBand="0" w:oddHBand="1" w:evenHBand="0" w:firstRowFirstColumn="0" w:firstRowLastColumn="0" w:lastRowFirstColumn="0" w:lastRowLastColumn="0"/>
+              <w:rPr>
+                <w:sz w:val="24"/>
+                <w:szCs w:val="24"/>
+              </w:rPr>
+            </w:pPr>
+            <w:r>
+              <w:rPr>
+                <w:sz w:val="24"/>
+                <w:szCs w:val="24"/>
+              </w:rPr>
+              <w:t xml:space="preserve">Checks if a string contains </w:t>
+            </w:r>
+            <w:r>
+              <w:rPr>
+                <w:sz w:val="24"/>
+                <w:szCs w:val="24"/>
+              </w:rPr>
+              <w:lastRenderedPageBreak/>
+              <w:t>a specific sequence</w:t>
+            </w:r>
+          </w:p>
+        </w:tc>
+        <w:tc>
+          <w:tcPr>
+            <w:tcW w:w="3848" w:type="dxa"/>
+            <w:hideMark/>
+          </w:tcPr>
+          <w:p>
+            <w:pPr>
+              <w:pStyle w:val="ListParagraph"/>
+              <w:spacing w:after="160" w:line="259" w:lineRule="auto"/>
+              <w:cnfStyle w:val="000000100000" w:firstRow="0" w:lastRow="0" w:firstColumn="0" w:lastColumn="0" w:oddVBand="0" w:evenVBand="0" w:oddHBand="1" w:evenHBand="0" w:firstRowFirstColumn="0" w:firstRowLastColumn="0" w:lastRowFirstColumn="0" w:lastRowLastColumn="0"/>
+              <w:rPr>
+                <w:sz w:val="24"/>
+                <w:szCs w:val="24"/>
+              </w:rPr>
+            </w:pPr>
+            <w:r>
+              <w:rPr>
+                <w:sz w:val="24"/>
+                <w:szCs w:val="24"/>
+              </w:rPr>
+              <w:lastRenderedPageBreak/>
+              <w:t>"</w:t>
+            </w:r>
+            <w:proofErr w:type="spellStart"/>
+            <w:r>
+              <w:rPr>
+                <w:sz w:val="24"/>
+                <w:szCs w:val="24"/>
+              </w:rPr>
+              <w:t>Programming</w:t>
+            </w:r>
+            <w:proofErr w:type="gramStart"/>
+            <w:r>
+              <w:rPr>
+                <w:sz w:val="24"/>
+                <w:szCs w:val="24"/>
+              </w:rPr>
+              <w:t>".contains</w:t>
+            </w:r>
+            <w:proofErr w:type="spellEnd"/>
+            <w:proofErr w:type="gramEnd"/>
+            <w:r>
+              <w:rPr>
+                <w:sz w:val="24"/>
+                <w:szCs w:val="24"/>
+              </w:rPr>
+              <w:t>("gram")</w:t>
+            </w:r>
+          </w:p>
+        </w:tc>
+        <w:tc>
+          <w:tcPr>
+            <w:tcW w:w="1129" w:type="dxa"/>
+            <w:hideMark/>
+          </w:tcPr>
+          <w:p>
+            <w:pPr>
+              <w:pStyle w:val="ListParagraph"/>
+              <w:spacing w:after="160" w:line="259" w:lineRule="auto"/>
+              <w:cnfStyle w:val="000000100000" w:firstRow="0" w:lastRow="0" w:firstColumn="0" w:lastColumn="0" w:oddVBand="0" w:evenVBand="0" w:oddHBand="1" w:evenHBand="0" w:firstRowFirstColumn="0" w:firstRowLastColumn="0" w:lastRowFirstColumn="0" w:lastRowLastColumn="0"/>
+              <w:rPr>
+                <w:sz w:val="24"/>
+                <w:szCs w:val="24"/>
+              </w:rPr>
+            </w:pPr>
+            <w:r>
+              <w:rPr>
+                <w:sz w:val="24"/>
+                <w:szCs w:val="24"/>
+              </w:rPr>
+              <w:t>true</w:t>
+            </w:r>
+          </w:p>
+        </w:tc>
+      </w:tr>
+      <w:tr>
+        <w:tc>
+          <w:tcPr>
+            <w:cnfStyle w:val="001000000000" w:firstRow="0" w:lastRow="0" w:firstColumn="1" w:lastColumn="0" w:oddVBand="0" w:evenVBand="0" w:oddHBand="0" w:evenHBand="0" w:firstRowFirstColumn="0" w:firstRowLastColumn="0" w:lastRowFirstColumn="0" w:lastRowLastColumn="0"/>
+            <w:tcW w:w="0" w:type="auto"/>
+            <w:hideMark/>
+          </w:tcPr>
+          <w:p>
+            <w:pPr>
+              <w:pStyle w:val="ListParagraph"/>
+              <w:spacing w:after="160" w:line="259" w:lineRule="auto"/>
+              <w:rPr>
+                <w:sz w:val="24"/>
+                <w:szCs w:val="24"/>
+              </w:rPr>
+            </w:pPr>
+            <w:proofErr w:type="spellStart"/>
+            <w:proofErr w:type="gramStart"/>
+            <w:r>
+              <w:rPr>
+                <w:sz w:val="24"/>
+                <w:szCs w:val="24"/>
+              </w:rPr>
+              <w:t>startsWith</w:t>
+            </w:r>
+            <w:proofErr w:type="spellEnd"/>
+            <w:r>
+              <w:rPr>
+                <w:sz w:val="24"/>
+                <w:szCs w:val="24"/>
+              </w:rPr>
+              <w:t>(</w:t>
+            </w:r>
+            <w:proofErr w:type="gramEnd"/>
+            <w:r>
+              <w:rPr>
+                <w:sz w:val="24"/>
+                <w:szCs w:val="24"/>
+              </w:rPr>
+              <w:t>)</w:t>
+            </w:r>
+          </w:p>
+        </w:tc>
+        <w:tc>
+          <w:tcPr>
+            <w:tcW w:w="2466" w:type="dxa"/>
+            <w:hideMark/>
+          </w:tcPr>
+          <w:p>
+            <w:pPr>
+              <w:pStyle w:val="ListParagraph"/>
+              <w:spacing w:after="160" w:line="259" w:lineRule="auto"/>
+              <w:cnfStyle w:val="000000000000" w:firstRow="0" w:lastRow="0" w:firstColumn="0" w:lastColumn="0" w:oddVBand="0" w:evenVBand="0" w:oddHBand="0" w:evenHBand="0" w:firstRowFirstColumn="0" w:firstRowLastColumn="0" w:lastRowFirstColumn="0" w:lastRowLastColumn="0"/>
+              <w:rPr>
+                <w:sz w:val="24"/>
+                <w:szCs w:val="24"/>
+              </w:rPr>
+            </w:pPr>
+            <w:r>
+              <w:rPr>
+                <w:sz w:val="24"/>
+                <w:szCs w:val="24"/>
+              </w:rPr>
+              <w:t>Checks if a string starts with specific characters</w:t>
+            </w:r>
+          </w:p>
+        </w:tc>
+        <w:tc>
+          <w:tcPr>
+            <w:tcW w:w="3848" w:type="dxa"/>
+            <w:hideMark/>
+          </w:tcPr>
+          <w:p>
+            <w:pPr>
+              <w:pStyle w:val="ListParagraph"/>
+              <w:spacing w:after="160" w:line="259" w:lineRule="auto"/>
+              <w:cnfStyle w:val="000000000000" w:firstRow="0" w:lastRow="0" w:firstColumn="0" w:lastColumn="0" w:oddVBand="0" w:evenVBand="0" w:oddHBand="0" w:evenHBand="0" w:firstRowFirstColumn="0" w:firstRowLastColumn="0" w:lastRowFirstColumn="0" w:lastRowLastColumn="0"/>
+              <w:rPr>
+                <w:sz w:val="24"/>
+                <w:szCs w:val="24"/>
+              </w:rPr>
+            </w:pPr>
+            <w:r>
+              <w:rPr>
+                <w:sz w:val="24"/>
+                <w:szCs w:val="24"/>
+              </w:rPr>
+              <w:t>"Java</w:t>
+            </w:r>
+            <w:proofErr w:type="gramStart"/>
+            <w:r>
+              <w:rPr>
+                <w:sz w:val="24"/>
+                <w:szCs w:val="24"/>
+              </w:rPr>
+              <w:t>".</w:t>
+            </w:r>
+            <w:proofErr w:type="spellStart"/>
+            <w:r>
+              <w:rPr>
+                <w:sz w:val="24"/>
+                <w:szCs w:val="24"/>
+              </w:rPr>
+              <w:t>startsWith</w:t>
+            </w:r>
+            <w:proofErr w:type="spellEnd"/>
+            <w:proofErr w:type="gramEnd"/>
+            <w:r>
+              <w:rPr>
+                <w:sz w:val="24"/>
+                <w:szCs w:val="24"/>
+              </w:rPr>
+              <w:t>("Ja")</w:t>
+            </w:r>
+          </w:p>
+        </w:tc>
+        <w:tc>
+          <w:tcPr>
+            <w:tcW w:w="1129" w:type="dxa"/>
+            <w:hideMark/>
+          </w:tcPr>
+          <w:p>
+            <w:pPr>
+              <w:pStyle w:val="ListParagraph"/>
+              <w:spacing w:after="160" w:line="259" w:lineRule="auto"/>
+              <w:cnfStyle w:val="000000000000" w:firstRow="0" w:lastRow="0" w:firstColumn="0" w:lastColumn="0" w:oddVBand="0" w:evenVBand="0" w:oddHBand="0" w:evenHBand="0" w:firstRowFirstColumn="0" w:firstRowLastColumn="0" w:lastRowFirstColumn="0" w:lastRowLastColumn="0"/>
+              <w:rPr>
+                <w:sz w:val="24"/>
+                <w:szCs w:val="24"/>
+              </w:rPr>
+            </w:pPr>
+            <w:r>
+              <w:rPr>
+                <w:sz w:val="24"/>
+                <w:szCs w:val="24"/>
+              </w:rPr>
+              <w:t>true</w:t>
+            </w:r>
+          </w:p>
+        </w:tc>
+      </w:tr>
+      <w:tr>
+        <w:trPr>
+          <w:cnfStyle w:val="000000100000" w:firstRow="0" w:lastRow="0" w:firstColumn="0" w:lastColumn="0" w:oddVBand="0" w:evenVBand="0" w:oddHBand="1" w:evenHBand="0" w:firstRowFirstColumn="0" w:firstRowLastColumn="0" w:lastRowFirstColumn="0" w:lastRowLastColumn="0"/>
+        </w:trPr>
+        <w:tc>
+          <w:tcPr>
+            <w:cnfStyle w:val="001000000000" w:firstRow="0" w:lastRow="0" w:firstColumn="1" w:lastColumn="0" w:oddVBand="0" w:evenVBand="0" w:oddHBand="0" w:evenHBand="0" w:firstRowFirstColumn="0" w:firstRowLastColumn="0" w:lastRowFirstColumn="0" w:lastRowLastColumn="0"/>
+            <w:tcW w:w="0" w:type="auto"/>
+            <w:hideMark/>
+          </w:tcPr>
+          <w:p>
+            <w:pPr>
+              <w:pStyle w:val="ListParagraph"/>
+              <w:spacing w:after="160" w:line="259" w:lineRule="auto"/>
+              <w:rPr>
+                <w:sz w:val="24"/>
+                <w:szCs w:val="24"/>
+              </w:rPr>
+            </w:pPr>
+            <w:proofErr w:type="spellStart"/>
+            <w:proofErr w:type="gramStart"/>
+            <w:r>
+              <w:rPr>
+                <w:sz w:val="24"/>
+                <w:szCs w:val="24"/>
+              </w:rPr>
+              <w:t>endsWith</w:t>
+            </w:r>
+            <w:proofErr w:type="spellEnd"/>
+            <w:r>
+              <w:rPr>
+                <w:sz w:val="24"/>
+                <w:szCs w:val="24"/>
+              </w:rPr>
+              <w:t>(</w:t>
+            </w:r>
+            <w:proofErr w:type="gramEnd"/>
+            <w:r>
+              <w:rPr>
+                <w:sz w:val="24"/>
+                <w:szCs w:val="24"/>
+              </w:rPr>
+              <w:t>)</w:t>
+            </w:r>
+          </w:p>
+        </w:tc>
+        <w:tc>
+          <w:tcPr>
+            <w:tcW w:w="2466" w:type="dxa"/>
+            <w:hideMark/>
+          </w:tcPr>
+          <w:p>
+            <w:pPr>
+              <w:pStyle w:val="ListParagraph"/>
+              <w:spacing w:after="160" w:line="259" w:lineRule="auto"/>
+              <w:cnfStyle w:val="000000100000" w:firstRow="0" w:lastRow="0" w:firstColumn="0" w:lastColumn="0" w:oddVBand="0" w:evenVBand="0" w:oddHBand="1" w:evenHBand="0" w:firstRowFirstColumn="0" w:firstRowLastColumn="0" w:lastRowFirstColumn="0" w:lastRowLastColumn="0"/>
+              <w:rPr>
+                <w:sz w:val="24"/>
+                <w:szCs w:val="24"/>
+              </w:rPr>
+            </w:pPr>
+            <w:r>
+              <w:rPr>
+                <w:sz w:val="24"/>
+                <w:szCs w:val="24"/>
+              </w:rPr>
+              <w:t>Checks if a string ends with specific characters</w:t>
+            </w:r>
+          </w:p>
+        </w:tc>
+        <w:tc>
+          <w:tcPr>
+            <w:tcW w:w="3848" w:type="dxa"/>
+            <w:hideMark/>
+          </w:tcPr>
+          <w:p>
+            <w:pPr>
+              <w:pStyle w:val="ListParagraph"/>
+              <w:spacing w:after="160" w:line="259" w:lineRule="auto"/>
+              <w:cnfStyle w:val="000000100000" w:firstRow="0" w:lastRow="0" w:firstColumn="0" w:lastColumn="0" w:oddVBand="0" w:evenVBand="0" w:oddHBand="1" w:evenHBand="0" w:firstRowFirstColumn="0" w:firstRowLastColumn="0" w:lastRowFirstColumn="0" w:lastRowLastColumn="0"/>
+              <w:rPr>
+                <w:sz w:val="24"/>
+                <w:szCs w:val="24"/>
+              </w:rPr>
+            </w:pPr>
+            <w:r>
+              <w:rPr>
+                <w:sz w:val="24"/>
+                <w:szCs w:val="24"/>
+              </w:rPr>
+              <w:t>"Java</w:t>
+            </w:r>
+            <w:proofErr w:type="gramStart"/>
+            <w:r>
+              <w:rPr>
+                <w:sz w:val="24"/>
+                <w:szCs w:val="24"/>
+              </w:rPr>
+              <w:t>".</w:t>
+            </w:r>
+            <w:proofErr w:type="spellStart"/>
+            <w:r>
+              <w:rPr>
+                <w:sz w:val="24"/>
+                <w:szCs w:val="24"/>
+              </w:rPr>
+              <w:t>endsWith</w:t>
+            </w:r>
+            <w:proofErr w:type="spellEnd"/>
+            <w:proofErr w:type="gramEnd"/>
+            <w:r>
+              <w:rPr>
+                <w:sz w:val="24"/>
+                <w:szCs w:val="24"/>
+              </w:rPr>
+              <w:t>("</w:t>
+            </w:r>
+            <w:proofErr w:type="spellStart"/>
+            <w:r>
+              <w:rPr>
+                <w:sz w:val="24"/>
+                <w:szCs w:val="24"/>
+              </w:rPr>
+              <w:t>va</w:t>
+            </w:r>
+            <w:proofErr w:type="spellEnd"/>
+            <w:r>
+              <w:rPr>
+                <w:sz w:val="24"/>
+                <w:szCs w:val="24"/>
+              </w:rPr>
+              <w:t>")</w:t>
+            </w:r>
+          </w:p>
+        </w:tc>
+        <w:tc>
+          <w:tcPr>
+            <w:tcW w:w="1129" w:type="dxa"/>
+            <w:hideMark/>
+          </w:tcPr>
+          <w:p>
+            <w:pPr>
+              <w:pStyle w:val="ListParagraph"/>
+              <w:spacing w:after="160" w:line="259" w:lineRule="auto"/>
+              <w:cnfStyle w:val="000000100000" w:firstRow="0" w:lastRow="0" w:firstColumn="0" w:lastColumn="0" w:oddVBand="0" w:evenVBand="0" w:oddHBand="1" w:evenHBand="0" w:firstRowFirstColumn="0" w:firstRowLastColumn="0" w:lastRowFirstColumn="0" w:lastRowLastColumn="0"/>
+              <w:rPr>
+                <w:sz w:val="24"/>
+                <w:szCs w:val="24"/>
+              </w:rPr>
+            </w:pPr>
+            <w:r>
+              <w:rPr>
+                <w:sz w:val="24"/>
+                <w:szCs w:val="24"/>
+              </w:rPr>
+              <w:t>true</w:t>
+            </w:r>
+          </w:p>
+        </w:tc>
+      </w:tr>
+      <w:tr>
+        <w:tc>
+          <w:tcPr>
+            <w:cnfStyle w:val="001000000000" w:firstRow="0" w:lastRow="0" w:firstColumn="1" w:lastColumn="0" w:oddVBand="0" w:evenVBand="0" w:oddHBand="0" w:evenHBand="0" w:firstRowFirstColumn="0" w:firstRowLastColumn="0" w:lastRowFirstColumn="0" w:lastRowLastColumn="0"/>
+            <w:tcW w:w="0" w:type="auto"/>
+            <w:hideMark/>
+          </w:tcPr>
+          <w:p>
+            <w:pPr>
+              <w:pStyle w:val="ListParagraph"/>
+              <w:spacing w:after="160" w:line="259" w:lineRule="auto"/>
+              <w:rPr>
+                <w:sz w:val="24"/>
+                <w:szCs w:val="24"/>
+              </w:rPr>
+            </w:pPr>
+            <w:proofErr w:type="gramStart"/>
+            <w:r>
+              <w:rPr>
+                <w:sz w:val="24"/>
+                <w:szCs w:val="24"/>
+              </w:rPr>
+              <w:t>replace(</w:t>
+            </w:r>
+            <w:proofErr w:type="gramEnd"/>
+            <w:r>
+              <w:rPr>
+                <w:sz w:val="24"/>
+                <w:szCs w:val="24"/>
+              </w:rPr>
+              <w:t>)</w:t>
+            </w:r>
+          </w:p>
+        </w:tc>
+        <w:tc>
+          <w:tcPr>
+            <w:tcW w:w="2466" w:type="dxa"/>
+            <w:hideMark/>
+          </w:tcPr>
+          <w:p>
+            <w:pPr>
+              <w:pStyle w:val="ListParagraph"/>
+              <w:spacing w:after="160" w:line="259" w:lineRule="auto"/>
+              <w:cnfStyle w:val="000000000000" w:firstRow="0" w:lastRow="0" w:firstColumn="0" w:lastColumn="0" w:oddVBand="0" w:evenVBand="0" w:oddHBand="0" w:evenHBand="0" w:firstRowFirstColumn="0" w:firstRowLastColumn="0" w:lastRowFirstColumn="0" w:lastRowLastColumn="0"/>
+              <w:rPr>
+                <w:sz w:val="24"/>
+                <w:szCs w:val="24"/>
+              </w:rPr>
+            </w:pPr>
+            <w:r>
+              <w:rPr>
+                <w:sz w:val="24"/>
+                <w:szCs w:val="24"/>
+              </w:rPr>
+              <w:t>Replaces characters or words in a string</w:t>
+            </w:r>
+          </w:p>
+        </w:tc>
+        <w:tc>
+          <w:tcPr>
+            <w:tcW w:w="3848" w:type="dxa"/>
+            <w:hideMark/>
+          </w:tcPr>
+          <w:p>
+            <w:pPr>
+              <w:pStyle w:val="ListParagraph"/>
+              <w:spacing w:after="160" w:line="259" w:lineRule="auto"/>
+              <w:cnfStyle w:val="000000000000" w:firstRow="0" w:lastRow="0" w:firstColumn="0" w:lastColumn="0" w:oddVBand="0" w:evenVBand="0" w:oddHBand="0" w:evenHBand="0" w:firstRowFirstColumn="0" w:firstRowLastColumn="0" w:lastRowFirstColumn="0" w:lastRowLastColumn="0"/>
+              <w:rPr>
+                <w:sz w:val="24"/>
+                <w:szCs w:val="24"/>
+              </w:rPr>
+            </w:pPr>
+            <w:r>
+              <w:rPr>
+                <w:sz w:val="24"/>
+                <w:szCs w:val="24"/>
+              </w:rPr>
+              <w:t>"</w:t>
+            </w:r>
+            <w:proofErr w:type="spellStart"/>
+            <w:r>
+              <w:rPr>
+                <w:sz w:val="24"/>
+                <w:szCs w:val="24"/>
+              </w:rPr>
+              <w:t>Java</w:t>
+            </w:r>
+            <w:proofErr w:type="gramStart"/>
+            <w:r>
+              <w:rPr>
+                <w:sz w:val="24"/>
+                <w:szCs w:val="24"/>
+              </w:rPr>
+              <w:t>".replace</w:t>
+            </w:r>
+            <w:proofErr w:type="spellEnd"/>
+            <w:proofErr w:type="gramEnd"/>
+            <w:r>
+              <w:rPr>
+                <w:sz w:val="24"/>
+                <w:szCs w:val="24"/>
+              </w:rPr>
+              <w:t>("J","L")</w:t>
+            </w:r>
+          </w:p>
+        </w:tc>
+        <w:tc>
+          <w:tcPr>
+            <w:tcW w:w="1129" w:type="dxa"/>
+            <w:hideMark/>
+          </w:tcPr>
+          <w:p>
+            <w:pPr>
+              <w:pStyle w:val="ListParagraph"/>
+              <w:spacing w:after="160" w:line="259" w:lineRule="auto"/>
+              <w:cnfStyle w:val="000000000000" w:firstRow="0" w:lastRow="0" w:firstColumn="0" w:lastColumn="0" w:oddVBand="0" w:evenVBand="0" w:oddHBand="0" w:evenHBand="0" w:firstRowFirstColumn="0" w:firstRowLastColumn="0" w:lastRowFirstColumn="0" w:lastRowLastColumn="0"/>
+              <w:rPr>
+                <w:sz w:val="24"/>
+                <w:szCs w:val="24"/>
+              </w:rPr>
+            </w:pPr>
+            <w:r>
+              <w:rPr>
+                <w:sz w:val="24"/>
+                <w:szCs w:val="24"/>
+              </w:rPr>
+              <w:t>Lava</w:t>
+            </w:r>
+          </w:p>
+        </w:tc>
+      </w:tr>
+      <w:tr>
+        <w:trPr>
+          <w:cnfStyle w:val="000000100000" w:firstRow="0" w:lastRow="0" w:firstColumn="0" w:lastColumn="0" w:oddVBand="0" w:evenVBand="0" w:oddHBand="1" w:evenHBand="0" w:firstRowFirstColumn="0" w:firstRowLastColumn="0" w:lastRowFirstColumn="0" w:lastRowLastColumn="0"/>
+        </w:trPr>
+        <w:tc>
+          <w:tcPr>
+            <w:cnfStyle w:val="001000000000" w:firstRow="0" w:lastRow="0" w:firstColumn="1" w:lastColumn="0" w:oddVBand="0" w:evenVBand="0" w:oddHBand="0" w:evenHBand="0" w:firstRowFirstColumn="0" w:firstRowLastColumn="0" w:lastRowFirstColumn="0" w:lastRowLastColumn="0"/>
+            <w:tcW w:w="0" w:type="auto"/>
+            <w:hideMark/>
+          </w:tcPr>
+          <w:p>
+            <w:pPr>
+              <w:pStyle w:val="ListParagraph"/>
+              <w:spacing w:after="160" w:line="259" w:lineRule="auto"/>
+              <w:rPr>
+                <w:sz w:val="24"/>
+                <w:szCs w:val="24"/>
+              </w:rPr>
+            </w:pPr>
+            <w:proofErr w:type="gramStart"/>
+            <w:r>
+              <w:rPr>
+                <w:sz w:val="24"/>
+                <w:szCs w:val="24"/>
+              </w:rPr>
+              <w:t>trim(</w:t>
+            </w:r>
+            <w:proofErr w:type="gramEnd"/>
+            <w:r>
+              <w:rPr>
+                <w:sz w:val="24"/>
+                <w:szCs w:val="24"/>
+              </w:rPr>
+              <w:t>)</w:t>
+            </w:r>
+          </w:p>
+        </w:tc>
+        <w:tc>
+          <w:tcPr>
+            <w:tcW w:w="2466" w:type="dxa"/>
+            <w:hideMark/>
+          </w:tcPr>
+          <w:p>
+            <w:pPr>
+              <w:pStyle w:val="ListParagraph"/>
+              <w:spacing w:after="160" w:line="259" w:lineRule="auto"/>
+              <w:cnfStyle w:val="000000100000" w:firstRow="0" w:lastRow="0" w:firstColumn="0" w:lastColumn="0" w:oddVBand="0" w:evenVBand="0" w:oddHBand="1" w:evenHBand="0" w:firstRowFirstColumn="0" w:firstRowLastColumn="0" w:lastRowFirstColumn="0" w:lastRowLastColumn="0"/>
+              <w:rPr>
+                <w:sz w:val="24"/>
+                <w:szCs w:val="24"/>
+              </w:rPr>
+            </w:pPr>
+            <w:r>
+              <w:rPr>
+                <w:sz w:val="24"/>
+                <w:szCs w:val="24"/>
+              </w:rPr>
+              <w:t>Removes spaces from the beginning and end</w:t>
+            </w:r>
+          </w:p>
+        </w:tc>
+        <w:tc>
+          <w:tcPr>
+            <w:tcW w:w="3848" w:type="dxa"/>
+            <w:hideMark/>
+          </w:tcPr>
+          <w:p>
+            <w:pPr>
+              <w:pStyle w:val="ListParagraph"/>
+              <w:spacing w:after="160" w:line="259" w:lineRule="auto"/>
+              <w:cnfStyle w:val="000000100000" w:firstRow="0" w:lastRow="0" w:firstColumn="0" w:lastColumn="0" w:oddVBand="0" w:evenVBand="0" w:oddHBand="1" w:evenHBand="0" w:firstRowFirstColumn="0" w:firstRowLastColumn="0" w:lastRowFirstColumn="0" w:lastRowLastColumn="0"/>
+              <w:rPr>
+                <w:sz w:val="24"/>
+                <w:szCs w:val="24"/>
+              </w:rPr>
+            </w:pPr>
+            <w:r>
+              <w:rPr>
+                <w:sz w:val="24"/>
+                <w:szCs w:val="24"/>
+              </w:rPr>
+              <w:t xml:space="preserve">" Java </w:t>
+            </w:r>
+            <w:proofErr w:type="gramStart"/>
+            <w:r>
+              <w:rPr>
+                <w:sz w:val="24"/>
+                <w:szCs w:val="24"/>
+              </w:rPr>
+              <w:t>".trim</w:t>
+            </w:r>
+            <w:proofErr w:type="gramEnd"/>
+            <w:r>
+              <w:rPr>
+                <w:sz w:val="24"/>
+                <w:szCs w:val="24"/>
+              </w:rPr>
+              <w:t>()</w:t>
+            </w:r>
+          </w:p>
+        </w:tc>
+        <w:tc>
+          <w:tcPr>
+            <w:tcW w:w="1129" w:type="dxa"/>
+            <w:hideMark/>
+          </w:tcPr>
+          <w:p>
+            <w:pPr>
+              <w:pStyle w:val="ListParagraph"/>
+              <w:spacing w:after="160" w:line="259" w:lineRule="auto"/>
+              <w:cnfStyle w:val="000000100000" w:firstRow="0" w:lastRow="0" w:firstColumn="0" w:lastColumn="0" w:oddVBand="0" w:evenVBand="0" w:oddHBand="1" w:evenHBand="0" w:firstRowFirstColumn="0" w:firstRowLastColumn="0" w:lastRowFirstColumn="0" w:lastRowLastColumn="0"/>
+              <w:rPr>
+                <w:sz w:val="24"/>
+                <w:szCs w:val="24"/>
+              </w:rPr>
+            </w:pPr>
+            <w:r>
+              <w:rPr>
+                <w:sz w:val="24"/>
+                <w:szCs w:val="24"/>
+              </w:rPr>
+              <w:t>Java</w:t>
+            </w:r>
+          </w:p>
+        </w:tc>
+      </w:tr>
+      <w:tr>
+        <w:tc>
+          <w:tcPr>
+            <w:cnfStyle w:val="001000000000" w:firstRow="0" w:lastRow="0" w:firstColumn="1" w:lastColumn="0" w:oddVBand="0" w:evenVBand="0" w:oddHBand="0" w:evenHBand="0" w:firstRowFirstColumn="0" w:firstRowLastColumn="0" w:lastRowFirstColumn="0" w:lastRowLastColumn="0"/>
+            <w:tcW w:w="0" w:type="auto"/>
+            <w:hideMark/>
+          </w:tcPr>
+          <w:p>
+            <w:pPr>
+              <w:pStyle w:val="ListParagraph"/>
+              <w:spacing w:after="160" w:line="259" w:lineRule="auto"/>
+              <w:rPr>
+                <w:sz w:val="24"/>
+                <w:szCs w:val="24"/>
+              </w:rPr>
+            </w:pPr>
+            <w:proofErr w:type="gramStart"/>
+            <w:r>
+              <w:rPr>
+                <w:sz w:val="24"/>
+                <w:szCs w:val="24"/>
+              </w:rPr>
+              <w:t>split(</w:t>
+            </w:r>
+            <w:proofErr w:type="gramEnd"/>
+            <w:r>
+              <w:rPr>
+                <w:sz w:val="24"/>
+                <w:szCs w:val="24"/>
+              </w:rPr>
+              <w:t>)</w:t>
+            </w:r>
+          </w:p>
+        </w:tc>
+        <w:tc>
+          <w:tcPr>
+            <w:tcW w:w="2466" w:type="dxa"/>
+            <w:hideMark/>
+          </w:tcPr>
+          <w:p>
+            <w:pPr>
+              <w:pStyle w:val="ListParagraph"/>
+              <w:spacing w:after="160" w:line="259" w:lineRule="auto"/>
+              <w:cnfStyle w:val="000000000000" w:firstRow="0" w:lastRow="0" w:firstColumn="0" w:lastColumn="0" w:oddVBand="0" w:evenVBand="0" w:oddHBand="0" w:evenHBand="0" w:firstRowFirstColumn="0" w:firstRowLastColumn="0" w:lastRowFirstColumn="0" w:lastRowLastColumn="0"/>
+              <w:rPr>
+                <w:sz w:val="24"/>
+                <w:szCs w:val="24"/>
+              </w:rPr>
+            </w:pPr>
+            <w:r>
+              <w:rPr>
+                <w:sz w:val="24"/>
+                <w:szCs w:val="24"/>
+              </w:rPr>
+              <w:t>Splits a string into an array using a separator</w:t>
+            </w:r>
+          </w:p>
+        </w:tc>
+        <w:tc>
+          <w:tcPr>
+            <w:tcW w:w="3848" w:type="dxa"/>
+            <w:hideMark/>
+          </w:tcPr>
+          <w:p>
+            <w:pPr>
+              <w:pStyle w:val="ListParagraph"/>
+              <w:spacing w:after="160" w:line="259" w:lineRule="auto"/>
+              <w:cnfStyle w:val="000000000000" w:firstRow="0" w:lastRow="0" w:firstColumn="0" w:lastColumn="0" w:oddVBand="0" w:evenVBand="0" w:oddHBand="0" w:evenHBand="0" w:firstRowFirstColumn="0" w:firstRowLastColumn="0" w:lastRowFirstColumn="0" w:lastRowLastColumn="0"/>
+              <w:rPr>
+                <w:sz w:val="24"/>
+                <w:szCs w:val="24"/>
+              </w:rPr>
+            </w:pPr>
+            <w:r>
+              <w:rPr>
+                <w:sz w:val="24"/>
+                <w:szCs w:val="24"/>
+              </w:rPr>
+              <w:t>"</w:t>
+            </w:r>
+            <w:proofErr w:type="spellStart"/>
+            <w:proofErr w:type="gramStart"/>
+            <w:r>
+              <w:rPr>
+                <w:sz w:val="24"/>
+                <w:szCs w:val="24"/>
+              </w:rPr>
+              <w:t>A,B</w:t>
+            </w:r>
+            <w:proofErr w:type="gramEnd"/>
+            <w:r>
+              <w:rPr>
+                <w:sz w:val="24"/>
+                <w:szCs w:val="24"/>
+              </w:rPr>
+              <w:t>,C</w:t>
+            </w:r>
+            <w:proofErr w:type="gramStart"/>
+            <w:r>
+              <w:rPr>
+                <w:sz w:val="24"/>
+                <w:szCs w:val="24"/>
+              </w:rPr>
+              <w:t>".split</w:t>
+            </w:r>
+            <w:proofErr w:type="spellEnd"/>
+            <w:proofErr w:type="gramEnd"/>
+            <w:r>
+              <w:rPr>
+                <w:sz w:val="24"/>
+                <w:szCs w:val="24"/>
+              </w:rPr>
+              <w:t>(",")</w:t>
+            </w:r>
+          </w:p>
+        </w:tc>
+        <w:tc>
+          <w:tcPr>
+            <w:tcW w:w="1129" w:type="dxa"/>
+            <w:hideMark/>
+          </w:tcPr>
+          <w:p>
+            <w:pPr>
+              <w:pStyle w:val="ListParagraph"/>
+              <w:spacing w:after="160" w:line="259" w:lineRule="auto"/>
+              <w:cnfStyle w:val="000000000000" w:firstRow="0" w:lastRow="0" w:firstColumn="0" w:lastColumn="0" w:oddVBand="0" w:evenVBand="0" w:oddHBand="0" w:evenHBand="0" w:firstRowFirstColumn="0" w:firstRowLastColumn="0" w:lastRowFirstColumn="0" w:lastRowLastColumn="0"/>
+              <w:rPr>
+                <w:sz w:val="24"/>
+                <w:szCs w:val="24"/>
+              </w:rPr>
+            </w:pPr>
+            <w:r>
+              <w:rPr>
+                <w:sz w:val="24"/>
+                <w:szCs w:val="24"/>
+              </w:rPr>
+              <w:t>[A, B, C]</w:t>
+            </w:r>
+          </w:p>
+        </w:tc>
+      </w:tr>
+      <w:tr>
+        <w:trPr>
+          <w:cnfStyle w:val="000000100000" w:firstRow="0" w:lastRow="0" w:firstColumn="0" w:lastColumn="0" w:oddVBand="0" w:evenVBand="0" w:oddHBand="1" w:evenHBand="0" w:firstRowFirstColumn="0" w:firstRowLastColumn="0" w:lastRowFirstColumn="0" w:lastRowLastColumn="0"/>
+        </w:trPr>
+        <w:tc>
+          <w:tcPr>
+            <w:cnfStyle w:val="001000000000" w:firstRow="0" w:lastRow="0" w:firstColumn="1" w:lastColumn="0" w:oddVBand="0" w:evenVBand="0" w:oddHBand="0" w:evenHBand="0" w:firstRowFirstColumn="0" w:firstRowLastColumn="0" w:lastRowFirstColumn="0" w:lastRowLastColumn="0"/>
+            <w:tcW w:w="0" w:type="auto"/>
+            <w:hideMark/>
+          </w:tcPr>
+          <w:p>
+            <w:pPr>
+              <w:pStyle w:val="ListParagraph"/>
+              <w:spacing w:after="160" w:line="259" w:lineRule="auto"/>
+              <w:rPr>
+                <w:sz w:val="24"/>
+                <w:szCs w:val="24"/>
+              </w:rPr>
+            </w:pPr>
+            <w:proofErr w:type="spellStart"/>
+            <w:proofErr w:type="gramStart"/>
+            <w:r>
+              <w:rPr>
+                <w:sz w:val="24"/>
+                <w:szCs w:val="24"/>
+              </w:rPr>
+              <w:t>indexOf</w:t>
+            </w:r>
+            <w:proofErr w:type="spellEnd"/>
+            <w:r>
+              <w:rPr>
+                <w:sz w:val="24"/>
+                <w:szCs w:val="24"/>
+              </w:rPr>
+              <w:t>(</w:t>
+            </w:r>
+            <w:proofErr w:type="gramEnd"/>
+            <w:r>
+              <w:rPr>
+                <w:sz w:val="24"/>
+                <w:szCs w:val="24"/>
+              </w:rPr>
+              <w:t>)</w:t>
+            </w:r>
+          </w:p>
+        </w:tc>
+        <w:tc>
+          <w:tcPr>
+            <w:tcW w:w="2466" w:type="dxa"/>
+            <w:hideMark/>
+          </w:tcPr>
+          <w:p>
+            <w:pPr>
+              <w:pStyle w:val="ListParagraph"/>
+              <w:spacing w:after="160" w:line="259" w:lineRule="auto"/>
+              <w:cnfStyle w:val="000000100000" w:firstRow="0" w:lastRow="0" w:firstColumn="0" w:lastColumn="0" w:oddVBand="0" w:evenVBand="0" w:oddHBand="1" w:evenHBand="0" w:firstRowFirstColumn="0" w:firstRowLastColumn="0" w:lastRowFirstColumn="0" w:lastRowLastColumn="0"/>
+              <w:rPr>
+                <w:sz w:val="24"/>
+                <w:szCs w:val="24"/>
+              </w:rPr>
+            </w:pPr>
+            <w:r>
+              <w:rPr>
+                <w:sz w:val="24"/>
+                <w:szCs w:val="24"/>
+              </w:rPr>
+              <w:t>Returns the position of the first occurrence</w:t>
+            </w:r>
+          </w:p>
+        </w:tc>
+        <w:tc>
+          <w:tcPr>
+            <w:tcW w:w="3848" w:type="dxa"/>
+            <w:hideMark/>
+          </w:tcPr>
+          <w:p>
+            <w:pPr>
+              <w:pStyle w:val="ListParagraph"/>
+              <w:spacing w:after="160" w:line="259" w:lineRule="auto"/>
+              <w:cnfStyle w:val="000000100000" w:firstRow="0" w:lastRow="0" w:firstColumn="0" w:lastColumn="0" w:oddVBand="0" w:evenVBand="0" w:oddHBand="1" w:evenHBand="0" w:firstRowFirstColumn="0" w:firstRowLastColumn="0" w:lastRowFirstColumn="0" w:lastRowLastColumn="0"/>
+              <w:rPr>
+                <w:sz w:val="24"/>
+                <w:szCs w:val="24"/>
+              </w:rPr>
+            </w:pPr>
+            <w:r>
+              <w:rPr>
+                <w:sz w:val="24"/>
+                <w:szCs w:val="24"/>
+              </w:rPr>
+              <w:t>"Java</w:t>
+            </w:r>
+            <w:proofErr w:type="gramStart"/>
+            <w:r>
+              <w:rPr>
+                <w:sz w:val="24"/>
+                <w:szCs w:val="24"/>
+              </w:rPr>
+              <w:t>".</w:t>
+            </w:r>
+            <w:proofErr w:type="spellStart"/>
+            <w:r>
+              <w:rPr>
+                <w:sz w:val="24"/>
+                <w:szCs w:val="24"/>
+              </w:rPr>
+              <w:t>indexOf</w:t>
+            </w:r>
+            <w:proofErr w:type="spellEnd"/>
+            <w:proofErr w:type="gramEnd"/>
+            <w:r>
+              <w:rPr>
+                <w:sz w:val="24"/>
+                <w:szCs w:val="24"/>
+              </w:rPr>
+              <w:t>("v")</w:t>
+            </w:r>
+          </w:p>
+        </w:tc>
+        <w:tc>
+          <w:tcPr>
+            <w:tcW w:w="1129" w:type="dxa"/>
+            <w:hideMark/>
+          </w:tcPr>
+          <w:p>
+            <w:pPr>
+              <w:pStyle w:val="ListParagraph"/>
+              <w:spacing w:after="160" w:line="259" w:lineRule="auto"/>
+              <w:cnfStyle w:val="000000100000" w:firstRow="0" w:lastRow="0" w:firstColumn="0" w:lastColumn="0" w:oddVBand="0" w:evenVBand="0" w:oddHBand="1" w:evenHBand="0" w:firstRowFirstColumn="0" w:firstRowLastColumn="0" w:lastRowFirstColumn="0" w:lastRowLastColumn="0"/>
+              <w:rPr>
+                <w:sz w:val="24"/>
+                <w:szCs w:val="24"/>
+              </w:rPr>
+            </w:pPr>
+            <w:r>
+              <w:rPr>
+                <w:sz w:val="24"/>
+                <w:szCs w:val="24"/>
+              </w:rPr>
+              <w:t>2</w:t>
+            </w:r>
+          </w:p>
+        </w:tc>
+      </w:tr>
+      <w:tr>
+        <w:tc>
+          <w:tcPr>
+            <w:cnfStyle w:val="001000000000" w:firstRow="0" w:lastRow="0" w:firstColumn="1" w:lastColumn="0" w:oddVBand="0" w:evenVBand="0" w:oddHBand="0" w:evenHBand="0" w:firstRowFirstColumn="0" w:firstRowLastColumn="0" w:lastRowFirstColumn="0" w:lastRowLastColumn="0"/>
+            <w:tcW w:w="0" w:type="auto"/>
+            <w:hideMark/>
+          </w:tcPr>
+          <w:p>
+            <w:pPr>
+              <w:pStyle w:val="ListParagraph"/>
+              <w:spacing w:after="160" w:line="259" w:lineRule="auto"/>
+              <w:rPr>
+                <w:sz w:val="24"/>
+                <w:szCs w:val="24"/>
+              </w:rPr>
+            </w:pPr>
+            <w:proofErr w:type="spellStart"/>
+            <w:proofErr w:type="gramStart"/>
+            <w:r>
+              <w:rPr>
+                <w:sz w:val="24"/>
+                <w:szCs w:val="24"/>
+              </w:rPr>
+              <w:t>lastIndexOf</w:t>
+            </w:r>
+            <w:proofErr w:type="spellEnd"/>
+            <w:r>
+              <w:rPr>
+                <w:sz w:val="24"/>
+                <w:szCs w:val="24"/>
+              </w:rPr>
+              <w:t>(</w:t>
+            </w:r>
+            <w:proofErr w:type="gramEnd"/>
+            <w:r>
+              <w:rPr>
+                <w:sz w:val="24"/>
+                <w:szCs w:val="24"/>
+              </w:rPr>
+              <w:t>)</w:t>
+            </w:r>
+          </w:p>
+        </w:tc>
+        <w:tc>
+          <w:tcPr>
+            <w:tcW w:w="2466" w:type="dxa"/>
+            <w:hideMark/>
+          </w:tcPr>
+          <w:p>
+            <w:pPr>
+              <w:pStyle w:val="ListParagraph"/>
+              <w:spacing w:after="160" w:line="259" w:lineRule="auto"/>
+              <w:cnfStyle w:val="000000000000" w:firstRow="0" w:lastRow="0" w:firstColumn="0" w:lastColumn="0" w:oddVBand="0" w:evenVBand="0" w:oddHBand="0" w:evenHBand="0" w:firstRowFirstColumn="0" w:firstRowLastColumn="0" w:lastRowFirstColumn="0" w:lastRowLastColumn="0"/>
+              <w:rPr>
+                <w:sz w:val="24"/>
+                <w:szCs w:val="24"/>
+              </w:rPr>
+            </w:pPr>
+            <w:r>
+              <w:rPr>
+                <w:sz w:val="24"/>
+                <w:szCs w:val="24"/>
+              </w:rPr>
+              <w:t>Returns the position of the last occurrence</w:t>
+            </w:r>
+          </w:p>
+        </w:tc>
+        <w:tc>
+          <w:tcPr>
+            <w:tcW w:w="3848" w:type="dxa"/>
+            <w:hideMark/>
+          </w:tcPr>
+          <w:p>
+            <w:pPr>
+              <w:pStyle w:val="ListParagraph"/>
+              <w:spacing w:after="160" w:line="259" w:lineRule="auto"/>
+              <w:cnfStyle w:val="000000000000" w:firstRow="0" w:lastRow="0" w:firstColumn="0" w:lastColumn="0" w:oddVBand="0" w:evenVBand="0" w:oddHBand="0" w:evenHBand="0" w:firstRowFirstColumn="0" w:firstRowLastColumn="0" w:lastRowFirstColumn="0" w:lastRowLastColumn="0"/>
+              <w:rPr>
+                <w:sz w:val="24"/>
+                <w:szCs w:val="24"/>
+              </w:rPr>
+            </w:pPr>
+            <w:r>
+              <w:rPr>
+                <w:sz w:val="24"/>
+                <w:szCs w:val="24"/>
+              </w:rPr>
+              <w:t>"Java Java</w:t>
+            </w:r>
+            <w:proofErr w:type="gramStart"/>
+            <w:r>
+              <w:rPr>
+                <w:sz w:val="24"/>
+                <w:szCs w:val="24"/>
+              </w:rPr>
+              <w:t>".</w:t>
+            </w:r>
+            <w:proofErr w:type="spellStart"/>
+            <w:r>
+              <w:rPr>
+                <w:sz w:val="24"/>
+                <w:szCs w:val="24"/>
+              </w:rPr>
+              <w:t>lastIndexOf</w:t>
+            </w:r>
+            <w:proofErr w:type="spellEnd"/>
+            <w:proofErr w:type="gramEnd"/>
+            <w:r>
+              <w:rPr>
+                <w:sz w:val="24"/>
+                <w:szCs w:val="24"/>
+              </w:rPr>
+              <w:t>("a")</w:t>
+            </w:r>
+          </w:p>
+        </w:tc>
+        <w:tc>
+          <w:tcPr>
+            <w:tcW w:w="1129" w:type="dxa"/>
+            <w:hideMark/>
+          </w:tcPr>
+          <w:p>
+            <w:pPr>
+              <w:pStyle w:val="ListParagraph"/>
+              <w:spacing w:after="160" w:line="259" w:lineRule="auto"/>
+              <w:cnfStyle w:val="000000000000" w:firstRow="0" w:lastRow="0" w:firstColumn="0" w:lastColumn="0" w:oddVBand="0" w:evenVBand="0" w:oddHBand="0" w:evenHBand="0" w:firstRowFirstColumn="0" w:firstRowLastColumn="0" w:lastRowFirstColumn="0" w:lastRowLastColumn="0"/>
+              <w:rPr>
+                <w:sz w:val="24"/>
+                <w:szCs w:val="24"/>
+              </w:rPr>
+            </w:pPr>
+            <w:r>
+              <w:rPr>
+                <w:sz w:val="24"/>
+                <w:szCs w:val="24"/>
+              </w:rPr>
+              <w:t>9</w:t>
+            </w:r>
+          </w:p>
+        </w:tc>
+      </w:tr>
+      <w:tr>
+        <w:trPr>
+          <w:cnfStyle w:val="000000100000" w:firstRow="0" w:lastRow="0" w:firstColumn="0" w:lastColumn="0" w:oddVBand="0" w:evenVBand="0" w:oddHBand="1" w:evenHBand="0" w:firstRowFirstColumn="0" w:firstRowLastColumn="0" w:lastRowFirstColumn="0" w:lastRowLastColumn="0"/>
+        </w:trPr>
+        <w:tc>
+          <w:tcPr>
+            <w:cnfStyle w:val="001000000000" w:firstRow="0" w:lastRow="0" w:firstColumn="1" w:lastColumn="0" w:oddVBand="0" w:evenVBand="0" w:oddHBand="0" w:evenHBand="0" w:firstRowFirstColumn="0" w:firstRowLastColumn="0" w:lastRowFirstColumn="0" w:lastRowLastColumn="0"/>
+            <w:tcW w:w="0" w:type="auto"/>
+            <w:hideMark/>
+          </w:tcPr>
+          <w:p>
+            <w:pPr>
+              <w:pStyle w:val="ListParagraph"/>
+              <w:spacing w:after="160" w:line="259" w:lineRule="auto"/>
+              <w:rPr>
+                <w:sz w:val="24"/>
+                <w:szCs w:val="24"/>
+              </w:rPr>
+            </w:pPr>
+            <w:proofErr w:type="spellStart"/>
+            <w:proofErr w:type="gramStart"/>
+            <w:r>
+              <w:rPr>
+                <w:sz w:val="24"/>
+                <w:szCs w:val="24"/>
+              </w:rPr>
+              <w:t>concat</w:t>
+            </w:r>
+            <w:proofErr w:type="spellEnd"/>
+            <w:r>
+              <w:rPr>
+                <w:sz w:val="24"/>
+                <w:szCs w:val="24"/>
+              </w:rPr>
+              <w:t>(</w:t>
+            </w:r>
+            <w:proofErr w:type="gramEnd"/>
+            <w:r>
+              <w:rPr>
+                <w:sz w:val="24"/>
+                <w:szCs w:val="24"/>
+              </w:rPr>
+              <w:t>)</w:t>
+            </w:r>
+          </w:p>
+        </w:tc>
+        <w:tc>
+          <w:tcPr>
+            <w:tcW w:w="2466" w:type="dxa"/>
+            <w:hideMark/>
+          </w:tcPr>
+          <w:p>
+            <w:pPr>
+              <w:pStyle w:val="ListParagraph"/>
+              <w:spacing w:after="160" w:line="259" w:lineRule="auto"/>
+              <w:cnfStyle w:val="000000100000" w:firstRow="0" w:lastRow="0" w:firstColumn="0" w:lastColumn="0" w:oddVBand="0" w:evenVBand="0" w:oddHBand="1" w:evenHBand="0" w:firstRowFirstColumn="0" w:firstRowLastColumn="0" w:lastRowFirstColumn="0" w:lastRowLastColumn="0"/>
+              <w:rPr>
+                <w:sz w:val="24"/>
+                <w:szCs w:val="24"/>
+              </w:rPr>
+            </w:pPr>
+            <w:r>
+              <w:rPr>
+                <w:sz w:val="24"/>
+                <w:szCs w:val="24"/>
+              </w:rPr>
+              <w:t>Joins two strings together</w:t>
+            </w:r>
+          </w:p>
+        </w:tc>
+        <w:tc>
+          <w:tcPr>
+            <w:tcW w:w="3848" w:type="dxa"/>
+            <w:hideMark/>
+          </w:tcPr>
+          <w:p>
+            <w:pPr>
+              <w:pStyle w:val="ListParagraph"/>
+              <w:spacing w:after="160" w:line="259" w:lineRule="auto"/>
+              <w:cnfStyle w:val="000000100000" w:firstRow="0" w:lastRow="0" w:firstColumn="0" w:lastColumn="0" w:oddVBand="0" w:evenVBand="0" w:oddHBand="1" w:evenHBand="0" w:firstRowFirstColumn="0" w:firstRowLastColumn="0" w:lastRowFirstColumn="0" w:lastRowLastColumn="0"/>
+              <w:rPr>
+                <w:sz w:val="24"/>
+                <w:szCs w:val="24"/>
+              </w:rPr>
+            </w:pPr>
+            <w:r>
+              <w:rPr>
+                <w:sz w:val="24"/>
+                <w:szCs w:val="24"/>
+              </w:rPr>
+              <w:t>"Hello</w:t>
+            </w:r>
+            <w:proofErr w:type="gramStart"/>
+            <w:r>
+              <w:rPr>
+                <w:sz w:val="24"/>
+                <w:szCs w:val="24"/>
+              </w:rPr>
+              <w:t>".</w:t>
+            </w:r>
+            <w:proofErr w:type="spellStart"/>
+            <w:r>
+              <w:rPr>
+                <w:sz w:val="24"/>
+                <w:szCs w:val="24"/>
+              </w:rPr>
+              <w:t>concat</w:t>
+            </w:r>
+            <w:proofErr w:type="spellEnd"/>
+            <w:proofErr w:type="gramEnd"/>
+            <w:r>
+              <w:rPr>
+                <w:sz w:val="24"/>
+                <w:szCs w:val="24"/>
+              </w:rPr>
+              <w:t>(" World")</w:t>
+            </w:r>
+          </w:p>
+        </w:tc>
+        <w:tc>
+          <w:tcPr>
+            <w:tcW w:w="1129" w:type="dxa"/>
+            <w:hideMark/>
+          </w:tcPr>
+          <w:p>
+            <w:pPr>
+              <w:pStyle w:val="ListParagraph"/>
+              <w:spacing w:after="160" w:line="259" w:lineRule="auto"/>
+              <w:cnfStyle w:val="000000100000" w:firstRow="0" w:lastRow="0" w:firstColumn="0" w:lastColumn="0" w:oddVBand="0" w:evenVBand="0" w:oddHBand="1" w:evenHBand="0" w:firstRowFirstColumn="0" w:firstRowLastColumn="0" w:lastRowFirstColumn="0" w:lastRowLastColumn="0"/>
+              <w:rPr>
+                <w:sz w:val="24"/>
+                <w:szCs w:val="24"/>
+              </w:rPr>
+            </w:pPr>
+            <w:r>
+              <w:rPr>
+                <w:sz w:val="24"/>
+                <w:szCs w:val="24"/>
+              </w:rPr>
+              <w:t>Hello World</w:t>
+            </w:r>
+          </w:p>
+        </w:tc>
+      </w:tr>
+      <w:tr>
+        <w:tc>
+          <w:tcPr>
+            <w:cnfStyle w:val="001000000000" w:firstRow="0" w:lastRow="0" w:firstColumn="1" w:lastColumn="0" w:oddVBand="0" w:evenVBand="0" w:oddHBand="0" w:evenHBand="0" w:firstRowFirstColumn="0" w:firstRowLastColumn="0" w:lastRowFirstColumn="0" w:lastRowLastColumn="0"/>
+            <w:tcW w:w="0" w:type="auto"/>
+            <w:hideMark/>
+          </w:tcPr>
+          <w:p>
+            <w:pPr>
+              <w:pStyle w:val="ListParagraph"/>
+              <w:spacing w:after="160" w:line="259" w:lineRule="auto"/>
+              <w:rPr>
+                <w:sz w:val="24"/>
+                <w:szCs w:val="24"/>
+              </w:rPr>
+            </w:pPr>
+            <w:proofErr w:type="spellStart"/>
+            <w:proofErr w:type="gramStart"/>
+            <w:r>
+              <w:rPr>
+                <w:sz w:val="24"/>
+                <w:szCs w:val="24"/>
+              </w:rPr>
+              <w:t>isEmpty</w:t>
+            </w:r>
+            <w:proofErr w:type="spellEnd"/>
+            <w:r>
+              <w:rPr>
+                <w:sz w:val="24"/>
+                <w:szCs w:val="24"/>
+              </w:rPr>
+              <w:t>(</w:t>
+            </w:r>
+            <w:proofErr w:type="gramEnd"/>
+            <w:r>
+              <w:rPr>
+                <w:sz w:val="24"/>
+                <w:szCs w:val="24"/>
+              </w:rPr>
+              <w:t>)</w:t>
+            </w:r>
+          </w:p>
+        </w:tc>
+        <w:tc>
+          <w:tcPr>
+            <w:tcW w:w="2466" w:type="dxa"/>
+            <w:hideMark/>
+          </w:tcPr>
+          <w:p>
+            <w:pPr>
+              <w:pStyle w:val="ListParagraph"/>
+              <w:spacing w:after="160" w:line="259" w:lineRule="auto"/>
+              <w:cnfStyle w:val="000000000000" w:firstRow="0" w:lastRow="0" w:firstColumn="0" w:lastColumn="0" w:oddVBand="0" w:evenVBand="0" w:oddHBand="0" w:evenHBand="0" w:firstRowFirstColumn="0" w:firstRowLastColumn="0" w:lastRowFirstColumn="0" w:lastRowLastColumn="0"/>
+              <w:rPr>
+                <w:sz w:val="24"/>
+                <w:szCs w:val="24"/>
+              </w:rPr>
+            </w:pPr>
+            <w:r>
+              <w:rPr>
+                <w:sz w:val="24"/>
+                <w:szCs w:val="24"/>
+              </w:rPr>
+              <w:t>Checks if a string has no characters</w:t>
+            </w:r>
+          </w:p>
+        </w:tc>
+        <w:tc>
+          <w:tcPr>
+            <w:tcW w:w="3848" w:type="dxa"/>
+            <w:hideMark/>
+          </w:tcPr>
+          <w:p>
+            <w:pPr>
+              <w:pStyle w:val="ListParagraph"/>
+              <w:spacing w:after="160" w:line="259" w:lineRule="auto"/>
+              <w:cnfStyle w:val="000000000000" w:firstRow="0" w:lastRow="0" w:firstColumn="0" w:lastColumn="0" w:oddVBand="0" w:evenVBand="0" w:oddHBand="0" w:evenHBand="0" w:firstRowFirstColumn="0" w:firstRowLastColumn="0" w:lastRowFirstColumn="0" w:lastRowLastColumn="0"/>
+              <w:rPr>
+                <w:sz w:val="24"/>
+                <w:szCs w:val="24"/>
+              </w:rPr>
+            </w:pPr>
+            <w:r>
+              <w:rPr>
+                <w:sz w:val="24"/>
+                <w:szCs w:val="24"/>
+              </w:rPr>
+              <w:t>"</w:t>
+            </w:r>
+            <w:proofErr w:type="gramStart"/>
+            <w:r>
+              <w:rPr>
+                <w:sz w:val="24"/>
+                <w:szCs w:val="24"/>
+              </w:rPr>
+              <w:t>".</w:t>
+            </w:r>
+            <w:proofErr w:type="spellStart"/>
+            <w:r>
+              <w:rPr>
+                <w:sz w:val="24"/>
+                <w:szCs w:val="24"/>
+              </w:rPr>
+              <w:t>isEmpty</w:t>
+            </w:r>
+            <w:proofErr w:type="spellEnd"/>
+            <w:proofErr w:type="gramEnd"/>
+            <w:r>
+              <w:rPr>
+                <w:sz w:val="24"/>
+                <w:szCs w:val="24"/>
+              </w:rPr>
+              <w:t>()</w:t>
+            </w:r>
+          </w:p>
+        </w:tc>
+        <w:tc>
+          <w:tcPr>
+            <w:tcW w:w="1129" w:type="dxa"/>
+            <w:hideMark/>
+          </w:tcPr>
+          <w:p>
+            <w:pPr>
+              <w:pStyle w:val="ListParagraph"/>
+              <w:spacing w:after="160" w:line="259" w:lineRule="auto"/>
+              <w:cnfStyle w:val="000000000000" w:firstRow="0" w:lastRow="0" w:firstColumn="0" w:lastColumn="0" w:oddVBand="0" w:evenVBand="0" w:oddHBand="0" w:evenHBand="0" w:firstRowFirstColumn="0" w:firstRowLastColumn="0" w:lastRowFirstColumn="0" w:lastRowLastColumn="0"/>
+              <w:rPr>
+                <w:sz w:val="24"/>
+                <w:szCs w:val="24"/>
+              </w:rPr>
+            </w:pPr>
+            <w:r>
+              <w:rPr>
+                <w:sz w:val="24"/>
+                <w:szCs w:val="24"/>
+              </w:rPr>
+              <w:t>true</w:t>
+            </w:r>
+          </w:p>
+        </w:tc>
+      </w:tr>
+      <w:tr>
+        <w:trPr>
+          <w:cnfStyle w:val="000000100000" w:firstRow="0" w:lastRow="0" w:firstColumn="0" w:lastColumn="0" w:oddVBand="0" w:evenVBand="0" w:oddHBand="1" w:evenHBand="0" w:firstRowFirstColumn="0" w:firstRowLastColumn="0" w:lastRowFirstColumn="0" w:lastRowLastColumn="0"/>
+        </w:trPr>
+        <w:tc>
+          <w:tcPr>
+            <w:cnfStyle w:val="001000000000" w:firstRow="0" w:lastRow="0" w:firstColumn="1" w:lastColumn="0" w:oddVBand="0" w:evenVBand="0" w:oddHBand="0" w:evenHBand="0" w:firstRowFirstColumn="0" w:firstRowLastColumn="0" w:lastRowFirstColumn="0" w:lastRowLastColumn="0"/>
+            <w:tcW w:w="0" w:type="auto"/>
+            <w:hideMark/>
+          </w:tcPr>
+          <w:p>
+            <w:pPr>
+              <w:pStyle w:val="ListParagraph"/>
+              <w:spacing w:after="160" w:line="259" w:lineRule="auto"/>
+              <w:rPr>
+                <w:sz w:val="24"/>
+                <w:szCs w:val="24"/>
+              </w:rPr>
+            </w:pPr>
+            <w:proofErr w:type="gramStart"/>
+            <w:r>
+              <w:rPr>
+                <w:sz w:val="24"/>
+                <w:szCs w:val="24"/>
+              </w:rPr>
+              <w:t>join(</w:t>
+            </w:r>
+            <w:proofErr w:type="gramEnd"/>
+            <w:r>
+              <w:rPr>
+                <w:sz w:val="24"/>
+                <w:szCs w:val="24"/>
+              </w:rPr>
+              <w:t>)</w:t>
+            </w:r>
+          </w:p>
+        </w:tc>
+        <w:tc>
+          <w:tcPr>
+            <w:tcW w:w="2466" w:type="dxa"/>
+            <w:hideMark/>
+          </w:tcPr>
+          <w:p>
+            <w:pPr>
+              <w:pStyle w:val="ListParagraph"/>
+              <w:spacing w:after="160" w:line="259" w:lineRule="auto"/>
+              <w:cnfStyle w:val="000000100000" w:firstRow="0" w:lastRow="0" w:firstColumn="0" w:lastColumn="0" w:oddVBand="0" w:evenVBand="0" w:oddHBand="1" w:evenHBand="0" w:firstRowFirstColumn="0" w:firstRowLastColumn="0" w:lastRowFirstColumn="0" w:lastRowLastColumn="0"/>
+              <w:rPr>
+                <w:sz w:val="24"/>
+                <w:szCs w:val="24"/>
+              </w:rPr>
+            </w:pPr>
+            <w:r>
+              <w:rPr>
+                <w:sz w:val="24"/>
+                <w:szCs w:val="24"/>
+              </w:rPr>
+              <w:t>Joins multiple strings with a separator</w:t>
+            </w:r>
+          </w:p>
+        </w:tc>
+        <w:tc>
+          <w:tcPr>
+            <w:tcW w:w="3848" w:type="dxa"/>
+            <w:hideMark/>
+          </w:tcPr>
+          <w:p>
+            <w:pPr>
+              <w:pStyle w:val="ListParagraph"/>
+              <w:spacing w:after="160" w:line="259" w:lineRule="auto"/>
+              <w:cnfStyle w:val="000000100000" w:firstRow="0" w:lastRow="0" w:firstColumn="0" w:lastColumn="0" w:oddVBand="0" w:evenVBand="0" w:oddHBand="1" w:evenHBand="0" w:firstRowFirstColumn="0" w:firstRowLastColumn="0" w:lastRowFirstColumn="0" w:lastRowLastColumn="0"/>
+              <w:rPr>
+                <w:sz w:val="24"/>
+                <w:szCs w:val="24"/>
+              </w:rPr>
+            </w:pPr>
+            <w:proofErr w:type="spellStart"/>
+            <w:r>
+              <w:rPr>
+                <w:sz w:val="24"/>
+                <w:szCs w:val="24"/>
+              </w:rPr>
+              <w:t>String.join</w:t>
+            </w:r>
+            <w:proofErr w:type="spellEnd"/>
+            <w:r>
+              <w:rPr>
+                <w:sz w:val="24"/>
+                <w:szCs w:val="24"/>
+              </w:rPr>
+              <w:t>("-", "A","B","C")</w:t>
+            </w:r>
+          </w:p>
+        </w:tc>
+        <w:tc>
+          <w:tcPr>
+            <w:tcW w:w="1129" w:type="dxa"/>
+            <w:hideMark/>
+          </w:tcPr>
+          <w:p>
+            <w:pPr>
+              <w:pStyle w:val="ListParagraph"/>
+              <w:spacing w:after="160" w:line="259" w:lineRule="auto"/>
+              <w:cnfStyle w:val="000000100000" w:firstRow="0" w:lastRow="0" w:firstColumn="0" w:lastColumn="0" w:oddVBand="0" w:evenVBand="0" w:oddHBand="1" w:evenHBand="0" w:firstRowFirstColumn="0" w:firstRowLastColumn="0" w:lastRowFirstColumn="0" w:lastRowLastColumn="0"/>
+              <w:rPr>
+                <w:sz w:val="24"/>
+                <w:szCs w:val="24"/>
+              </w:rPr>
+            </w:pPr>
+            <w:r>
+              <w:rPr>
+                <w:sz w:val="24"/>
+                <w:szCs w:val="24"/>
+              </w:rPr>
+              <w:t>A-B-C</w:t>
+            </w:r>
+          </w:p>
+        </w:tc>
+      </w:tr>
+      <w:tr>
+        <w:tc>
+          <w:tcPr>
+            <w:cnfStyle w:val="001000000000" w:firstRow="0" w:lastRow="0" w:firstColumn="1" w:lastColumn="0" w:oddVBand="0" w:evenVBand="0" w:oddHBand="0" w:evenHBand="0" w:firstRowFirstColumn="0" w:firstRowLastColumn="0" w:lastRowFirstColumn="0" w:lastRowLastColumn="0"/>
+            <w:tcW w:w="0" w:type="auto"/>
+            <w:hideMark/>
+          </w:tcPr>
+          <w:p>
+            <w:pPr>
+              <w:pStyle w:val="ListParagraph"/>
+              <w:spacing w:after="160" w:line="259" w:lineRule="auto"/>
+              <w:rPr>
+                <w:sz w:val="24"/>
+                <w:szCs w:val="24"/>
+              </w:rPr>
+            </w:pPr>
+            <w:proofErr w:type="spellStart"/>
+            <w:proofErr w:type="gramStart"/>
+            <w:r>
+              <w:rPr>
+                <w:sz w:val="24"/>
+                <w:szCs w:val="24"/>
+              </w:rPr>
+              <w:t>compareTo</w:t>
+            </w:r>
+            <w:proofErr w:type="spellEnd"/>
+            <w:r>
+              <w:rPr>
+                <w:sz w:val="24"/>
+                <w:szCs w:val="24"/>
+              </w:rPr>
+              <w:t>(</w:t>
+            </w:r>
+            <w:proofErr w:type="gramEnd"/>
+            <w:r>
+              <w:rPr>
+                <w:sz w:val="24"/>
+                <w:szCs w:val="24"/>
+              </w:rPr>
+              <w:t>)</w:t>
+            </w:r>
+          </w:p>
+        </w:tc>
+        <w:tc>
+          <w:tcPr>
+            <w:tcW w:w="2466" w:type="dxa"/>
+            <w:hideMark/>
+          </w:tcPr>
+          <w:p>
+            <w:pPr>
+              <w:pStyle w:val="ListParagraph"/>
+              <w:spacing w:after="160" w:line="259" w:lineRule="auto"/>
+              <w:cnfStyle w:val="000000000000" w:firstRow="0" w:lastRow="0" w:firstColumn="0" w:lastColumn="0" w:oddVBand="0" w:evenVBand="0" w:oddHBand="0" w:evenHBand="0" w:firstRowFirstColumn="0" w:firstRowLastColumn="0" w:lastRowFirstColumn="0" w:lastRowLastColumn="0"/>
+              <w:rPr>
+                <w:sz w:val="24"/>
+                <w:szCs w:val="24"/>
+              </w:rPr>
+            </w:pPr>
+            <w:r>
+              <w:rPr>
+                <w:sz w:val="24"/>
+                <w:szCs w:val="24"/>
+              </w:rPr>
+              <w:t>Compares two strings lexicographically</w:t>
+            </w:r>
+          </w:p>
+        </w:tc>
+        <w:tc>
+          <w:tcPr>
+            <w:tcW w:w="3848" w:type="dxa"/>
+            <w:hideMark/>
+          </w:tcPr>
+          <w:p>
+            <w:pPr>
+              <w:pStyle w:val="ListParagraph"/>
+              <w:spacing w:after="160" w:line="259" w:lineRule="auto"/>
+              <w:cnfStyle w:val="000000000000" w:firstRow="0" w:lastRow="0" w:firstColumn="0" w:lastColumn="0" w:oddVBand="0" w:evenVBand="0" w:oddHBand="0" w:evenHBand="0" w:firstRowFirstColumn="0" w:firstRowLastColumn="0" w:lastRowFirstColumn="0" w:lastRowLastColumn="0"/>
+              <w:rPr>
+                <w:sz w:val="24"/>
+                <w:szCs w:val="24"/>
+              </w:rPr>
+            </w:pPr>
+            <w:r>
+              <w:rPr>
+                <w:sz w:val="24"/>
+                <w:szCs w:val="24"/>
+              </w:rPr>
+              <w:t>"A</w:t>
+            </w:r>
+            <w:proofErr w:type="gramStart"/>
+            <w:r>
+              <w:rPr>
+                <w:sz w:val="24"/>
+                <w:szCs w:val="24"/>
+              </w:rPr>
+              <w:t>".</w:t>
+            </w:r>
+            <w:proofErr w:type="spellStart"/>
+            <w:r>
+              <w:rPr>
+                <w:sz w:val="24"/>
+                <w:szCs w:val="24"/>
+              </w:rPr>
+              <w:t>compareTo</w:t>
+            </w:r>
+            <w:proofErr w:type="spellEnd"/>
+            <w:proofErr w:type="gramEnd"/>
+            <w:r>
+              <w:rPr>
+                <w:sz w:val="24"/>
+                <w:szCs w:val="24"/>
+              </w:rPr>
+              <w:t>("B")</w:t>
+            </w:r>
+          </w:p>
+        </w:tc>
+        <w:tc>
+          <w:tcPr>
+            <w:tcW w:w="1129" w:type="dxa"/>
+            <w:hideMark/>
+          </w:tcPr>
+          <w:p>
+            <w:pPr>
+              <w:pStyle w:val="ListParagraph"/>
+              <w:spacing w:after="160" w:line="259" w:lineRule="auto"/>
+              <w:cnfStyle w:val="000000000000" w:firstRow="0" w:lastRow="0" w:firstColumn="0" w:lastColumn="0" w:oddVBand="0" w:evenVBand="0" w:oddHBand="0" w:evenHBand="0" w:firstRowFirstColumn="0" w:firstRowLastColumn="0" w:lastRowFirstColumn="0" w:lastRowLastColumn="0"/>
+              <w:rPr>
+                <w:sz w:val="24"/>
+                <w:szCs w:val="24"/>
+              </w:rPr>
+            </w:pPr>
+            <w:r>
+              <w:rPr>
+                <w:sz w:val="24"/>
+                <w:szCs w:val="24"/>
+              </w:rPr>
+              <w:t>Negative value</w:t>
+            </w:r>
+          </w:p>
+        </w:tc>
+      </w:tr>
+    </w:tbl>
+    <w:p>
+      <w:pPr>
+        <w:pStyle w:val="ListParagraph"/>
+        <w:rPr>
+          <w:sz w:val="24"/>
+          <w:szCs w:val="24"/>
+        </w:rPr>
+      </w:pPr>
+    </w:p>
+    <w:p>
+      <w:pPr>
+        <w:pStyle w:val="ListParagraph"/>
+        <w:rPr>
+          <w:sz w:val="24"/>
+          <w:szCs w:val="24"/>
+        </w:rPr>
+      </w:pPr>
+    </w:p>
+    <w:p>
+      <w:pPr>
+        <w:pStyle w:val="ListParagraph"/>
+        <w:rPr>
+          <w:sz w:val="24"/>
+          <w:szCs w:val="24"/>
+        </w:rPr>
+      </w:pPr>
+    </w:p>
+    <w:p>
+      <w:pPr>
+        <w:pStyle w:val="ListParagraph"/>
+        <w:rPr>
+          <w:sz w:val="24"/>
+          <w:szCs w:val="24"/>
+        </w:rPr>
+      </w:pPr>
+    </w:p>
+    <w:p>
+      <w:pPr>
+        <w:pStyle w:val="ListParagraph"/>
+        <w:rPr>
+          <w:sz w:val="24"/>
+          <w:szCs w:val="24"/>
+        </w:rPr>
+      </w:pPr>
+    </w:p>
+    <w:p>
+      <w:pPr>
+        <w:pStyle w:val="ListParagraph"/>
+        <w:rPr>
+          <w:sz w:val="24"/>
+          <w:szCs w:val="24"/>
+        </w:rPr>
+      </w:pPr>
+    </w:p>
+    <w:p>
+      <w:pPr>
+        <w:pStyle w:val="ListParagraph"/>
+        <w:rPr>
+          <w:sz w:val="24"/>
+          <w:szCs w:val="24"/>
+        </w:rPr>
+      </w:pPr>
+    </w:p>
+    <w:p>
+      <w:pPr>
+        <w:pStyle w:val="ListParagraph"/>
+        <w:rPr>
+          <w:b/>
+          <w:bCs/>
+          <w:sz w:val="24"/>
+          <w:szCs w:val="24"/>
+        </w:rPr>
+      </w:pPr>
+      <w:r>
+        <w:rPr>
+          <w:b/>
+          <w:bCs/>
+          <w:sz w:val="24"/>
+          <w:szCs w:val="24"/>
+        </w:rPr>
+        <w:lastRenderedPageBreak/>
         <w:t>Array</w:t>
       </w:r>
       <w:r>
@@ -2048,21 +5557,7 @@
           <w:sz w:val="24"/>
           <w:szCs w:val="24"/>
         </w:rPr>
-        <w:t xml:space="preserve">A blueprint for creating objects that define data (fields) and </w:t>
-      </w:r>
-      <w:r>
-        <w:rPr>
-          <w:sz w:val="24"/>
-          <w:szCs w:val="24"/>
-        </w:rPr>
-        <w:t>behaviour</w:t>
-      </w:r>
-      <w:r>
-        <w:rPr>
-          <w:sz w:val="24"/>
-          <w:szCs w:val="24"/>
-        </w:rPr>
-        <w:t xml:space="preserve"> (methods).</w:t>
+        <w:t>A blueprint for creating objects that define data (fields) and behaviour (methods).</w:t>
       </w:r>
       <w:r>
         <w:rPr>
@@ -2206,7 +5701,7 @@
           <w:sz w:val="24"/>
           <w:szCs w:val="24"/>
         </w:rPr>
-        <w:t>(Java 16+</w:t>
+        <w:t>(Java 16+)</w:t>
       </w:r>
       <w:r>
         <w:rPr>
@@ -2217,46 +5712,35 @@
           <w:sz w:val="24"/>
           <w:szCs w:val="24"/>
         </w:rPr>
-        <w:t>)</w:t>
-      </w:r>
-      <w:r>
-        <w:rPr>
-          <w:b/>
-          <w:bCs/>
+        <w:t xml:space="preserve">: </w:t>
+      </w:r>
+      <w:r>
+        <w:rPr>
           <w:i/>
           <w:iCs/>
           <w:sz w:val="24"/>
           <w:szCs w:val="24"/>
         </w:rPr>
-        <w:t xml:space="preserve">: </w:t>
-      </w:r>
-      <w:r>
-        <w:rPr>
+        <w:t>A special class used to create immutable data objects with minimal</w:t>
+      </w:r>
+      <w:r>
+        <w:rPr>
+          <w:b/>
+          <w:bCs/>
           <w:i/>
           <w:iCs/>
           <w:sz w:val="24"/>
           <w:szCs w:val="24"/>
         </w:rPr>
-        <w:t>A special class used to create immutable data objects with minimal</w:t>
-      </w:r>
-      <w:r>
-        <w:rPr>
-          <w:b/>
-          <w:bCs/>
+        <w:t xml:space="preserve"> </w:t>
+      </w:r>
+      <w:r>
+        <w:rPr>
           <w:i/>
           <w:iCs/>
           <w:sz w:val="24"/>
           <w:szCs w:val="24"/>
         </w:rPr>
-        <w:t xml:space="preserve"> </w:t>
-      </w:r>
-      <w:r>
-        <w:rPr>
-          <w:i/>
-          <w:iCs/>
-          <w:sz w:val="24"/>
-          <w:szCs w:val="24"/>
-        </w:rPr>
         <w:t>code.</w:t>
       </w:r>
       <w:r>
@@ -2272,18 +5756,37 @@
     <w:p/>
     <w:p>
       <w:pPr>
-        <w:rPr>
-          <w:b/>
-          <w:bCs/>
-        </w:rPr>
-      </w:pPr>
-      <w:r>
-        <w:rPr>
-          <w:b/>
-          <w:bCs/>
-        </w:rPr>
-        <w:t>4. Control Flow</w:t>
-      </w:r>
+        <w:ind w:left="45"/>
+        <w:rPr>
+          <w:b/>
+          <w:bCs/>
+          <w:u w:val="single"/>
+        </w:rPr>
+      </w:pPr>
+      <w:r>
+        <w:rPr>
+          <w:b/>
+          <w:bCs/>
+          <w:u w:val="single"/>
+        </w:rPr>
+        <w:t xml:space="preserve">2. </w:t>
+      </w:r>
+      <w:r>
+        <w:rPr>
+          <w:b/>
+          <w:bCs/>
+          <w:u w:val="single"/>
+        </w:rPr>
+        <w:t>Modifiers, Variables and Constants</w:t>
+      </w:r>
+    </w:p>
+    <w:p>
+      <w:pPr>
+        <w:rPr>
+          <w:b/>
+          <w:bCs/>
+        </w:rPr>
+      </w:pPr>
     </w:p>
     <w:sectPr>
       <w:pgSz w:w="11906" w:h="16838"/>
@@ -2924,6 +6427,95 @@
     </w:lvl>
   </w:abstractNum>
   <w:abstractNum w:abstractNumId="6" w15:restartNumberingAfterBreak="0">
+    <w:nsid w:val="58381389"/>
+    <w:multiLevelType w:val="hybridMultilevel"/>
+    <w:tmpl w:val="56489F34"/>
+    <w:lvl w:ilvl="0" w:tplc="A252AA2E">
+      <w:start w:val="1"/>
+      <w:numFmt w:val="decimal"/>
+      <w:lvlText w:val="%1."/>
+      <w:lvlJc w:val="left"/>
+      <w:pPr>
+        <w:ind w:left="405" w:hanging="360"/>
+      </w:pPr>
+      <w:rPr>
+        <w:rFonts w:hint="default"/>
+      </w:rPr>
+    </w:lvl>
+    <w:lvl w:ilvl="1" w:tplc="4C090019" w:tentative="1">
+      <w:start w:val="1"/>
+      <w:numFmt w:val="lowerLetter"/>
+      <w:lvlText w:val="%2."/>
+      <w:lvlJc w:val="left"/>
+      <w:pPr>
+        <w:ind w:left="1125" w:hanging="360"/>
+      </w:pPr>
+    </w:lvl>
+    <w:lvl w:ilvl="2" w:tplc="4C09001B" w:tentative="1">
+      <w:start w:val="1"/>
+      <w:numFmt w:val="lowerRoman"/>
+      <w:lvlText w:val="%3."/>
+      <w:lvlJc w:val="right"/>
+      <w:pPr>
+        <w:ind w:left="1845" w:hanging="180"/>
+      </w:pPr>
+    </w:lvl>
+    <w:lvl w:ilvl="3" w:tplc="4C09000F" w:tentative="1">
+      <w:start w:val="1"/>
+      <w:numFmt w:val="decimal"/>
+      <w:lvlText w:val="%4."/>
+      <w:lvlJc w:val="left"/>
+      <w:pPr>
+        <w:ind w:left="2565" w:hanging="360"/>
+      </w:pPr>
+    </w:lvl>
+    <w:lvl w:ilvl="4" w:tplc="4C090019" w:tentative="1">
+      <w:start w:val="1"/>
+      <w:numFmt w:val="lowerLetter"/>
+      <w:lvlText w:val="%5."/>
+      <w:lvlJc w:val="left"/>
+      <w:pPr>
+        <w:ind w:left="3285" w:hanging="360"/>
+      </w:pPr>
+    </w:lvl>
+    <w:lvl w:ilvl="5" w:tplc="4C09001B" w:tentative="1">
+      <w:start w:val="1"/>
+      <w:numFmt w:val="lowerRoman"/>
+      <w:lvlText w:val="%6."/>
+      <w:lvlJc w:val="right"/>
+      <w:pPr>
+        <w:ind w:left="4005" w:hanging="180"/>
+      </w:pPr>
+    </w:lvl>
+    <w:lvl w:ilvl="6" w:tplc="4C09000F" w:tentative="1">
+      <w:start w:val="1"/>
+      <w:numFmt w:val="decimal"/>
+      <w:lvlText w:val="%7."/>
+      <w:lvlJc w:val="left"/>
+      <w:pPr>
+        <w:ind w:left="4725" w:hanging="360"/>
+      </w:pPr>
+    </w:lvl>
+    <w:lvl w:ilvl="7" w:tplc="4C090019" w:tentative="1">
+      <w:start w:val="1"/>
+      <w:numFmt w:val="lowerLetter"/>
+      <w:lvlText w:val="%8."/>
+      <w:lvlJc w:val="left"/>
+      <w:pPr>
+        <w:ind w:left="5445" w:hanging="360"/>
+      </w:pPr>
+    </w:lvl>
+    <w:lvl w:ilvl="8" w:tplc="4C09001B" w:tentative="1">
+      <w:start w:val="1"/>
+      <w:numFmt w:val="lowerRoman"/>
+      <w:lvlText w:val="%9."/>
+      <w:lvlJc w:val="right"/>
+      <w:pPr>
+        <w:ind w:left="6165" w:hanging="180"/>
+      </w:pPr>
+    </w:lvl>
+  </w:abstractNum>
+  <w:abstractNum w:abstractNumId="7" w15:restartNumberingAfterBreak="0">
     <w:nsid w:val="770B2AED"/>
     <w:multiLevelType w:val="hybridMultilevel"/>
     <w:tmpl w:val="E334FAA2"/>
@@ -3036,7 +6628,7 @@
       </w:rPr>
     </w:lvl>
   </w:abstractNum>
-  <w:abstractNum w:abstractNumId="7" w15:restartNumberingAfterBreak="0">
+  <w:abstractNum w:abstractNumId="8" w15:restartNumberingAfterBreak="0">
     <w:nsid w:val="7BE67E43"/>
     <w:multiLevelType w:val="hybridMultilevel"/>
     <w:tmpl w:val="4F446838"/>
@@ -3162,16 +6754,19 @@
     <w:abstractNumId w:val="4"/>
   </w:num>
   <w:num w:numId="5" w16cid:durableId="1167330143">
-    <w:abstractNumId w:val="7"/>
+    <w:abstractNumId w:val="8"/>
   </w:num>
   <w:num w:numId="6" w16cid:durableId="2061400478">
-    <w:abstractNumId w:val="6"/>
+    <w:abstractNumId w:val="7"/>
   </w:num>
   <w:num w:numId="7" w16cid:durableId="1402633030">
     <w:abstractNumId w:val="1"/>
   </w:num>
   <w:num w:numId="8" w16cid:durableId="308097594">
     <w:abstractNumId w:val="0"/>
+  </w:num>
+  <w:num w:numId="9" w16cid:durableId="205677">
+    <w:abstractNumId w:val="6"/>
   </w:num>
 </w:numbering>
 </file>
@@ -4160,6 +7755,69 @@
       <w:szCs w:val="20"/>
     </w:rPr>
   </w:style>
+  <w:style w:type="table" w:styleId="PlainTable1">
+    <w:name w:val="Plain Table 1"/>
+    <w:basedOn w:val="TableNormal"/>
+    <w:uiPriority w:val="41"/>
+    <w:rsid w:val="00B46378"/>
+    <w:pPr>
+      <w:spacing w:after="0" w:line="240" w:lineRule="auto"/>
+    </w:pPr>
+    <w:tblPr>
+      <w:tblStyleRowBandSize w:val="1"/>
+      <w:tblStyleColBandSize w:val="1"/>
+      <w:tblBorders>
+        <w:top w:val="single" w:sz="4" w:space="0" w:color="BFBFBF" w:themeColor="background1" w:themeShade="BF"/>
+        <w:left w:val="single" w:sz="4" w:space="0" w:color="BFBFBF" w:themeColor="background1" w:themeShade="BF"/>
+        <w:bottom w:val="single" w:sz="4" w:space="0" w:color="BFBFBF" w:themeColor="background1" w:themeShade="BF"/>
+        <w:right w:val="single" w:sz="4" w:space="0" w:color="BFBFBF" w:themeColor="background1" w:themeShade="BF"/>
+        <w:insideH w:val="single" w:sz="4" w:space="0" w:color="BFBFBF" w:themeColor="background1" w:themeShade="BF"/>
+        <w:insideV w:val="single" w:sz="4" w:space="0" w:color="BFBFBF" w:themeColor="background1" w:themeShade="BF"/>
+      </w:tblBorders>
+    </w:tblPr>
+    <w:tblStylePr w:type="firstRow">
+      <w:rPr>
+        <w:b/>
+        <w:bCs/>
+      </w:rPr>
+    </w:tblStylePr>
+    <w:tblStylePr w:type="lastRow">
+      <w:rPr>
+        <w:b/>
+        <w:bCs/>
+      </w:rPr>
+      <w:tblPr/>
+      <w:tcPr>
+        <w:tcBorders>
+          <w:top w:val="double" w:sz="4" w:space="0" w:color="BFBFBF" w:themeColor="background1" w:themeShade="BF"/>
+        </w:tcBorders>
+      </w:tcPr>
+    </w:tblStylePr>
+    <w:tblStylePr w:type="firstCol">
+      <w:rPr>
+        <w:b/>
+        <w:bCs/>
+      </w:rPr>
+    </w:tblStylePr>
+    <w:tblStylePr w:type="lastCol">
+      <w:rPr>
+        <w:b/>
+        <w:bCs/>
+      </w:rPr>
+    </w:tblStylePr>
+    <w:tblStylePr w:type="band1Vert">
+      <w:tblPr/>
+      <w:tcPr>
+        <w:shd w:val="clear" w:color="auto" w:fill="F2F2F2" w:themeFill="background1" w:themeFillShade="F2"/>
+      </w:tcPr>
+    </w:tblStylePr>
+    <w:tblStylePr w:type="band1Horz">
+      <w:tblPr/>
+      <w:tcPr>
+        <w:shd w:val="clear" w:color="auto" w:fill="F2F2F2" w:themeFill="background1" w:themeFillShade="F2"/>
+      </w:tcPr>
+    </w:tblStylePr>
+  </w:style>
 </w:styles>
 </file>
 

</xml_diff>

<commit_message>
Arrays Internally in Java  #17
</commit_message>
<xml_diff>
--- a/Chapter3/CH3.docx
+++ b/Chapter3/CH3.docx
@@ -503,17 +503,12 @@
         <w:t xml:space="preserve">Type mismatch: cannot convert from String to </w:t>
       </w:r>
       <w:proofErr w:type="spellStart"/>
-      <w:proofErr w:type="gramStart"/>
       <w:r>
         <w:t>intJava</w:t>
       </w:r>
       <w:proofErr w:type="spellEnd"/>
       <w:r>
-        <w:t>(</w:t>
-      </w:r>
-      <w:proofErr w:type="gramEnd"/>
-      <w:r>
-        <w:t>16777233)</w:t>
+        <w:t>(16777233)</w:t>
       </w:r>
       <w:r>
         <w:t>” Error.</w:t>
@@ -2159,14 +2154,7 @@
           <w:sz w:val="24"/>
           <w:szCs w:val="24"/>
         </w:rPr>
-        <w:t xml:space="preserve"> and </w:t>
-      </w:r>
-      <w:r>
-        <w:rPr>
-          <w:sz w:val="24"/>
-          <w:szCs w:val="24"/>
-        </w:rPr>
-        <w:t>e</w:t>
+        <w:t xml:space="preserve"> and e</w:t>
       </w:r>
       <w:r>
         <w:rPr>
@@ -2275,23 +2263,7 @@
           <w:sz w:val="24"/>
           <w:szCs w:val="24"/>
         </w:rPr>
-        <w:t>when you create a string using a literal, like String name = "Java</w:t>
-      </w:r>
-      <w:proofErr w:type="gramStart"/>
-      <w:r>
-        <w:rPr>
-          <w:sz w:val="24"/>
-          <w:szCs w:val="24"/>
-        </w:rPr>
-        <w:t>";,</w:t>
-      </w:r>
-      <w:proofErr w:type="gramEnd"/>
-      <w:r>
-        <w:rPr>
-          <w:sz w:val="24"/>
-          <w:szCs w:val="24"/>
-        </w:rPr>
-        <w:t xml:space="preserve"> allowing Java to reuse existing string objects and save memory. Java stores strings in the </w:t>
+        <w:t xml:space="preserve">when you create a string using a literal, like String name = "Java";, allowing Java to reuse existing string objects and save memory. Java stores strings in the </w:t>
       </w:r>
       <w:r>
         <w:rPr>
@@ -2307,39 +2279,7 @@
           <w:sz w:val="24"/>
           <w:szCs w:val="24"/>
         </w:rPr>
-        <w:t xml:space="preserve"> when you create them using new, like String name = new </w:t>
-      </w:r>
-      <w:proofErr w:type="gramStart"/>
-      <w:r>
-        <w:rPr>
-          <w:sz w:val="24"/>
-          <w:szCs w:val="24"/>
-        </w:rPr>
-        <w:t>String(</w:t>
-      </w:r>
-      <w:proofErr w:type="gramEnd"/>
-      <w:r>
-        <w:rPr>
-          <w:sz w:val="24"/>
-          <w:szCs w:val="24"/>
-        </w:rPr>
-        <w:t>"Java"</w:t>
-      </w:r>
-      <w:proofErr w:type="gramStart"/>
-      <w:r>
-        <w:rPr>
-          <w:sz w:val="24"/>
-          <w:szCs w:val="24"/>
-        </w:rPr>
-        <w:t>);,</w:t>
-      </w:r>
-      <w:proofErr w:type="gramEnd"/>
-      <w:r>
-        <w:rPr>
-          <w:sz w:val="24"/>
-          <w:szCs w:val="24"/>
-        </w:rPr>
-        <w:t xml:space="preserve"> which creates a separate string object even if the same value already exists in the pool.</w:t>
+        <w:t xml:space="preserve"> when you create them using new, like String name = new String("Java");, which creates a separate string object even if the same value already exists in the pool.</w:t>
       </w:r>
     </w:p>
     <w:p>
@@ -2664,21 +2604,12 @@
                 <w:szCs w:val="24"/>
               </w:rPr>
             </w:pPr>
-            <w:proofErr w:type="gramStart"/>
-            <w:r>
-              <w:rPr>
-                <w:sz w:val="24"/>
-                <w:szCs w:val="24"/>
-              </w:rPr>
-              <w:t>length(</w:t>
-            </w:r>
-            <w:proofErr w:type="gramEnd"/>
-            <w:r>
-              <w:rPr>
-                <w:sz w:val="24"/>
-                <w:szCs w:val="24"/>
-              </w:rPr>
-              <w:t>)</w:t>
+            <w:r>
+              <w:rPr>
+                <w:sz w:val="24"/>
+                <w:szCs w:val="24"/>
+              </w:rPr>
+              <w:t>length()</w:t>
             </w:r>
           </w:p>
         </w:tc>
@@ -2734,18 +2665,9 @@
                 <w:sz w:val="24"/>
                 <w:szCs w:val="24"/>
               </w:rPr>
-              <w:t>Java</w:t>
-            </w:r>
-            <w:proofErr w:type="gramStart"/>
-            <w:r>
-              <w:rPr>
-                <w:sz w:val="24"/>
-                <w:szCs w:val="24"/>
-              </w:rPr>
-              <w:t>".length</w:t>
+              <w:t>Java".length</w:t>
             </w:r>
             <w:proofErr w:type="spellEnd"/>
-            <w:proofErr w:type="gramEnd"/>
             <w:r>
               <w:rPr>
                 <w:sz w:val="24"/>
@@ -2858,15 +2780,7 @@
                 <w:sz w:val="24"/>
                 <w:szCs w:val="24"/>
               </w:rPr>
-              <w:t>"Java</w:t>
-            </w:r>
-            <w:proofErr w:type="gramStart"/>
-            <w:r>
-              <w:rPr>
-                <w:sz w:val="24"/>
-                <w:szCs w:val="24"/>
-              </w:rPr>
-              <w:t>".</w:t>
+              <w:t>"Java".</w:t>
             </w:r>
             <w:proofErr w:type="spellStart"/>
             <w:r>
@@ -2877,7 +2791,6 @@
               <w:t>charAt</w:t>
             </w:r>
             <w:proofErr w:type="spellEnd"/>
-            <w:proofErr w:type="gramEnd"/>
             <w:r>
               <w:rPr>
                 <w:sz w:val="24"/>
@@ -2992,18 +2905,9 @@
                 <w:sz w:val="24"/>
                 <w:szCs w:val="24"/>
               </w:rPr>
-              <w:t>Programming</w:t>
-            </w:r>
-            <w:proofErr w:type="gramStart"/>
-            <w:r>
-              <w:rPr>
-                <w:sz w:val="24"/>
-                <w:szCs w:val="24"/>
-              </w:rPr>
-              <w:t>".substring</w:t>
+              <w:t>Programming".substring</w:t>
             </w:r>
             <w:proofErr w:type="spellEnd"/>
-            <w:proofErr w:type="gramEnd"/>
             <w:r>
               <w:rPr>
                 <w:sz w:val="24"/>
@@ -3056,21 +2960,12 @@
                 <w:szCs w:val="24"/>
               </w:rPr>
             </w:pPr>
-            <w:proofErr w:type="gramStart"/>
-            <w:r>
-              <w:rPr>
-                <w:sz w:val="24"/>
-                <w:szCs w:val="24"/>
-              </w:rPr>
-              <w:t>substring(</w:t>
-            </w:r>
-            <w:proofErr w:type="gramEnd"/>
-            <w:r>
-              <w:rPr>
-                <w:sz w:val="24"/>
-                <w:szCs w:val="24"/>
-              </w:rPr>
-              <w:t>start, end)</w:t>
+            <w:r>
+              <w:rPr>
+                <w:sz w:val="24"/>
+                <w:szCs w:val="24"/>
+              </w:rPr>
+              <w:t>substring(start, end)</w:t>
             </w:r>
           </w:p>
         </w:tc>
@@ -3126,18 +3021,9 @@
                 <w:sz w:val="24"/>
                 <w:szCs w:val="24"/>
               </w:rPr>
-              <w:t>Programming</w:t>
-            </w:r>
-            <w:proofErr w:type="gramStart"/>
-            <w:r>
-              <w:rPr>
-                <w:sz w:val="24"/>
-                <w:szCs w:val="24"/>
-              </w:rPr>
-              <w:t>".substring</w:t>
+              <w:t>Programming".substring</w:t>
             </w:r>
             <w:proofErr w:type="spellEnd"/>
-            <w:proofErr w:type="gramEnd"/>
             <w:r>
               <w:rPr>
                 <w:sz w:val="24"/>
@@ -3192,7 +3078,6 @@
               </w:rPr>
             </w:pPr>
             <w:proofErr w:type="spellStart"/>
-            <w:proofErr w:type="gramStart"/>
             <w:r>
               <w:rPr>
                 <w:sz w:val="24"/>
@@ -3206,15 +3091,7 @@
                 <w:sz w:val="24"/>
                 <w:szCs w:val="24"/>
               </w:rPr>
-              <w:t>(</w:t>
-            </w:r>
-            <w:proofErr w:type="gramEnd"/>
-            <w:r>
-              <w:rPr>
-                <w:sz w:val="24"/>
-                <w:szCs w:val="24"/>
-              </w:rPr>
-              <w:t>)</w:t>
+              <w:t>()</w:t>
             </w:r>
           </w:p>
         </w:tc>
@@ -3262,15 +3139,7 @@
                 <w:sz w:val="24"/>
                 <w:szCs w:val="24"/>
               </w:rPr>
-              <w:t>"java</w:t>
-            </w:r>
-            <w:proofErr w:type="gramStart"/>
-            <w:r>
-              <w:rPr>
-                <w:sz w:val="24"/>
-                <w:szCs w:val="24"/>
-              </w:rPr>
-              <w:t>".</w:t>
+              <w:t>"java".</w:t>
             </w:r>
             <w:proofErr w:type="spellStart"/>
             <w:r>
@@ -3281,7 +3150,6 @@
               <w:t>toUpperCase</w:t>
             </w:r>
             <w:proofErr w:type="spellEnd"/>
-            <w:proofErr w:type="gramEnd"/>
             <w:r>
               <w:rPr>
                 <w:sz w:val="24"/>
@@ -3333,7 +3201,6 @@
               </w:rPr>
             </w:pPr>
             <w:proofErr w:type="spellStart"/>
-            <w:proofErr w:type="gramStart"/>
             <w:r>
               <w:rPr>
                 <w:sz w:val="24"/>
@@ -3347,15 +3214,7 @@
                 <w:sz w:val="24"/>
                 <w:szCs w:val="24"/>
               </w:rPr>
-              <w:t>(</w:t>
-            </w:r>
-            <w:proofErr w:type="gramEnd"/>
-            <w:r>
-              <w:rPr>
-                <w:sz w:val="24"/>
-                <w:szCs w:val="24"/>
-              </w:rPr>
-              <w:t>)</w:t>
+              <w:t>()</w:t>
             </w:r>
           </w:p>
         </w:tc>
@@ -3403,15 +3262,7 @@
                 <w:sz w:val="24"/>
                 <w:szCs w:val="24"/>
               </w:rPr>
-              <w:t>"JAVA</w:t>
-            </w:r>
-            <w:proofErr w:type="gramStart"/>
-            <w:r>
-              <w:rPr>
-                <w:sz w:val="24"/>
-                <w:szCs w:val="24"/>
-              </w:rPr>
-              <w:t>".</w:t>
+              <w:t>"JAVA".</w:t>
             </w:r>
             <w:proofErr w:type="spellStart"/>
             <w:r>
@@ -3422,7 +3273,6 @@
               <w:t>toLowerCase</w:t>
             </w:r>
             <w:proofErr w:type="spellEnd"/>
-            <w:proofErr w:type="gramEnd"/>
             <w:r>
               <w:rPr>
                 <w:sz w:val="24"/>
@@ -3476,21 +3326,12 @@
                 <w:szCs w:val="24"/>
               </w:rPr>
             </w:pPr>
-            <w:proofErr w:type="gramStart"/>
-            <w:r>
-              <w:rPr>
-                <w:sz w:val="24"/>
-                <w:szCs w:val="24"/>
-              </w:rPr>
-              <w:t>equals(</w:t>
-            </w:r>
-            <w:proofErr w:type="gramEnd"/>
-            <w:r>
-              <w:rPr>
-                <w:sz w:val="24"/>
-                <w:szCs w:val="24"/>
-              </w:rPr>
-              <w:t>)</w:t>
+            <w:r>
+              <w:rPr>
+                <w:sz w:val="24"/>
+                <w:szCs w:val="24"/>
+              </w:rPr>
+              <w:t>equals()</w:t>
             </w:r>
           </w:p>
         </w:tc>
@@ -3546,18 +3387,9 @@
                 <w:sz w:val="24"/>
                 <w:szCs w:val="24"/>
               </w:rPr>
-              <w:t>Java</w:t>
-            </w:r>
-            <w:proofErr w:type="gramStart"/>
-            <w:r>
-              <w:rPr>
-                <w:sz w:val="24"/>
-                <w:szCs w:val="24"/>
-              </w:rPr>
-              <w:t>".equals</w:t>
+              <w:t>Java".equals</w:t>
             </w:r>
             <w:proofErr w:type="spellEnd"/>
-            <w:proofErr w:type="gramEnd"/>
             <w:r>
               <w:rPr>
                 <w:sz w:val="24"/>
@@ -3609,7 +3441,6 @@
               </w:rPr>
             </w:pPr>
             <w:proofErr w:type="spellStart"/>
-            <w:proofErr w:type="gramStart"/>
             <w:r>
               <w:rPr>
                 <w:sz w:val="24"/>
@@ -3623,15 +3454,7 @@
                 <w:sz w:val="24"/>
                 <w:szCs w:val="24"/>
               </w:rPr>
-              <w:t>(</w:t>
-            </w:r>
-            <w:proofErr w:type="gramEnd"/>
-            <w:r>
-              <w:rPr>
-                <w:sz w:val="24"/>
-                <w:szCs w:val="24"/>
-              </w:rPr>
-              <w:t>)</w:t>
+              <w:t>()</w:t>
             </w:r>
           </w:p>
         </w:tc>
@@ -3679,15 +3502,7 @@
                 <w:sz w:val="24"/>
                 <w:szCs w:val="24"/>
               </w:rPr>
-              <w:t>"java</w:t>
-            </w:r>
-            <w:proofErr w:type="gramStart"/>
-            <w:r>
-              <w:rPr>
-                <w:sz w:val="24"/>
-                <w:szCs w:val="24"/>
-              </w:rPr>
-              <w:t>".</w:t>
+              <w:t>"java".</w:t>
             </w:r>
             <w:proofErr w:type="spellStart"/>
             <w:r>
@@ -3698,7 +3513,6 @@
               <w:t>equalsIgnoreCase</w:t>
             </w:r>
             <w:proofErr w:type="spellEnd"/>
-            <w:proofErr w:type="gramEnd"/>
             <w:r>
               <w:rPr>
                 <w:sz w:val="24"/>
@@ -3752,21 +3566,12 @@
                 <w:szCs w:val="24"/>
               </w:rPr>
             </w:pPr>
-            <w:proofErr w:type="gramStart"/>
-            <w:r>
-              <w:rPr>
-                <w:sz w:val="24"/>
-                <w:szCs w:val="24"/>
-              </w:rPr>
-              <w:t>contains(</w:t>
-            </w:r>
-            <w:proofErr w:type="gramEnd"/>
-            <w:r>
-              <w:rPr>
-                <w:sz w:val="24"/>
-                <w:szCs w:val="24"/>
-              </w:rPr>
-              <w:t>)</w:t>
+            <w:r>
+              <w:rPr>
+                <w:sz w:val="24"/>
+                <w:szCs w:val="24"/>
+              </w:rPr>
+              <w:t>contains()</w:t>
             </w:r>
           </w:p>
         </w:tc>
@@ -3831,18 +3636,9 @@
                 <w:sz w:val="24"/>
                 <w:szCs w:val="24"/>
               </w:rPr>
-              <w:t>Programming</w:t>
-            </w:r>
-            <w:proofErr w:type="gramStart"/>
-            <w:r>
-              <w:rPr>
-                <w:sz w:val="24"/>
-                <w:szCs w:val="24"/>
-              </w:rPr>
-              <w:t>".contains</w:t>
+              <w:t>Programming".contains</w:t>
             </w:r>
             <w:proofErr w:type="spellEnd"/>
-            <w:proofErr w:type="gramEnd"/>
             <w:r>
               <w:rPr>
                 <w:sz w:val="24"/>
@@ -3894,7 +3690,6 @@
               </w:rPr>
             </w:pPr>
             <w:proofErr w:type="spellStart"/>
-            <w:proofErr w:type="gramStart"/>
             <w:r>
               <w:rPr>
                 <w:sz w:val="24"/>
@@ -3908,15 +3703,7 @@
                 <w:sz w:val="24"/>
                 <w:szCs w:val="24"/>
               </w:rPr>
-              <w:t>(</w:t>
-            </w:r>
-            <w:proofErr w:type="gramEnd"/>
-            <w:r>
-              <w:rPr>
-                <w:sz w:val="24"/>
-                <w:szCs w:val="24"/>
-              </w:rPr>
-              <w:t>)</w:t>
+              <w:t>()</w:t>
             </w:r>
           </w:p>
         </w:tc>
@@ -3964,15 +3751,7 @@
                 <w:sz w:val="24"/>
                 <w:szCs w:val="24"/>
               </w:rPr>
-              <w:t>"Java</w:t>
-            </w:r>
-            <w:proofErr w:type="gramStart"/>
-            <w:r>
-              <w:rPr>
-                <w:sz w:val="24"/>
-                <w:szCs w:val="24"/>
-              </w:rPr>
-              <w:t>".</w:t>
+              <w:t>"Java".</w:t>
             </w:r>
             <w:proofErr w:type="spellStart"/>
             <w:r>
@@ -3983,7 +3762,6 @@
               <w:t>startsWith</w:t>
             </w:r>
             <w:proofErr w:type="spellEnd"/>
-            <w:proofErr w:type="gramEnd"/>
             <w:r>
               <w:rPr>
                 <w:sz w:val="24"/>
@@ -4038,7 +3816,6 @@
               </w:rPr>
             </w:pPr>
             <w:proofErr w:type="spellStart"/>
-            <w:proofErr w:type="gramStart"/>
             <w:r>
               <w:rPr>
                 <w:sz w:val="24"/>
@@ -4052,15 +3829,7 @@
                 <w:sz w:val="24"/>
                 <w:szCs w:val="24"/>
               </w:rPr>
-              <w:t>(</w:t>
-            </w:r>
-            <w:proofErr w:type="gramEnd"/>
-            <w:r>
-              <w:rPr>
-                <w:sz w:val="24"/>
-                <w:szCs w:val="24"/>
-              </w:rPr>
-              <w:t>)</w:t>
+              <w:t>()</w:t>
             </w:r>
           </w:p>
         </w:tc>
@@ -4108,15 +3877,7 @@
                 <w:sz w:val="24"/>
                 <w:szCs w:val="24"/>
               </w:rPr>
-              <w:t>"Java</w:t>
-            </w:r>
-            <w:proofErr w:type="gramStart"/>
-            <w:r>
-              <w:rPr>
-                <w:sz w:val="24"/>
-                <w:szCs w:val="24"/>
-              </w:rPr>
-              <w:t>".</w:t>
+              <w:t>"Java".</w:t>
             </w:r>
             <w:proofErr w:type="spellStart"/>
             <w:r>
@@ -4127,7 +3888,6 @@
               <w:t>endsWith</w:t>
             </w:r>
             <w:proofErr w:type="spellEnd"/>
-            <w:proofErr w:type="gramEnd"/>
             <w:r>
               <w:rPr>
                 <w:sz w:val="24"/>
@@ -4194,21 +3954,12 @@
                 <w:szCs w:val="24"/>
               </w:rPr>
             </w:pPr>
-            <w:proofErr w:type="gramStart"/>
-            <w:r>
-              <w:rPr>
-                <w:sz w:val="24"/>
-                <w:szCs w:val="24"/>
-              </w:rPr>
-              <w:t>replace(</w:t>
-            </w:r>
-            <w:proofErr w:type="gramEnd"/>
-            <w:r>
-              <w:rPr>
-                <w:sz w:val="24"/>
-                <w:szCs w:val="24"/>
-              </w:rPr>
-              <w:t>)</w:t>
+            <w:r>
+              <w:rPr>
+                <w:sz w:val="24"/>
+                <w:szCs w:val="24"/>
+              </w:rPr>
+              <w:t>replace()</w:t>
             </w:r>
           </w:p>
         </w:tc>
@@ -4264,18 +4015,9 @@
                 <w:sz w:val="24"/>
                 <w:szCs w:val="24"/>
               </w:rPr>
-              <w:t>Java</w:t>
-            </w:r>
-            <w:proofErr w:type="gramStart"/>
-            <w:r>
-              <w:rPr>
-                <w:sz w:val="24"/>
-                <w:szCs w:val="24"/>
-              </w:rPr>
-              <w:t>".replace</w:t>
+              <w:t>Java".replace</w:t>
             </w:r>
             <w:proofErr w:type="spellEnd"/>
-            <w:proofErr w:type="gramEnd"/>
             <w:r>
               <w:rPr>
                 <w:sz w:val="24"/>
@@ -4329,21 +4071,12 @@
                 <w:szCs w:val="24"/>
               </w:rPr>
             </w:pPr>
-            <w:proofErr w:type="gramStart"/>
-            <w:r>
-              <w:rPr>
-                <w:sz w:val="24"/>
-                <w:szCs w:val="24"/>
-              </w:rPr>
-              <w:t>trim(</w:t>
-            </w:r>
-            <w:proofErr w:type="gramEnd"/>
-            <w:r>
-              <w:rPr>
-                <w:sz w:val="24"/>
-                <w:szCs w:val="24"/>
-              </w:rPr>
-              <w:t>)</w:t>
+            <w:r>
+              <w:rPr>
+                <w:sz w:val="24"/>
+                <w:szCs w:val="24"/>
+              </w:rPr>
+              <w:t>trim()</w:t>
             </w:r>
           </w:p>
         </w:tc>
@@ -4391,23 +4124,7 @@
                 <w:sz w:val="24"/>
                 <w:szCs w:val="24"/>
               </w:rPr>
-              <w:t xml:space="preserve">" Java </w:t>
-            </w:r>
-            <w:proofErr w:type="gramStart"/>
-            <w:r>
-              <w:rPr>
-                <w:sz w:val="24"/>
-                <w:szCs w:val="24"/>
-              </w:rPr>
-              <w:t>".trim</w:t>
-            </w:r>
-            <w:proofErr w:type="gramEnd"/>
-            <w:r>
-              <w:rPr>
-                <w:sz w:val="24"/>
-                <w:szCs w:val="24"/>
-              </w:rPr>
-              <w:t>()</w:t>
+              <w:t>" Java ".trim()</w:t>
             </w:r>
           </w:p>
         </w:tc>
@@ -4452,21 +4169,12 @@
                 <w:szCs w:val="24"/>
               </w:rPr>
             </w:pPr>
-            <w:proofErr w:type="gramStart"/>
-            <w:r>
-              <w:rPr>
-                <w:sz w:val="24"/>
-                <w:szCs w:val="24"/>
-              </w:rPr>
-              <w:t>split(</w:t>
-            </w:r>
-            <w:proofErr w:type="gramEnd"/>
-            <w:r>
-              <w:rPr>
-                <w:sz w:val="24"/>
-                <w:szCs w:val="24"/>
-              </w:rPr>
-              <w:t>)</w:t>
+            <w:r>
+              <w:rPr>
+                <w:sz w:val="24"/>
+                <w:szCs w:val="24"/>
+              </w:rPr>
+              <w:t>split()</w:t>
             </w:r>
           </w:p>
         </w:tc>
@@ -4517,32 +4225,14 @@
               <w:t>"</w:t>
             </w:r>
             <w:proofErr w:type="spellStart"/>
-            <w:proofErr w:type="gramStart"/>
-            <w:r>
-              <w:rPr>
-                <w:sz w:val="24"/>
-                <w:szCs w:val="24"/>
-              </w:rPr>
-              <w:t>A,B</w:t>
-            </w:r>
-            <w:proofErr w:type="gramEnd"/>
-            <w:r>
-              <w:rPr>
-                <w:sz w:val="24"/>
-                <w:szCs w:val="24"/>
-              </w:rPr>
-              <w:t>,C</w:t>
-            </w:r>
-            <w:proofErr w:type="gramStart"/>
-            <w:r>
-              <w:rPr>
-                <w:sz w:val="24"/>
-                <w:szCs w:val="24"/>
-              </w:rPr>
-              <w:t>".split</w:t>
+            <w:r>
+              <w:rPr>
+                <w:sz w:val="24"/>
+                <w:szCs w:val="24"/>
+              </w:rPr>
+              <w:t>A,B,C".split</w:t>
             </w:r>
             <w:proofErr w:type="spellEnd"/>
-            <w:proofErr w:type="gramEnd"/>
             <w:r>
               <w:rPr>
                 <w:sz w:val="24"/>
@@ -4597,7 +4287,6 @@
               </w:rPr>
             </w:pPr>
             <w:proofErr w:type="spellStart"/>
-            <w:proofErr w:type="gramStart"/>
             <w:r>
               <w:rPr>
                 <w:sz w:val="24"/>
@@ -4611,15 +4300,7 @@
                 <w:sz w:val="24"/>
                 <w:szCs w:val="24"/>
               </w:rPr>
-              <w:t>(</w:t>
-            </w:r>
-            <w:proofErr w:type="gramEnd"/>
-            <w:r>
-              <w:rPr>
-                <w:sz w:val="24"/>
-                <w:szCs w:val="24"/>
-              </w:rPr>
-              <w:t>)</w:t>
+              <w:t>()</w:t>
             </w:r>
           </w:p>
         </w:tc>
@@ -4667,15 +4348,7 @@
                 <w:sz w:val="24"/>
                 <w:szCs w:val="24"/>
               </w:rPr>
-              <w:t>"Java</w:t>
-            </w:r>
-            <w:proofErr w:type="gramStart"/>
-            <w:r>
-              <w:rPr>
-                <w:sz w:val="24"/>
-                <w:szCs w:val="24"/>
-              </w:rPr>
-              <w:t>".</w:t>
+              <w:t>"Java".</w:t>
             </w:r>
             <w:proofErr w:type="spellStart"/>
             <w:r>
@@ -4686,7 +4359,6 @@
               <w:t>indexOf</w:t>
             </w:r>
             <w:proofErr w:type="spellEnd"/>
-            <w:proofErr w:type="gramEnd"/>
             <w:r>
               <w:rPr>
                 <w:sz w:val="24"/>
@@ -4738,7 +4410,6 @@
               </w:rPr>
             </w:pPr>
             <w:proofErr w:type="spellStart"/>
-            <w:proofErr w:type="gramStart"/>
             <w:r>
               <w:rPr>
                 <w:sz w:val="24"/>
@@ -4752,15 +4423,7 @@
                 <w:sz w:val="24"/>
                 <w:szCs w:val="24"/>
               </w:rPr>
-              <w:t>(</w:t>
-            </w:r>
-            <w:proofErr w:type="gramEnd"/>
-            <w:r>
-              <w:rPr>
-                <w:sz w:val="24"/>
-                <w:szCs w:val="24"/>
-              </w:rPr>
-              <w:t>)</w:t>
+              <w:t>()</w:t>
             </w:r>
           </w:p>
         </w:tc>
@@ -4808,15 +4471,7 @@
                 <w:sz w:val="24"/>
                 <w:szCs w:val="24"/>
               </w:rPr>
-              <w:t>"Java Java</w:t>
-            </w:r>
-            <w:proofErr w:type="gramStart"/>
-            <w:r>
-              <w:rPr>
-                <w:sz w:val="24"/>
-                <w:szCs w:val="24"/>
-              </w:rPr>
-              <w:t>".</w:t>
+              <w:t>"Java Java".</w:t>
             </w:r>
             <w:proofErr w:type="spellStart"/>
             <w:r>
@@ -4827,7 +4482,6 @@
               <w:t>lastIndexOf</w:t>
             </w:r>
             <w:proofErr w:type="spellEnd"/>
-            <w:proofErr w:type="gramEnd"/>
             <w:r>
               <w:rPr>
                 <w:sz w:val="24"/>
@@ -4882,7 +4536,6 @@
               </w:rPr>
             </w:pPr>
             <w:proofErr w:type="spellStart"/>
-            <w:proofErr w:type="gramStart"/>
             <w:r>
               <w:rPr>
                 <w:sz w:val="24"/>
@@ -4896,15 +4549,7 @@
                 <w:sz w:val="24"/>
                 <w:szCs w:val="24"/>
               </w:rPr>
-              <w:t>(</w:t>
-            </w:r>
-            <w:proofErr w:type="gramEnd"/>
-            <w:r>
-              <w:rPr>
-                <w:sz w:val="24"/>
-                <w:szCs w:val="24"/>
-              </w:rPr>
-              <w:t>)</w:t>
+              <w:t>()</w:t>
             </w:r>
           </w:p>
         </w:tc>
@@ -4952,15 +4597,7 @@
                 <w:sz w:val="24"/>
                 <w:szCs w:val="24"/>
               </w:rPr>
-              <w:t>"Hello</w:t>
-            </w:r>
-            <w:proofErr w:type="gramStart"/>
-            <w:r>
-              <w:rPr>
-                <w:sz w:val="24"/>
-                <w:szCs w:val="24"/>
-              </w:rPr>
-              <w:t>".</w:t>
+              <w:t>"Hello".</w:t>
             </w:r>
             <w:proofErr w:type="spellStart"/>
             <w:r>
@@ -4971,7 +4608,6 @@
               <w:t>concat</w:t>
             </w:r>
             <w:proofErr w:type="spellEnd"/>
-            <w:proofErr w:type="gramEnd"/>
             <w:r>
               <w:rPr>
                 <w:sz w:val="24"/>
@@ -5023,7 +4659,6 @@
               </w:rPr>
             </w:pPr>
             <w:proofErr w:type="spellStart"/>
-            <w:proofErr w:type="gramStart"/>
             <w:r>
               <w:rPr>
                 <w:sz w:val="24"/>
@@ -5037,15 +4672,7 @@
                 <w:sz w:val="24"/>
                 <w:szCs w:val="24"/>
               </w:rPr>
-              <w:t>(</w:t>
-            </w:r>
-            <w:proofErr w:type="gramEnd"/>
-            <w:r>
-              <w:rPr>
-                <w:sz w:val="24"/>
-                <w:szCs w:val="24"/>
-              </w:rPr>
-              <w:t>)</w:t>
+              <w:t>()</w:t>
             </w:r>
           </w:p>
         </w:tc>
@@ -5093,15 +4720,7 @@
                 <w:sz w:val="24"/>
                 <w:szCs w:val="24"/>
               </w:rPr>
-              <w:t>"</w:t>
-            </w:r>
-            <w:proofErr w:type="gramStart"/>
-            <w:r>
-              <w:rPr>
-                <w:sz w:val="24"/>
-                <w:szCs w:val="24"/>
-              </w:rPr>
-              <w:t>".</w:t>
+              <w:t>"".</w:t>
             </w:r>
             <w:proofErr w:type="spellStart"/>
             <w:r>
@@ -5112,7 +4731,6 @@
               <w:t>isEmpty</w:t>
             </w:r>
             <w:proofErr w:type="spellEnd"/>
-            <w:proofErr w:type="gramEnd"/>
             <w:r>
               <w:rPr>
                 <w:sz w:val="24"/>
@@ -5166,21 +4784,12 @@
                 <w:szCs w:val="24"/>
               </w:rPr>
             </w:pPr>
-            <w:proofErr w:type="gramStart"/>
-            <w:r>
-              <w:rPr>
-                <w:sz w:val="24"/>
-                <w:szCs w:val="24"/>
-              </w:rPr>
-              <w:t>join(</w:t>
-            </w:r>
-            <w:proofErr w:type="gramEnd"/>
-            <w:r>
-              <w:rPr>
-                <w:sz w:val="24"/>
-                <w:szCs w:val="24"/>
-              </w:rPr>
-              <w:t>)</w:t>
+            <w:r>
+              <w:rPr>
+                <w:sz w:val="24"/>
+                <w:szCs w:val="24"/>
+              </w:rPr>
+              <w:t>join()</w:t>
             </w:r>
           </w:p>
         </w:tc>
@@ -5283,7 +4892,6 @@
               </w:rPr>
             </w:pPr>
             <w:proofErr w:type="spellStart"/>
-            <w:proofErr w:type="gramStart"/>
             <w:r>
               <w:rPr>
                 <w:sz w:val="24"/>
@@ -5297,15 +4905,7 @@
                 <w:sz w:val="24"/>
                 <w:szCs w:val="24"/>
               </w:rPr>
-              <w:t>(</w:t>
-            </w:r>
-            <w:proofErr w:type="gramEnd"/>
-            <w:r>
-              <w:rPr>
-                <w:sz w:val="24"/>
-                <w:szCs w:val="24"/>
-              </w:rPr>
-              <w:t>)</w:t>
+              <w:t>()</w:t>
             </w:r>
           </w:p>
         </w:tc>
@@ -5353,15 +4953,7 @@
                 <w:sz w:val="24"/>
                 <w:szCs w:val="24"/>
               </w:rPr>
-              <w:t>"A</w:t>
-            </w:r>
-            <w:proofErr w:type="gramStart"/>
-            <w:r>
-              <w:rPr>
-                <w:sz w:val="24"/>
-                <w:szCs w:val="24"/>
-              </w:rPr>
-              <w:t>".</w:t>
+              <w:t>"A".</w:t>
             </w:r>
             <w:proofErr w:type="spellStart"/>
             <w:r>
@@ -5372,7 +4964,6 @@
               <w:t>compareTo</w:t>
             </w:r>
             <w:proofErr w:type="spellEnd"/>
-            <w:proofErr w:type="gramEnd"/>
             <w:r>
               <w:rPr>
                 <w:sz w:val="24"/>
@@ -5475,8 +5066,6 @@
       <w:pPr>
         <w:pStyle w:val="ListParagraph"/>
         <w:rPr>
-          <w:b/>
-          <w:bCs/>
           <w:sz w:val="24"/>
           <w:szCs w:val="24"/>
         </w:rPr>
@@ -5527,6 +5116,295 @@
       </w:pPr>
       <w:r>
         <w:rPr>
+          <w:sz w:val="24"/>
+          <w:szCs w:val="24"/>
+        </w:rPr>
+        <w:t xml:space="preserve">When an array is created in Java, the JVM creates a reference variable in the </w:t>
+      </w:r>
+      <w:r>
+        <w:rPr>
+          <w:b/>
+          <w:bCs/>
+          <w:sz w:val="24"/>
+          <w:szCs w:val="24"/>
+        </w:rPr>
+        <w:t>stack memory</w:t>
+      </w:r>
+      <w:r>
+        <w:rPr>
+          <w:sz w:val="24"/>
+          <w:szCs w:val="24"/>
+        </w:rPr>
+        <w:t xml:space="preserve"> and allocates the actual array object in the </w:t>
+      </w:r>
+      <w:r>
+        <w:rPr>
+          <w:b/>
+          <w:bCs/>
+          <w:sz w:val="24"/>
+          <w:szCs w:val="24"/>
+        </w:rPr>
+        <w:t>heap memory</w:t>
+      </w:r>
+      <w:r>
+        <w:rPr>
+          <w:sz w:val="24"/>
+          <w:szCs w:val="24"/>
+        </w:rPr>
+        <w:t xml:space="preserve">. The array object stores metadata such as its type and length, along with its elements. When accessing an element like </w:t>
+      </w:r>
+      <w:proofErr w:type="spellStart"/>
+      <w:r>
+        <w:rPr>
+          <w:sz w:val="24"/>
+          <w:szCs w:val="24"/>
+        </w:rPr>
+        <w:t>arr</w:t>
+      </w:r>
+      <w:proofErr w:type="spellEnd"/>
+      <w:r>
+        <w:rPr>
+          <w:sz w:val="24"/>
+          <w:szCs w:val="24"/>
+        </w:rPr>
+        <w:t xml:space="preserve">[3], the JVM calculates its memory location and retrieves the value while performing </w:t>
+      </w:r>
+      <w:r>
+        <w:rPr>
+          <w:b/>
+          <w:bCs/>
+          <w:sz w:val="24"/>
+          <w:szCs w:val="24"/>
+        </w:rPr>
+        <w:t>bounds checking</w:t>
+      </w:r>
+      <w:r>
+        <w:rPr>
+          <w:sz w:val="24"/>
+          <w:szCs w:val="24"/>
+        </w:rPr>
+        <w:t xml:space="preserve"> to prevent invalid access. Since arrays are objects, they are automatically managed by the </w:t>
+      </w:r>
+      <w:r>
+        <w:rPr>
+          <w:b/>
+          <w:bCs/>
+          <w:sz w:val="24"/>
+          <w:szCs w:val="24"/>
+        </w:rPr>
+        <w:t>Garbage Collector</w:t>
+      </w:r>
+      <w:r>
+        <w:rPr>
+          <w:sz w:val="24"/>
+          <w:szCs w:val="24"/>
+        </w:rPr>
+        <w:t>, which removes unused arrays from heap memory when they are no longer reachable.</w:t>
+      </w:r>
+    </w:p>
+    <w:p>
+      <w:pPr>
+        <w:pStyle w:val="ListParagraph"/>
+        <w:rPr>
+          <w:sz w:val="24"/>
+          <w:szCs w:val="24"/>
+        </w:rPr>
+      </w:pPr>
+    </w:p>
+    <w:p>
+      <w:pPr>
+        <w:pStyle w:val="ListParagraph"/>
+        <w:rPr>
+          <w:sz w:val="24"/>
+          <w:szCs w:val="24"/>
+        </w:rPr>
+      </w:pPr>
+      <w:r>
+        <w:rPr>
+          <w:sz w:val="24"/>
+          <w:szCs w:val="24"/>
+        </w:rPr>
+        <w:t xml:space="preserve">In Java, an array can store </w:t>
+      </w:r>
+      <w:r>
+        <w:rPr>
+          <w:b/>
+          <w:bCs/>
+          <w:sz w:val="24"/>
+          <w:szCs w:val="24"/>
+        </w:rPr>
+        <w:t>references to objects</w:t>
+      </w:r>
+      <w:r>
+        <w:rPr>
+          <w:sz w:val="24"/>
+          <w:szCs w:val="24"/>
+        </w:rPr>
+        <w:t xml:space="preserve"> rather than storing the objects themselves. When an object array is created, the JVM allocates the array in the </w:t>
+      </w:r>
+      <w:r>
+        <w:rPr>
+          <w:b/>
+          <w:bCs/>
+          <w:sz w:val="24"/>
+          <w:szCs w:val="24"/>
+        </w:rPr>
+        <w:t>heap memory</w:t>
+      </w:r>
+      <w:r>
+        <w:rPr>
+          <w:sz w:val="24"/>
+          <w:szCs w:val="24"/>
+        </w:rPr>
+        <w:t xml:space="preserve"> and initializes all elements with null references. For example, Student[] students = new Student[3]; creates an array that can hold three Student object references. When students[0] = new Student(); is executed, the first array element stores a reference pointing to the newly created Student object in the heap. The array stores the addresses of objects, while the actual objects are stored separately in memory.</w:t>
+      </w:r>
+    </w:p>
+    <w:p>
+      <w:pPr>
+        <w:pStyle w:val="ListParagraph"/>
+        <w:rPr>
+          <w:sz w:val="24"/>
+          <w:szCs w:val="24"/>
+        </w:rPr>
+      </w:pPr>
+    </w:p>
+    <w:p>
+      <w:pPr>
+        <w:pStyle w:val="ListParagraph"/>
+        <w:rPr>
+          <w:sz w:val="24"/>
+          <w:szCs w:val="24"/>
+        </w:rPr>
+      </w:pPr>
+      <w:r>
+        <w:rPr>
+          <w:sz w:val="24"/>
+          <w:szCs w:val="24"/>
+        </w:rPr>
+        <w:t>There are two common ways to create an array</w:t>
+      </w:r>
+      <w:r>
+        <w:rPr>
+          <w:sz w:val="24"/>
+          <w:szCs w:val="24"/>
+        </w:rPr>
+        <w:t>,</w:t>
+      </w:r>
+      <w:r>
+        <w:rPr>
+          <w:sz w:val="24"/>
+          <w:szCs w:val="24"/>
+        </w:rPr>
+        <w:t xml:space="preserve"> </w:t>
+      </w:r>
+      <w:r>
+        <w:rPr>
+          <w:sz w:val="24"/>
+          <w:szCs w:val="24"/>
+        </w:rPr>
+        <w:t>Declaration + Memory Allocation</w:t>
+      </w:r>
+      <w:r>
+        <w:rPr>
+          <w:sz w:val="24"/>
+          <w:szCs w:val="24"/>
+        </w:rPr>
+        <w:t xml:space="preserve"> and </w:t>
+      </w:r>
+      <w:r>
+        <w:rPr>
+          <w:sz w:val="24"/>
+          <w:szCs w:val="24"/>
+        </w:rPr>
+        <w:t>Declaration with Initialization</w:t>
+      </w:r>
+      <w:r>
+        <w:rPr>
+          <w:sz w:val="24"/>
+          <w:szCs w:val="24"/>
+        </w:rPr>
+        <w:t>.</w:t>
+      </w:r>
+    </w:p>
+    <w:p>
+      <w:pPr>
+        <w:pStyle w:val="ListParagraph"/>
+        <w:rPr>
+          <w:sz w:val="24"/>
+          <w:szCs w:val="24"/>
+        </w:rPr>
+      </w:pPr>
+    </w:p>
+    <w:p>
+      <w:pPr>
+        <w:pStyle w:val="ListParagraph"/>
+        <w:rPr>
+          <w:sz w:val="24"/>
+          <w:szCs w:val="24"/>
+        </w:rPr>
+      </w:pPr>
+      <w:r>
+        <w:rPr>
+          <w:sz w:val="24"/>
+          <w:szCs w:val="24"/>
+        </w:rPr>
+        <w:t xml:space="preserve">It got </w:t>
+      </w:r>
+      <w:r>
+        <w:rPr>
+          <w:sz w:val="24"/>
+          <w:szCs w:val="24"/>
+        </w:rPr>
+        <w:t>One-Dimensional Array</w:t>
+      </w:r>
+      <w:r>
+        <w:rPr>
+          <w:sz w:val="24"/>
+          <w:szCs w:val="24"/>
+        </w:rPr>
+        <w:t xml:space="preserve">, </w:t>
+      </w:r>
+      <w:r>
+        <w:rPr>
+          <w:sz w:val="24"/>
+          <w:szCs w:val="24"/>
+        </w:rPr>
+        <w:t>A normal list of values</w:t>
+      </w:r>
+      <w:r>
+        <w:rPr>
+          <w:sz w:val="24"/>
+          <w:szCs w:val="24"/>
+        </w:rPr>
+        <w:t xml:space="preserve"> and </w:t>
+      </w:r>
+      <w:r>
+        <w:rPr>
+          <w:sz w:val="24"/>
+          <w:szCs w:val="24"/>
+        </w:rPr>
+        <w:t>Multidimensional Array</w:t>
+      </w:r>
+    </w:p>
+    <w:p>
+      <w:pPr>
+        <w:pStyle w:val="ListParagraph"/>
+        <w:rPr>
+          <w:sz w:val="24"/>
+          <w:szCs w:val="24"/>
+        </w:rPr>
+      </w:pPr>
+    </w:p>
+    <w:p>
+      <w:pPr>
+        <w:pStyle w:val="ListParagraph"/>
+        <w:rPr>
+          <w:sz w:val="24"/>
+          <w:szCs w:val="24"/>
+        </w:rPr>
+      </w:pPr>
+      <w:r>
+        <w:rPr>
           <w:b/>
           <w:bCs/>
           <w:sz w:val="24"/>
@@ -5769,15 +5647,7 @@
           <w:bCs/>
           <w:u w:val="single"/>
         </w:rPr>
-        <w:t xml:space="preserve">2. </w:t>
-      </w:r>
-      <w:r>
-        <w:rPr>
-          <w:b/>
-          <w:bCs/>
-          <w:u w:val="single"/>
-        </w:rPr>
-        <w:t>Modifiers, Variables and Constants</w:t>
+        <w:t>2. Modifiers, Variables and Constants</w:t>
       </w:r>
     </w:p>
     <w:p>

</xml_diff>

<commit_message>
Interface data type  #19
</commit_message>
<xml_diff>
--- a/Chapter3/CH3.docx
+++ b/Chapter3/CH3.docx
@@ -503,12 +503,17 @@
         <w:t xml:space="preserve">Type mismatch: cannot convert from String to </w:t>
       </w:r>
       <w:proofErr w:type="spellStart"/>
+      <w:proofErr w:type="gramStart"/>
       <w:r>
         <w:t>intJava</w:t>
       </w:r>
       <w:proofErr w:type="spellEnd"/>
       <w:r>
-        <w:t>(16777233)</w:t>
+        <w:t>(</w:t>
+      </w:r>
+      <w:proofErr w:type="gramEnd"/>
+      <w:r>
+        <w:t>16777233)</w:t>
       </w:r>
       <w:r>
         <w:t>” Error.</w:t>
@@ -2263,7 +2268,23 @@
           <w:sz w:val="24"/>
           <w:szCs w:val="24"/>
         </w:rPr>
-        <w:t xml:space="preserve">when you create a string using a literal, like String name = "Java";, allowing Java to reuse existing string objects and save memory. Java stores strings in the </w:t>
+        <w:t>when you create a string using a literal, like String name = "Java</w:t>
+      </w:r>
+      <w:proofErr w:type="gramStart"/>
+      <w:r>
+        <w:rPr>
+          <w:sz w:val="24"/>
+          <w:szCs w:val="24"/>
+        </w:rPr>
+        <w:t>";,</w:t>
+      </w:r>
+      <w:proofErr w:type="gramEnd"/>
+      <w:r>
+        <w:rPr>
+          <w:sz w:val="24"/>
+          <w:szCs w:val="24"/>
+        </w:rPr>
+        <w:t xml:space="preserve"> allowing Java to reuse existing string objects and save memory. Java stores strings in the </w:t>
       </w:r>
       <w:r>
         <w:rPr>
@@ -2279,7 +2300,39 @@
           <w:sz w:val="24"/>
           <w:szCs w:val="24"/>
         </w:rPr>
-        <w:t xml:space="preserve"> when you create them using new, like String name = new String("Java");, which creates a separate string object even if the same value already exists in the pool.</w:t>
+        <w:t xml:space="preserve"> when you create them using new, like String name = new </w:t>
+      </w:r>
+      <w:proofErr w:type="gramStart"/>
+      <w:r>
+        <w:rPr>
+          <w:sz w:val="24"/>
+          <w:szCs w:val="24"/>
+        </w:rPr>
+        <w:t>String(</w:t>
+      </w:r>
+      <w:proofErr w:type="gramEnd"/>
+      <w:r>
+        <w:rPr>
+          <w:sz w:val="24"/>
+          <w:szCs w:val="24"/>
+        </w:rPr>
+        <w:t>"Java"</w:t>
+      </w:r>
+      <w:proofErr w:type="gramStart"/>
+      <w:r>
+        <w:rPr>
+          <w:sz w:val="24"/>
+          <w:szCs w:val="24"/>
+        </w:rPr>
+        <w:t>);,</w:t>
+      </w:r>
+      <w:proofErr w:type="gramEnd"/>
+      <w:r>
+        <w:rPr>
+          <w:sz w:val="24"/>
+          <w:szCs w:val="24"/>
+        </w:rPr>
+        <w:t xml:space="preserve"> which creates a separate string object even if the same value already exists in the pool.</w:t>
       </w:r>
     </w:p>
     <w:p>
@@ -2604,12 +2657,21 @@
                 <w:szCs w:val="24"/>
               </w:rPr>
             </w:pPr>
-            <w:r>
-              <w:rPr>
-                <w:sz w:val="24"/>
-                <w:szCs w:val="24"/>
-              </w:rPr>
-              <w:t>length()</w:t>
+            <w:proofErr w:type="gramStart"/>
+            <w:r>
+              <w:rPr>
+                <w:sz w:val="24"/>
+                <w:szCs w:val="24"/>
+              </w:rPr>
+              <w:t>length(</w:t>
+            </w:r>
+            <w:proofErr w:type="gramEnd"/>
+            <w:r>
+              <w:rPr>
+                <w:sz w:val="24"/>
+                <w:szCs w:val="24"/>
+              </w:rPr>
+              <w:t>)</w:t>
             </w:r>
           </w:p>
         </w:tc>
@@ -2665,9 +2727,18 @@
                 <w:sz w:val="24"/>
                 <w:szCs w:val="24"/>
               </w:rPr>
-              <w:t>Java".length</w:t>
+              <w:t>Java</w:t>
+            </w:r>
+            <w:proofErr w:type="gramStart"/>
+            <w:r>
+              <w:rPr>
+                <w:sz w:val="24"/>
+                <w:szCs w:val="24"/>
+              </w:rPr>
+              <w:t>".length</w:t>
             </w:r>
             <w:proofErr w:type="spellEnd"/>
+            <w:proofErr w:type="gramEnd"/>
             <w:r>
               <w:rPr>
                 <w:sz w:val="24"/>
@@ -2780,7 +2851,15 @@
                 <w:sz w:val="24"/>
                 <w:szCs w:val="24"/>
               </w:rPr>
-              <w:t>"Java".</w:t>
+              <w:t>"Java</w:t>
+            </w:r>
+            <w:proofErr w:type="gramStart"/>
+            <w:r>
+              <w:rPr>
+                <w:sz w:val="24"/>
+                <w:szCs w:val="24"/>
+              </w:rPr>
+              <w:t>".</w:t>
             </w:r>
             <w:proofErr w:type="spellStart"/>
             <w:r>
@@ -2791,6 +2870,7 @@
               <w:t>charAt</w:t>
             </w:r>
             <w:proofErr w:type="spellEnd"/>
+            <w:proofErr w:type="gramEnd"/>
             <w:r>
               <w:rPr>
                 <w:sz w:val="24"/>
@@ -2905,9 +2985,18 @@
                 <w:sz w:val="24"/>
                 <w:szCs w:val="24"/>
               </w:rPr>
-              <w:t>Programming".substring</w:t>
+              <w:t>Programming</w:t>
+            </w:r>
+            <w:proofErr w:type="gramStart"/>
+            <w:r>
+              <w:rPr>
+                <w:sz w:val="24"/>
+                <w:szCs w:val="24"/>
+              </w:rPr>
+              <w:t>".substring</w:t>
             </w:r>
             <w:proofErr w:type="spellEnd"/>
+            <w:proofErr w:type="gramEnd"/>
             <w:r>
               <w:rPr>
                 <w:sz w:val="24"/>
@@ -2960,12 +3049,21 @@
                 <w:szCs w:val="24"/>
               </w:rPr>
             </w:pPr>
-            <w:r>
-              <w:rPr>
-                <w:sz w:val="24"/>
-                <w:szCs w:val="24"/>
-              </w:rPr>
-              <w:t>substring(start, end)</w:t>
+            <w:proofErr w:type="gramStart"/>
+            <w:r>
+              <w:rPr>
+                <w:sz w:val="24"/>
+                <w:szCs w:val="24"/>
+              </w:rPr>
+              <w:t>substring(</w:t>
+            </w:r>
+            <w:proofErr w:type="gramEnd"/>
+            <w:r>
+              <w:rPr>
+                <w:sz w:val="24"/>
+                <w:szCs w:val="24"/>
+              </w:rPr>
+              <w:t>start, end)</w:t>
             </w:r>
           </w:p>
         </w:tc>
@@ -3021,9 +3119,18 @@
                 <w:sz w:val="24"/>
                 <w:szCs w:val="24"/>
               </w:rPr>
-              <w:t>Programming".substring</w:t>
+              <w:t>Programming</w:t>
+            </w:r>
+            <w:proofErr w:type="gramStart"/>
+            <w:r>
+              <w:rPr>
+                <w:sz w:val="24"/>
+                <w:szCs w:val="24"/>
+              </w:rPr>
+              <w:t>".substring</w:t>
             </w:r>
             <w:proofErr w:type="spellEnd"/>
+            <w:proofErr w:type="gramEnd"/>
             <w:r>
               <w:rPr>
                 <w:sz w:val="24"/>
@@ -3078,6 +3185,7 @@
               </w:rPr>
             </w:pPr>
             <w:proofErr w:type="spellStart"/>
+            <w:proofErr w:type="gramStart"/>
             <w:r>
               <w:rPr>
                 <w:sz w:val="24"/>
@@ -3091,7 +3199,15 @@
                 <w:sz w:val="24"/>
                 <w:szCs w:val="24"/>
               </w:rPr>
-              <w:t>()</w:t>
+              <w:t>(</w:t>
+            </w:r>
+            <w:proofErr w:type="gramEnd"/>
+            <w:r>
+              <w:rPr>
+                <w:sz w:val="24"/>
+                <w:szCs w:val="24"/>
+              </w:rPr>
+              <w:t>)</w:t>
             </w:r>
           </w:p>
         </w:tc>
@@ -3139,7 +3255,15 @@
                 <w:sz w:val="24"/>
                 <w:szCs w:val="24"/>
               </w:rPr>
-              <w:t>"java".</w:t>
+              <w:t>"java</w:t>
+            </w:r>
+            <w:proofErr w:type="gramStart"/>
+            <w:r>
+              <w:rPr>
+                <w:sz w:val="24"/>
+                <w:szCs w:val="24"/>
+              </w:rPr>
+              <w:t>".</w:t>
             </w:r>
             <w:proofErr w:type="spellStart"/>
             <w:r>
@@ -3150,6 +3274,7 @@
               <w:t>toUpperCase</w:t>
             </w:r>
             <w:proofErr w:type="spellEnd"/>
+            <w:proofErr w:type="gramEnd"/>
             <w:r>
               <w:rPr>
                 <w:sz w:val="24"/>
@@ -3201,6 +3326,7 @@
               </w:rPr>
             </w:pPr>
             <w:proofErr w:type="spellStart"/>
+            <w:proofErr w:type="gramStart"/>
             <w:r>
               <w:rPr>
                 <w:sz w:val="24"/>
@@ -3214,7 +3340,15 @@
                 <w:sz w:val="24"/>
                 <w:szCs w:val="24"/>
               </w:rPr>
-              <w:t>()</w:t>
+              <w:t>(</w:t>
+            </w:r>
+            <w:proofErr w:type="gramEnd"/>
+            <w:r>
+              <w:rPr>
+                <w:sz w:val="24"/>
+                <w:szCs w:val="24"/>
+              </w:rPr>
+              <w:t>)</w:t>
             </w:r>
           </w:p>
         </w:tc>
@@ -3262,7 +3396,15 @@
                 <w:sz w:val="24"/>
                 <w:szCs w:val="24"/>
               </w:rPr>
-              <w:t>"JAVA".</w:t>
+              <w:t>"JAVA</w:t>
+            </w:r>
+            <w:proofErr w:type="gramStart"/>
+            <w:r>
+              <w:rPr>
+                <w:sz w:val="24"/>
+                <w:szCs w:val="24"/>
+              </w:rPr>
+              <w:t>".</w:t>
             </w:r>
             <w:proofErr w:type="spellStart"/>
             <w:r>
@@ -3273,6 +3415,7 @@
               <w:t>toLowerCase</w:t>
             </w:r>
             <w:proofErr w:type="spellEnd"/>
+            <w:proofErr w:type="gramEnd"/>
             <w:r>
               <w:rPr>
                 <w:sz w:val="24"/>
@@ -3326,12 +3469,21 @@
                 <w:szCs w:val="24"/>
               </w:rPr>
             </w:pPr>
-            <w:r>
-              <w:rPr>
-                <w:sz w:val="24"/>
-                <w:szCs w:val="24"/>
-              </w:rPr>
-              <w:t>equals()</w:t>
+            <w:proofErr w:type="gramStart"/>
+            <w:r>
+              <w:rPr>
+                <w:sz w:val="24"/>
+                <w:szCs w:val="24"/>
+              </w:rPr>
+              <w:t>equals(</w:t>
+            </w:r>
+            <w:proofErr w:type="gramEnd"/>
+            <w:r>
+              <w:rPr>
+                <w:sz w:val="24"/>
+                <w:szCs w:val="24"/>
+              </w:rPr>
+              <w:t>)</w:t>
             </w:r>
           </w:p>
         </w:tc>
@@ -3387,9 +3539,18 @@
                 <w:sz w:val="24"/>
                 <w:szCs w:val="24"/>
               </w:rPr>
-              <w:t>Java".equals</w:t>
+              <w:t>Java</w:t>
+            </w:r>
+            <w:proofErr w:type="gramStart"/>
+            <w:r>
+              <w:rPr>
+                <w:sz w:val="24"/>
+                <w:szCs w:val="24"/>
+              </w:rPr>
+              <w:t>".equals</w:t>
             </w:r>
             <w:proofErr w:type="spellEnd"/>
+            <w:proofErr w:type="gramEnd"/>
             <w:r>
               <w:rPr>
                 <w:sz w:val="24"/>
@@ -3441,6 +3602,7 @@
               </w:rPr>
             </w:pPr>
             <w:proofErr w:type="spellStart"/>
+            <w:proofErr w:type="gramStart"/>
             <w:r>
               <w:rPr>
                 <w:sz w:val="24"/>
@@ -3454,7 +3616,15 @@
                 <w:sz w:val="24"/>
                 <w:szCs w:val="24"/>
               </w:rPr>
-              <w:t>()</w:t>
+              <w:t>(</w:t>
+            </w:r>
+            <w:proofErr w:type="gramEnd"/>
+            <w:r>
+              <w:rPr>
+                <w:sz w:val="24"/>
+                <w:szCs w:val="24"/>
+              </w:rPr>
+              <w:t>)</w:t>
             </w:r>
           </w:p>
         </w:tc>
@@ -3502,7 +3672,15 @@
                 <w:sz w:val="24"/>
                 <w:szCs w:val="24"/>
               </w:rPr>
-              <w:t>"java".</w:t>
+              <w:t>"java</w:t>
+            </w:r>
+            <w:proofErr w:type="gramStart"/>
+            <w:r>
+              <w:rPr>
+                <w:sz w:val="24"/>
+                <w:szCs w:val="24"/>
+              </w:rPr>
+              <w:t>".</w:t>
             </w:r>
             <w:proofErr w:type="spellStart"/>
             <w:r>
@@ -3513,6 +3691,7 @@
               <w:t>equalsIgnoreCase</w:t>
             </w:r>
             <w:proofErr w:type="spellEnd"/>
+            <w:proofErr w:type="gramEnd"/>
             <w:r>
               <w:rPr>
                 <w:sz w:val="24"/>
@@ -3566,12 +3745,21 @@
                 <w:szCs w:val="24"/>
               </w:rPr>
             </w:pPr>
-            <w:r>
-              <w:rPr>
-                <w:sz w:val="24"/>
-                <w:szCs w:val="24"/>
-              </w:rPr>
-              <w:t>contains()</w:t>
+            <w:proofErr w:type="gramStart"/>
+            <w:r>
+              <w:rPr>
+                <w:sz w:val="24"/>
+                <w:szCs w:val="24"/>
+              </w:rPr>
+              <w:t>contains(</w:t>
+            </w:r>
+            <w:proofErr w:type="gramEnd"/>
+            <w:r>
+              <w:rPr>
+                <w:sz w:val="24"/>
+                <w:szCs w:val="24"/>
+              </w:rPr>
+              <w:t>)</w:t>
             </w:r>
           </w:p>
         </w:tc>
@@ -3636,9 +3824,18 @@
                 <w:sz w:val="24"/>
                 <w:szCs w:val="24"/>
               </w:rPr>
-              <w:t>Programming".contains</w:t>
+              <w:t>Programming</w:t>
+            </w:r>
+            <w:proofErr w:type="gramStart"/>
+            <w:r>
+              <w:rPr>
+                <w:sz w:val="24"/>
+                <w:szCs w:val="24"/>
+              </w:rPr>
+              <w:t>".contains</w:t>
             </w:r>
             <w:proofErr w:type="spellEnd"/>
+            <w:proofErr w:type="gramEnd"/>
             <w:r>
               <w:rPr>
                 <w:sz w:val="24"/>
@@ -3690,6 +3887,7 @@
               </w:rPr>
             </w:pPr>
             <w:proofErr w:type="spellStart"/>
+            <w:proofErr w:type="gramStart"/>
             <w:r>
               <w:rPr>
                 <w:sz w:val="24"/>
@@ -3703,7 +3901,15 @@
                 <w:sz w:val="24"/>
                 <w:szCs w:val="24"/>
               </w:rPr>
-              <w:t>()</w:t>
+              <w:t>(</w:t>
+            </w:r>
+            <w:proofErr w:type="gramEnd"/>
+            <w:r>
+              <w:rPr>
+                <w:sz w:val="24"/>
+                <w:szCs w:val="24"/>
+              </w:rPr>
+              <w:t>)</w:t>
             </w:r>
           </w:p>
         </w:tc>
@@ -3751,7 +3957,15 @@
                 <w:sz w:val="24"/>
                 <w:szCs w:val="24"/>
               </w:rPr>
-              <w:t>"Java".</w:t>
+              <w:t>"Java</w:t>
+            </w:r>
+            <w:proofErr w:type="gramStart"/>
+            <w:r>
+              <w:rPr>
+                <w:sz w:val="24"/>
+                <w:szCs w:val="24"/>
+              </w:rPr>
+              <w:t>".</w:t>
             </w:r>
             <w:proofErr w:type="spellStart"/>
             <w:r>
@@ -3762,6 +3976,7 @@
               <w:t>startsWith</w:t>
             </w:r>
             <w:proofErr w:type="spellEnd"/>
+            <w:proofErr w:type="gramEnd"/>
             <w:r>
               <w:rPr>
                 <w:sz w:val="24"/>
@@ -3816,6 +4031,7 @@
               </w:rPr>
             </w:pPr>
             <w:proofErr w:type="spellStart"/>
+            <w:proofErr w:type="gramStart"/>
             <w:r>
               <w:rPr>
                 <w:sz w:val="24"/>
@@ -3829,7 +4045,15 @@
                 <w:sz w:val="24"/>
                 <w:szCs w:val="24"/>
               </w:rPr>
-              <w:t>()</w:t>
+              <w:t>(</w:t>
+            </w:r>
+            <w:proofErr w:type="gramEnd"/>
+            <w:r>
+              <w:rPr>
+                <w:sz w:val="24"/>
+                <w:szCs w:val="24"/>
+              </w:rPr>
+              <w:t>)</w:t>
             </w:r>
           </w:p>
         </w:tc>
@@ -3877,7 +4101,15 @@
                 <w:sz w:val="24"/>
                 <w:szCs w:val="24"/>
               </w:rPr>
-              <w:t>"Java".</w:t>
+              <w:t>"Java</w:t>
+            </w:r>
+            <w:proofErr w:type="gramStart"/>
+            <w:r>
+              <w:rPr>
+                <w:sz w:val="24"/>
+                <w:szCs w:val="24"/>
+              </w:rPr>
+              <w:t>".</w:t>
             </w:r>
             <w:proofErr w:type="spellStart"/>
             <w:r>
@@ -3888,6 +4120,7 @@
               <w:t>endsWith</w:t>
             </w:r>
             <w:proofErr w:type="spellEnd"/>
+            <w:proofErr w:type="gramEnd"/>
             <w:r>
               <w:rPr>
                 <w:sz w:val="24"/>
@@ -3954,12 +4187,21 @@
                 <w:szCs w:val="24"/>
               </w:rPr>
             </w:pPr>
-            <w:r>
-              <w:rPr>
-                <w:sz w:val="24"/>
-                <w:szCs w:val="24"/>
-              </w:rPr>
-              <w:t>replace()</w:t>
+            <w:proofErr w:type="gramStart"/>
+            <w:r>
+              <w:rPr>
+                <w:sz w:val="24"/>
+                <w:szCs w:val="24"/>
+              </w:rPr>
+              <w:t>replace(</w:t>
+            </w:r>
+            <w:proofErr w:type="gramEnd"/>
+            <w:r>
+              <w:rPr>
+                <w:sz w:val="24"/>
+                <w:szCs w:val="24"/>
+              </w:rPr>
+              <w:t>)</w:t>
             </w:r>
           </w:p>
         </w:tc>
@@ -4015,9 +4257,18 @@
                 <w:sz w:val="24"/>
                 <w:szCs w:val="24"/>
               </w:rPr>
-              <w:t>Java".replace</w:t>
+              <w:t>Java</w:t>
+            </w:r>
+            <w:proofErr w:type="gramStart"/>
+            <w:r>
+              <w:rPr>
+                <w:sz w:val="24"/>
+                <w:szCs w:val="24"/>
+              </w:rPr>
+              <w:t>".replace</w:t>
             </w:r>
             <w:proofErr w:type="spellEnd"/>
+            <w:proofErr w:type="gramEnd"/>
             <w:r>
               <w:rPr>
                 <w:sz w:val="24"/>
@@ -4071,12 +4322,21 @@
                 <w:szCs w:val="24"/>
               </w:rPr>
             </w:pPr>
-            <w:r>
-              <w:rPr>
-                <w:sz w:val="24"/>
-                <w:szCs w:val="24"/>
-              </w:rPr>
-              <w:t>trim()</w:t>
+            <w:proofErr w:type="gramStart"/>
+            <w:r>
+              <w:rPr>
+                <w:sz w:val="24"/>
+                <w:szCs w:val="24"/>
+              </w:rPr>
+              <w:t>trim(</w:t>
+            </w:r>
+            <w:proofErr w:type="gramEnd"/>
+            <w:r>
+              <w:rPr>
+                <w:sz w:val="24"/>
+                <w:szCs w:val="24"/>
+              </w:rPr>
+              <w:t>)</w:t>
             </w:r>
           </w:p>
         </w:tc>
@@ -4124,7 +4384,23 @@
                 <w:sz w:val="24"/>
                 <w:szCs w:val="24"/>
               </w:rPr>
-              <w:t>" Java ".trim()</w:t>
+              <w:t xml:space="preserve">" Java </w:t>
+            </w:r>
+            <w:proofErr w:type="gramStart"/>
+            <w:r>
+              <w:rPr>
+                <w:sz w:val="24"/>
+                <w:szCs w:val="24"/>
+              </w:rPr>
+              <w:t>".trim</w:t>
+            </w:r>
+            <w:proofErr w:type="gramEnd"/>
+            <w:r>
+              <w:rPr>
+                <w:sz w:val="24"/>
+                <w:szCs w:val="24"/>
+              </w:rPr>
+              <w:t>()</w:t>
             </w:r>
           </w:p>
         </w:tc>
@@ -4169,12 +4445,21 @@
                 <w:szCs w:val="24"/>
               </w:rPr>
             </w:pPr>
-            <w:r>
-              <w:rPr>
-                <w:sz w:val="24"/>
-                <w:szCs w:val="24"/>
-              </w:rPr>
-              <w:t>split()</w:t>
+            <w:proofErr w:type="gramStart"/>
+            <w:r>
+              <w:rPr>
+                <w:sz w:val="24"/>
+                <w:szCs w:val="24"/>
+              </w:rPr>
+              <w:t>split(</w:t>
+            </w:r>
+            <w:proofErr w:type="gramEnd"/>
+            <w:r>
+              <w:rPr>
+                <w:sz w:val="24"/>
+                <w:szCs w:val="24"/>
+              </w:rPr>
+              <w:t>)</w:t>
             </w:r>
           </w:p>
         </w:tc>
@@ -4225,14 +4510,32 @@
               <w:t>"</w:t>
             </w:r>
             <w:proofErr w:type="spellStart"/>
-            <w:r>
-              <w:rPr>
-                <w:sz w:val="24"/>
-                <w:szCs w:val="24"/>
-              </w:rPr>
-              <w:t>A,B,C".split</w:t>
+            <w:proofErr w:type="gramStart"/>
+            <w:r>
+              <w:rPr>
+                <w:sz w:val="24"/>
+                <w:szCs w:val="24"/>
+              </w:rPr>
+              <w:t>A,B</w:t>
+            </w:r>
+            <w:proofErr w:type="gramEnd"/>
+            <w:r>
+              <w:rPr>
+                <w:sz w:val="24"/>
+                <w:szCs w:val="24"/>
+              </w:rPr>
+              <w:t>,C</w:t>
+            </w:r>
+            <w:proofErr w:type="gramStart"/>
+            <w:r>
+              <w:rPr>
+                <w:sz w:val="24"/>
+                <w:szCs w:val="24"/>
+              </w:rPr>
+              <w:t>".split</w:t>
             </w:r>
             <w:proofErr w:type="spellEnd"/>
+            <w:proofErr w:type="gramEnd"/>
             <w:r>
               <w:rPr>
                 <w:sz w:val="24"/>
@@ -4287,6 +4590,7 @@
               </w:rPr>
             </w:pPr>
             <w:proofErr w:type="spellStart"/>
+            <w:proofErr w:type="gramStart"/>
             <w:r>
               <w:rPr>
                 <w:sz w:val="24"/>
@@ -4300,7 +4604,15 @@
                 <w:sz w:val="24"/>
                 <w:szCs w:val="24"/>
               </w:rPr>
-              <w:t>()</w:t>
+              <w:t>(</w:t>
+            </w:r>
+            <w:proofErr w:type="gramEnd"/>
+            <w:r>
+              <w:rPr>
+                <w:sz w:val="24"/>
+                <w:szCs w:val="24"/>
+              </w:rPr>
+              <w:t>)</w:t>
             </w:r>
           </w:p>
         </w:tc>
@@ -4348,7 +4660,15 @@
                 <w:sz w:val="24"/>
                 <w:szCs w:val="24"/>
               </w:rPr>
-              <w:t>"Java".</w:t>
+              <w:t>"Java</w:t>
+            </w:r>
+            <w:proofErr w:type="gramStart"/>
+            <w:r>
+              <w:rPr>
+                <w:sz w:val="24"/>
+                <w:szCs w:val="24"/>
+              </w:rPr>
+              <w:t>".</w:t>
             </w:r>
             <w:proofErr w:type="spellStart"/>
             <w:r>
@@ -4359,6 +4679,7 @@
               <w:t>indexOf</w:t>
             </w:r>
             <w:proofErr w:type="spellEnd"/>
+            <w:proofErr w:type="gramEnd"/>
             <w:r>
               <w:rPr>
                 <w:sz w:val="24"/>
@@ -4410,6 +4731,7 @@
               </w:rPr>
             </w:pPr>
             <w:proofErr w:type="spellStart"/>
+            <w:proofErr w:type="gramStart"/>
             <w:r>
               <w:rPr>
                 <w:sz w:val="24"/>
@@ -4423,7 +4745,15 @@
                 <w:sz w:val="24"/>
                 <w:szCs w:val="24"/>
               </w:rPr>
-              <w:t>()</w:t>
+              <w:t>(</w:t>
+            </w:r>
+            <w:proofErr w:type="gramEnd"/>
+            <w:r>
+              <w:rPr>
+                <w:sz w:val="24"/>
+                <w:szCs w:val="24"/>
+              </w:rPr>
+              <w:t>)</w:t>
             </w:r>
           </w:p>
         </w:tc>
@@ -4471,7 +4801,15 @@
                 <w:sz w:val="24"/>
                 <w:szCs w:val="24"/>
               </w:rPr>
-              <w:t>"Java Java".</w:t>
+              <w:t>"Java Java</w:t>
+            </w:r>
+            <w:proofErr w:type="gramStart"/>
+            <w:r>
+              <w:rPr>
+                <w:sz w:val="24"/>
+                <w:szCs w:val="24"/>
+              </w:rPr>
+              <w:t>".</w:t>
             </w:r>
             <w:proofErr w:type="spellStart"/>
             <w:r>
@@ -4482,6 +4820,7 @@
               <w:t>lastIndexOf</w:t>
             </w:r>
             <w:proofErr w:type="spellEnd"/>
+            <w:proofErr w:type="gramEnd"/>
             <w:r>
               <w:rPr>
                 <w:sz w:val="24"/>
@@ -4536,6 +4875,7 @@
               </w:rPr>
             </w:pPr>
             <w:proofErr w:type="spellStart"/>
+            <w:proofErr w:type="gramStart"/>
             <w:r>
               <w:rPr>
                 <w:sz w:val="24"/>
@@ -4549,7 +4889,15 @@
                 <w:sz w:val="24"/>
                 <w:szCs w:val="24"/>
               </w:rPr>
-              <w:t>()</w:t>
+              <w:t>(</w:t>
+            </w:r>
+            <w:proofErr w:type="gramEnd"/>
+            <w:r>
+              <w:rPr>
+                <w:sz w:val="24"/>
+                <w:szCs w:val="24"/>
+              </w:rPr>
+              <w:t>)</w:t>
             </w:r>
           </w:p>
         </w:tc>
@@ -4597,7 +4945,15 @@
                 <w:sz w:val="24"/>
                 <w:szCs w:val="24"/>
               </w:rPr>
-              <w:t>"Hello".</w:t>
+              <w:t>"Hello</w:t>
+            </w:r>
+            <w:proofErr w:type="gramStart"/>
+            <w:r>
+              <w:rPr>
+                <w:sz w:val="24"/>
+                <w:szCs w:val="24"/>
+              </w:rPr>
+              <w:t>".</w:t>
             </w:r>
             <w:proofErr w:type="spellStart"/>
             <w:r>
@@ -4608,6 +4964,7 @@
               <w:t>concat</w:t>
             </w:r>
             <w:proofErr w:type="spellEnd"/>
+            <w:proofErr w:type="gramEnd"/>
             <w:r>
               <w:rPr>
                 <w:sz w:val="24"/>
@@ -4659,6 +5016,7 @@
               </w:rPr>
             </w:pPr>
             <w:proofErr w:type="spellStart"/>
+            <w:proofErr w:type="gramStart"/>
             <w:r>
               <w:rPr>
                 <w:sz w:val="24"/>
@@ -4672,7 +5030,15 @@
                 <w:sz w:val="24"/>
                 <w:szCs w:val="24"/>
               </w:rPr>
-              <w:t>()</w:t>
+              <w:t>(</w:t>
+            </w:r>
+            <w:proofErr w:type="gramEnd"/>
+            <w:r>
+              <w:rPr>
+                <w:sz w:val="24"/>
+                <w:szCs w:val="24"/>
+              </w:rPr>
+              <w:t>)</w:t>
             </w:r>
           </w:p>
         </w:tc>
@@ -4720,7 +5086,15 @@
                 <w:sz w:val="24"/>
                 <w:szCs w:val="24"/>
               </w:rPr>
-              <w:t>"".</w:t>
+              <w:t>"</w:t>
+            </w:r>
+            <w:proofErr w:type="gramStart"/>
+            <w:r>
+              <w:rPr>
+                <w:sz w:val="24"/>
+                <w:szCs w:val="24"/>
+              </w:rPr>
+              <w:t>".</w:t>
             </w:r>
             <w:proofErr w:type="spellStart"/>
             <w:r>
@@ -4731,6 +5105,7 @@
               <w:t>isEmpty</w:t>
             </w:r>
             <w:proofErr w:type="spellEnd"/>
+            <w:proofErr w:type="gramEnd"/>
             <w:r>
               <w:rPr>
                 <w:sz w:val="24"/>
@@ -4784,12 +5159,21 @@
                 <w:szCs w:val="24"/>
               </w:rPr>
             </w:pPr>
-            <w:r>
-              <w:rPr>
-                <w:sz w:val="24"/>
-                <w:szCs w:val="24"/>
-              </w:rPr>
-              <w:t>join()</w:t>
+            <w:proofErr w:type="gramStart"/>
+            <w:r>
+              <w:rPr>
+                <w:sz w:val="24"/>
+                <w:szCs w:val="24"/>
+              </w:rPr>
+              <w:t>join(</w:t>
+            </w:r>
+            <w:proofErr w:type="gramEnd"/>
+            <w:r>
+              <w:rPr>
+                <w:sz w:val="24"/>
+                <w:szCs w:val="24"/>
+              </w:rPr>
+              <w:t>)</w:t>
             </w:r>
           </w:p>
         </w:tc>
@@ -4892,6 +5276,7 @@
               </w:rPr>
             </w:pPr>
             <w:proofErr w:type="spellStart"/>
+            <w:proofErr w:type="gramStart"/>
             <w:r>
               <w:rPr>
                 <w:sz w:val="24"/>
@@ -4905,7 +5290,15 @@
                 <w:sz w:val="24"/>
                 <w:szCs w:val="24"/>
               </w:rPr>
-              <w:t>()</w:t>
+              <w:t>(</w:t>
+            </w:r>
+            <w:proofErr w:type="gramEnd"/>
+            <w:r>
+              <w:rPr>
+                <w:sz w:val="24"/>
+                <w:szCs w:val="24"/>
+              </w:rPr>
+              <w:t>)</w:t>
             </w:r>
           </w:p>
         </w:tc>
@@ -4953,7 +5346,15 @@
                 <w:sz w:val="24"/>
                 <w:szCs w:val="24"/>
               </w:rPr>
-              <w:t>"A".</w:t>
+              <w:t>"A</w:t>
+            </w:r>
+            <w:proofErr w:type="gramStart"/>
+            <w:r>
+              <w:rPr>
+                <w:sz w:val="24"/>
+                <w:szCs w:val="24"/>
+              </w:rPr>
+              <w:t>".</w:t>
             </w:r>
             <w:proofErr w:type="spellStart"/>
             <w:r>
@@ -4964,6 +5365,7 @@
               <w:t>compareTo</w:t>
             </w:r>
             <w:proofErr w:type="spellEnd"/>
+            <w:proofErr w:type="gramEnd"/>
             <w:r>
               <w:rPr>
                 <w:sz w:val="24"/>
@@ -5154,6 +5556,7 @@
         <w:t xml:space="preserve">. The array object stores metadata such as its type and length, along with its elements. When accessing an element like </w:t>
       </w:r>
       <w:proofErr w:type="spellStart"/>
+      <w:proofErr w:type="gramStart"/>
       <w:r>
         <w:rPr>
           <w:sz w:val="24"/>
@@ -5167,7 +5570,15 @@
           <w:sz w:val="24"/>
           <w:szCs w:val="24"/>
         </w:rPr>
-        <w:t xml:space="preserve">[3], the JVM calculates its memory location and retrieves the value while performing </w:t>
+        <w:t>[</w:t>
+      </w:r>
+      <w:proofErr w:type="gramEnd"/>
+      <w:r>
+        <w:rPr>
+          <w:sz w:val="24"/>
+          <w:szCs w:val="24"/>
+        </w:rPr>
+        <w:t xml:space="preserve">3], the JVM calculates its memory location and retrieves the value while performing </w:t>
       </w:r>
       <w:r>
         <w:rPr>
@@ -5256,7 +5667,71 @@
           <w:sz w:val="24"/>
           <w:szCs w:val="24"/>
         </w:rPr>
-        <w:t xml:space="preserve"> and initializes all elements with null references. For example, Student[] students = new Student[3]; creates an array that can hold three Student object references. When students[0] = new Student(); is executed, the first array element stores a reference pointing to the newly created Student object in the heap. The array stores the addresses of objects, while the actual objects are stored separately in memory.</w:t>
+        <w:t xml:space="preserve"> and initializes all elements with null references. For example, </w:t>
+      </w:r>
+      <w:proofErr w:type="gramStart"/>
+      <w:r>
+        <w:rPr>
+          <w:sz w:val="24"/>
+          <w:szCs w:val="24"/>
+        </w:rPr>
+        <w:t>Student[</w:t>
+      </w:r>
+      <w:proofErr w:type="gramEnd"/>
+      <w:r>
+        <w:rPr>
+          <w:sz w:val="24"/>
+          <w:szCs w:val="24"/>
+        </w:rPr>
+        <w:t xml:space="preserve">] students = new </w:t>
+      </w:r>
+      <w:proofErr w:type="gramStart"/>
+      <w:r>
+        <w:rPr>
+          <w:sz w:val="24"/>
+          <w:szCs w:val="24"/>
+        </w:rPr>
+        <w:t>Student[</w:t>
+      </w:r>
+      <w:proofErr w:type="gramEnd"/>
+      <w:r>
+        <w:rPr>
+          <w:sz w:val="24"/>
+          <w:szCs w:val="24"/>
+        </w:rPr>
+        <w:t xml:space="preserve">3]; creates an array that can hold three Student object references. When </w:t>
+      </w:r>
+      <w:proofErr w:type="gramStart"/>
+      <w:r>
+        <w:rPr>
+          <w:sz w:val="24"/>
+          <w:szCs w:val="24"/>
+        </w:rPr>
+        <w:t>students[</w:t>
+      </w:r>
+      <w:proofErr w:type="gramEnd"/>
+      <w:r>
+        <w:rPr>
+          <w:sz w:val="24"/>
+          <w:szCs w:val="24"/>
+        </w:rPr>
+        <w:t xml:space="preserve">0] = new </w:t>
+      </w:r>
+      <w:proofErr w:type="gramStart"/>
+      <w:r>
+        <w:rPr>
+          <w:sz w:val="24"/>
+          <w:szCs w:val="24"/>
+        </w:rPr>
+        <w:t>Student(</w:t>
+      </w:r>
+      <w:proofErr w:type="gramEnd"/>
+      <w:r>
+        <w:rPr>
+          <w:sz w:val="24"/>
+          <w:szCs w:val="24"/>
+        </w:rPr>
+        <w:t>); is executed, the first array element stores a reference pointing to the newly created Student object in the heap. The array stores the addresses of objects, while the actual objects are stored separately in memory.</w:t>
       </w:r>
     </w:p>
     <w:p>
@@ -5302,14 +5777,7 @@
           <w:sz w:val="24"/>
           <w:szCs w:val="24"/>
         </w:rPr>
-        <w:t>Declaration + Memory Allocation</w:t>
-      </w:r>
-      <w:r>
-        <w:rPr>
-          <w:sz w:val="24"/>
-          <w:szCs w:val="24"/>
-        </w:rPr>
-        <w:t xml:space="preserve"> and </w:t>
+        <w:t xml:space="preserve">Declaration + Memory Allocation and </w:t>
       </w:r>
       <w:r>
         <w:rPr>
@@ -5348,35 +5816,7 @@
           <w:sz w:val="24"/>
           <w:szCs w:val="24"/>
         </w:rPr>
-        <w:t xml:space="preserve">It got </w:t>
-      </w:r>
-      <w:r>
-        <w:rPr>
-          <w:sz w:val="24"/>
-          <w:szCs w:val="24"/>
-        </w:rPr>
-        <w:t>One-Dimensional Array</w:t>
-      </w:r>
-      <w:r>
-        <w:rPr>
-          <w:sz w:val="24"/>
-          <w:szCs w:val="24"/>
-        </w:rPr>
-        <w:t xml:space="preserve">, </w:t>
-      </w:r>
-      <w:r>
-        <w:rPr>
-          <w:sz w:val="24"/>
-          <w:szCs w:val="24"/>
-        </w:rPr>
-        <w:t>A normal list of values</w:t>
-      </w:r>
-      <w:r>
-        <w:rPr>
-          <w:sz w:val="24"/>
-          <w:szCs w:val="24"/>
-        </w:rPr>
-        <w:t xml:space="preserve"> and </w:t>
+        <w:t xml:space="preserve">It got One-Dimensional Array, A normal list of values and </w:t>
       </w:r>
       <w:r>
         <w:rPr>
@@ -5449,8 +5889,111 @@
       <w:pPr>
         <w:pStyle w:val="ListParagraph"/>
         <w:rPr>
-          <w:b/>
-          <w:bCs/>
+          <w:sz w:val="24"/>
+          <w:szCs w:val="24"/>
+        </w:rPr>
+      </w:pPr>
+      <w:r>
+        <w:rPr>
+          <w:sz w:val="24"/>
+          <w:szCs w:val="24"/>
+        </w:rPr>
+        <w:t xml:space="preserve">In Java, creating a class means defining a new </w:t>
+      </w:r>
+      <w:r>
+        <w:rPr>
+          <w:b/>
+          <w:bCs/>
+          <w:sz w:val="24"/>
+          <w:szCs w:val="24"/>
+        </w:rPr>
+        <w:t>reference data type</w:t>
+      </w:r>
+      <w:r>
+        <w:rPr>
+          <w:sz w:val="24"/>
+          <w:szCs w:val="24"/>
+        </w:rPr>
+        <w:t xml:space="preserve">. A class acts as a blueprint that describes what data (fields) and </w:t>
+      </w:r>
+      <w:proofErr w:type="spellStart"/>
+      <w:r>
+        <w:rPr>
+          <w:sz w:val="24"/>
+          <w:szCs w:val="24"/>
+        </w:rPr>
+        <w:t>behaviors</w:t>
+      </w:r>
+      <w:proofErr w:type="spellEnd"/>
+      <w:r>
+        <w:rPr>
+          <w:sz w:val="24"/>
+          <w:szCs w:val="24"/>
+        </w:rPr>
+        <w:t xml:space="preserve"> (methods) objects of that type will have. Once a class is created, its name can be used as a data type to declare reference variables, just like we use built-in types such as int or String. For example, after creating a </w:t>
+      </w:r>
+      <w:proofErr w:type="gramStart"/>
+      <w:r>
+        <w:rPr>
+          <w:sz w:val="24"/>
+          <w:szCs w:val="24"/>
+        </w:rPr>
+        <w:t>Student</w:t>
+      </w:r>
+      <w:proofErr w:type="gramEnd"/>
+      <w:r>
+        <w:rPr>
+          <w:sz w:val="24"/>
+          <w:szCs w:val="24"/>
+        </w:rPr>
+        <w:t xml:space="preserve"> class, we can write Student s</w:t>
+      </w:r>
+      <w:proofErr w:type="gramStart"/>
+      <w:r>
+        <w:rPr>
+          <w:sz w:val="24"/>
+          <w:szCs w:val="24"/>
+        </w:rPr>
+        <w:t>1;,</w:t>
+      </w:r>
+      <w:proofErr w:type="gramEnd"/>
+      <w:r>
+        <w:rPr>
+          <w:sz w:val="24"/>
+          <w:szCs w:val="24"/>
+        </w:rPr>
+        <w:t xml:space="preserve"> where Student becomes a new data type and s1 becomes a reference variable that can point to a </w:t>
+      </w:r>
+      <w:proofErr w:type="gramStart"/>
+      <w:r>
+        <w:rPr>
+          <w:sz w:val="24"/>
+          <w:szCs w:val="24"/>
+        </w:rPr>
+        <w:t>Student</w:t>
+      </w:r>
+      <w:proofErr w:type="gramEnd"/>
+      <w:r>
+        <w:rPr>
+          <w:sz w:val="24"/>
+          <w:szCs w:val="24"/>
+        </w:rPr>
+        <w:t xml:space="preserve"> object created in memory.</w:t>
+      </w:r>
+    </w:p>
+    <w:p>
+      <w:pPr>
+        <w:pStyle w:val="ListParagraph"/>
+        <w:rPr>
+          <w:sz w:val="24"/>
+          <w:szCs w:val="24"/>
+        </w:rPr>
+      </w:pPr>
+    </w:p>
+    <w:p>
+      <w:pPr>
+        <w:pStyle w:val="ListParagraph"/>
+        <w:rPr>
           <w:sz w:val="24"/>
           <w:szCs w:val="24"/>
         </w:rPr>
@@ -5485,8 +6028,33 @@
       <w:pPr>
         <w:pStyle w:val="ListParagraph"/>
         <w:rPr>
-          <w:b/>
-          <w:bCs/>
+          <w:sz w:val="24"/>
+          <w:szCs w:val="24"/>
+        </w:rPr>
+      </w:pPr>
+      <w:r>
+        <w:rPr>
+          <w:sz w:val="24"/>
+          <w:szCs w:val="24"/>
+        </w:rPr>
+        <w:t>In Java, Object is the root data type of all classes. Every class in Java directly or indirectly inherits from the built-in Object class, which means a variable of type Object can store a reference to an object of any class.</w:t>
+      </w:r>
+    </w:p>
+    <w:p>
+      <w:pPr>
+        <w:pStyle w:val="ListParagraph"/>
+        <w:rPr>
+          <w:b/>
+          <w:bCs/>
+          <w:sz w:val="24"/>
+          <w:szCs w:val="24"/>
+        </w:rPr>
+      </w:pPr>
+    </w:p>
+    <w:p>
+      <w:pPr>
+        <w:pStyle w:val="ListParagraph"/>
+        <w:rPr>
           <w:sz w:val="24"/>
           <w:szCs w:val="24"/>
         </w:rPr>
@@ -5521,6 +6089,98 @@
       <w:pPr>
         <w:pStyle w:val="ListParagraph"/>
         <w:rPr>
+          <w:b/>
+          <w:bCs/>
+          <w:sz w:val="24"/>
+          <w:szCs w:val="24"/>
+        </w:rPr>
+      </w:pPr>
+      <w:r>
+        <w:rPr>
+          <w:sz w:val="24"/>
+          <w:szCs w:val="24"/>
+        </w:rPr>
+        <w:t>In Java, an interface can act as a reference data type that defines a set of methods that a class must implement. An interface does not create objects directly; instead, it is used as a type for reference variables that can point to objects of any class that implements that interface</w:t>
+      </w:r>
+      <w:r>
+        <w:rPr>
+          <w:b/>
+          <w:bCs/>
+          <w:sz w:val="24"/>
+          <w:szCs w:val="24"/>
+        </w:rPr>
+        <w:t>.</w:t>
+      </w:r>
+    </w:p>
+    <w:p>
+      <w:pPr>
+        <w:pStyle w:val="ListParagraph"/>
+        <w:ind w:left="284"/>
+        <w:jc w:val="center"/>
+        <w:rPr>
+          <w:b/>
+          <w:bCs/>
+          <w:sz w:val="24"/>
+          <w:szCs w:val="24"/>
+        </w:rPr>
+      </w:pPr>
+      <w:r>
+        <w:rPr>
+          <w:noProof/>
+        </w:rPr>
+        <w:lastRenderedPageBreak/>
+        <w:drawing>
+          <wp:inline distT="0" distB="0" distL="0" distR="0" wp14:anchorId="1B3F7ECE" wp14:editId="4D004C1D">
+            <wp:extent cx="6210935" cy="3521710"/>
+            <wp:effectExtent l="0" t="0" r="0" b="2540"/>
+            <wp:docPr id="611661039" name="Picture 1"/>
+            <wp:cNvGraphicFramePr>
+              <a:graphicFrameLocks xmlns:a="http://schemas.openxmlformats.org/drawingml/2006/main" noChangeAspect="1"/>
+            </wp:cNvGraphicFramePr>
+            <a:graphic xmlns:a="http://schemas.openxmlformats.org/drawingml/2006/main">
+              <a:graphicData uri="http://schemas.openxmlformats.org/drawingml/2006/picture">
+                <pic:pic xmlns:pic="http://schemas.openxmlformats.org/drawingml/2006/picture">
+                  <pic:nvPicPr>
+                    <pic:cNvPr id="611661039" name=""/>
+                    <pic:cNvPicPr/>
+                  </pic:nvPicPr>
+                  <pic:blipFill>
+                    <a:blip r:embed="rId10"/>
+                    <a:stretch>
+                      <a:fillRect/>
+                    </a:stretch>
+                  </pic:blipFill>
+                  <pic:spPr>
+                    <a:xfrm>
+                      <a:off x="0" y="0"/>
+                      <a:ext cx="6210935" cy="3521710"/>
+                    </a:xfrm>
+                    <a:prstGeom prst="rect">
+                      <a:avLst/>
+                    </a:prstGeom>
+                  </pic:spPr>
+                </pic:pic>
+              </a:graphicData>
+            </a:graphic>
+          </wp:inline>
+        </w:drawing>
+      </w:r>
+    </w:p>
+    <w:p>
+      <w:pPr>
+        <w:pStyle w:val="ListParagraph"/>
+        <w:rPr>
+          <w:b/>
+          <w:bCs/>
+          <w:sz w:val="24"/>
+          <w:szCs w:val="24"/>
+        </w:rPr>
+      </w:pPr>
+    </w:p>
+    <w:p>
+      <w:pPr>
+        <w:pStyle w:val="ListParagraph"/>
+        <w:rPr>
           <w:sz w:val="24"/>
           <w:szCs w:val="24"/>
         </w:rPr>
@@ -5550,6 +6210,15 @@
         </w:rPr>
         <w:t>A special type used to define a fixed set of named constants.</w:t>
       </w:r>
+    </w:p>
+    <w:p>
+      <w:pPr>
+        <w:pStyle w:val="ListParagraph"/>
+        <w:rPr>
+          <w:sz w:val="24"/>
+          <w:szCs w:val="24"/>
+        </w:rPr>
+      </w:pPr>
     </w:p>
     <w:p>
       <w:pPr>

</xml_diff>

<commit_message>
Enum as a Data Type  #21
</commit_message>
<xml_diff>
--- a/Chapter3/CH3.docx
+++ b/Chapter3/CH3.docx
@@ -503,17 +503,12 @@
         <w:t xml:space="preserve">Type mismatch: cannot convert from String to </w:t>
       </w:r>
       <w:proofErr w:type="spellStart"/>
-      <w:proofErr w:type="gramStart"/>
       <w:r>
         <w:t>intJava</w:t>
       </w:r>
       <w:proofErr w:type="spellEnd"/>
       <w:r>
-        <w:t>(</w:t>
-      </w:r>
-      <w:proofErr w:type="gramEnd"/>
-      <w:r>
-        <w:t>16777233)</w:t>
+        <w:t>(16777233)</w:t>
       </w:r>
       <w:r>
         <w:t>” Error.</w:t>
@@ -2268,23 +2263,7 @@
           <w:sz w:val="24"/>
           <w:szCs w:val="24"/>
         </w:rPr>
-        <w:t>when you create a string using a literal, like String name = "Java</w:t>
-      </w:r>
-      <w:proofErr w:type="gramStart"/>
-      <w:r>
-        <w:rPr>
-          <w:sz w:val="24"/>
-          <w:szCs w:val="24"/>
-        </w:rPr>
-        <w:t>";,</w:t>
-      </w:r>
-      <w:proofErr w:type="gramEnd"/>
-      <w:r>
-        <w:rPr>
-          <w:sz w:val="24"/>
-          <w:szCs w:val="24"/>
-        </w:rPr>
-        <w:t xml:space="preserve"> allowing Java to reuse existing string objects and save memory. Java stores strings in the </w:t>
+        <w:t xml:space="preserve">when you create a string using a literal, like String name = "Java";, allowing Java to reuse existing string objects and save memory. Java stores strings in the </w:t>
       </w:r>
       <w:r>
         <w:rPr>
@@ -2300,39 +2279,7 @@
           <w:sz w:val="24"/>
           <w:szCs w:val="24"/>
         </w:rPr>
-        <w:t xml:space="preserve"> when you create them using new, like String name = new </w:t>
-      </w:r>
-      <w:proofErr w:type="gramStart"/>
-      <w:r>
-        <w:rPr>
-          <w:sz w:val="24"/>
-          <w:szCs w:val="24"/>
-        </w:rPr>
-        <w:t>String(</w:t>
-      </w:r>
-      <w:proofErr w:type="gramEnd"/>
-      <w:r>
-        <w:rPr>
-          <w:sz w:val="24"/>
-          <w:szCs w:val="24"/>
-        </w:rPr>
-        <w:t>"Java"</w:t>
-      </w:r>
-      <w:proofErr w:type="gramStart"/>
-      <w:r>
-        <w:rPr>
-          <w:sz w:val="24"/>
-          <w:szCs w:val="24"/>
-        </w:rPr>
-        <w:t>);,</w:t>
-      </w:r>
-      <w:proofErr w:type="gramEnd"/>
-      <w:r>
-        <w:rPr>
-          <w:sz w:val="24"/>
-          <w:szCs w:val="24"/>
-        </w:rPr>
-        <w:t xml:space="preserve"> which creates a separate string object even if the same value already exists in the pool.</w:t>
+        <w:t xml:space="preserve"> when you create them using new, like String name = new String("Java");, which creates a separate string object even if the same value already exists in the pool.</w:t>
       </w:r>
     </w:p>
     <w:p>
@@ -2657,21 +2604,12 @@
                 <w:szCs w:val="24"/>
               </w:rPr>
             </w:pPr>
-            <w:proofErr w:type="gramStart"/>
-            <w:r>
-              <w:rPr>
-                <w:sz w:val="24"/>
-                <w:szCs w:val="24"/>
-              </w:rPr>
-              <w:t>length(</w:t>
-            </w:r>
-            <w:proofErr w:type="gramEnd"/>
-            <w:r>
-              <w:rPr>
-                <w:sz w:val="24"/>
-                <w:szCs w:val="24"/>
-              </w:rPr>
-              <w:t>)</w:t>
+            <w:r>
+              <w:rPr>
+                <w:sz w:val="24"/>
+                <w:szCs w:val="24"/>
+              </w:rPr>
+              <w:t>length()</w:t>
             </w:r>
           </w:p>
         </w:tc>
@@ -2727,18 +2665,9 @@
                 <w:sz w:val="24"/>
                 <w:szCs w:val="24"/>
               </w:rPr>
-              <w:t>Java</w:t>
-            </w:r>
-            <w:proofErr w:type="gramStart"/>
-            <w:r>
-              <w:rPr>
-                <w:sz w:val="24"/>
-                <w:szCs w:val="24"/>
-              </w:rPr>
-              <w:t>".length</w:t>
+              <w:t>Java".length</w:t>
             </w:r>
             <w:proofErr w:type="spellEnd"/>
-            <w:proofErr w:type="gramEnd"/>
             <w:r>
               <w:rPr>
                 <w:sz w:val="24"/>
@@ -2851,15 +2780,7 @@
                 <w:sz w:val="24"/>
                 <w:szCs w:val="24"/>
               </w:rPr>
-              <w:t>"Java</w:t>
-            </w:r>
-            <w:proofErr w:type="gramStart"/>
-            <w:r>
-              <w:rPr>
-                <w:sz w:val="24"/>
-                <w:szCs w:val="24"/>
-              </w:rPr>
-              <w:t>".</w:t>
+              <w:t>"Java".</w:t>
             </w:r>
             <w:proofErr w:type="spellStart"/>
             <w:r>
@@ -2870,7 +2791,6 @@
               <w:t>charAt</w:t>
             </w:r>
             <w:proofErr w:type="spellEnd"/>
-            <w:proofErr w:type="gramEnd"/>
             <w:r>
               <w:rPr>
                 <w:sz w:val="24"/>
@@ -2985,18 +2905,9 @@
                 <w:sz w:val="24"/>
                 <w:szCs w:val="24"/>
               </w:rPr>
-              <w:t>Programming</w:t>
-            </w:r>
-            <w:proofErr w:type="gramStart"/>
-            <w:r>
-              <w:rPr>
-                <w:sz w:val="24"/>
-                <w:szCs w:val="24"/>
-              </w:rPr>
-              <w:t>".substring</w:t>
+              <w:t>Programming".substring</w:t>
             </w:r>
             <w:proofErr w:type="spellEnd"/>
-            <w:proofErr w:type="gramEnd"/>
             <w:r>
               <w:rPr>
                 <w:sz w:val="24"/>
@@ -3049,21 +2960,12 @@
                 <w:szCs w:val="24"/>
               </w:rPr>
             </w:pPr>
-            <w:proofErr w:type="gramStart"/>
-            <w:r>
-              <w:rPr>
-                <w:sz w:val="24"/>
-                <w:szCs w:val="24"/>
-              </w:rPr>
-              <w:t>substring(</w:t>
-            </w:r>
-            <w:proofErr w:type="gramEnd"/>
-            <w:r>
-              <w:rPr>
-                <w:sz w:val="24"/>
-                <w:szCs w:val="24"/>
-              </w:rPr>
-              <w:t>start, end)</w:t>
+            <w:r>
+              <w:rPr>
+                <w:sz w:val="24"/>
+                <w:szCs w:val="24"/>
+              </w:rPr>
+              <w:t>substring(start, end)</w:t>
             </w:r>
           </w:p>
         </w:tc>
@@ -3119,18 +3021,9 @@
                 <w:sz w:val="24"/>
                 <w:szCs w:val="24"/>
               </w:rPr>
-              <w:t>Programming</w:t>
-            </w:r>
-            <w:proofErr w:type="gramStart"/>
-            <w:r>
-              <w:rPr>
-                <w:sz w:val="24"/>
-                <w:szCs w:val="24"/>
-              </w:rPr>
-              <w:t>".substring</w:t>
+              <w:t>Programming".substring</w:t>
             </w:r>
             <w:proofErr w:type="spellEnd"/>
-            <w:proofErr w:type="gramEnd"/>
             <w:r>
               <w:rPr>
                 <w:sz w:val="24"/>
@@ -3185,7 +3078,6 @@
               </w:rPr>
             </w:pPr>
             <w:proofErr w:type="spellStart"/>
-            <w:proofErr w:type="gramStart"/>
             <w:r>
               <w:rPr>
                 <w:sz w:val="24"/>
@@ -3199,15 +3091,7 @@
                 <w:sz w:val="24"/>
                 <w:szCs w:val="24"/>
               </w:rPr>
-              <w:t>(</w:t>
-            </w:r>
-            <w:proofErr w:type="gramEnd"/>
-            <w:r>
-              <w:rPr>
-                <w:sz w:val="24"/>
-                <w:szCs w:val="24"/>
-              </w:rPr>
-              <w:t>)</w:t>
+              <w:t>()</w:t>
             </w:r>
           </w:p>
         </w:tc>
@@ -3255,15 +3139,7 @@
                 <w:sz w:val="24"/>
                 <w:szCs w:val="24"/>
               </w:rPr>
-              <w:t>"java</w:t>
-            </w:r>
-            <w:proofErr w:type="gramStart"/>
-            <w:r>
-              <w:rPr>
-                <w:sz w:val="24"/>
-                <w:szCs w:val="24"/>
-              </w:rPr>
-              <w:t>".</w:t>
+              <w:t>"java".</w:t>
             </w:r>
             <w:proofErr w:type="spellStart"/>
             <w:r>
@@ -3274,7 +3150,6 @@
               <w:t>toUpperCase</w:t>
             </w:r>
             <w:proofErr w:type="spellEnd"/>
-            <w:proofErr w:type="gramEnd"/>
             <w:r>
               <w:rPr>
                 <w:sz w:val="24"/>
@@ -3326,7 +3201,6 @@
               </w:rPr>
             </w:pPr>
             <w:proofErr w:type="spellStart"/>
-            <w:proofErr w:type="gramStart"/>
             <w:r>
               <w:rPr>
                 <w:sz w:val="24"/>
@@ -3340,15 +3214,7 @@
                 <w:sz w:val="24"/>
                 <w:szCs w:val="24"/>
               </w:rPr>
-              <w:t>(</w:t>
-            </w:r>
-            <w:proofErr w:type="gramEnd"/>
-            <w:r>
-              <w:rPr>
-                <w:sz w:val="24"/>
-                <w:szCs w:val="24"/>
-              </w:rPr>
-              <w:t>)</w:t>
+              <w:t>()</w:t>
             </w:r>
           </w:p>
         </w:tc>
@@ -3396,15 +3262,7 @@
                 <w:sz w:val="24"/>
                 <w:szCs w:val="24"/>
               </w:rPr>
-              <w:t>"JAVA</w:t>
-            </w:r>
-            <w:proofErr w:type="gramStart"/>
-            <w:r>
-              <w:rPr>
-                <w:sz w:val="24"/>
-                <w:szCs w:val="24"/>
-              </w:rPr>
-              <w:t>".</w:t>
+              <w:t>"JAVA".</w:t>
             </w:r>
             <w:proofErr w:type="spellStart"/>
             <w:r>
@@ -3415,7 +3273,6 @@
               <w:t>toLowerCase</w:t>
             </w:r>
             <w:proofErr w:type="spellEnd"/>
-            <w:proofErr w:type="gramEnd"/>
             <w:r>
               <w:rPr>
                 <w:sz w:val="24"/>
@@ -3469,21 +3326,12 @@
                 <w:szCs w:val="24"/>
               </w:rPr>
             </w:pPr>
-            <w:proofErr w:type="gramStart"/>
-            <w:r>
-              <w:rPr>
-                <w:sz w:val="24"/>
-                <w:szCs w:val="24"/>
-              </w:rPr>
-              <w:t>equals(</w:t>
-            </w:r>
-            <w:proofErr w:type="gramEnd"/>
-            <w:r>
-              <w:rPr>
-                <w:sz w:val="24"/>
-                <w:szCs w:val="24"/>
-              </w:rPr>
-              <w:t>)</w:t>
+            <w:r>
+              <w:rPr>
+                <w:sz w:val="24"/>
+                <w:szCs w:val="24"/>
+              </w:rPr>
+              <w:t>equals()</w:t>
             </w:r>
           </w:p>
         </w:tc>
@@ -3539,18 +3387,9 @@
                 <w:sz w:val="24"/>
                 <w:szCs w:val="24"/>
               </w:rPr>
-              <w:t>Java</w:t>
-            </w:r>
-            <w:proofErr w:type="gramStart"/>
-            <w:r>
-              <w:rPr>
-                <w:sz w:val="24"/>
-                <w:szCs w:val="24"/>
-              </w:rPr>
-              <w:t>".equals</w:t>
+              <w:t>Java".equals</w:t>
             </w:r>
             <w:proofErr w:type="spellEnd"/>
-            <w:proofErr w:type="gramEnd"/>
             <w:r>
               <w:rPr>
                 <w:sz w:val="24"/>
@@ -3602,7 +3441,6 @@
               </w:rPr>
             </w:pPr>
             <w:proofErr w:type="spellStart"/>
-            <w:proofErr w:type="gramStart"/>
             <w:r>
               <w:rPr>
                 <w:sz w:val="24"/>
@@ -3616,15 +3454,7 @@
                 <w:sz w:val="24"/>
                 <w:szCs w:val="24"/>
               </w:rPr>
-              <w:t>(</w:t>
-            </w:r>
-            <w:proofErr w:type="gramEnd"/>
-            <w:r>
-              <w:rPr>
-                <w:sz w:val="24"/>
-                <w:szCs w:val="24"/>
-              </w:rPr>
-              <w:t>)</w:t>
+              <w:t>()</w:t>
             </w:r>
           </w:p>
         </w:tc>
@@ -3672,15 +3502,7 @@
                 <w:sz w:val="24"/>
                 <w:szCs w:val="24"/>
               </w:rPr>
-              <w:t>"java</w:t>
-            </w:r>
-            <w:proofErr w:type="gramStart"/>
-            <w:r>
-              <w:rPr>
-                <w:sz w:val="24"/>
-                <w:szCs w:val="24"/>
-              </w:rPr>
-              <w:t>".</w:t>
+              <w:t>"java".</w:t>
             </w:r>
             <w:proofErr w:type="spellStart"/>
             <w:r>
@@ -3691,7 +3513,6 @@
               <w:t>equalsIgnoreCase</w:t>
             </w:r>
             <w:proofErr w:type="spellEnd"/>
-            <w:proofErr w:type="gramEnd"/>
             <w:r>
               <w:rPr>
                 <w:sz w:val="24"/>
@@ -3745,21 +3566,12 @@
                 <w:szCs w:val="24"/>
               </w:rPr>
             </w:pPr>
-            <w:proofErr w:type="gramStart"/>
-            <w:r>
-              <w:rPr>
-                <w:sz w:val="24"/>
-                <w:szCs w:val="24"/>
-              </w:rPr>
-              <w:t>contains(</w:t>
-            </w:r>
-            <w:proofErr w:type="gramEnd"/>
-            <w:r>
-              <w:rPr>
-                <w:sz w:val="24"/>
-                <w:szCs w:val="24"/>
-              </w:rPr>
-              <w:t>)</w:t>
+            <w:r>
+              <w:rPr>
+                <w:sz w:val="24"/>
+                <w:szCs w:val="24"/>
+              </w:rPr>
+              <w:t>contains()</w:t>
             </w:r>
           </w:p>
         </w:tc>
@@ -3824,18 +3636,9 @@
                 <w:sz w:val="24"/>
                 <w:szCs w:val="24"/>
               </w:rPr>
-              <w:t>Programming</w:t>
-            </w:r>
-            <w:proofErr w:type="gramStart"/>
-            <w:r>
-              <w:rPr>
-                <w:sz w:val="24"/>
-                <w:szCs w:val="24"/>
-              </w:rPr>
-              <w:t>".contains</w:t>
+              <w:t>Programming".contains</w:t>
             </w:r>
             <w:proofErr w:type="spellEnd"/>
-            <w:proofErr w:type="gramEnd"/>
             <w:r>
               <w:rPr>
                 <w:sz w:val="24"/>
@@ -3887,7 +3690,6 @@
               </w:rPr>
             </w:pPr>
             <w:proofErr w:type="spellStart"/>
-            <w:proofErr w:type="gramStart"/>
             <w:r>
               <w:rPr>
                 <w:sz w:val="24"/>
@@ -3901,15 +3703,7 @@
                 <w:sz w:val="24"/>
                 <w:szCs w:val="24"/>
               </w:rPr>
-              <w:t>(</w:t>
-            </w:r>
-            <w:proofErr w:type="gramEnd"/>
-            <w:r>
-              <w:rPr>
-                <w:sz w:val="24"/>
-                <w:szCs w:val="24"/>
-              </w:rPr>
-              <w:t>)</w:t>
+              <w:t>()</w:t>
             </w:r>
           </w:p>
         </w:tc>
@@ -3957,15 +3751,7 @@
                 <w:sz w:val="24"/>
                 <w:szCs w:val="24"/>
               </w:rPr>
-              <w:t>"Java</w:t>
-            </w:r>
-            <w:proofErr w:type="gramStart"/>
-            <w:r>
-              <w:rPr>
-                <w:sz w:val="24"/>
-                <w:szCs w:val="24"/>
-              </w:rPr>
-              <w:t>".</w:t>
+              <w:t>"Java".</w:t>
             </w:r>
             <w:proofErr w:type="spellStart"/>
             <w:r>
@@ -3976,7 +3762,6 @@
               <w:t>startsWith</w:t>
             </w:r>
             <w:proofErr w:type="spellEnd"/>
-            <w:proofErr w:type="gramEnd"/>
             <w:r>
               <w:rPr>
                 <w:sz w:val="24"/>
@@ -4031,7 +3816,6 @@
               </w:rPr>
             </w:pPr>
             <w:proofErr w:type="spellStart"/>
-            <w:proofErr w:type="gramStart"/>
             <w:r>
               <w:rPr>
                 <w:sz w:val="24"/>
@@ -4045,15 +3829,7 @@
                 <w:sz w:val="24"/>
                 <w:szCs w:val="24"/>
               </w:rPr>
-              <w:t>(</w:t>
-            </w:r>
-            <w:proofErr w:type="gramEnd"/>
-            <w:r>
-              <w:rPr>
-                <w:sz w:val="24"/>
-                <w:szCs w:val="24"/>
-              </w:rPr>
-              <w:t>)</w:t>
+              <w:t>()</w:t>
             </w:r>
           </w:p>
         </w:tc>
@@ -4101,15 +3877,7 @@
                 <w:sz w:val="24"/>
                 <w:szCs w:val="24"/>
               </w:rPr>
-              <w:t>"Java</w:t>
-            </w:r>
-            <w:proofErr w:type="gramStart"/>
-            <w:r>
-              <w:rPr>
-                <w:sz w:val="24"/>
-                <w:szCs w:val="24"/>
-              </w:rPr>
-              <w:t>".</w:t>
+              <w:t>"Java".</w:t>
             </w:r>
             <w:proofErr w:type="spellStart"/>
             <w:r>
@@ -4120,7 +3888,6 @@
               <w:t>endsWith</w:t>
             </w:r>
             <w:proofErr w:type="spellEnd"/>
-            <w:proofErr w:type="gramEnd"/>
             <w:r>
               <w:rPr>
                 <w:sz w:val="24"/>
@@ -4187,21 +3954,12 @@
                 <w:szCs w:val="24"/>
               </w:rPr>
             </w:pPr>
-            <w:proofErr w:type="gramStart"/>
-            <w:r>
-              <w:rPr>
-                <w:sz w:val="24"/>
-                <w:szCs w:val="24"/>
-              </w:rPr>
-              <w:t>replace(</w:t>
-            </w:r>
-            <w:proofErr w:type="gramEnd"/>
-            <w:r>
-              <w:rPr>
-                <w:sz w:val="24"/>
-                <w:szCs w:val="24"/>
-              </w:rPr>
-              <w:t>)</w:t>
+            <w:r>
+              <w:rPr>
+                <w:sz w:val="24"/>
+                <w:szCs w:val="24"/>
+              </w:rPr>
+              <w:t>replace()</w:t>
             </w:r>
           </w:p>
         </w:tc>
@@ -4257,18 +4015,9 @@
                 <w:sz w:val="24"/>
                 <w:szCs w:val="24"/>
               </w:rPr>
-              <w:t>Java</w:t>
-            </w:r>
-            <w:proofErr w:type="gramStart"/>
-            <w:r>
-              <w:rPr>
-                <w:sz w:val="24"/>
-                <w:szCs w:val="24"/>
-              </w:rPr>
-              <w:t>".replace</w:t>
+              <w:t>Java".replace</w:t>
             </w:r>
             <w:proofErr w:type="spellEnd"/>
-            <w:proofErr w:type="gramEnd"/>
             <w:r>
               <w:rPr>
                 <w:sz w:val="24"/>
@@ -4322,21 +4071,12 @@
                 <w:szCs w:val="24"/>
               </w:rPr>
             </w:pPr>
-            <w:proofErr w:type="gramStart"/>
-            <w:r>
-              <w:rPr>
-                <w:sz w:val="24"/>
-                <w:szCs w:val="24"/>
-              </w:rPr>
-              <w:t>trim(</w:t>
-            </w:r>
-            <w:proofErr w:type="gramEnd"/>
-            <w:r>
-              <w:rPr>
-                <w:sz w:val="24"/>
-                <w:szCs w:val="24"/>
-              </w:rPr>
-              <w:t>)</w:t>
+            <w:r>
+              <w:rPr>
+                <w:sz w:val="24"/>
+                <w:szCs w:val="24"/>
+              </w:rPr>
+              <w:t>trim()</w:t>
             </w:r>
           </w:p>
         </w:tc>
@@ -4384,23 +4124,7 @@
                 <w:sz w:val="24"/>
                 <w:szCs w:val="24"/>
               </w:rPr>
-              <w:t xml:space="preserve">" Java </w:t>
-            </w:r>
-            <w:proofErr w:type="gramStart"/>
-            <w:r>
-              <w:rPr>
-                <w:sz w:val="24"/>
-                <w:szCs w:val="24"/>
-              </w:rPr>
-              <w:t>".trim</w:t>
-            </w:r>
-            <w:proofErr w:type="gramEnd"/>
-            <w:r>
-              <w:rPr>
-                <w:sz w:val="24"/>
-                <w:szCs w:val="24"/>
-              </w:rPr>
-              <w:t>()</w:t>
+              <w:t>" Java ".trim()</w:t>
             </w:r>
           </w:p>
         </w:tc>
@@ -4445,21 +4169,12 @@
                 <w:szCs w:val="24"/>
               </w:rPr>
             </w:pPr>
-            <w:proofErr w:type="gramStart"/>
-            <w:r>
-              <w:rPr>
-                <w:sz w:val="24"/>
-                <w:szCs w:val="24"/>
-              </w:rPr>
-              <w:t>split(</w:t>
-            </w:r>
-            <w:proofErr w:type="gramEnd"/>
-            <w:r>
-              <w:rPr>
-                <w:sz w:val="24"/>
-                <w:szCs w:val="24"/>
-              </w:rPr>
-              <w:t>)</w:t>
+            <w:r>
+              <w:rPr>
+                <w:sz w:val="24"/>
+                <w:szCs w:val="24"/>
+              </w:rPr>
+              <w:t>split()</w:t>
             </w:r>
           </w:p>
         </w:tc>
@@ -4510,32 +4225,14 @@
               <w:t>"</w:t>
             </w:r>
             <w:proofErr w:type="spellStart"/>
-            <w:proofErr w:type="gramStart"/>
-            <w:r>
-              <w:rPr>
-                <w:sz w:val="24"/>
-                <w:szCs w:val="24"/>
-              </w:rPr>
-              <w:t>A,B</w:t>
-            </w:r>
-            <w:proofErr w:type="gramEnd"/>
-            <w:r>
-              <w:rPr>
-                <w:sz w:val="24"/>
-                <w:szCs w:val="24"/>
-              </w:rPr>
-              <w:t>,C</w:t>
-            </w:r>
-            <w:proofErr w:type="gramStart"/>
-            <w:r>
-              <w:rPr>
-                <w:sz w:val="24"/>
-                <w:szCs w:val="24"/>
-              </w:rPr>
-              <w:t>".split</w:t>
+            <w:r>
+              <w:rPr>
+                <w:sz w:val="24"/>
+                <w:szCs w:val="24"/>
+              </w:rPr>
+              <w:t>A,B,C".split</w:t>
             </w:r>
             <w:proofErr w:type="spellEnd"/>
-            <w:proofErr w:type="gramEnd"/>
             <w:r>
               <w:rPr>
                 <w:sz w:val="24"/>
@@ -4590,7 +4287,6 @@
               </w:rPr>
             </w:pPr>
             <w:proofErr w:type="spellStart"/>
-            <w:proofErr w:type="gramStart"/>
             <w:r>
               <w:rPr>
                 <w:sz w:val="24"/>
@@ -4604,15 +4300,7 @@
                 <w:sz w:val="24"/>
                 <w:szCs w:val="24"/>
               </w:rPr>
-              <w:t>(</w:t>
-            </w:r>
-            <w:proofErr w:type="gramEnd"/>
-            <w:r>
-              <w:rPr>
-                <w:sz w:val="24"/>
-                <w:szCs w:val="24"/>
-              </w:rPr>
-              <w:t>)</w:t>
+              <w:t>()</w:t>
             </w:r>
           </w:p>
         </w:tc>
@@ -4660,15 +4348,7 @@
                 <w:sz w:val="24"/>
                 <w:szCs w:val="24"/>
               </w:rPr>
-              <w:t>"Java</w:t>
-            </w:r>
-            <w:proofErr w:type="gramStart"/>
-            <w:r>
-              <w:rPr>
-                <w:sz w:val="24"/>
-                <w:szCs w:val="24"/>
-              </w:rPr>
-              <w:t>".</w:t>
+              <w:t>"Java".</w:t>
             </w:r>
             <w:proofErr w:type="spellStart"/>
             <w:r>
@@ -4679,7 +4359,6 @@
               <w:t>indexOf</w:t>
             </w:r>
             <w:proofErr w:type="spellEnd"/>
-            <w:proofErr w:type="gramEnd"/>
             <w:r>
               <w:rPr>
                 <w:sz w:val="24"/>
@@ -4731,7 +4410,6 @@
               </w:rPr>
             </w:pPr>
             <w:proofErr w:type="spellStart"/>
-            <w:proofErr w:type="gramStart"/>
             <w:r>
               <w:rPr>
                 <w:sz w:val="24"/>
@@ -4745,15 +4423,7 @@
                 <w:sz w:val="24"/>
                 <w:szCs w:val="24"/>
               </w:rPr>
-              <w:t>(</w:t>
-            </w:r>
-            <w:proofErr w:type="gramEnd"/>
-            <w:r>
-              <w:rPr>
-                <w:sz w:val="24"/>
-                <w:szCs w:val="24"/>
-              </w:rPr>
-              <w:t>)</w:t>
+              <w:t>()</w:t>
             </w:r>
           </w:p>
         </w:tc>
@@ -4801,15 +4471,7 @@
                 <w:sz w:val="24"/>
                 <w:szCs w:val="24"/>
               </w:rPr>
-              <w:t>"Java Java</w:t>
-            </w:r>
-            <w:proofErr w:type="gramStart"/>
-            <w:r>
-              <w:rPr>
-                <w:sz w:val="24"/>
-                <w:szCs w:val="24"/>
-              </w:rPr>
-              <w:t>".</w:t>
+              <w:t>"Java Java".</w:t>
             </w:r>
             <w:proofErr w:type="spellStart"/>
             <w:r>
@@ -4820,7 +4482,6 @@
               <w:t>lastIndexOf</w:t>
             </w:r>
             <w:proofErr w:type="spellEnd"/>
-            <w:proofErr w:type="gramEnd"/>
             <w:r>
               <w:rPr>
                 <w:sz w:val="24"/>
@@ -4875,7 +4536,6 @@
               </w:rPr>
             </w:pPr>
             <w:proofErr w:type="spellStart"/>
-            <w:proofErr w:type="gramStart"/>
             <w:r>
               <w:rPr>
                 <w:sz w:val="24"/>
@@ -4889,15 +4549,7 @@
                 <w:sz w:val="24"/>
                 <w:szCs w:val="24"/>
               </w:rPr>
-              <w:t>(</w:t>
-            </w:r>
-            <w:proofErr w:type="gramEnd"/>
-            <w:r>
-              <w:rPr>
-                <w:sz w:val="24"/>
-                <w:szCs w:val="24"/>
-              </w:rPr>
-              <w:t>)</w:t>
+              <w:t>()</w:t>
             </w:r>
           </w:p>
         </w:tc>
@@ -4945,15 +4597,7 @@
                 <w:sz w:val="24"/>
                 <w:szCs w:val="24"/>
               </w:rPr>
-              <w:t>"Hello</w:t>
-            </w:r>
-            <w:proofErr w:type="gramStart"/>
-            <w:r>
-              <w:rPr>
-                <w:sz w:val="24"/>
-                <w:szCs w:val="24"/>
-              </w:rPr>
-              <w:t>".</w:t>
+              <w:t>"Hello".</w:t>
             </w:r>
             <w:proofErr w:type="spellStart"/>
             <w:r>
@@ -4964,7 +4608,6 @@
               <w:t>concat</w:t>
             </w:r>
             <w:proofErr w:type="spellEnd"/>
-            <w:proofErr w:type="gramEnd"/>
             <w:r>
               <w:rPr>
                 <w:sz w:val="24"/>
@@ -5016,7 +4659,6 @@
               </w:rPr>
             </w:pPr>
             <w:proofErr w:type="spellStart"/>
-            <w:proofErr w:type="gramStart"/>
             <w:r>
               <w:rPr>
                 <w:sz w:val="24"/>
@@ -5030,15 +4672,7 @@
                 <w:sz w:val="24"/>
                 <w:szCs w:val="24"/>
               </w:rPr>
-              <w:t>(</w:t>
-            </w:r>
-            <w:proofErr w:type="gramEnd"/>
-            <w:r>
-              <w:rPr>
-                <w:sz w:val="24"/>
-                <w:szCs w:val="24"/>
-              </w:rPr>
-              <w:t>)</w:t>
+              <w:t>()</w:t>
             </w:r>
           </w:p>
         </w:tc>
@@ -5086,15 +4720,7 @@
                 <w:sz w:val="24"/>
                 <w:szCs w:val="24"/>
               </w:rPr>
-              <w:t>"</w:t>
-            </w:r>
-            <w:proofErr w:type="gramStart"/>
-            <w:r>
-              <w:rPr>
-                <w:sz w:val="24"/>
-                <w:szCs w:val="24"/>
-              </w:rPr>
-              <w:t>".</w:t>
+              <w:t>"".</w:t>
             </w:r>
             <w:proofErr w:type="spellStart"/>
             <w:r>
@@ -5105,7 +4731,6 @@
               <w:t>isEmpty</w:t>
             </w:r>
             <w:proofErr w:type="spellEnd"/>
-            <w:proofErr w:type="gramEnd"/>
             <w:r>
               <w:rPr>
                 <w:sz w:val="24"/>
@@ -5159,21 +4784,12 @@
                 <w:szCs w:val="24"/>
               </w:rPr>
             </w:pPr>
-            <w:proofErr w:type="gramStart"/>
-            <w:r>
-              <w:rPr>
-                <w:sz w:val="24"/>
-                <w:szCs w:val="24"/>
-              </w:rPr>
-              <w:t>join(</w:t>
-            </w:r>
-            <w:proofErr w:type="gramEnd"/>
-            <w:r>
-              <w:rPr>
-                <w:sz w:val="24"/>
-                <w:szCs w:val="24"/>
-              </w:rPr>
-              <w:t>)</w:t>
+            <w:r>
+              <w:rPr>
+                <w:sz w:val="24"/>
+                <w:szCs w:val="24"/>
+              </w:rPr>
+              <w:t>join()</w:t>
             </w:r>
           </w:p>
         </w:tc>
@@ -5276,7 +4892,6 @@
               </w:rPr>
             </w:pPr>
             <w:proofErr w:type="spellStart"/>
-            <w:proofErr w:type="gramStart"/>
             <w:r>
               <w:rPr>
                 <w:sz w:val="24"/>
@@ -5290,15 +4905,7 @@
                 <w:sz w:val="24"/>
                 <w:szCs w:val="24"/>
               </w:rPr>
-              <w:t>(</w:t>
-            </w:r>
-            <w:proofErr w:type="gramEnd"/>
-            <w:r>
-              <w:rPr>
-                <w:sz w:val="24"/>
-                <w:szCs w:val="24"/>
-              </w:rPr>
-              <w:t>)</w:t>
+              <w:t>()</w:t>
             </w:r>
           </w:p>
         </w:tc>
@@ -5346,15 +4953,7 @@
                 <w:sz w:val="24"/>
                 <w:szCs w:val="24"/>
               </w:rPr>
-              <w:t>"A</w:t>
-            </w:r>
-            <w:proofErr w:type="gramStart"/>
-            <w:r>
-              <w:rPr>
-                <w:sz w:val="24"/>
-                <w:szCs w:val="24"/>
-              </w:rPr>
-              <w:t>".</w:t>
+              <w:t>"A".</w:t>
             </w:r>
             <w:proofErr w:type="spellStart"/>
             <w:r>
@@ -5365,7 +4964,6 @@
               <w:t>compareTo</w:t>
             </w:r>
             <w:proofErr w:type="spellEnd"/>
-            <w:proofErr w:type="gramEnd"/>
             <w:r>
               <w:rPr>
                 <w:sz w:val="24"/>
@@ -5556,7 +5154,6 @@
         <w:t xml:space="preserve">. The array object stores metadata such as its type and length, along with its elements. When accessing an element like </w:t>
       </w:r>
       <w:proofErr w:type="spellStart"/>
-      <w:proofErr w:type="gramStart"/>
       <w:r>
         <w:rPr>
           <w:sz w:val="24"/>
@@ -5570,15 +5167,7 @@
           <w:sz w:val="24"/>
           <w:szCs w:val="24"/>
         </w:rPr>
-        <w:t>[</w:t>
-      </w:r>
-      <w:proofErr w:type="gramEnd"/>
-      <w:r>
-        <w:rPr>
-          <w:sz w:val="24"/>
-          <w:szCs w:val="24"/>
-        </w:rPr>
-        <w:t xml:space="preserve">3], the JVM calculates its memory location and retrieves the value while performing </w:t>
+        <w:t xml:space="preserve">[3], the JVM calculates its memory location and retrieves the value while performing </w:t>
       </w:r>
       <w:r>
         <w:rPr>
@@ -5667,71 +5256,7 @@
           <w:sz w:val="24"/>
           <w:szCs w:val="24"/>
         </w:rPr>
-        <w:t xml:space="preserve"> and initializes all elements with null references. For example, </w:t>
-      </w:r>
-      <w:proofErr w:type="gramStart"/>
-      <w:r>
-        <w:rPr>
-          <w:sz w:val="24"/>
-          <w:szCs w:val="24"/>
-        </w:rPr>
-        <w:t>Student[</w:t>
-      </w:r>
-      <w:proofErr w:type="gramEnd"/>
-      <w:r>
-        <w:rPr>
-          <w:sz w:val="24"/>
-          <w:szCs w:val="24"/>
-        </w:rPr>
-        <w:t xml:space="preserve">] students = new </w:t>
-      </w:r>
-      <w:proofErr w:type="gramStart"/>
-      <w:r>
-        <w:rPr>
-          <w:sz w:val="24"/>
-          <w:szCs w:val="24"/>
-        </w:rPr>
-        <w:t>Student[</w:t>
-      </w:r>
-      <w:proofErr w:type="gramEnd"/>
-      <w:r>
-        <w:rPr>
-          <w:sz w:val="24"/>
-          <w:szCs w:val="24"/>
-        </w:rPr>
-        <w:t xml:space="preserve">3]; creates an array that can hold three Student object references. When </w:t>
-      </w:r>
-      <w:proofErr w:type="gramStart"/>
-      <w:r>
-        <w:rPr>
-          <w:sz w:val="24"/>
-          <w:szCs w:val="24"/>
-        </w:rPr>
-        <w:t>students[</w:t>
-      </w:r>
-      <w:proofErr w:type="gramEnd"/>
-      <w:r>
-        <w:rPr>
-          <w:sz w:val="24"/>
-          <w:szCs w:val="24"/>
-        </w:rPr>
-        <w:t xml:space="preserve">0] = new </w:t>
-      </w:r>
-      <w:proofErr w:type="gramStart"/>
-      <w:r>
-        <w:rPr>
-          <w:sz w:val="24"/>
-          <w:szCs w:val="24"/>
-        </w:rPr>
-        <w:t>Student(</w:t>
-      </w:r>
-      <w:proofErr w:type="gramEnd"/>
-      <w:r>
-        <w:rPr>
-          <w:sz w:val="24"/>
-          <w:szCs w:val="24"/>
-        </w:rPr>
-        <w:t>); is executed, the first array element stores a reference pointing to the newly created Student object in the heap. The array stores the addresses of objects, while the actual objects are stored separately in memory.</w:t>
+        <w:t xml:space="preserve"> and initializes all elements with null references. For example, Student[] students = new Student[3]; creates an array that can hold three Student object references. When students[0] = new Student(); is executed, the first array element stores a reference pointing to the newly created Student object in the heap. The array stores the addresses of objects, while the actual objects are stored separately in memory.</w:t>
       </w:r>
     </w:p>
     <w:p>
@@ -5930,55 +5455,7 @@
           <w:sz w:val="24"/>
           <w:szCs w:val="24"/>
         </w:rPr>
-        <w:t xml:space="preserve"> (methods) objects of that type will have. Once a class is created, its name can be used as a data type to declare reference variables, just like we use built-in types such as int or String. For example, after creating a </w:t>
-      </w:r>
-      <w:proofErr w:type="gramStart"/>
-      <w:r>
-        <w:rPr>
-          <w:sz w:val="24"/>
-          <w:szCs w:val="24"/>
-        </w:rPr>
-        <w:t>Student</w:t>
-      </w:r>
-      <w:proofErr w:type="gramEnd"/>
-      <w:r>
-        <w:rPr>
-          <w:sz w:val="24"/>
-          <w:szCs w:val="24"/>
-        </w:rPr>
-        <w:t xml:space="preserve"> class, we can write Student s</w:t>
-      </w:r>
-      <w:proofErr w:type="gramStart"/>
-      <w:r>
-        <w:rPr>
-          <w:sz w:val="24"/>
-          <w:szCs w:val="24"/>
-        </w:rPr>
-        <w:t>1;,</w:t>
-      </w:r>
-      <w:proofErr w:type="gramEnd"/>
-      <w:r>
-        <w:rPr>
-          <w:sz w:val="24"/>
-          <w:szCs w:val="24"/>
-        </w:rPr>
-        <w:t xml:space="preserve"> where Student becomes a new data type and s1 becomes a reference variable that can point to a </w:t>
-      </w:r>
-      <w:proofErr w:type="gramStart"/>
-      <w:r>
-        <w:rPr>
-          <w:sz w:val="24"/>
-          <w:szCs w:val="24"/>
-        </w:rPr>
-        <w:t>Student</w:t>
-      </w:r>
-      <w:proofErr w:type="gramEnd"/>
-      <w:r>
-        <w:rPr>
-          <w:sz w:val="24"/>
-          <w:szCs w:val="24"/>
-        </w:rPr>
-        <w:t xml:space="preserve"> object created in memory.</w:t>
+        <w:t xml:space="preserve"> (methods) objects of that type will have. Once a class is created, its name can be used as a data type to declare reference variables, just like we use built-in types such as int or String. For example, after creating a Student class, we can write Student s1;, where Student becomes a new data type and s1 becomes a reference variable that can point to a Student object created in memory.</w:t>
       </w:r>
     </w:p>
     <w:p>
@@ -6209,6 +5686,138 @@
           <w:szCs w:val="24"/>
         </w:rPr>
         <w:t>A special type used to define a fixed set of named constants.</w:t>
+      </w:r>
+    </w:p>
+    <w:p>
+      <w:pPr>
+        <w:pStyle w:val="ListParagraph"/>
+        <w:rPr>
+          <w:sz w:val="24"/>
+          <w:szCs w:val="24"/>
+        </w:rPr>
+      </w:pPr>
+      <w:r>
+        <w:rPr>
+          <w:sz w:val="24"/>
+          <w:szCs w:val="24"/>
+        </w:rPr>
+        <w:t xml:space="preserve">An </w:t>
+      </w:r>
+      <w:proofErr w:type="spellStart"/>
+      <w:r>
+        <w:rPr>
+          <w:b/>
+          <w:bCs/>
+          <w:sz w:val="24"/>
+          <w:szCs w:val="24"/>
+        </w:rPr>
+        <w:t>enum</w:t>
+      </w:r>
+      <w:proofErr w:type="spellEnd"/>
+      <w:r>
+        <w:rPr>
+          <w:b/>
+          <w:bCs/>
+          <w:sz w:val="24"/>
+          <w:szCs w:val="24"/>
+        </w:rPr>
+        <w:t xml:space="preserve"> (enumeration)</w:t>
+      </w:r>
+      <w:r>
+        <w:rPr>
+          <w:sz w:val="24"/>
+          <w:szCs w:val="24"/>
+        </w:rPr>
+        <w:t xml:space="preserve"> is a special reference data type in Java used to represent a fixed set of constant values. Instead of creating multiple constant variables, an </w:t>
+      </w:r>
+      <w:proofErr w:type="spellStart"/>
+      <w:r>
+        <w:rPr>
+          <w:sz w:val="24"/>
+          <w:szCs w:val="24"/>
+        </w:rPr>
+        <w:t>enum</w:t>
+      </w:r>
+      <w:proofErr w:type="spellEnd"/>
+      <w:r>
+        <w:rPr>
+          <w:sz w:val="24"/>
+          <w:szCs w:val="24"/>
+        </w:rPr>
+        <w:t xml:space="preserve"> groups related constants under a single type, making the code more readable and type-safe.</w:t>
+      </w:r>
+    </w:p>
+    <w:p>
+      <w:pPr>
+        <w:pStyle w:val="ListParagraph"/>
+        <w:rPr>
+          <w:sz w:val="24"/>
+          <w:szCs w:val="24"/>
+        </w:rPr>
+      </w:pPr>
+    </w:p>
+    <w:p>
+      <w:pPr>
+        <w:pStyle w:val="ListParagraph"/>
+        <w:rPr>
+          <w:sz w:val="24"/>
+          <w:szCs w:val="24"/>
+        </w:rPr>
+      </w:pPr>
+      <w:r>
+        <w:rPr>
+          <w:sz w:val="24"/>
+          <w:szCs w:val="24"/>
+        </w:rPr>
+        <w:t xml:space="preserve">When the JVM loads an </w:t>
+      </w:r>
+      <w:proofErr w:type="spellStart"/>
+      <w:r>
+        <w:rPr>
+          <w:sz w:val="24"/>
+          <w:szCs w:val="24"/>
+        </w:rPr>
+        <w:t>enum</w:t>
+      </w:r>
+      <w:proofErr w:type="spellEnd"/>
+      <w:r>
+        <w:rPr>
+          <w:sz w:val="24"/>
+          <w:szCs w:val="24"/>
+        </w:rPr>
+        <w:t xml:space="preserve">, it automatically creates a </w:t>
+      </w:r>
+      <w:r>
+        <w:rPr>
+          <w:b/>
+          <w:bCs/>
+          <w:sz w:val="24"/>
+          <w:szCs w:val="24"/>
+        </w:rPr>
+        <w:t>single object</w:t>
+      </w:r>
+      <w:r>
+        <w:rPr>
+          <w:sz w:val="24"/>
+          <w:szCs w:val="24"/>
+        </w:rPr>
+        <w:t xml:space="preserve"> for each </w:t>
+      </w:r>
+      <w:proofErr w:type="spellStart"/>
+      <w:r>
+        <w:rPr>
+          <w:sz w:val="24"/>
+          <w:szCs w:val="24"/>
+        </w:rPr>
+        <w:t>enum</w:t>
+      </w:r>
+      <w:proofErr w:type="spellEnd"/>
+      <w:r>
+        <w:rPr>
+          <w:sz w:val="24"/>
+          <w:szCs w:val="24"/>
+        </w:rPr>
+        <w:t xml:space="preserve"> constant. These objects are stored in memory and reused throughout the program.</w:t>
       </w:r>
     </w:p>
     <w:p>

</xml_diff>

<commit_message>
Record as a Data Type in Java  #23
</commit_message>
<xml_diff>
--- a/Chapter3/CH3.docx
+++ b/Chapter3/CH3.docx
@@ -500,15 +500,7 @@
         <w:t xml:space="preserve"> “</w:t>
       </w:r>
       <w:r>
-        <w:t xml:space="preserve">Type mismatch: cannot convert from String to </w:t>
-      </w:r>
-      <w:proofErr w:type="spellStart"/>
-      <w:r>
-        <w:t>intJava</w:t>
-      </w:r>
-      <w:proofErr w:type="spellEnd"/>
-      <w:r>
-        <w:t>(16777233)</w:t>
+        <w:t>Type mismatch: cannot convert from String to intJava(16777233)</w:t>
       </w:r>
       <w:r>
         <w:t>” Error.</w:t>
@@ -1485,21 +1477,12 @@
         <w:pStyle w:val="ListParagraph"/>
         <w:ind w:left="1854"/>
       </w:pPr>
-      <w:proofErr w:type="spellStart"/>
-      <w:r>
-        <w:rPr>
-          <w:b/>
-          <w:bCs/>
-        </w:rPr>
-        <w:t>BigDecimal</w:t>
-      </w:r>
-      <w:proofErr w:type="spellEnd"/>
-      <w:r>
-        <w:rPr>
-          <w:b/>
-          <w:bCs/>
-        </w:rPr>
-        <w:t xml:space="preserve"> </w:t>
+      <w:r>
+        <w:rPr>
+          <w:b/>
+          <w:bCs/>
+        </w:rPr>
+        <w:t xml:space="preserve">BigDecimal </w:t>
       </w:r>
       <w:r>
         <w:t>stores decimal numbers with arbitrary precision, avoiding the rounding errors that can occur with float and double.</w:t>
@@ -2363,7 +2346,6 @@
           <w:szCs w:val="24"/>
         </w:rPr>
       </w:pPr>
-      <w:proofErr w:type="spellStart"/>
       <w:r>
         <w:rPr>
           <w:b/>
@@ -2373,47 +2355,21 @@
         </w:rPr>
         <w:t>StringBuffer</w:t>
       </w:r>
-      <w:proofErr w:type="spellEnd"/>
-    </w:p>
-    <w:p>
-      <w:pPr>
-        <w:pStyle w:val="ListParagraph"/>
-        <w:rPr>
-          <w:sz w:val="24"/>
-          <w:szCs w:val="24"/>
-        </w:rPr>
-      </w:pPr>
-      <w:proofErr w:type="spellStart"/>
-      <w:r>
-        <w:rPr>
-          <w:sz w:val="24"/>
-          <w:szCs w:val="24"/>
-        </w:rPr>
-        <w:t>StringBuffer</w:t>
-      </w:r>
-      <w:proofErr w:type="spellEnd"/>
-      <w:r>
-        <w:rPr>
-          <w:sz w:val="24"/>
-          <w:szCs w:val="24"/>
-        </w:rPr>
-        <w:t xml:space="preserve"> is similar to StringBuilder because it also allows strings to be modified without creating new objects. The difference is that </w:t>
-      </w:r>
-      <w:proofErr w:type="spellStart"/>
-      <w:r>
-        <w:rPr>
-          <w:sz w:val="24"/>
-          <w:szCs w:val="24"/>
-        </w:rPr>
-        <w:t>StringBuffer</w:t>
-      </w:r>
-      <w:proofErr w:type="spellEnd"/>
-      <w:r>
-        <w:rPr>
-          <w:sz w:val="24"/>
-          <w:szCs w:val="24"/>
-        </w:rPr>
-        <w:t xml:space="preserve"> is </w:t>
+    </w:p>
+    <w:p>
+      <w:pPr>
+        <w:pStyle w:val="ListParagraph"/>
+        <w:rPr>
+          <w:sz w:val="24"/>
+          <w:szCs w:val="24"/>
+        </w:rPr>
+      </w:pPr>
+      <w:r>
+        <w:rPr>
+          <w:sz w:val="24"/>
+          <w:szCs w:val="24"/>
+        </w:rPr>
+        <w:t xml:space="preserve">StringBuffer is similar to StringBuilder because it also allows strings to be modified without creating new objects. The difference is that StringBuffer is </w:t>
       </w:r>
       <w:r>
         <w:rPr>
@@ -2657,23 +2613,7 @@
                 <w:sz w:val="24"/>
                 <w:szCs w:val="24"/>
               </w:rPr>
-              <w:t>"</w:t>
-            </w:r>
-            <w:proofErr w:type="spellStart"/>
-            <w:r>
-              <w:rPr>
-                <w:sz w:val="24"/>
-                <w:szCs w:val="24"/>
-              </w:rPr>
-              <w:t>Java".length</w:t>
-            </w:r>
-            <w:proofErr w:type="spellEnd"/>
-            <w:r>
-              <w:rPr>
-                <w:sz w:val="24"/>
-                <w:szCs w:val="24"/>
-              </w:rPr>
-              <w:t>()</w:t>
+              <w:t>"Java".length()</w:t>
             </w:r>
           </w:p>
         </w:tc>
@@ -2718,21 +2658,12 @@
                 <w:szCs w:val="24"/>
               </w:rPr>
             </w:pPr>
-            <w:proofErr w:type="spellStart"/>
-            <w:r>
-              <w:rPr>
-                <w:sz w:val="24"/>
-                <w:szCs w:val="24"/>
-              </w:rPr>
-              <w:t>charAt</w:t>
-            </w:r>
-            <w:proofErr w:type="spellEnd"/>
-            <w:r>
-              <w:rPr>
-                <w:sz w:val="24"/>
-                <w:szCs w:val="24"/>
-              </w:rPr>
-              <w:t>(index)</w:t>
+            <w:r>
+              <w:rPr>
+                <w:sz w:val="24"/>
+                <w:szCs w:val="24"/>
+              </w:rPr>
+              <w:t>charAt(index)</w:t>
             </w:r>
           </w:p>
         </w:tc>
@@ -2780,23 +2711,7 @@
                 <w:sz w:val="24"/>
                 <w:szCs w:val="24"/>
               </w:rPr>
-              <w:t>"Java".</w:t>
-            </w:r>
-            <w:proofErr w:type="spellStart"/>
-            <w:r>
-              <w:rPr>
-                <w:sz w:val="24"/>
-                <w:szCs w:val="24"/>
-              </w:rPr>
-              <w:t>charAt</w:t>
-            </w:r>
-            <w:proofErr w:type="spellEnd"/>
-            <w:r>
-              <w:rPr>
-                <w:sz w:val="24"/>
-                <w:szCs w:val="24"/>
-              </w:rPr>
-              <w:t>(2)</w:t>
+              <w:t>"Java".charAt(2)</w:t>
             </w:r>
           </w:p>
         </w:tc>
@@ -2897,23 +2812,7 @@
                 <w:sz w:val="24"/>
                 <w:szCs w:val="24"/>
               </w:rPr>
-              <w:t>"</w:t>
-            </w:r>
-            <w:proofErr w:type="spellStart"/>
-            <w:r>
-              <w:rPr>
-                <w:sz w:val="24"/>
-                <w:szCs w:val="24"/>
-              </w:rPr>
-              <w:t>Programming".substring</w:t>
-            </w:r>
-            <w:proofErr w:type="spellEnd"/>
-            <w:r>
-              <w:rPr>
-                <w:sz w:val="24"/>
-                <w:szCs w:val="24"/>
-              </w:rPr>
-              <w:t>(3)</w:t>
+              <w:t>"Programming".substring(3)</w:t>
             </w:r>
           </w:p>
         </w:tc>
@@ -2932,7 +2831,6 @@
                 <w:szCs w:val="24"/>
               </w:rPr>
             </w:pPr>
-            <w:proofErr w:type="spellStart"/>
             <w:r>
               <w:rPr>
                 <w:sz w:val="24"/>
@@ -2940,7 +2838,6 @@
               </w:rPr>
               <w:t>gramming</w:t>
             </w:r>
-            <w:proofErr w:type="spellEnd"/>
           </w:p>
         </w:tc>
       </w:tr>
@@ -3013,23 +2910,7 @@
                 <w:sz w:val="24"/>
                 <w:szCs w:val="24"/>
               </w:rPr>
-              <w:t>"</w:t>
-            </w:r>
-            <w:proofErr w:type="spellStart"/>
-            <w:r>
-              <w:rPr>
-                <w:sz w:val="24"/>
-                <w:szCs w:val="24"/>
-              </w:rPr>
-              <w:t>Programming".substring</w:t>
-            </w:r>
-            <w:proofErr w:type="spellEnd"/>
-            <w:r>
-              <w:rPr>
-                <w:sz w:val="24"/>
-                <w:szCs w:val="24"/>
-              </w:rPr>
-              <w:t>(3,7)</w:t>
+              <w:t>"Programming".substring(3,7)</w:t>
             </w:r>
           </w:p>
         </w:tc>
@@ -3077,21 +2958,12 @@
                 <w:szCs w:val="24"/>
               </w:rPr>
             </w:pPr>
-            <w:proofErr w:type="spellStart"/>
-            <w:r>
-              <w:rPr>
-                <w:sz w:val="24"/>
-                <w:szCs w:val="24"/>
-              </w:rPr>
-              <w:t>toUpperCase</w:t>
-            </w:r>
-            <w:proofErr w:type="spellEnd"/>
-            <w:r>
-              <w:rPr>
-                <w:sz w:val="24"/>
-                <w:szCs w:val="24"/>
-              </w:rPr>
-              <w:t>()</w:t>
+            <w:r>
+              <w:rPr>
+                <w:sz w:val="24"/>
+                <w:szCs w:val="24"/>
+              </w:rPr>
+              <w:t>toUpperCase()</w:t>
             </w:r>
           </w:p>
         </w:tc>
@@ -3139,23 +3011,7 @@
                 <w:sz w:val="24"/>
                 <w:szCs w:val="24"/>
               </w:rPr>
-              <w:t>"java".</w:t>
-            </w:r>
-            <w:proofErr w:type="spellStart"/>
-            <w:r>
-              <w:rPr>
-                <w:sz w:val="24"/>
-                <w:szCs w:val="24"/>
-              </w:rPr>
-              <w:t>toUpperCase</w:t>
-            </w:r>
-            <w:proofErr w:type="spellEnd"/>
-            <w:r>
-              <w:rPr>
-                <w:sz w:val="24"/>
-                <w:szCs w:val="24"/>
-              </w:rPr>
-              <w:t>()</w:t>
+              <w:t>"java".toUpperCase()</w:t>
             </w:r>
           </w:p>
         </w:tc>
@@ -3200,21 +3056,12 @@
                 <w:szCs w:val="24"/>
               </w:rPr>
             </w:pPr>
-            <w:proofErr w:type="spellStart"/>
-            <w:r>
-              <w:rPr>
-                <w:sz w:val="24"/>
-                <w:szCs w:val="24"/>
-              </w:rPr>
-              <w:t>toLowerCase</w:t>
-            </w:r>
-            <w:proofErr w:type="spellEnd"/>
-            <w:r>
-              <w:rPr>
-                <w:sz w:val="24"/>
-                <w:szCs w:val="24"/>
-              </w:rPr>
-              <w:t>()</w:t>
+            <w:r>
+              <w:rPr>
+                <w:sz w:val="24"/>
+                <w:szCs w:val="24"/>
+              </w:rPr>
+              <w:t>toLowerCase()</w:t>
             </w:r>
           </w:p>
         </w:tc>
@@ -3262,23 +3109,7 @@
                 <w:sz w:val="24"/>
                 <w:szCs w:val="24"/>
               </w:rPr>
-              <w:t>"JAVA".</w:t>
-            </w:r>
-            <w:proofErr w:type="spellStart"/>
-            <w:r>
-              <w:rPr>
-                <w:sz w:val="24"/>
-                <w:szCs w:val="24"/>
-              </w:rPr>
-              <w:t>toLowerCase</w:t>
-            </w:r>
-            <w:proofErr w:type="spellEnd"/>
-            <w:r>
-              <w:rPr>
-                <w:sz w:val="24"/>
-                <w:szCs w:val="24"/>
-              </w:rPr>
-              <w:t>()</w:t>
+              <w:t>"JAVA".toLowerCase()</w:t>
             </w:r>
           </w:p>
         </w:tc>
@@ -3379,23 +3210,7 @@
                 <w:sz w:val="24"/>
                 <w:szCs w:val="24"/>
               </w:rPr>
-              <w:t>"</w:t>
-            </w:r>
-            <w:proofErr w:type="spellStart"/>
-            <w:r>
-              <w:rPr>
-                <w:sz w:val="24"/>
-                <w:szCs w:val="24"/>
-              </w:rPr>
-              <w:t>Java".equals</w:t>
-            </w:r>
-            <w:proofErr w:type="spellEnd"/>
-            <w:r>
-              <w:rPr>
-                <w:sz w:val="24"/>
-                <w:szCs w:val="24"/>
-              </w:rPr>
-              <w:t>("Java")</w:t>
+              <w:t>"Java".equals("Java")</w:t>
             </w:r>
           </w:p>
         </w:tc>
@@ -3440,21 +3255,12 @@
                 <w:szCs w:val="24"/>
               </w:rPr>
             </w:pPr>
-            <w:proofErr w:type="spellStart"/>
-            <w:r>
-              <w:rPr>
-                <w:sz w:val="24"/>
-                <w:szCs w:val="24"/>
-              </w:rPr>
-              <w:t>equalsIgnoreCase</w:t>
-            </w:r>
-            <w:proofErr w:type="spellEnd"/>
-            <w:r>
-              <w:rPr>
-                <w:sz w:val="24"/>
-                <w:szCs w:val="24"/>
-              </w:rPr>
-              <w:t>()</w:t>
+            <w:r>
+              <w:rPr>
+                <w:sz w:val="24"/>
+                <w:szCs w:val="24"/>
+              </w:rPr>
+              <w:t>equalsIgnoreCase()</w:t>
             </w:r>
           </w:p>
         </w:tc>
@@ -3502,23 +3308,7 @@
                 <w:sz w:val="24"/>
                 <w:szCs w:val="24"/>
               </w:rPr>
-              <w:t>"java".</w:t>
-            </w:r>
-            <w:proofErr w:type="spellStart"/>
-            <w:r>
-              <w:rPr>
-                <w:sz w:val="24"/>
-                <w:szCs w:val="24"/>
-              </w:rPr>
-              <w:t>equalsIgnoreCase</w:t>
-            </w:r>
-            <w:proofErr w:type="spellEnd"/>
-            <w:r>
-              <w:rPr>
-                <w:sz w:val="24"/>
-                <w:szCs w:val="24"/>
-              </w:rPr>
-              <w:t>("JAVA")</w:t>
+              <w:t>"java".equalsIgnoreCase("JAVA")</w:t>
             </w:r>
           </w:p>
         </w:tc>
@@ -3628,23 +3418,7 @@
                 <w:szCs w:val="24"/>
               </w:rPr>
               <w:lastRenderedPageBreak/>
-              <w:t>"</w:t>
-            </w:r>
-            <w:proofErr w:type="spellStart"/>
-            <w:r>
-              <w:rPr>
-                <w:sz w:val="24"/>
-                <w:szCs w:val="24"/>
-              </w:rPr>
-              <w:t>Programming".contains</w:t>
-            </w:r>
-            <w:proofErr w:type="spellEnd"/>
-            <w:r>
-              <w:rPr>
-                <w:sz w:val="24"/>
-                <w:szCs w:val="24"/>
-              </w:rPr>
-              <w:t>("gram")</w:t>
+              <w:t>"Programming".contains("gram")</w:t>
             </w:r>
           </w:p>
         </w:tc>
@@ -3689,21 +3463,12 @@
                 <w:szCs w:val="24"/>
               </w:rPr>
             </w:pPr>
-            <w:proofErr w:type="spellStart"/>
-            <w:r>
-              <w:rPr>
-                <w:sz w:val="24"/>
-                <w:szCs w:val="24"/>
-              </w:rPr>
-              <w:t>startsWith</w:t>
-            </w:r>
-            <w:proofErr w:type="spellEnd"/>
-            <w:r>
-              <w:rPr>
-                <w:sz w:val="24"/>
-                <w:szCs w:val="24"/>
-              </w:rPr>
-              <w:t>()</w:t>
+            <w:r>
+              <w:rPr>
+                <w:sz w:val="24"/>
+                <w:szCs w:val="24"/>
+              </w:rPr>
+              <w:t>startsWith()</w:t>
             </w:r>
           </w:p>
         </w:tc>
@@ -3751,23 +3516,7 @@
                 <w:sz w:val="24"/>
                 <w:szCs w:val="24"/>
               </w:rPr>
-              <w:t>"Java".</w:t>
-            </w:r>
-            <w:proofErr w:type="spellStart"/>
-            <w:r>
-              <w:rPr>
-                <w:sz w:val="24"/>
-                <w:szCs w:val="24"/>
-              </w:rPr>
-              <w:t>startsWith</w:t>
-            </w:r>
-            <w:proofErr w:type="spellEnd"/>
-            <w:r>
-              <w:rPr>
-                <w:sz w:val="24"/>
-                <w:szCs w:val="24"/>
-              </w:rPr>
-              <w:t>("Ja")</w:t>
+              <w:t>"Java".startsWith("Ja")</w:t>
             </w:r>
           </w:p>
         </w:tc>
@@ -3815,21 +3564,12 @@
                 <w:szCs w:val="24"/>
               </w:rPr>
             </w:pPr>
-            <w:proofErr w:type="spellStart"/>
-            <w:r>
-              <w:rPr>
-                <w:sz w:val="24"/>
-                <w:szCs w:val="24"/>
-              </w:rPr>
-              <w:t>endsWith</w:t>
-            </w:r>
-            <w:proofErr w:type="spellEnd"/>
-            <w:r>
-              <w:rPr>
-                <w:sz w:val="24"/>
-                <w:szCs w:val="24"/>
-              </w:rPr>
-              <w:t>()</w:t>
+            <w:r>
+              <w:rPr>
+                <w:sz w:val="24"/>
+                <w:szCs w:val="24"/>
+              </w:rPr>
+              <w:t>endsWith()</w:t>
             </w:r>
           </w:p>
         </w:tc>
@@ -3877,39 +3617,7 @@
                 <w:sz w:val="24"/>
                 <w:szCs w:val="24"/>
               </w:rPr>
-              <w:t>"Java".</w:t>
-            </w:r>
-            <w:proofErr w:type="spellStart"/>
-            <w:r>
-              <w:rPr>
-                <w:sz w:val="24"/>
-                <w:szCs w:val="24"/>
-              </w:rPr>
-              <w:t>endsWith</w:t>
-            </w:r>
-            <w:proofErr w:type="spellEnd"/>
-            <w:r>
-              <w:rPr>
-                <w:sz w:val="24"/>
-                <w:szCs w:val="24"/>
-              </w:rPr>
-              <w:t>("</w:t>
-            </w:r>
-            <w:proofErr w:type="spellStart"/>
-            <w:r>
-              <w:rPr>
-                <w:sz w:val="24"/>
-                <w:szCs w:val="24"/>
-              </w:rPr>
-              <w:t>va</w:t>
-            </w:r>
-            <w:proofErr w:type="spellEnd"/>
-            <w:r>
-              <w:rPr>
-                <w:sz w:val="24"/>
-                <w:szCs w:val="24"/>
-              </w:rPr>
-              <w:t>")</w:t>
+              <w:t>"Java".endsWith("va")</w:t>
             </w:r>
           </w:p>
         </w:tc>
@@ -4007,23 +3715,7 @@
                 <w:sz w:val="24"/>
                 <w:szCs w:val="24"/>
               </w:rPr>
-              <w:t>"</w:t>
-            </w:r>
-            <w:proofErr w:type="spellStart"/>
-            <w:r>
-              <w:rPr>
-                <w:sz w:val="24"/>
-                <w:szCs w:val="24"/>
-              </w:rPr>
-              <w:t>Java".replace</w:t>
-            </w:r>
-            <w:proofErr w:type="spellEnd"/>
-            <w:r>
-              <w:rPr>
-                <w:sz w:val="24"/>
-                <w:szCs w:val="24"/>
-              </w:rPr>
-              <w:t>("J","L")</w:t>
+              <w:t>"Java".replace("J","L")</w:t>
             </w:r>
           </w:p>
         </w:tc>
@@ -4222,23 +3914,7 @@
                 <w:sz w:val="24"/>
                 <w:szCs w:val="24"/>
               </w:rPr>
-              <w:t>"</w:t>
-            </w:r>
-            <w:proofErr w:type="spellStart"/>
-            <w:r>
-              <w:rPr>
-                <w:sz w:val="24"/>
-                <w:szCs w:val="24"/>
-              </w:rPr>
-              <w:t>A,B,C".split</w:t>
-            </w:r>
-            <w:proofErr w:type="spellEnd"/>
-            <w:r>
-              <w:rPr>
-                <w:sz w:val="24"/>
-                <w:szCs w:val="24"/>
-              </w:rPr>
-              <w:t>(",")</w:t>
+              <w:t>"A,B,C".split(",")</w:t>
             </w:r>
           </w:p>
         </w:tc>
@@ -4286,21 +3962,12 @@
                 <w:szCs w:val="24"/>
               </w:rPr>
             </w:pPr>
-            <w:proofErr w:type="spellStart"/>
-            <w:r>
-              <w:rPr>
-                <w:sz w:val="24"/>
-                <w:szCs w:val="24"/>
-              </w:rPr>
-              <w:t>indexOf</w:t>
-            </w:r>
-            <w:proofErr w:type="spellEnd"/>
-            <w:r>
-              <w:rPr>
-                <w:sz w:val="24"/>
-                <w:szCs w:val="24"/>
-              </w:rPr>
-              <w:t>()</w:t>
+            <w:r>
+              <w:rPr>
+                <w:sz w:val="24"/>
+                <w:szCs w:val="24"/>
+              </w:rPr>
+              <w:t>indexOf()</w:t>
             </w:r>
           </w:p>
         </w:tc>
@@ -4348,23 +4015,7 @@
                 <w:sz w:val="24"/>
                 <w:szCs w:val="24"/>
               </w:rPr>
-              <w:t>"Java".</w:t>
-            </w:r>
-            <w:proofErr w:type="spellStart"/>
-            <w:r>
-              <w:rPr>
-                <w:sz w:val="24"/>
-                <w:szCs w:val="24"/>
-              </w:rPr>
-              <w:t>indexOf</w:t>
-            </w:r>
-            <w:proofErr w:type="spellEnd"/>
-            <w:r>
-              <w:rPr>
-                <w:sz w:val="24"/>
-                <w:szCs w:val="24"/>
-              </w:rPr>
-              <w:t>("v")</w:t>
+              <w:t>"Java".indexOf("v")</w:t>
             </w:r>
           </w:p>
         </w:tc>
@@ -4409,21 +4060,12 @@
                 <w:szCs w:val="24"/>
               </w:rPr>
             </w:pPr>
-            <w:proofErr w:type="spellStart"/>
-            <w:r>
-              <w:rPr>
-                <w:sz w:val="24"/>
-                <w:szCs w:val="24"/>
-              </w:rPr>
-              <w:t>lastIndexOf</w:t>
-            </w:r>
-            <w:proofErr w:type="spellEnd"/>
-            <w:r>
-              <w:rPr>
-                <w:sz w:val="24"/>
-                <w:szCs w:val="24"/>
-              </w:rPr>
-              <w:t>()</w:t>
+            <w:r>
+              <w:rPr>
+                <w:sz w:val="24"/>
+                <w:szCs w:val="24"/>
+              </w:rPr>
+              <w:t>lastIndexOf()</w:t>
             </w:r>
           </w:p>
         </w:tc>
@@ -4471,23 +4113,7 @@
                 <w:sz w:val="24"/>
                 <w:szCs w:val="24"/>
               </w:rPr>
-              <w:t>"Java Java".</w:t>
-            </w:r>
-            <w:proofErr w:type="spellStart"/>
-            <w:r>
-              <w:rPr>
-                <w:sz w:val="24"/>
-                <w:szCs w:val="24"/>
-              </w:rPr>
-              <w:t>lastIndexOf</w:t>
-            </w:r>
-            <w:proofErr w:type="spellEnd"/>
-            <w:r>
-              <w:rPr>
-                <w:sz w:val="24"/>
-                <w:szCs w:val="24"/>
-              </w:rPr>
-              <w:t>("a")</w:t>
+              <w:t>"Java Java".lastIndexOf("a")</w:t>
             </w:r>
           </w:p>
         </w:tc>
@@ -4535,21 +4161,12 @@
                 <w:szCs w:val="24"/>
               </w:rPr>
             </w:pPr>
-            <w:proofErr w:type="spellStart"/>
-            <w:r>
-              <w:rPr>
-                <w:sz w:val="24"/>
-                <w:szCs w:val="24"/>
-              </w:rPr>
-              <w:t>concat</w:t>
-            </w:r>
-            <w:proofErr w:type="spellEnd"/>
-            <w:r>
-              <w:rPr>
-                <w:sz w:val="24"/>
-                <w:szCs w:val="24"/>
-              </w:rPr>
-              <w:t>()</w:t>
+            <w:r>
+              <w:rPr>
+                <w:sz w:val="24"/>
+                <w:szCs w:val="24"/>
+              </w:rPr>
+              <w:t>concat()</w:t>
             </w:r>
           </w:p>
         </w:tc>
@@ -4597,23 +4214,7 @@
                 <w:sz w:val="24"/>
                 <w:szCs w:val="24"/>
               </w:rPr>
-              <w:t>"Hello".</w:t>
-            </w:r>
-            <w:proofErr w:type="spellStart"/>
-            <w:r>
-              <w:rPr>
-                <w:sz w:val="24"/>
-                <w:szCs w:val="24"/>
-              </w:rPr>
-              <w:t>concat</w:t>
-            </w:r>
-            <w:proofErr w:type="spellEnd"/>
-            <w:r>
-              <w:rPr>
-                <w:sz w:val="24"/>
-                <w:szCs w:val="24"/>
-              </w:rPr>
-              <w:t>(" World")</w:t>
+              <w:t>"Hello".concat(" World")</w:t>
             </w:r>
           </w:p>
         </w:tc>
@@ -4658,21 +4259,12 @@
                 <w:szCs w:val="24"/>
               </w:rPr>
             </w:pPr>
-            <w:proofErr w:type="spellStart"/>
-            <w:r>
-              <w:rPr>
-                <w:sz w:val="24"/>
-                <w:szCs w:val="24"/>
-              </w:rPr>
-              <w:t>isEmpty</w:t>
-            </w:r>
-            <w:proofErr w:type="spellEnd"/>
-            <w:r>
-              <w:rPr>
-                <w:sz w:val="24"/>
-                <w:szCs w:val="24"/>
-              </w:rPr>
-              <w:t>()</w:t>
+            <w:r>
+              <w:rPr>
+                <w:sz w:val="24"/>
+                <w:szCs w:val="24"/>
+              </w:rPr>
+              <w:t>isEmpty()</w:t>
             </w:r>
           </w:p>
         </w:tc>
@@ -4720,23 +4312,7 @@
                 <w:sz w:val="24"/>
                 <w:szCs w:val="24"/>
               </w:rPr>
-              <w:t>"".</w:t>
-            </w:r>
-            <w:proofErr w:type="spellStart"/>
-            <w:r>
-              <w:rPr>
-                <w:sz w:val="24"/>
-                <w:szCs w:val="24"/>
-              </w:rPr>
-              <w:t>isEmpty</w:t>
-            </w:r>
-            <w:proofErr w:type="spellEnd"/>
-            <w:r>
-              <w:rPr>
-                <w:sz w:val="24"/>
-                <w:szCs w:val="24"/>
-              </w:rPr>
-              <w:t>()</w:t>
+              <w:t>"".isEmpty()</w:t>
             </w:r>
           </w:p>
         </w:tc>
@@ -4832,21 +4408,12 @@
                 <w:szCs w:val="24"/>
               </w:rPr>
             </w:pPr>
-            <w:proofErr w:type="spellStart"/>
-            <w:r>
-              <w:rPr>
-                <w:sz w:val="24"/>
-                <w:szCs w:val="24"/>
-              </w:rPr>
-              <w:t>String.join</w:t>
-            </w:r>
-            <w:proofErr w:type="spellEnd"/>
-            <w:r>
-              <w:rPr>
-                <w:sz w:val="24"/>
-                <w:szCs w:val="24"/>
-              </w:rPr>
-              <w:t>("-", "A","B","C")</w:t>
+            <w:r>
+              <w:rPr>
+                <w:sz w:val="24"/>
+                <w:szCs w:val="24"/>
+              </w:rPr>
+              <w:t>String.join("-", "A","B","C")</w:t>
             </w:r>
           </w:p>
         </w:tc>
@@ -4891,21 +4458,12 @@
                 <w:szCs w:val="24"/>
               </w:rPr>
             </w:pPr>
-            <w:proofErr w:type="spellStart"/>
-            <w:r>
-              <w:rPr>
-                <w:sz w:val="24"/>
-                <w:szCs w:val="24"/>
-              </w:rPr>
-              <w:t>compareTo</w:t>
-            </w:r>
-            <w:proofErr w:type="spellEnd"/>
-            <w:r>
-              <w:rPr>
-                <w:sz w:val="24"/>
-                <w:szCs w:val="24"/>
-              </w:rPr>
-              <w:t>()</w:t>
+            <w:r>
+              <w:rPr>
+                <w:sz w:val="24"/>
+                <w:szCs w:val="24"/>
+              </w:rPr>
+              <w:t>compareTo()</w:t>
             </w:r>
           </w:p>
         </w:tc>
@@ -4953,23 +4511,7 @@
                 <w:sz w:val="24"/>
                 <w:szCs w:val="24"/>
               </w:rPr>
-              <w:t>"A".</w:t>
-            </w:r>
-            <w:proofErr w:type="spellStart"/>
-            <w:r>
-              <w:rPr>
-                <w:sz w:val="24"/>
-                <w:szCs w:val="24"/>
-              </w:rPr>
-              <w:t>compareTo</w:t>
-            </w:r>
-            <w:proofErr w:type="spellEnd"/>
-            <w:r>
-              <w:rPr>
-                <w:sz w:val="24"/>
-                <w:szCs w:val="24"/>
-              </w:rPr>
-              <w:t>("B")</w:t>
+              <w:t>"A".compareTo("B")</w:t>
             </w:r>
           </w:p>
         </w:tc>
@@ -5151,23 +4693,7 @@
           <w:sz w:val="24"/>
           <w:szCs w:val="24"/>
         </w:rPr>
-        <w:t xml:space="preserve">. The array object stores metadata such as its type and length, along with its elements. When accessing an element like </w:t>
-      </w:r>
-      <w:proofErr w:type="spellStart"/>
-      <w:r>
-        <w:rPr>
-          <w:sz w:val="24"/>
-          <w:szCs w:val="24"/>
-        </w:rPr>
-        <w:t>arr</w:t>
-      </w:r>
-      <w:proofErr w:type="spellEnd"/>
-      <w:r>
-        <w:rPr>
-          <w:sz w:val="24"/>
-          <w:szCs w:val="24"/>
-        </w:rPr>
-        <w:t xml:space="preserve">[3], the JVM calculates its memory location and retrieves the value while performing </w:t>
+        <w:t xml:space="preserve">. The array object stores metadata such as its type and length, along with its elements. When accessing an element like arr[3], the JVM calculates its memory location and retrieves the value while performing </w:t>
       </w:r>
       <w:r>
         <w:rPr>
@@ -5439,23 +4965,7 @@
           <w:sz w:val="24"/>
           <w:szCs w:val="24"/>
         </w:rPr>
-        <w:t xml:space="preserve">. A class acts as a blueprint that describes what data (fields) and </w:t>
-      </w:r>
-      <w:proofErr w:type="spellStart"/>
-      <w:r>
-        <w:rPr>
-          <w:sz w:val="24"/>
-          <w:szCs w:val="24"/>
-        </w:rPr>
-        <w:t>behaviors</w:t>
-      </w:r>
-      <w:proofErr w:type="spellEnd"/>
-      <w:r>
-        <w:rPr>
-          <w:sz w:val="24"/>
-          <w:szCs w:val="24"/>
-        </w:rPr>
-        <w:t xml:space="preserve"> (methods) objects of that type will have. Once a class is created, its name can be used as a data type to declare reference variables, just like we use built-in types such as int or String. For example, after creating a Student class, we can write Student s1;, where Student becomes a new data type and s1 becomes a reference variable that can point to a Student object created in memory.</w:t>
+        <w:t>. A class acts as a blueprint that describes what data (fields) and behaviors (methods) objects of that type will have. Once a class is created, its name can be used as a data type to declare reference variables, just like we use built-in types such as int or String. For example, after creating a Student class, we can write Student s1;, where Student becomes a new data type and s1 becomes a reference variable that can point to a Student object created in memory.</w:t>
       </w:r>
     </w:p>
     <w:p>
@@ -5703,89 +5213,46 @@
         </w:rPr>
         <w:t xml:space="preserve">An </w:t>
       </w:r>
-      <w:proofErr w:type="spellStart"/>
-      <w:r>
-        <w:rPr>
-          <w:b/>
-          <w:bCs/>
-          <w:sz w:val="24"/>
-          <w:szCs w:val="24"/>
-        </w:rPr>
-        <w:t>enum</w:t>
-      </w:r>
-      <w:proofErr w:type="spellEnd"/>
-      <w:r>
-        <w:rPr>
-          <w:b/>
-          <w:bCs/>
-          <w:sz w:val="24"/>
-          <w:szCs w:val="24"/>
-        </w:rPr>
-        <w:t xml:space="preserve"> (enumeration)</w:t>
-      </w:r>
-      <w:r>
-        <w:rPr>
-          <w:sz w:val="24"/>
-          <w:szCs w:val="24"/>
-        </w:rPr>
-        <w:t xml:space="preserve"> is a special reference data type in Java used to represent a fixed set of constant values. Instead of creating multiple constant variables, an </w:t>
-      </w:r>
-      <w:proofErr w:type="spellStart"/>
-      <w:r>
-        <w:rPr>
-          <w:sz w:val="24"/>
-          <w:szCs w:val="24"/>
-        </w:rPr>
-        <w:t>enum</w:t>
-      </w:r>
-      <w:proofErr w:type="spellEnd"/>
-      <w:r>
-        <w:rPr>
-          <w:sz w:val="24"/>
-          <w:szCs w:val="24"/>
-        </w:rPr>
-        <w:t xml:space="preserve"> groups related constants under a single type, making the code more readable and type-safe.</w:t>
-      </w:r>
-    </w:p>
-    <w:p>
-      <w:pPr>
-        <w:pStyle w:val="ListParagraph"/>
-        <w:rPr>
-          <w:sz w:val="24"/>
-          <w:szCs w:val="24"/>
-        </w:rPr>
-      </w:pPr>
-    </w:p>
-    <w:p>
-      <w:pPr>
-        <w:pStyle w:val="ListParagraph"/>
-        <w:rPr>
-          <w:sz w:val="24"/>
-          <w:szCs w:val="24"/>
-        </w:rPr>
-      </w:pPr>
-      <w:r>
-        <w:rPr>
-          <w:sz w:val="24"/>
-          <w:szCs w:val="24"/>
-        </w:rPr>
-        <w:t xml:space="preserve">When the JVM loads an </w:t>
-      </w:r>
-      <w:proofErr w:type="spellStart"/>
-      <w:r>
-        <w:rPr>
-          <w:sz w:val="24"/>
-          <w:szCs w:val="24"/>
-        </w:rPr>
-        <w:t>enum</w:t>
-      </w:r>
-      <w:proofErr w:type="spellEnd"/>
-      <w:r>
-        <w:rPr>
-          <w:sz w:val="24"/>
-          <w:szCs w:val="24"/>
-        </w:rPr>
-        <w:t xml:space="preserve">, it automatically creates a </w:t>
+      <w:r>
+        <w:rPr>
+          <w:b/>
+          <w:bCs/>
+          <w:sz w:val="24"/>
+          <w:szCs w:val="24"/>
+        </w:rPr>
+        <w:t>enum (enumeration)</w:t>
+      </w:r>
+      <w:r>
+        <w:rPr>
+          <w:sz w:val="24"/>
+          <w:szCs w:val="24"/>
+        </w:rPr>
+        <w:t xml:space="preserve"> is a special reference data type in Java used to represent a fixed set of constant values. Instead of creating multiple constant variables, an enum groups related constants under a single type, making the code more readable and type-safe.</w:t>
+      </w:r>
+    </w:p>
+    <w:p>
+      <w:pPr>
+        <w:pStyle w:val="ListParagraph"/>
+        <w:rPr>
+          <w:sz w:val="24"/>
+          <w:szCs w:val="24"/>
+        </w:rPr>
+      </w:pPr>
+    </w:p>
+    <w:p>
+      <w:pPr>
+        <w:pStyle w:val="ListParagraph"/>
+        <w:rPr>
+          <w:sz w:val="24"/>
+          <w:szCs w:val="24"/>
+        </w:rPr>
+      </w:pPr>
+      <w:r>
+        <w:rPr>
+          <w:sz w:val="24"/>
+          <w:szCs w:val="24"/>
+        </w:rPr>
+        <w:t xml:space="preserve">When the JVM loads an enum, it automatically creates a </w:t>
       </w:r>
       <w:r>
         <w:rPr>
@@ -5801,23 +5268,69 @@
           <w:sz w:val="24"/>
           <w:szCs w:val="24"/>
         </w:rPr>
-        <w:t xml:space="preserve"> for each </w:t>
-      </w:r>
-      <w:proofErr w:type="spellStart"/>
-      <w:r>
-        <w:rPr>
-          <w:sz w:val="24"/>
-          <w:szCs w:val="24"/>
-        </w:rPr>
-        <w:t>enum</w:t>
-      </w:r>
-      <w:proofErr w:type="spellEnd"/>
-      <w:r>
-        <w:rPr>
-          <w:sz w:val="24"/>
-          <w:szCs w:val="24"/>
-        </w:rPr>
-        <w:t xml:space="preserve"> constant. These objects are stored in memory and reused throughout the program.</w:t>
+        <w:t xml:space="preserve"> for each enum constant. These objects are stored in memory and reused throughout the program.</w:t>
+      </w:r>
+    </w:p>
+    <w:p>
+      <w:pPr>
+        <w:pStyle w:val="ListParagraph"/>
+        <w:ind w:left="142"/>
+        <w:jc w:val="center"/>
+        <w:rPr>
+          <w:sz w:val="24"/>
+          <w:szCs w:val="24"/>
+        </w:rPr>
+      </w:pPr>
+    </w:p>
+    <w:p>
+      <w:pPr>
+        <w:pStyle w:val="ListParagraph"/>
+        <w:ind w:left="142"/>
+        <w:jc w:val="center"/>
+        <w:rPr>
+          <w:sz w:val="24"/>
+          <w:szCs w:val="24"/>
+        </w:rPr>
+      </w:pPr>
+      <w:r>
+        <w:rPr>
+          <w:noProof/>
+        </w:rPr>
+        <w:drawing>
+          <wp:inline distT="0" distB="0" distL="0" distR="0" wp14:anchorId="37469502" wp14:editId="06B6A2FA">
+            <wp:extent cx="6210935" cy="2039620"/>
+            <wp:effectExtent l="0" t="0" r="0" b="0"/>
+            <wp:docPr id="109889642" name="Picture 1"/>
+            <wp:cNvGraphicFramePr>
+              <a:graphicFrameLocks xmlns:a="http://schemas.openxmlformats.org/drawingml/2006/main" noChangeAspect="1"/>
+            </wp:cNvGraphicFramePr>
+            <a:graphic xmlns:a="http://schemas.openxmlformats.org/drawingml/2006/main">
+              <a:graphicData uri="http://schemas.openxmlformats.org/drawingml/2006/picture">
+                <pic:pic xmlns:pic="http://schemas.openxmlformats.org/drawingml/2006/picture">
+                  <pic:nvPicPr>
+                    <pic:cNvPr id="109889642" name=""/>
+                    <pic:cNvPicPr/>
+                  </pic:nvPicPr>
+                  <pic:blipFill>
+                    <a:blip r:embed="rId11"/>
+                    <a:stretch>
+                      <a:fillRect/>
+                    </a:stretch>
+                  </pic:blipFill>
+                  <pic:spPr>
+                    <a:xfrm>
+                      <a:off x="0" y="0"/>
+                      <a:ext cx="6210935" cy="2039620"/>
+                    </a:xfrm>
+                    <a:prstGeom prst="rect">
+                      <a:avLst/>
+                    </a:prstGeom>
+                  </pic:spPr>
+                </pic:pic>
+              </a:graphicData>
+            </a:graphic>
+          </wp:inline>
+        </w:drawing>
       </w:r>
     </w:p>
     <w:p>
@@ -5909,7 +5422,121 @@
         <w:t xml:space="preserve">    </w:t>
       </w:r>
     </w:p>
+    <w:p>
+      <w:r>
+        <w:t xml:space="preserve">A </w:t>
+      </w:r>
+      <w:r>
+        <w:rPr>
+          <w:b/>
+          <w:bCs/>
+        </w:rPr>
+        <w:t>record</w:t>
+      </w:r>
+      <w:r>
+        <w:t xml:space="preserve"> is a special reference data type introduced in Java to represent immutable data. It automatically generates common methods such as the constructor, getters (accessor methods), equals(), hashCode(), and toString(), reducing the amount of boilerplate code needed for simple data-holding classes.</w:t>
+      </w:r>
+    </w:p>
     <w:p/>
+    <w:p/>
+    <w:p/>
+    <w:p/>
+    <w:p>
+      <w:pPr>
+        <w:jc w:val="center"/>
+      </w:pPr>
+      <w:r>
+        <w:rPr>
+          <w:noProof/>
+        </w:rPr>
+        <w:lastRenderedPageBreak/>
+        <w:drawing>
+          <wp:inline distT="0" distB="0" distL="0" distR="0" wp14:anchorId="4C99EF8D" wp14:editId="3D36ED4C">
+            <wp:extent cx="6210935" cy="1395730"/>
+            <wp:effectExtent l="0" t="0" r="0" b="0"/>
+            <wp:docPr id="154461266" name="Picture 1"/>
+            <wp:cNvGraphicFramePr>
+              <a:graphicFrameLocks xmlns:a="http://schemas.openxmlformats.org/drawingml/2006/main" noChangeAspect="1"/>
+            </wp:cNvGraphicFramePr>
+            <a:graphic xmlns:a="http://schemas.openxmlformats.org/drawingml/2006/main">
+              <a:graphicData uri="http://schemas.openxmlformats.org/drawingml/2006/picture">
+                <pic:pic xmlns:pic="http://schemas.openxmlformats.org/drawingml/2006/picture">
+                  <pic:nvPicPr>
+                    <pic:cNvPr id="154461266" name=""/>
+                    <pic:cNvPicPr/>
+                  </pic:nvPicPr>
+                  <pic:blipFill>
+                    <a:blip r:embed="rId12"/>
+                    <a:stretch>
+                      <a:fillRect/>
+                    </a:stretch>
+                  </pic:blipFill>
+                  <pic:spPr>
+                    <a:xfrm>
+                      <a:off x="0" y="0"/>
+                      <a:ext cx="6210935" cy="1395730"/>
+                    </a:xfrm>
+                    <a:prstGeom prst="rect">
+                      <a:avLst/>
+                    </a:prstGeom>
+                  </pic:spPr>
+                </pic:pic>
+              </a:graphicData>
+            </a:graphic>
+          </wp:inline>
+        </w:drawing>
+      </w:r>
+    </w:p>
+    <w:p>
+      <w:pPr>
+        <w:jc w:val="center"/>
+      </w:pPr>
+    </w:p>
+    <w:p>
+      <w:pPr>
+        <w:jc w:val="center"/>
+      </w:pPr>
+      <w:r>
+        <w:rPr>
+          <w:noProof/>
+        </w:rPr>
+        <w:drawing>
+          <wp:inline distT="0" distB="0" distL="0" distR="0" wp14:anchorId="6088B8B4" wp14:editId="7E0F4085">
+            <wp:extent cx="6210935" cy="1122045"/>
+            <wp:effectExtent l="0" t="0" r="0" b="1905"/>
+            <wp:docPr id="1691959004" name="Picture 1"/>
+            <wp:cNvGraphicFramePr>
+              <a:graphicFrameLocks xmlns:a="http://schemas.openxmlformats.org/drawingml/2006/main" noChangeAspect="1"/>
+            </wp:cNvGraphicFramePr>
+            <a:graphic xmlns:a="http://schemas.openxmlformats.org/drawingml/2006/main">
+              <a:graphicData uri="http://schemas.openxmlformats.org/drawingml/2006/picture">
+                <pic:pic xmlns:pic="http://schemas.openxmlformats.org/drawingml/2006/picture">
+                  <pic:nvPicPr>
+                    <pic:cNvPr id="1691959004" name=""/>
+                    <pic:cNvPicPr/>
+                  </pic:nvPicPr>
+                  <pic:blipFill>
+                    <a:blip r:embed="rId13"/>
+                    <a:stretch>
+                      <a:fillRect/>
+                    </a:stretch>
+                  </pic:blipFill>
+                  <pic:spPr>
+                    <a:xfrm>
+                      <a:off x="0" y="0"/>
+                      <a:ext cx="6210935" cy="1122045"/>
+                    </a:xfrm>
+                    <a:prstGeom prst="rect">
+                      <a:avLst/>
+                    </a:prstGeom>
+                  </pic:spPr>
+                </pic:pic>
+              </a:graphicData>
+            </a:graphic>
+          </wp:inline>
+        </w:drawing>
+      </w:r>
+    </w:p>
     <w:p>
       <w:pPr>
         <w:ind w:left="45"/>

</xml_diff>

<commit_message>
Input and Output (I/O) in Java  #25
</commit_message>
<xml_diff>
--- a/Chapter3/CH3.docx
+++ b/Chapter3/CH3.docx
@@ -5539,7 +5539,12 @@
     </w:p>
     <w:p>
       <w:pPr>
-        <w:ind w:left="45"/>
+        <w:pStyle w:val="ListParagraph"/>
+        <w:numPr>
+          <w:ilvl w:val="0"/>
+          <w:numId w:val="8"/>
+        </w:numPr>
+        <w:ind w:left="851" w:firstLine="141"/>
         <w:rPr>
           <w:b/>
           <w:bCs/>
@@ -5552,17 +5557,1710 @@
           <w:bCs/>
           <w:u w:val="single"/>
         </w:rPr>
-        <w:t>2. Modifiers, Variables and Constants</w:t>
-      </w:r>
-    </w:p>
-    <w:p>
-      <w:pPr>
-        <w:rPr>
-          <w:b/>
-          <w:bCs/>
-        </w:rPr>
-      </w:pPr>
-    </w:p>
+        <w:t>Modifiers, Variables and Constants</w:t>
+      </w:r>
+    </w:p>
+    <w:p>
+      <w:pPr>
+        <w:pStyle w:val="ListParagraph"/>
+        <w:ind w:left="1854"/>
+        <w:rPr>
+          <w:b/>
+          <w:bCs/>
+          <w:u w:val="single"/>
+        </w:rPr>
+      </w:pPr>
+    </w:p>
+    <w:p>
+      <w:pPr>
+        <w:pStyle w:val="ListParagraph"/>
+        <w:ind w:left="993"/>
+        <w:rPr>
+          <w:b/>
+          <w:bCs/>
+        </w:rPr>
+      </w:pPr>
+      <w:r>
+        <w:rPr>
+          <w:b/>
+          <w:bCs/>
+        </w:rPr>
+        <w:t>Modifiers</w:t>
+      </w:r>
+    </w:p>
+    <w:p>
+      <w:pPr>
+        <w:pStyle w:val="ListParagraph"/>
+        <w:ind w:left="993"/>
+      </w:pPr>
+      <w:r>
+        <w:t>Modifiers are keywords that define the visibility, behavior, and characteristics of classes, methods, variables, and constructors. They help control access and specify how Java elements can be used.</w:t>
+      </w:r>
+    </w:p>
+    <w:p>
+      <w:pPr>
+        <w:pStyle w:val="ListParagraph"/>
+        <w:ind w:left="993"/>
+      </w:pPr>
+    </w:p>
+    <w:p>
+      <w:pPr>
+        <w:pStyle w:val="ListParagraph"/>
+        <w:numPr>
+          <w:ilvl w:val="0"/>
+          <w:numId w:val="4"/>
+        </w:numPr>
+      </w:pPr>
+      <w:r>
+        <w:rPr>
+          <w:b/>
+          <w:bCs/>
+        </w:rPr>
+        <w:t>Access Modifiers:</w:t>
+      </w:r>
+      <w:r>
+        <w:t xml:space="preserve"> public, private, protected, and default (no modifier) </w:t>
+      </w:r>
+    </w:p>
+    <w:tbl>
+      <w:tblPr>
+        <w:tblStyle w:val="PlainTable1"/>
+        <w:tblW w:w="10201" w:type="dxa"/>
+        <w:tblLook w:val="04A0" w:firstRow="1" w:lastRow="0" w:firstColumn="1" w:lastColumn="0" w:noHBand="0" w:noVBand="1"/>
+      </w:tblPr>
+      <w:tblGrid>
+        <w:gridCol w:w="1505"/>
+        <w:gridCol w:w="1037"/>
+        <w:gridCol w:w="1174"/>
+        <w:gridCol w:w="1764"/>
+        <w:gridCol w:w="1461"/>
+        <w:gridCol w:w="3260"/>
+      </w:tblGrid>
+      <w:tr>
+        <w:trPr>
+          <w:cnfStyle w:val="100000000000" w:firstRow="1" w:lastRow="0" w:firstColumn="0" w:lastColumn="0" w:oddVBand="0" w:evenVBand="0" w:oddHBand="0" w:evenHBand="0" w:firstRowFirstColumn="0" w:firstRowLastColumn="0" w:lastRowFirstColumn="0" w:lastRowLastColumn="0"/>
+          <w:trHeight w:val="1069"/>
+        </w:trPr>
+        <w:tc>
+          <w:tcPr>
+            <w:cnfStyle w:val="001000000000" w:firstRow="0" w:lastRow="0" w:firstColumn="1" w:lastColumn="0" w:oddVBand="0" w:evenVBand="0" w:oddHBand="0" w:evenHBand="0" w:firstRowFirstColumn="0" w:firstRowLastColumn="0" w:lastRowFirstColumn="0" w:lastRowLastColumn="0"/>
+            <w:tcW w:w="0" w:type="auto"/>
+            <w:hideMark/>
+          </w:tcPr>
+          <w:p>
+            <w:pPr>
+              <w:spacing w:after="160" w:line="259" w:lineRule="auto"/>
+            </w:pPr>
+            <w:r>
+              <w:t>Modifier</w:t>
+            </w:r>
+          </w:p>
+        </w:tc>
+        <w:tc>
+          <w:tcPr>
+            <w:tcW w:w="0" w:type="auto"/>
+            <w:hideMark/>
+          </w:tcPr>
+          <w:p>
+            <w:pPr>
+              <w:spacing w:after="160" w:line="259" w:lineRule="auto"/>
+              <w:cnfStyle w:val="100000000000" w:firstRow="1" w:lastRow="0" w:firstColumn="0" w:lastColumn="0" w:oddVBand="0" w:evenVBand="0" w:oddHBand="0" w:evenHBand="0" w:firstRowFirstColumn="0" w:firstRowLastColumn="0" w:lastRowFirstColumn="0" w:lastRowLastColumn="0"/>
+            </w:pPr>
+            <w:r>
+              <w:t>Within Class</w:t>
+            </w:r>
+          </w:p>
+        </w:tc>
+        <w:tc>
+          <w:tcPr>
+            <w:tcW w:w="0" w:type="auto"/>
+            <w:hideMark/>
+          </w:tcPr>
+          <w:p>
+            <w:pPr>
+              <w:spacing w:after="160" w:line="259" w:lineRule="auto"/>
+              <w:cnfStyle w:val="100000000000" w:firstRow="1" w:lastRow="0" w:firstColumn="0" w:lastColumn="0" w:oddVBand="0" w:evenVBand="0" w:oddHBand="0" w:evenHBand="0" w:firstRowFirstColumn="0" w:firstRowLastColumn="0" w:lastRowFirstColumn="0" w:lastRowLastColumn="0"/>
+            </w:pPr>
+            <w:r>
+              <w:t>Same Package</w:t>
+            </w:r>
+          </w:p>
+        </w:tc>
+        <w:tc>
+          <w:tcPr>
+            <w:tcW w:w="0" w:type="auto"/>
+            <w:hideMark/>
+          </w:tcPr>
+          <w:p>
+            <w:pPr>
+              <w:spacing w:after="160" w:line="259" w:lineRule="auto"/>
+              <w:cnfStyle w:val="100000000000" w:firstRow="1" w:lastRow="0" w:firstColumn="0" w:lastColumn="0" w:oddVBand="0" w:evenVBand="0" w:oddHBand="0" w:evenHBand="0" w:firstRowFirstColumn="0" w:firstRowLastColumn="0" w:lastRowFirstColumn="0" w:lastRowLastColumn="0"/>
+            </w:pPr>
+            <w:r>
+              <w:t>Subclass (Different Package)</w:t>
+            </w:r>
+          </w:p>
+        </w:tc>
+        <w:tc>
+          <w:tcPr>
+            <w:tcW w:w="1461" w:type="dxa"/>
+            <w:hideMark/>
+          </w:tcPr>
+          <w:p>
+            <w:pPr>
+              <w:spacing w:after="160" w:line="259" w:lineRule="auto"/>
+              <w:cnfStyle w:val="100000000000" w:firstRow="1" w:lastRow="0" w:firstColumn="0" w:lastColumn="0" w:oddVBand="0" w:evenVBand="0" w:oddHBand="0" w:evenHBand="0" w:firstRowFirstColumn="0" w:firstRowLastColumn="0" w:lastRowFirstColumn="0" w:lastRowLastColumn="0"/>
+            </w:pPr>
+            <w:r>
+              <w:t>Everywhere</w:t>
+            </w:r>
+          </w:p>
+        </w:tc>
+        <w:tc>
+          <w:tcPr>
+            <w:tcW w:w="3260" w:type="dxa"/>
+            <w:hideMark/>
+          </w:tcPr>
+          <w:p>
+            <w:pPr>
+              <w:spacing w:after="160" w:line="259" w:lineRule="auto"/>
+              <w:cnfStyle w:val="100000000000" w:firstRow="1" w:lastRow="0" w:firstColumn="0" w:lastColumn="0" w:oddVBand="0" w:evenVBand="0" w:oddHBand="0" w:evenHBand="0" w:firstRowFirstColumn="0" w:firstRowLastColumn="0" w:lastRowFirstColumn="0" w:lastRowLastColumn="0"/>
+            </w:pPr>
+            <w:r>
+              <w:t>Description</w:t>
+            </w:r>
+          </w:p>
+        </w:tc>
+      </w:tr>
+      <w:tr>
+        <w:trPr>
+          <w:cnfStyle w:val="000000100000" w:firstRow="0" w:lastRow="0" w:firstColumn="0" w:lastColumn="0" w:oddVBand="0" w:evenVBand="0" w:oddHBand="1" w:evenHBand="0" w:firstRowFirstColumn="0" w:firstRowLastColumn="0" w:lastRowFirstColumn="0" w:lastRowLastColumn="0"/>
+          <w:trHeight w:val="770"/>
+        </w:trPr>
+        <w:tc>
+          <w:tcPr>
+            <w:cnfStyle w:val="001000000000" w:firstRow="0" w:lastRow="0" w:firstColumn="1" w:lastColumn="0" w:oddVBand="0" w:evenVBand="0" w:oddHBand="0" w:evenHBand="0" w:firstRowFirstColumn="0" w:firstRowLastColumn="0" w:lastRowFirstColumn="0" w:lastRowLastColumn="0"/>
+            <w:tcW w:w="0" w:type="auto"/>
+            <w:hideMark/>
+          </w:tcPr>
+          <w:p>
+            <w:pPr>
+              <w:spacing w:after="160" w:line="259" w:lineRule="auto"/>
+            </w:pPr>
+            <w:r>
+              <w:t>public</w:t>
+            </w:r>
+          </w:p>
+        </w:tc>
+        <w:tc>
+          <w:tcPr>
+            <w:tcW w:w="0" w:type="auto"/>
+            <w:hideMark/>
+          </w:tcPr>
+          <w:p>
+            <w:pPr>
+              <w:spacing w:after="160" w:line="259" w:lineRule="auto"/>
+              <w:cnfStyle w:val="000000100000" w:firstRow="0" w:lastRow="0" w:firstColumn="0" w:lastColumn="0" w:oddVBand="0" w:evenVBand="0" w:oddHBand="1" w:evenHBand="0" w:firstRowFirstColumn="0" w:firstRowLastColumn="0" w:lastRowFirstColumn="0" w:lastRowLastColumn="0"/>
+              <w:rPr>
+                <w:b/>
+                <w:bCs/>
+              </w:rPr>
+            </w:pPr>
+            <w:r>
+              <w:rPr>
+                <w:b/>
+                <w:bCs/>
+              </w:rPr>
+              <w:t>●</w:t>
+            </w:r>
+          </w:p>
+        </w:tc>
+        <w:tc>
+          <w:tcPr>
+            <w:tcW w:w="0" w:type="auto"/>
+            <w:hideMark/>
+          </w:tcPr>
+          <w:p>
+            <w:pPr>
+              <w:spacing w:after="160" w:line="259" w:lineRule="auto"/>
+              <w:cnfStyle w:val="000000100000" w:firstRow="0" w:lastRow="0" w:firstColumn="0" w:lastColumn="0" w:oddVBand="0" w:evenVBand="0" w:oddHBand="1" w:evenHBand="0" w:firstRowFirstColumn="0" w:firstRowLastColumn="0" w:lastRowFirstColumn="0" w:lastRowLastColumn="0"/>
+              <w:rPr>
+                <w:b/>
+                <w:bCs/>
+              </w:rPr>
+            </w:pPr>
+            <w:r>
+              <w:rPr>
+                <w:b/>
+                <w:bCs/>
+              </w:rPr>
+              <w:t>●</w:t>
+            </w:r>
+          </w:p>
+        </w:tc>
+        <w:tc>
+          <w:tcPr>
+            <w:tcW w:w="0" w:type="auto"/>
+            <w:hideMark/>
+          </w:tcPr>
+          <w:p>
+            <w:pPr>
+              <w:spacing w:after="160" w:line="259" w:lineRule="auto"/>
+              <w:cnfStyle w:val="000000100000" w:firstRow="0" w:lastRow="0" w:firstColumn="0" w:lastColumn="0" w:oddVBand="0" w:evenVBand="0" w:oddHBand="1" w:evenHBand="0" w:firstRowFirstColumn="0" w:firstRowLastColumn="0" w:lastRowFirstColumn="0" w:lastRowLastColumn="0"/>
+              <w:rPr>
+                <w:b/>
+                <w:bCs/>
+              </w:rPr>
+            </w:pPr>
+            <w:r>
+              <w:rPr>
+                <w:b/>
+                <w:bCs/>
+              </w:rPr>
+              <w:t>●</w:t>
+            </w:r>
+          </w:p>
+        </w:tc>
+        <w:tc>
+          <w:tcPr>
+            <w:tcW w:w="1461" w:type="dxa"/>
+            <w:hideMark/>
+          </w:tcPr>
+          <w:p>
+            <w:pPr>
+              <w:spacing w:after="160" w:line="259" w:lineRule="auto"/>
+              <w:cnfStyle w:val="000000100000" w:firstRow="0" w:lastRow="0" w:firstColumn="0" w:lastColumn="0" w:oddVBand="0" w:evenVBand="0" w:oddHBand="1" w:evenHBand="0" w:firstRowFirstColumn="0" w:firstRowLastColumn="0" w:lastRowFirstColumn="0" w:lastRowLastColumn="0"/>
+              <w:rPr>
+                <w:b/>
+                <w:bCs/>
+              </w:rPr>
+            </w:pPr>
+            <w:r>
+              <w:rPr>
+                <w:b/>
+                <w:bCs/>
+              </w:rPr>
+              <w:t>●</w:t>
+            </w:r>
+          </w:p>
+        </w:tc>
+        <w:tc>
+          <w:tcPr>
+            <w:tcW w:w="3260" w:type="dxa"/>
+            <w:hideMark/>
+          </w:tcPr>
+          <w:p>
+            <w:pPr>
+              <w:spacing w:after="160" w:line="259" w:lineRule="auto"/>
+              <w:cnfStyle w:val="000000100000" w:firstRow="0" w:lastRow="0" w:firstColumn="0" w:lastColumn="0" w:oddVBand="0" w:evenVBand="0" w:oddHBand="1" w:evenHBand="0" w:firstRowFirstColumn="0" w:firstRowLastColumn="0" w:lastRowFirstColumn="0" w:lastRowLastColumn="0"/>
+              <w:rPr>
+                <w:b/>
+                <w:bCs/>
+              </w:rPr>
+            </w:pPr>
+            <w:r>
+              <w:rPr>
+                <w:b/>
+                <w:bCs/>
+              </w:rPr>
+              <w:t>Accessible from anywhere in the application.</w:t>
+            </w:r>
+          </w:p>
+        </w:tc>
+      </w:tr>
+      <w:tr>
+        <w:trPr>
+          <w:trHeight w:val="1085"/>
+        </w:trPr>
+        <w:tc>
+          <w:tcPr>
+            <w:cnfStyle w:val="001000000000" w:firstRow="0" w:lastRow="0" w:firstColumn="1" w:lastColumn="0" w:oddVBand="0" w:evenVBand="0" w:oddHBand="0" w:evenHBand="0" w:firstRowFirstColumn="0" w:firstRowLastColumn="0" w:lastRowFirstColumn="0" w:lastRowLastColumn="0"/>
+            <w:tcW w:w="0" w:type="auto"/>
+            <w:hideMark/>
+          </w:tcPr>
+          <w:p>
+            <w:pPr>
+              <w:spacing w:after="160" w:line="259" w:lineRule="auto"/>
+            </w:pPr>
+            <w:r>
+              <w:t>protected</w:t>
+            </w:r>
+          </w:p>
+        </w:tc>
+        <w:tc>
+          <w:tcPr>
+            <w:tcW w:w="0" w:type="auto"/>
+            <w:hideMark/>
+          </w:tcPr>
+          <w:p>
+            <w:pPr>
+              <w:spacing w:after="160" w:line="259" w:lineRule="auto"/>
+              <w:cnfStyle w:val="000000000000" w:firstRow="0" w:lastRow="0" w:firstColumn="0" w:lastColumn="0" w:oddVBand="0" w:evenVBand="0" w:oddHBand="0" w:evenHBand="0" w:firstRowFirstColumn="0" w:firstRowLastColumn="0" w:lastRowFirstColumn="0" w:lastRowLastColumn="0"/>
+              <w:rPr>
+                <w:b/>
+                <w:bCs/>
+              </w:rPr>
+            </w:pPr>
+            <w:r>
+              <w:rPr>
+                <w:b/>
+                <w:bCs/>
+              </w:rPr>
+              <w:t>●</w:t>
+            </w:r>
+          </w:p>
+        </w:tc>
+        <w:tc>
+          <w:tcPr>
+            <w:tcW w:w="0" w:type="auto"/>
+            <w:hideMark/>
+          </w:tcPr>
+          <w:p>
+            <w:pPr>
+              <w:spacing w:after="160" w:line="259" w:lineRule="auto"/>
+              <w:cnfStyle w:val="000000000000" w:firstRow="0" w:lastRow="0" w:firstColumn="0" w:lastColumn="0" w:oddVBand="0" w:evenVBand="0" w:oddHBand="0" w:evenHBand="0" w:firstRowFirstColumn="0" w:firstRowLastColumn="0" w:lastRowFirstColumn="0" w:lastRowLastColumn="0"/>
+              <w:rPr>
+                <w:b/>
+                <w:bCs/>
+              </w:rPr>
+            </w:pPr>
+            <w:r>
+              <w:rPr>
+                <w:b/>
+                <w:bCs/>
+              </w:rPr>
+              <w:t>●</w:t>
+            </w:r>
+          </w:p>
+        </w:tc>
+        <w:tc>
+          <w:tcPr>
+            <w:tcW w:w="0" w:type="auto"/>
+            <w:hideMark/>
+          </w:tcPr>
+          <w:p>
+            <w:pPr>
+              <w:spacing w:after="160" w:line="259" w:lineRule="auto"/>
+              <w:cnfStyle w:val="000000000000" w:firstRow="0" w:lastRow="0" w:firstColumn="0" w:lastColumn="0" w:oddVBand="0" w:evenVBand="0" w:oddHBand="0" w:evenHBand="0" w:firstRowFirstColumn="0" w:firstRowLastColumn="0" w:lastRowFirstColumn="0" w:lastRowLastColumn="0"/>
+              <w:rPr>
+                <w:b/>
+                <w:bCs/>
+              </w:rPr>
+            </w:pPr>
+            <w:r>
+              <w:rPr>
+                <w:b/>
+                <w:bCs/>
+              </w:rPr>
+              <w:t>●</w:t>
+            </w:r>
+          </w:p>
+        </w:tc>
+        <w:tc>
+          <w:tcPr>
+            <w:tcW w:w="1461" w:type="dxa"/>
+            <w:hideMark/>
+          </w:tcPr>
+          <w:p>
+            <w:pPr>
+              <w:spacing w:after="160" w:line="259" w:lineRule="auto"/>
+              <w:cnfStyle w:val="000000000000" w:firstRow="0" w:lastRow="0" w:firstColumn="0" w:lastColumn="0" w:oddVBand="0" w:evenVBand="0" w:oddHBand="0" w:evenHBand="0" w:firstRowFirstColumn="0" w:firstRowLastColumn="0" w:lastRowFirstColumn="0" w:lastRowLastColumn="0"/>
+              <w:rPr>
+                <w:b/>
+                <w:bCs/>
+              </w:rPr>
+            </w:pPr>
+            <w:r>
+              <w:rPr>
+                <w:b/>
+                <w:bCs/>
+              </w:rPr>
+              <w:t>○</w:t>
+            </w:r>
+          </w:p>
+        </w:tc>
+        <w:tc>
+          <w:tcPr>
+            <w:tcW w:w="3260" w:type="dxa"/>
+            <w:hideMark/>
+          </w:tcPr>
+          <w:p>
+            <w:pPr>
+              <w:spacing w:after="160" w:line="259" w:lineRule="auto"/>
+              <w:cnfStyle w:val="000000000000" w:firstRow="0" w:lastRow="0" w:firstColumn="0" w:lastColumn="0" w:oddVBand="0" w:evenVBand="0" w:oddHBand="0" w:evenHBand="0" w:firstRowFirstColumn="0" w:firstRowLastColumn="0" w:lastRowFirstColumn="0" w:lastRowLastColumn="0"/>
+              <w:rPr>
+                <w:b/>
+                <w:bCs/>
+              </w:rPr>
+            </w:pPr>
+            <w:r>
+              <w:rPr>
+                <w:b/>
+                <w:bCs/>
+              </w:rPr>
+              <w:t>Accessible within the same package and by subclasses in different packages.</w:t>
+            </w:r>
+          </w:p>
+        </w:tc>
+      </w:tr>
+      <w:tr>
+        <w:trPr>
+          <w:cnfStyle w:val="000000100000" w:firstRow="0" w:lastRow="0" w:firstColumn="0" w:lastColumn="0" w:oddVBand="0" w:evenVBand="0" w:oddHBand="1" w:evenHBand="0" w:firstRowFirstColumn="0" w:firstRowLastColumn="0" w:lastRowFirstColumn="0" w:lastRowLastColumn="0"/>
+          <w:trHeight w:val="770"/>
+        </w:trPr>
+        <w:tc>
+          <w:tcPr>
+            <w:cnfStyle w:val="001000000000" w:firstRow="0" w:lastRow="0" w:firstColumn="1" w:lastColumn="0" w:oddVBand="0" w:evenVBand="0" w:oddHBand="0" w:evenHBand="0" w:firstRowFirstColumn="0" w:firstRowLastColumn="0" w:lastRowFirstColumn="0" w:lastRowLastColumn="0"/>
+            <w:tcW w:w="0" w:type="auto"/>
+            <w:hideMark/>
+          </w:tcPr>
+          <w:p>
+            <w:pPr>
+              <w:spacing w:after="160" w:line="259" w:lineRule="auto"/>
+            </w:pPr>
+            <w:r>
+              <w:t xml:space="preserve">default </w:t>
+            </w:r>
+            <w:r>
+              <w:rPr>
+                <w:i/>
+                <w:iCs/>
+              </w:rPr>
+              <w:t>(no modifier)</w:t>
+            </w:r>
+          </w:p>
+        </w:tc>
+        <w:tc>
+          <w:tcPr>
+            <w:tcW w:w="0" w:type="auto"/>
+            <w:hideMark/>
+          </w:tcPr>
+          <w:p>
+            <w:pPr>
+              <w:spacing w:after="160" w:line="259" w:lineRule="auto"/>
+              <w:cnfStyle w:val="000000100000" w:firstRow="0" w:lastRow="0" w:firstColumn="0" w:lastColumn="0" w:oddVBand="0" w:evenVBand="0" w:oddHBand="1" w:evenHBand="0" w:firstRowFirstColumn="0" w:firstRowLastColumn="0" w:lastRowFirstColumn="0" w:lastRowLastColumn="0"/>
+              <w:rPr>
+                <w:b/>
+                <w:bCs/>
+              </w:rPr>
+            </w:pPr>
+            <w:r>
+              <w:rPr>
+                <w:b/>
+                <w:bCs/>
+              </w:rPr>
+              <w:t>●</w:t>
+            </w:r>
+          </w:p>
+        </w:tc>
+        <w:tc>
+          <w:tcPr>
+            <w:tcW w:w="0" w:type="auto"/>
+            <w:hideMark/>
+          </w:tcPr>
+          <w:p>
+            <w:pPr>
+              <w:spacing w:after="160" w:line="259" w:lineRule="auto"/>
+              <w:cnfStyle w:val="000000100000" w:firstRow="0" w:lastRow="0" w:firstColumn="0" w:lastColumn="0" w:oddVBand="0" w:evenVBand="0" w:oddHBand="1" w:evenHBand="0" w:firstRowFirstColumn="0" w:firstRowLastColumn="0" w:lastRowFirstColumn="0" w:lastRowLastColumn="0"/>
+              <w:rPr>
+                <w:b/>
+                <w:bCs/>
+              </w:rPr>
+            </w:pPr>
+            <w:r>
+              <w:rPr>
+                <w:b/>
+                <w:bCs/>
+              </w:rPr>
+              <w:t>●</w:t>
+            </w:r>
+          </w:p>
+        </w:tc>
+        <w:tc>
+          <w:tcPr>
+            <w:tcW w:w="0" w:type="auto"/>
+            <w:hideMark/>
+          </w:tcPr>
+          <w:p>
+            <w:pPr>
+              <w:spacing w:after="160" w:line="259" w:lineRule="auto"/>
+              <w:cnfStyle w:val="000000100000" w:firstRow="0" w:lastRow="0" w:firstColumn="0" w:lastColumn="0" w:oddVBand="0" w:evenVBand="0" w:oddHBand="1" w:evenHBand="0" w:firstRowFirstColumn="0" w:firstRowLastColumn="0" w:lastRowFirstColumn="0" w:lastRowLastColumn="0"/>
+              <w:rPr>
+                <w:b/>
+                <w:bCs/>
+              </w:rPr>
+            </w:pPr>
+            <w:r>
+              <w:rPr>
+                <w:b/>
+                <w:bCs/>
+              </w:rPr>
+              <w:t>○</w:t>
+            </w:r>
+          </w:p>
+        </w:tc>
+        <w:tc>
+          <w:tcPr>
+            <w:tcW w:w="1461" w:type="dxa"/>
+            <w:hideMark/>
+          </w:tcPr>
+          <w:p>
+            <w:pPr>
+              <w:spacing w:after="160" w:line="259" w:lineRule="auto"/>
+              <w:cnfStyle w:val="000000100000" w:firstRow="0" w:lastRow="0" w:firstColumn="0" w:lastColumn="0" w:oddVBand="0" w:evenVBand="0" w:oddHBand="1" w:evenHBand="0" w:firstRowFirstColumn="0" w:firstRowLastColumn="0" w:lastRowFirstColumn="0" w:lastRowLastColumn="0"/>
+              <w:rPr>
+                <w:b/>
+                <w:bCs/>
+              </w:rPr>
+            </w:pPr>
+            <w:r>
+              <w:rPr>
+                <w:b/>
+                <w:bCs/>
+              </w:rPr>
+              <w:t>○</w:t>
+            </w:r>
+          </w:p>
+        </w:tc>
+        <w:tc>
+          <w:tcPr>
+            <w:tcW w:w="3260" w:type="dxa"/>
+            <w:hideMark/>
+          </w:tcPr>
+          <w:p>
+            <w:pPr>
+              <w:spacing w:after="160" w:line="259" w:lineRule="auto"/>
+              <w:cnfStyle w:val="000000100000" w:firstRow="0" w:lastRow="0" w:firstColumn="0" w:lastColumn="0" w:oddVBand="0" w:evenVBand="0" w:oddHBand="1" w:evenHBand="0" w:firstRowFirstColumn="0" w:firstRowLastColumn="0" w:lastRowFirstColumn="0" w:lastRowLastColumn="0"/>
+              <w:rPr>
+                <w:b/>
+                <w:bCs/>
+              </w:rPr>
+            </w:pPr>
+            <w:r>
+              <w:rPr>
+                <w:b/>
+                <w:bCs/>
+              </w:rPr>
+              <w:t>Accessible only within the same package.</w:t>
+            </w:r>
+          </w:p>
+        </w:tc>
+      </w:tr>
+      <w:tr>
+        <w:trPr>
+          <w:trHeight w:val="754"/>
+        </w:trPr>
+        <w:tc>
+          <w:tcPr>
+            <w:cnfStyle w:val="001000000000" w:firstRow="0" w:lastRow="0" w:firstColumn="1" w:lastColumn="0" w:oddVBand="0" w:evenVBand="0" w:oddHBand="0" w:evenHBand="0" w:firstRowFirstColumn="0" w:firstRowLastColumn="0" w:lastRowFirstColumn="0" w:lastRowLastColumn="0"/>
+            <w:tcW w:w="0" w:type="auto"/>
+            <w:hideMark/>
+          </w:tcPr>
+          <w:p>
+            <w:pPr>
+              <w:spacing w:after="160" w:line="259" w:lineRule="auto"/>
+            </w:pPr>
+            <w:r>
+              <w:t>private</w:t>
+            </w:r>
+          </w:p>
+        </w:tc>
+        <w:tc>
+          <w:tcPr>
+            <w:tcW w:w="0" w:type="auto"/>
+            <w:hideMark/>
+          </w:tcPr>
+          <w:p>
+            <w:pPr>
+              <w:spacing w:after="160" w:line="259" w:lineRule="auto"/>
+              <w:cnfStyle w:val="000000000000" w:firstRow="0" w:lastRow="0" w:firstColumn="0" w:lastColumn="0" w:oddVBand="0" w:evenVBand="0" w:oddHBand="0" w:evenHBand="0" w:firstRowFirstColumn="0" w:firstRowLastColumn="0" w:lastRowFirstColumn="0" w:lastRowLastColumn="0"/>
+              <w:rPr>
+                <w:b/>
+                <w:bCs/>
+              </w:rPr>
+            </w:pPr>
+            <w:r>
+              <w:rPr>
+                <w:b/>
+                <w:bCs/>
+              </w:rPr>
+              <w:t>●</w:t>
+            </w:r>
+          </w:p>
+        </w:tc>
+        <w:tc>
+          <w:tcPr>
+            <w:tcW w:w="0" w:type="auto"/>
+            <w:hideMark/>
+          </w:tcPr>
+          <w:p>
+            <w:pPr>
+              <w:spacing w:after="160" w:line="259" w:lineRule="auto"/>
+              <w:cnfStyle w:val="000000000000" w:firstRow="0" w:lastRow="0" w:firstColumn="0" w:lastColumn="0" w:oddVBand="0" w:evenVBand="0" w:oddHBand="0" w:evenHBand="0" w:firstRowFirstColumn="0" w:firstRowLastColumn="0" w:lastRowFirstColumn="0" w:lastRowLastColumn="0"/>
+              <w:rPr>
+                <w:b/>
+                <w:bCs/>
+              </w:rPr>
+            </w:pPr>
+            <w:r>
+              <w:rPr>
+                <w:b/>
+                <w:bCs/>
+              </w:rPr>
+              <w:t>○</w:t>
+            </w:r>
+          </w:p>
+        </w:tc>
+        <w:tc>
+          <w:tcPr>
+            <w:tcW w:w="0" w:type="auto"/>
+            <w:hideMark/>
+          </w:tcPr>
+          <w:p>
+            <w:pPr>
+              <w:spacing w:after="160" w:line="259" w:lineRule="auto"/>
+              <w:cnfStyle w:val="000000000000" w:firstRow="0" w:lastRow="0" w:firstColumn="0" w:lastColumn="0" w:oddVBand="0" w:evenVBand="0" w:oddHBand="0" w:evenHBand="0" w:firstRowFirstColumn="0" w:firstRowLastColumn="0" w:lastRowFirstColumn="0" w:lastRowLastColumn="0"/>
+              <w:rPr>
+                <w:b/>
+                <w:bCs/>
+              </w:rPr>
+            </w:pPr>
+            <w:r>
+              <w:rPr>
+                <w:b/>
+                <w:bCs/>
+              </w:rPr>
+              <w:t>○</w:t>
+            </w:r>
+          </w:p>
+        </w:tc>
+        <w:tc>
+          <w:tcPr>
+            <w:tcW w:w="1461" w:type="dxa"/>
+            <w:hideMark/>
+          </w:tcPr>
+          <w:p>
+            <w:pPr>
+              <w:spacing w:after="160" w:line="259" w:lineRule="auto"/>
+              <w:cnfStyle w:val="000000000000" w:firstRow="0" w:lastRow="0" w:firstColumn="0" w:lastColumn="0" w:oddVBand="0" w:evenVBand="0" w:oddHBand="0" w:evenHBand="0" w:firstRowFirstColumn="0" w:firstRowLastColumn="0" w:lastRowFirstColumn="0" w:lastRowLastColumn="0"/>
+              <w:rPr>
+                <w:b/>
+                <w:bCs/>
+              </w:rPr>
+            </w:pPr>
+            <w:r>
+              <w:rPr>
+                <w:b/>
+                <w:bCs/>
+              </w:rPr>
+              <w:t>○</w:t>
+            </w:r>
+          </w:p>
+        </w:tc>
+        <w:tc>
+          <w:tcPr>
+            <w:tcW w:w="3260" w:type="dxa"/>
+            <w:hideMark/>
+          </w:tcPr>
+          <w:p>
+            <w:pPr>
+              <w:spacing w:after="160" w:line="259" w:lineRule="auto"/>
+              <w:cnfStyle w:val="000000000000" w:firstRow="0" w:lastRow="0" w:firstColumn="0" w:lastColumn="0" w:oddVBand="0" w:evenVBand="0" w:oddHBand="0" w:evenHBand="0" w:firstRowFirstColumn="0" w:firstRowLastColumn="0" w:lastRowFirstColumn="0" w:lastRowLastColumn="0"/>
+              <w:rPr>
+                <w:b/>
+                <w:bCs/>
+              </w:rPr>
+            </w:pPr>
+            <w:r>
+              <w:rPr>
+                <w:b/>
+                <w:bCs/>
+              </w:rPr>
+              <w:t>Accessible only within the same class.</w:t>
+            </w:r>
+          </w:p>
+        </w:tc>
+      </w:tr>
+    </w:tbl>
+    <w:p>
+      <w:pPr>
+        <w:pStyle w:val="ListParagraph"/>
+      </w:pPr>
+    </w:p>
+    <w:p>
+      <w:pPr>
+        <w:pStyle w:val="ListParagraph"/>
+      </w:pPr>
+      <w:r>
+        <w:rPr>
+          <w:b/>
+          <w:bCs/>
+        </w:rPr>
+        <w:t>Legend:</w:t>
+      </w:r>
+    </w:p>
+    <w:p>
+      <w:pPr>
+        <w:pStyle w:val="ListParagraph"/>
+        <w:numPr>
+          <w:ilvl w:val="0"/>
+          <w:numId w:val="10"/>
+        </w:numPr>
+      </w:pPr>
+      <w:r>
+        <w:rPr>
+          <w:b/>
+          <w:bCs/>
+        </w:rPr>
+        <w:t>●</w:t>
+      </w:r>
+      <w:r>
+        <w:t xml:space="preserve"> = Accessible </w:t>
+      </w:r>
+    </w:p>
+    <w:p>
+      <w:pPr>
+        <w:pStyle w:val="ListParagraph"/>
+        <w:numPr>
+          <w:ilvl w:val="0"/>
+          <w:numId w:val="10"/>
+        </w:numPr>
+      </w:pPr>
+      <w:r>
+        <w:rPr>
+          <w:b/>
+          <w:bCs/>
+        </w:rPr>
+        <w:t>○</w:t>
+      </w:r>
+      <w:r>
+        <w:t xml:space="preserve"> = Not Accessible</w:t>
+      </w:r>
+    </w:p>
+    <w:p>
+      <w:pPr>
+        <w:pStyle w:val="ListParagraph"/>
+      </w:pPr>
+    </w:p>
+    <w:p>
+      <w:pPr>
+        <w:pStyle w:val="ListParagraph"/>
+        <w:numPr>
+          <w:ilvl w:val="0"/>
+          <w:numId w:val="4"/>
+        </w:numPr>
+      </w:pPr>
+      <w:r>
+        <w:rPr>
+          <w:b/>
+          <w:bCs/>
+        </w:rPr>
+        <w:t>Non-Access Modifiers:</w:t>
+      </w:r>
+      <w:r>
+        <w:t xml:space="preserve"> static, final, abstract, synchronized, volatile, transient, native, and strictfp</w:t>
+      </w:r>
+    </w:p>
+    <w:tbl>
+      <w:tblPr>
+        <w:tblStyle w:val="PlainTable1"/>
+        <w:tblW w:w="0" w:type="auto"/>
+        <w:tblLook w:val="04A0" w:firstRow="1" w:lastRow="0" w:firstColumn="1" w:lastColumn="0" w:noHBand="0" w:noVBand="1"/>
+      </w:tblPr>
+      <w:tblGrid>
+        <w:gridCol w:w="2131"/>
+        <w:gridCol w:w="2784"/>
+        <w:gridCol w:w="4856"/>
+      </w:tblGrid>
+      <w:tr>
+        <w:trPr>
+          <w:cnfStyle w:val="100000000000" w:firstRow="1" w:lastRow="0" w:firstColumn="0" w:lastColumn="0" w:oddVBand="0" w:evenVBand="0" w:oddHBand="0" w:evenHBand="0" w:firstRowFirstColumn="0" w:firstRowLastColumn="0" w:lastRowFirstColumn="0" w:lastRowLastColumn="0"/>
+        </w:trPr>
+        <w:tc>
+          <w:tcPr>
+            <w:cnfStyle w:val="001000000000" w:firstRow="0" w:lastRow="0" w:firstColumn="1" w:lastColumn="0" w:oddVBand="0" w:evenVBand="0" w:oddHBand="0" w:evenHBand="0" w:firstRowFirstColumn="0" w:firstRowLastColumn="0" w:lastRowFirstColumn="0" w:lastRowLastColumn="0"/>
+            <w:tcW w:w="0" w:type="auto"/>
+            <w:hideMark/>
+          </w:tcPr>
+          <w:p>
+            <w:pPr>
+              <w:pStyle w:val="ListParagraph"/>
+              <w:spacing w:after="160" w:line="259" w:lineRule="auto"/>
+            </w:pPr>
+            <w:r>
+              <w:t>Modifier</w:t>
+            </w:r>
+          </w:p>
+        </w:tc>
+        <w:tc>
+          <w:tcPr>
+            <w:tcW w:w="0" w:type="auto"/>
+            <w:hideMark/>
+          </w:tcPr>
+          <w:p>
+            <w:pPr>
+              <w:pStyle w:val="ListParagraph"/>
+              <w:spacing w:after="160" w:line="259" w:lineRule="auto"/>
+              <w:cnfStyle w:val="100000000000" w:firstRow="1" w:lastRow="0" w:firstColumn="0" w:lastColumn="0" w:oddVBand="0" w:evenVBand="0" w:oddHBand="0" w:evenHBand="0" w:firstRowFirstColumn="0" w:firstRowLastColumn="0" w:lastRowFirstColumn="0" w:lastRowLastColumn="0"/>
+            </w:pPr>
+            <w:r>
+              <w:t>Can Be Applied To</w:t>
+            </w:r>
+          </w:p>
+        </w:tc>
+        <w:tc>
+          <w:tcPr>
+            <w:tcW w:w="0" w:type="auto"/>
+            <w:hideMark/>
+          </w:tcPr>
+          <w:p>
+            <w:pPr>
+              <w:pStyle w:val="ListParagraph"/>
+              <w:spacing w:after="160" w:line="259" w:lineRule="auto"/>
+              <w:cnfStyle w:val="100000000000" w:firstRow="1" w:lastRow="0" w:firstColumn="0" w:lastColumn="0" w:oddVBand="0" w:evenVBand="0" w:oddHBand="0" w:evenHBand="0" w:firstRowFirstColumn="0" w:firstRowLastColumn="0" w:lastRowFirstColumn="0" w:lastRowLastColumn="0"/>
+            </w:pPr>
+            <w:r>
+              <w:t>Description</w:t>
+            </w:r>
+          </w:p>
+        </w:tc>
+      </w:tr>
+      <w:tr>
+        <w:trPr>
+          <w:cnfStyle w:val="000000100000" w:firstRow="0" w:lastRow="0" w:firstColumn="0" w:lastColumn="0" w:oddVBand="0" w:evenVBand="0" w:oddHBand="1" w:evenHBand="0" w:firstRowFirstColumn="0" w:firstRowLastColumn="0" w:lastRowFirstColumn="0" w:lastRowLastColumn="0"/>
+        </w:trPr>
+        <w:tc>
+          <w:tcPr>
+            <w:cnfStyle w:val="001000000000" w:firstRow="0" w:lastRow="0" w:firstColumn="1" w:lastColumn="0" w:oddVBand="0" w:evenVBand="0" w:oddHBand="0" w:evenHBand="0" w:firstRowFirstColumn="0" w:firstRowLastColumn="0" w:lastRowFirstColumn="0" w:lastRowLastColumn="0"/>
+            <w:tcW w:w="0" w:type="auto"/>
+            <w:hideMark/>
+          </w:tcPr>
+          <w:p>
+            <w:pPr>
+              <w:pStyle w:val="ListParagraph"/>
+              <w:spacing w:after="160" w:line="259" w:lineRule="auto"/>
+            </w:pPr>
+            <w:r>
+              <w:t>static</w:t>
+            </w:r>
+          </w:p>
+        </w:tc>
+        <w:tc>
+          <w:tcPr>
+            <w:tcW w:w="0" w:type="auto"/>
+            <w:hideMark/>
+          </w:tcPr>
+          <w:p>
+            <w:pPr>
+              <w:pStyle w:val="ListParagraph"/>
+              <w:spacing w:after="160" w:line="259" w:lineRule="auto"/>
+              <w:cnfStyle w:val="000000100000" w:firstRow="0" w:lastRow="0" w:firstColumn="0" w:lastColumn="0" w:oddVBand="0" w:evenVBand="0" w:oddHBand="1" w:evenHBand="0" w:firstRowFirstColumn="0" w:firstRowLastColumn="0" w:lastRowFirstColumn="0" w:lastRowLastColumn="0"/>
+            </w:pPr>
+            <w:r>
+              <w:t>Classes (nested), methods, variables, blocks</w:t>
+            </w:r>
+          </w:p>
+        </w:tc>
+        <w:tc>
+          <w:tcPr>
+            <w:tcW w:w="0" w:type="auto"/>
+            <w:hideMark/>
+          </w:tcPr>
+          <w:p>
+            <w:pPr>
+              <w:pStyle w:val="ListParagraph"/>
+              <w:spacing w:after="160" w:line="259" w:lineRule="auto"/>
+              <w:cnfStyle w:val="000000100000" w:firstRow="0" w:lastRow="0" w:firstColumn="0" w:lastColumn="0" w:oddVBand="0" w:evenVBand="0" w:oddHBand="1" w:evenHBand="0" w:firstRowFirstColumn="0" w:firstRowLastColumn="0" w:lastRowFirstColumn="0" w:lastRowLastColumn="0"/>
+            </w:pPr>
+            <w:r>
+              <w:t>Makes the member belong to the class rather than individual objects.</w:t>
+            </w:r>
+          </w:p>
+        </w:tc>
+      </w:tr>
+      <w:tr>
+        <w:tc>
+          <w:tcPr>
+            <w:cnfStyle w:val="001000000000" w:firstRow="0" w:lastRow="0" w:firstColumn="1" w:lastColumn="0" w:oddVBand="0" w:evenVBand="0" w:oddHBand="0" w:evenHBand="0" w:firstRowFirstColumn="0" w:firstRowLastColumn="0" w:lastRowFirstColumn="0" w:lastRowLastColumn="0"/>
+            <w:tcW w:w="0" w:type="auto"/>
+            <w:hideMark/>
+          </w:tcPr>
+          <w:p>
+            <w:pPr>
+              <w:pStyle w:val="ListParagraph"/>
+              <w:spacing w:after="160" w:line="259" w:lineRule="auto"/>
+            </w:pPr>
+            <w:r>
+              <w:t>final</w:t>
+            </w:r>
+          </w:p>
+        </w:tc>
+        <w:tc>
+          <w:tcPr>
+            <w:tcW w:w="0" w:type="auto"/>
+            <w:hideMark/>
+          </w:tcPr>
+          <w:p>
+            <w:pPr>
+              <w:pStyle w:val="ListParagraph"/>
+              <w:spacing w:after="160" w:line="259" w:lineRule="auto"/>
+              <w:cnfStyle w:val="000000000000" w:firstRow="0" w:lastRow="0" w:firstColumn="0" w:lastColumn="0" w:oddVBand="0" w:evenVBand="0" w:oddHBand="0" w:evenHBand="0" w:firstRowFirstColumn="0" w:firstRowLastColumn="0" w:lastRowFirstColumn="0" w:lastRowLastColumn="0"/>
+            </w:pPr>
+            <w:r>
+              <w:t>Classes, methods, variables</w:t>
+            </w:r>
+          </w:p>
+        </w:tc>
+        <w:tc>
+          <w:tcPr>
+            <w:tcW w:w="0" w:type="auto"/>
+            <w:hideMark/>
+          </w:tcPr>
+          <w:p>
+            <w:pPr>
+              <w:pStyle w:val="ListParagraph"/>
+              <w:spacing w:after="160" w:line="259" w:lineRule="auto"/>
+              <w:cnfStyle w:val="000000000000" w:firstRow="0" w:lastRow="0" w:firstColumn="0" w:lastColumn="0" w:oddVBand="0" w:evenVBand="0" w:oddHBand="0" w:evenHBand="0" w:firstRowFirstColumn="0" w:firstRowLastColumn="0" w:lastRowFirstColumn="0" w:lastRowLastColumn="0"/>
+            </w:pPr>
+            <w:r>
+              <w:t>Prevents inheritance (class), overriding (method), or reassignment (variable).</w:t>
+            </w:r>
+          </w:p>
+        </w:tc>
+      </w:tr>
+      <w:tr>
+        <w:trPr>
+          <w:cnfStyle w:val="000000100000" w:firstRow="0" w:lastRow="0" w:firstColumn="0" w:lastColumn="0" w:oddVBand="0" w:evenVBand="0" w:oddHBand="1" w:evenHBand="0" w:firstRowFirstColumn="0" w:firstRowLastColumn="0" w:lastRowFirstColumn="0" w:lastRowLastColumn="0"/>
+        </w:trPr>
+        <w:tc>
+          <w:tcPr>
+            <w:cnfStyle w:val="001000000000" w:firstRow="0" w:lastRow="0" w:firstColumn="1" w:lastColumn="0" w:oddVBand="0" w:evenVBand="0" w:oddHBand="0" w:evenHBand="0" w:firstRowFirstColumn="0" w:firstRowLastColumn="0" w:lastRowFirstColumn="0" w:lastRowLastColumn="0"/>
+            <w:tcW w:w="0" w:type="auto"/>
+            <w:hideMark/>
+          </w:tcPr>
+          <w:p>
+            <w:pPr>
+              <w:pStyle w:val="ListParagraph"/>
+              <w:spacing w:after="160" w:line="259" w:lineRule="auto"/>
+            </w:pPr>
+            <w:r>
+              <w:lastRenderedPageBreak/>
+              <w:t>abstract</w:t>
+            </w:r>
+          </w:p>
+        </w:tc>
+        <w:tc>
+          <w:tcPr>
+            <w:tcW w:w="0" w:type="auto"/>
+            <w:hideMark/>
+          </w:tcPr>
+          <w:p>
+            <w:pPr>
+              <w:pStyle w:val="ListParagraph"/>
+              <w:spacing w:after="160" w:line="259" w:lineRule="auto"/>
+              <w:cnfStyle w:val="000000100000" w:firstRow="0" w:lastRow="0" w:firstColumn="0" w:lastColumn="0" w:oddVBand="0" w:evenVBand="0" w:oddHBand="1" w:evenHBand="0" w:firstRowFirstColumn="0" w:firstRowLastColumn="0" w:lastRowFirstColumn="0" w:lastRowLastColumn="0"/>
+            </w:pPr>
+            <w:r>
+              <w:t>Classes, methods</w:t>
+            </w:r>
+          </w:p>
+        </w:tc>
+        <w:tc>
+          <w:tcPr>
+            <w:tcW w:w="0" w:type="auto"/>
+            <w:hideMark/>
+          </w:tcPr>
+          <w:p>
+            <w:pPr>
+              <w:pStyle w:val="ListParagraph"/>
+              <w:spacing w:after="160" w:line="259" w:lineRule="auto"/>
+              <w:cnfStyle w:val="000000100000" w:firstRow="0" w:lastRow="0" w:firstColumn="0" w:lastColumn="0" w:oddVBand="0" w:evenVBand="0" w:oddHBand="1" w:evenHBand="0" w:firstRowFirstColumn="0" w:firstRowLastColumn="0" w:lastRowFirstColumn="0" w:lastRowLastColumn="0"/>
+            </w:pPr>
+            <w:r>
+              <w:t>Declares incomplete classes or methods that must be implemented by subclasses.</w:t>
+            </w:r>
+          </w:p>
+        </w:tc>
+      </w:tr>
+      <w:tr>
+        <w:tc>
+          <w:tcPr>
+            <w:cnfStyle w:val="001000000000" w:firstRow="0" w:lastRow="0" w:firstColumn="1" w:lastColumn="0" w:oddVBand="0" w:evenVBand="0" w:oddHBand="0" w:evenHBand="0" w:firstRowFirstColumn="0" w:firstRowLastColumn="0" w:lastRowFirstColumn="0" w:lastRowLastColumn="0"/>
+            <w:tcW w:w="0" w:type="auto"/>
+            <w:hideMark/>
+          </w:tcPr>
+          <w:p>
+            <w:pPr>
+              <w:pStyle w:val="ListParagraph"/>
+              <w:spacing w:after="160" w:line="259" w:lineRule="auto"/>
+            </w:pPr>
+            <w:r>
+              <w:t>synchronized</w:t>
+            </w:r>
+          </w:p>
+        </w:tc>
+        <w:tc>
+          <w:tcPr>
+            <w:tcW w:w="0" w:type="auto"/>
+            <w:hideMark/>
+          </w:tcPr>
+          <w:p>
+            <w:pPr>
+              <w:pStyle w:val="ListParagraph"/>
+              <w:spacing w:after="160" w:line="259" w:lineRule="auto"/>
+              <w:cnfStyle w:val="000000000000" w:firstRow="0" w:lastRow="0" w:firstColumn="0" w:lastColumn="0" w:oddVBand="0" w:evenVBand="0" w:oddHBand="0" w:evenHBand="0" w:firstRowFirstColumn="0" w:firstRowLastColumn="0" w:lastRowFirstColumn="0" w:lastRowLastColumn="0"/>
+            </w:pPr>
+            <w:r>
+              <w:t>Methods, blocks</w:t>
+            </w:r>
+          </w:p>
+        </w:tc>
+        <w:tc>
+          <w:tcPr>
+            <w:tcW w:w="0" w:type="auto"/>
+            <w:hideMark/>
+          </w:tcPr>
+          <w:p>
+            <w:pPr>
+              <w:pStyle w:val="ListParagraph"/>
+              <w:spacing w:after="160" w:line="259" w:lineRule="auto"/>
+              <w:cnfStyle w:val="000000000000" w:firstRow="0" w:lastRow="0" w:firstColumn="0" w:lastColumn="0" w:oddVBand="0" w:evenVBand="0" w:oddHBand="0" w:evenHBand="0" w:firstRowFirstColumn="0" w:firstRowLastColumn="0" w:lastRowFirstColumn="0" w:lastRowLastColumn="0"/>
+            </w:pPr>
+            <w:r>
+              <w:t>Allows only one thread to execute the method or block at a time.</w:t>
+            </w:r>
+          </w:p>
+        </w:tc>
+      </w:tr>
+      <w:tr>
+        <w:trPr>
+          <w:cnfStyle w:val="000000100000" w:firstRow="0" w:lastRow="0" w:firstColumn="0" w:lastColumn="0" w:oddVBand="0" w:evenVBand="0" w:oddHBand="1" w:evenHBand="0" w:firstRowFirstColumn="0" w:firstRowLastColumn="0" w:lastRowFirstColumn="0" w:lastRowLastColumn="0"/>
+        </w:trPr>
+        <w:tc>
+          <w:tcPr>
+            <w:cnfStyle w:val="001000000000" w:firstRow="0" w:lastRow="0" w:firstColumn="1" w:lastColumn="0" w:oddVBand="0" w:evenVBand="0" w:oddHBand="0" w:evenHBand="0" w:firstRowFirstColumn="0" w:firstRowLastColumn="0" w:lastRowFirstColumn="0" w:lastRowLastColumn="0"/>
+            <w:tcW w:w="0" w:type="auto"/>
+            <w:hideMark/>
+          </w:tcPr>
+          <w:p>
+            <w:pPr>
+              <w:pStyle w:val="ListParagraph"/>
+              <w:spacing w:after="160" w:line="259" w:lineRule="auto"/>
+            </w:pPr>
+            <w:r>
+              <w:t>volatile</w:t>
+            </w:r>
+          </w:p>
+        </w:tc>
+        <w:tc>
+          <w:tcPr>
+            <w:tcW w:w="0" w:type="auto"/>
+            <w:hideMark/>
+          </w:tcPr>
+          <w:p>
+            <w:pPr>
+              <w:pStyle w:val="ListParagraph"/>
+              <w:spacing w:after="160" w:line="259" w:lineRule="auto"/>
+              <w:cnfStyle w:val="000000100000" w:firstRow="0" w:lastRow="0" w:firstColumn="0" w:lastColumn="0" w:oddVBand="0" w:evenVBand="0" w:oddHBand="1" w:evenHBand="0" w:firstRowFirstColumn="0" w:firstRowLastColumn="0" w:lastRowFirstColumn="0" w:lastRowLastColumn="0"/>
+            </w:pPr>
+            <w:r>
+              <w:t>Variables</w:t>
+            </w:r>
+          </w:p>
+        </w:tc>
+        <w:tc>
+          <w:tcPr>
+            <w:tcW w:w="0" w:type="auto"/>
+            <w:hideMark/>
+          </w:tcPr>
+          <w:p>
+            <w:pPr>
+              <w:pStyle w:val="ListParagraph"/>
+              <w:spacing w:after="160" w:line="259" w:lineRule="auto"/>
+              <w:cnfStyle w:val="000000100000" w:firstRow="0" w:lastRow="0" w:firstColumn="0" w:lastColumn="0" w:oddVBand="0" w:evenVBand="0" w:oddHBand="1" w:evenHBand="0" w:firstRowFirstColumn="0" w:firstRowLastColumn="0" w:lastRowFirstColumn="0" w:lastRowLastColumn="0"/>
+            </w:pPr>
+            <w:r>
+              <w:t>Ensures that a variable's value is always read from and written to main memory, improving thread visibility.</w:t>
+            </w:r>
+          </w:p>
+        </w:tc>
+      </w:tr>
+      <w:tr>
+        <w:tc>
+          <w:tcPr>
+            <w:cnfStyle w:val="001000000000" w:firstRow="0" w:lastRow="0" w:firstColumn="1" w:lastColumn="0" w:oddVBand="0" w:evenVBand="0" w:oddHBand="0" w:evenHBand="0" w:firstRowFirstColumn="0" w:firstRowLastColumn="0" w:lastRowFirstColumn="0" w:lastRowLastColumn="0"/>
+            <w:tcW w:w="0" w:type="auto"/>
+            <w:hideMark/>
+          </w:tcPr>
+          <w:p>
+            <w:pPr>
+              <w:pStyle w:val="ListParagraph"/>
+              <w:spacing w:after="160" w:line="259" w:lineRule="auto"/>
+            </w:pPr>
+            <w:r>
+              <w:t>transient</w:t>
+            </w:r>
+          </w:p>
+        </w:tc>
+        <w:tc>
+          <w:tcPr>
+            <w:tcW w:w="0" w:type="auto"/>
+            <w:hideMark/>
+          </w:tcPr>
+          <w:p>
+            <w:pPr>
+              <w:pStyle w:val="ListParagraph"/>
+              <w:spacing w:after="160" w:line="259" w:lineRule="auto"/>
+              <w:cnfStyle w:val="000000000000" w:firstRow="0" w:lastRow="0" w:firstColumn="0" w:lastColumn="0" w:oddVBand="0" w:evenVBand="0" w:oddHBand="0" w:evenHBand="0" w:firstRowFirstColumn="0" w:firstRowLastColumn="0" w:lastRowFirstColumn="0" w:lastRowLastColumn="0"/>
+            </w:pPr>
+            <w:r>
+              <w:t>Variables</w:t>
+            </w:r>
+          </w:p>
+        </w:tc>
+        <w:tc>
+          <w:tcPr>
+            <w:tcW w:w="0" w:type="auto"/>
+            <w:hideMark/>
+          </w:tcPr>
+          <w:p>
+            <w:pPr>
+              <w:pStyle w:val="ListParagraph"/>
+              <w:spacing w:after="160" w:line="259" w:lineRule="auto"/>
+              <w:cnfStyle w:val="000000000000" w:firstRow="0" w:lastRow="0" w:firstColumn="0" w:lastColumn="0" w:oddVBand="0" w:evenVBand="0" w:oddHBand="0" w:evenHBand="0" w:firstRowFirstColumn="0" w:firstRowLastColumn="0" w:lastRowFirstColumn="0" w:lastRowLastColumn="0"/>
+            </w:pPr>
+            <w:r>
+              <w:t>Excludes a variable from serialization.</w:t>
+            </w:r>
+          </w:p>
+        </w:tc>
+      </w:tr>
+      <w:tr>
+        <w:trPr>
+          <w:cnfStyle w:val="000000100000" w:firstRow="0" w:lastRow="0" w:firstColumn="0" w:lastColumn="0" w:oddVBand="0" w:evenVBand="0" w:oddHBand="1" w:evenHBand="0" w:firstRowFirstColumn="0" w:firstRowLastColumn="0" w:lastRowFirstColumn="0" w:lastRowLastColumn="0"/>
+        </w:trPr>
+        <w:tc>
+          <w:tcPr>
+            <w:cnfStyle w:val="001000000000" w:firstRow="0" w:lastRow="0" w:firstColumn="1" w:lastColumn="0" w:oddVBand="0" w:evenVBand="0" w:oddHBand="0" w:evenHBand="0" w:firstRowFirstColumn="0" w:firstRowLastColumn="0" w:lastRowFirstColumn="0" w:lastRowLastColumn="0"/>
+            <w:tcW w:w="0" w:type="auto"/>
+            <w:hideMark/>
+          </w:tcPr>
+          <w:p>
+            <w:pPr>
+              <w:pStyle w:val="ListParagraph"/>
+              <w:spacing w:after="160" w:line="259" w:lineRule="auto"/>
+            </w:pPr>
+            <w:r>
+              <w:t>native</w:t>
+            </w:r>
+          </w:p>
+        </w:tc>
+        <w:tc>
+          <w:tcPr>
+            <w:tcW w:w="0" w:type="auto"/>
+            <w:hideMark/>
+          </w:tcPr>
+          <w:p>
+            <w:pPr>
+              <w:pStyle w:val="ListParagraph"/>
+              <w:spacing w:after="160" w:line="259" w:lineRule="auto"/>
+              <w:cnfStyle w:val="000000100000" w:firstRow="0" w:lastRow="0" w:firstColumn="0" w:lastColumn="0" w:oddVBand="0" w:evenVBand="0" w:oddHBand="1" w:evenHBand="0" w:firstRowFirstColumn="0" w:firstRowLastColumn="0" w:lastRowFirstColumn="0" w:lastRowLastColumn="0"/>
+            </w:pPr>
+            <w:r>
+              <w:t>Methods</w:t>
+            </w:r>
+          </w:p>
+        </w:tc>
+        <w:tc>
+          <w:tcPr>
+            <w:tcW w:w="0" w:type="auto"/>
+            <w:hideMark/>
+          </w:tcPr>
+          <w:p>
+            <w:pPr>
+              <w:pStyle w:val="ListParagraph"/>
+              <w:spacing w:after="160" w:line="259" w:lineRule="auto"/>
+              <w:cnfStyle w:val="000000100000" w:firstRow="0" w:lastRow="0" w:firstColumn="0" w:lastColumn="0" w:oddVBand="0" w:evenVBand="0" w:oddHBand="1" w:evenHBand="0" w:firstRowFirstColumn="0" w:firstRowLastColumn="0" w:lastRowFirstColumn="0" w:lastRowLastColumn="0"/>
+            </w:pPr>
+            <w:r>
+              <w:t>Indicates that the method is implemented in a language other than Java (such as C or C++).</w:t>
+            </w:r>
+          </w:p>
+        </w:tc>
+      </w:tr>
+      <w:tr>
+        <w:tc>
+          <w:tcPr>
+            <w:cnfStyle w:val="001000000000" w:firstRow="0" w:lastRow="0" w:firstColumn="1" w:lastColumn="0" w:oddVBand="0" w:evenVBand="0" w:oddHBand="0" w:evenHBand="0" w:firstRowFirstColumn="0" w:firstRowLastColumn="0" w:lastRowFirstColumn="0" w:lastRowLastColumn="0"/>
+            <w:tcW w:w="0" w:type="auto"/>
+            <w:hideMark/>
+          </w:tcPr>
+          <w:p>
+            <w:pPr>
+              <w:pStyle w:val="ListParagraph"/>
+              <w:spacing w:after="160" w:line="259" w:lineRule="auto"/>
+            </w:pPr>
+            <w:r>
+              <w:t>strictfp</w:t>
+            </w:r>
+          </w:p>
+        </w:tc>
+        <w:tc>
+          <w:tcPr>
+            <w:tcW w:w="0" w:type="auto"/>
+            <w:hideMark/>
+          </w:tcPr>
+          <w:p>
+            <w:pPr>
+              <w:pStyle w:val="ListParagraph"/>
+              <w:spacing w:after="160" w:line="259" w:lineRule="auto"/>
+              <w:cnfStyle w:val="000000000000" w:firstRow="0" w:lastRow="0" w:firstColumn="0" w:lastColumn="0" w:oddVBand="0" w:evenVBand="0" w:oddHBand="0" w:evenHBand="0" w:firstRowFirstColumn="0" w:firstRowLastColumn="0" w:lastRowFirstColumn="0" w:lastRowLastColumn="0"/>
+            </w:pPr>
+            <w:r>
+              <w:t>Classes, methods</w:t>
+            </w:r>
+          </w:p>
+        </w:tc>
+        <w:tc>
+          <w:tcPr>
+            <w:tcW w:w="0" w:type="auto"/>
+            <w:hideMark/>
+          </w:tcPr>
+          <w:p>
+            <w:pPr>
+              <w:pStyle w:val="ListParagraph"/>
+              <w:spacing w:after="160" w:line="259" w:lineRule="auto"/>
+              <w:cnfStyle w:val="000000000000" w:firstRow="0" w:lastRow="0" w:firstColumn="0" w:lastColumn="0" w:oddVBand="0" w:evenVBand="0" w:oddHBand="0" w:evenHBand="0" w:firstRowFirstColumn="0" w:firstRowLastColumn="0" w:lastRowFirstColumn="0" w:lastRowLastColumn="0"/>
+            </w:pPr>
+            <w:r>
+              <w:t>Ensures consistent floating-point calculations across different platforms.</w:t>
+            </w:r>
+          </w:p>
+        </w:tc>
+      </w:tr>
+    </w:tbl>
+    <w:p>
+      <w:pPr>
+        <w:pStyle w:val="ListParagraph"/>
+      </w:pPr>
+    </w:p>
+    <w:p>
+      <w:pPr>
+        <w:pStyle w:val="ListParagraph"/>
+        <w:ind w:left="1854"/>
+        <w:rPr>
+          <w:b/>
+          <w:bCs/>
+          <w:u w:val="single"/>
+        </w:rPr>
+      </w:pPr>
+    </w:p>
+    <w:p>
+      <w:pPr>
+        <w:pStyle w:val="ListParagraph"/>
+        <w:ind w:left="142"/>
+      </w:pPr>
+    </w:p>
+    <w:p>
+      <w:pPr>
+        <w:rPr>
+          <w:b/>
+          <w:bCs/>
+        </w:rPr>
+      </w:pPr>
+      <w:r>
+        <w:rPr>
+          <w:b/>
+          <w:bCs/>
+        </w:rPr>
+        <w:t>Variables</w:t>
+      </w:r>
+    </w:p>
+    <w:p>
+      <w:r>
+        <w:t>A variable is a named memory location used to store data that can change during program execution. Every variable has a data type, a name, and a value.</w:t>
+      </w:r>
+    </w:p>
+    <w:p>
+      <w:pPr>
+        <w:rPr>
+          <w:b/>
+          <w:bCs/>
+        </w:rPr>
+      </w:pPr>
+    </w:p>
+    <w:p>
+      <w:pPr>
+        <w:rPr>
+          <w:b/>
+          <w:bCs/>
+        </w:rPr>
+      </w:pPr>
+    </w:p>
+    <w:p>
+      <w:pPr>
+        <w:rPr>
+          <w:b/>
+          <w:bCs/>
+        </w:rPr>
+      </w:pPr>
+      <w:r>
+        <w:rPr>
+          <w:b/>
+          <w:bCs/>
+        </w:rPr>
+        <w:t>Constants</w:t>
+      </w:r>
+    </w:p>
+    <w:p>
+      <w:r>
+        <w:t>A constant is a variable whose value cannot be changed after it is initialized. In Java, constants are declared using the final keyword.</w:t>
+      </w:r>
+    </w:p>
+    <w:p>
+      <w:pPr>
+        <w:pStyle w:val="ListParagraph"/>
+        <w:numPr>
+          <w:ilvl w:val="0"/>
+          <w:numId w:val="8"/>
+        </w:numPr>
+        <w:ind w:left="567" w:hanging="141"/>
+        <w:rPr>
+          <w:b/>
+          <w:bCs/>
+          <w:u w:val="single"/>
+        </w:rPr>
+      </w:pPr>
+      <w:r>
+        <w:rPr>
+          <w:b/>
+          <w:bCs/>
+          <w:u w:val="single"/>
+        </w:rPr>
+        <w:t>Input and Output (I/O) in Java</w:t>
+      </w:r>
+    </w:p>
+    <w:p>
+      <w:r>
+        <w:rPr>
+          <w:b/>
+          <w:bCs/>
+        </w:rPr>
+        <w:t>Input and Output (I/O)</w:t>
+      </w:r>
+      <w:r>
+        <w:t xml:space="preserve"> in Java refers to the process of receiving data from a user or another source (</w:t>
+      </w:r>
+      <w:r>
+        <w:rPr>
+          <w:b/>
+          <w:bCs/>
+        </w:rPr>
+        <w:t>input</w:t>
+      </w:r>
+      <w:r>
+        <w:t>) and displaying or writing data to a destination (</w:t>
+      </w:r>
+      <w:r>
+        <w:rPr>
+          <w:b/>
+          <w:bCs/>
+        </w:rPr>
+        <w:t>output</w:t>
+      </w:r>
+      <w:r>
+        <w:t>). Input allows a program to accept information, while output lets it present results to the user.</w:t>
+      </w:r>
+    </w:p>
+    <w:p>
+      <w:pPr>
+        <w:rPr>
+          <w:b/>
+          <w:bCs/>
+        </w:rPr>
+      </w:pPr>
+      <w:r>
+        <w:rPr>
+          <w:b/>
+          <w:bCs/>
+        </w:rPr>
+        <w:t>Input</w:t>
+      </w:r>
+    </w:p>
+    <w:p>
+      <w:r>
+        <w:t>Input is the data provided to a program during execution. Java offers several ways to read input, with the Scanner class being one of the most commonly used for console applications.</w:t>
+      </w:r>
+    </w:p>
+    <w:p>
+      <w:r>
+        <w:rPr>
+          <w:noProof/>
+        </w:rPr>
+        <w:drawing>
+          <wp:inline distT="0" distB="0" distL="0" distR="0" wp14:anchorId="74308779" wp14:editId="66C22A18">
+            <wp:extent cx="6210935" cy="2143125"/>
+            <wp:effectExtent l="0" t="0" r="0" b="9525"/>
+            <wp:docPr id="226490402" name="Picture 1"/>
+            <wp:cNvGraphicFramePr>
+              <a:graphicFrameLocks xmlns:a="http://schemas.openxmlformats.org/drawingml/2006/main" noChangeAspect="1"/>
+            </wp:cNvGraphicFramePr>
+            <a:graphic xmlns:a="http://schemas.openxmlformats.org/drawingml/2006/main">
+              <a:graphicData uri="http://schemas.openxmlformats.org/drawingml/2006/picture">
+                <pic:pic xmlns:pic="http://schemas.openxmlformats.org/drawingml/2006/picture">
+                  <pic:nvPicPr>
+                    <pic:cNvPr id="226490402" name=""/>
+                    <pic:cNvPicPr/>
+                  </pic:nvPicPr>
+                  <pic:blipFill>
+                    <a:blip r:embed="rId14"/>
+                    <a:stretch>
+                      <a:fillRect/>
+                    </a:stretch>
+                  </pic:blipFill>
+                  <pic:spPr>
+                    <a:xfrm>
+                      <a:off x="0" y="0"/>
+                      <a:ext cx="6210935" cy="2143125"/>
+                    </a:xfrm>
+                    <a:prstGeom prst="rect">
+                      <a:avLst/>
+                    </a:prstGeom>
+                  </pic:spPr>
+                </pic:pic>
+              </a:graphicData>
+            </a:graphic>
+          </wp:inline>
+        </w:drawing>
+      </w:r>
+    </w:p>
+    <w:p>
+      <w:pPr>
+        <w:rPr>
+          <w:b/>
+          <w:bCs/>
+        </w:rPr>
+      </w:pPr>
+      <w:r>
+        <w:rPr>
+          <w:noProof/>
+        </w:rPr>
+        <w:lastRenderedPageBreak/>
+        <w:drawing>
+          <wp:inline distT="0" distB="0" distL="0" distR="0" wp14:anchorId="190F1B7D" wp14:editId="739E466D">
+            <wp:extent cx="5791200" cy="1743075"/>
+            <wp:effectExtent l="0" t="0" r="0" b="9525"/>
+            <wp:docPr id="121946347" name="Picture 1"/>
+            <wp:cNvGraphicFramePr>
+              <a:graphicFrameLocks xmlns:a="http://schemas.openxmlformats.org/drawingml/2006/main" noChangeAspect="1"/>
+            </wp:cNvGraphicFramePr>
+            <a:graphic xmlns:a="http://schemas.openxmlformats.org/drawingml/2006/main">
+              <a:graphicData uri="http://schemas.openxmlformats.org/drawingml/2006/picture">
+                <pic:pic xmlns:pic="http://schemas.openxmlformats.org/drawingml/2006/picture">
+                  <pic:nvPicPr>
+                    <pic:cNvPr id="121946347" name=""/>
+                    <pic:cNvPicPr/>
+                  </pic:nvPicPr>
+                  <pic:blipFill>
+                    <a:blip r:embed="rId15"/>
+                    <a:stretch>
+                      <a:fillRect/>
+                    </a:stretch>
+                  </pic:blipFill>
+                  <pic:spPr>
+                    <a:xfrm>
+                      <a:off x="0" y="0"/>
+                      <a:ext cx="5791200" cy="1743075"/>
+                    </a:xfrm>
+                    <a:prstGeom prst="rect">
+                      <a:avLst/>
+                    </a:prstGeom>
+                  </pic:spPr>
+                </pic:pic>
+              </a:graphicData>
+            </a:graphic>
+          </wp:inline>
+        </w:drawing>
+      </w:r>
+    </w:p>
+    <w:p>
+      <w:pPr>
+        <w:rPr>
+          <w:b/>
+          <w:bCs/>
+        </w:rPr>
+      </w:pPr>
+    </w:p>
+    <w:p>
+      <w:pPr>
+        <w:rPr>
+          <w:b/>
+          <w:bCs/>
+        </w:rPr>
+      </w:pPr>
+      <w:r>
+        <w:rPr>
+          <w:b/>
+          <w:bCs/>
+        </w:rPr>
+        <w:t>Output</w:t>
+      </w:r>
+    </w:p>
+    <w:p>
+      <w:r>
+        <w:t>Output is the information a program displays or writes after processing data. Java uses the System.out object to display output on the console.</w:t>
+      </w:r>
+    </w:p>
+    <w:tbl>
+      <w:tblPr>
+        <w:tblStyle w:val="PlainTable1"/>
+        <w:tblW w:w="0" w:type="auto"/>
+        <w:tblLook w:val="04A0" w:firstRow="1" w:lastRow="0" w:firstColumn="1" w:lastColumn="0" w:noHBand="0" w:noVBand="1"/>
+      </w:tblPr>
+      <w:tblGrid>
+        <w:gridCol w:w="2051"/>
+        <w:gridCol w:w="4564"/>
+      </w:tblGrid>
+      <w:tr>
+        <w:trPr>
+          <w:cnfStyle w:val="100000000000" w:firstRow="1" w:lastRow="0" w:firstColumn="0" w:lastColumn="0" w:oddVBand="0" w:evenVBand="0" w:oddHBand="0" w:evenHBand="0" w:firstRowFirstColumn="0" w:firstRowLastColumn="0" w:lastRowFirstColumn="0" w:lastRowLastColumn="0"/>
+        </w:trPr>
+        <w:tc>
+          <w:tcPr>
+            <w:cnfStyle w:val="001000000000" w:firstRow="0" w:lastRow="0" w:firstColumn="1" w:lastColumn="0" w:oddVBand="0" w:evenVBand="0" w:oddHBand="0" w:evenHBand="0" w:firstRowFirstColumn="0" w:firstRowLastColumn="0" w:lastRowFirstColumn="0" w:lastRowLastColumn="0"/>
+            <w:tcW w:w="0" w:type="auto"/>
+            <w:hideMark/>
+          </w:tcPr>
+          <w:p>
+            <w:pPr>
+              <w:spacing w:after="160" w:line="259" w:lineRule="auto"/>
+            </w:pPr>
+            <w:r>
+              <w:t>Method</w:t>
+            </w:r>
+          </w:p>
+        </w:tc>
+        <w:tc>
+          <w:tcPr>
+            <w:tcW w:w="0" w:type="auto"/>
+            <w:hideMark/>
+          </w:tcPr>
+          <w:p>
+            <w:pPr>
+              <w:spacing w:after="160" w:line="259" w:lineRule="auto"/>
+              <w:cnfStyle w:val="100000000000" w:firstRow="1" w:lastRow="0" w:firstColumn="0" w:lastColumn="0" w:oddVBand="0" w:evenVBand="0" w:oddHBand="0" w:evenHBand="0" w:firstRowFirstColumn="0" w:firstRowLastColumn="0" w:lastRowFirstColumn="0" w:lastRowLastColumn="0"/>
+            </w:pPr>
+            <w:r>
+              <w:t>Description</w:t>
+            </w:r>
+          </w:p>
+        </w:tc>
+      </w:tr>
+      <w:tr>
+        <w:trPr>
+          <w:cnfStyle w:val="000000100000" w:firstRow="0" w:lastRow="0" w:firstColumn="0" w:lastColumn="0" w:oddVBand="0" w:evenVBand="0" w:oddHBand="1" w:evenHBand="0" w:firstRowFirstColumn="0" w:firstRowLastColumn="0" w:lastRowFirstColumn="0" w:lastRowLastColumn="0"/>
+        </w:trPr>
+        <w:tc>
+          <w:tcPr>
+            <w:cnfStyle w:val="001000000000" w:firstRow="0" w:lastRow="0" w:firstColumn="1" w:lastColumn="0" w:oddVBand="0" w:evenVBand="0" w:oddHBand="0" w:evenHBand="0" w:firstRowFirstColumn="0" w:firstRowLastColumn="0" w:lastRowFirstColumn="0" w:lastRowLastColumn="0"/>
+            <w:tcW w:w="0" w:type="auto"/>
+            <w:hideMark/>
+          </w:tcPr>
+          <w:p>
+            <w:pPr>
+              <w:spacing w:after="160" w:line="259" w:lineRule="auto"/>
+            </w:pPr>
+            <w:r>
+              <w:t>System.out.print()</w:t>
+            </w:r>
+          </w:p>
+        </w:tc>
+        <w:tc>
+          <w:tcPr>
+            <w:tcW w:w="0" w:type="auto"/>
+            <w:hideMark/>
+          </w:tcPr>
+          <w:p>
+            <w:pPr>
+              <w:spacing w:after="160" w:line="259" w:lineRule="auto"/>
+              <w:cnfStyle w:val="000000100000" w:firstRow="0" w:lastRow="0" w:firstColumn="0" w:lastColumn="0" w:oddVBand="0" w:evenVBand="0" w:oddHBand="1" w:evenHBand="0" w:firstRowFirstColumn="0" w:firstRowLastColumn="0" w:lastRowFirstColumn="0" w:lastRowLastColumn="0"/>
+            </w:pPr>
+            <w:r>
+              <w:t>Prints text without moving to a new line.</w:t>
+            </w:r>
+          </w:p>
+        </w:tc>
+      </w:tr>
+      <w:tr>
+        <w:tc>
+          <w:tcPr>
+            <w:cnfStyle w:val="001000000000" w:firstRow="0" w:lastRow="0" w:firstColumn="1" w:lastColumn="0" w:oddVBand="0" w:evenVBand="0" w:oddHBand="0" w:evenHBand="0" w:firstRowFirstColumn="0" w:firstRowLastColumn="0" w:lastRowFirstColumn="0" w:lastRowLastColumn="0"/>
+            <w:tcW w:w="0" w:type="auto"/>
+            <w:hideMark/>
+          </w:tcPr>
+          <w:p>
+            <w:pPr>
+              <w:spacing w:after="160" w:line="259" w:lineRule="auto"/>
+            </w:pPr>
+            <w:r>
+              <w:t>System.out.println()</w:t>
+            </w:r>
+          </w:p>
+        </w:tc>
+        <w:tc>
+          <w:tcPr>
+            <w:tcW w:w="0" w:type="auto"/>
+            <w:hideMark/>
+          </w:tcPr>
+          <w:p>
+            <w:pPr>
+              <w:spacing w:after="160" w:line="259" w:lineRule="auto"/>
+              <w:cnfStyle w:val="000000000000" w:firstRow="0" w:lastRow="0" w:firstColumn="0" w:lastColumn="0" w:oddVBand="0" w:evenVBand="0" w:oddHBand="0" w:evenHBand="0" w:firstRowFirstColumn="0" w:firstRowLastColumn="0" w:lastRowFirstColumn="0" w:lastRowLastColumn="0"/>
+            </w:pPr>
+            <w:r>
+              <w:t>Prints text and moves the cursor to the next line.</w:t>
+            </w:r>
+          </w:p>
+        </w:tc>
+      </w:tr>
+      <w:tr>
+        <w:trPr>
+          <w:cnfStyle w:val="000000100000" w:firstRow="0" w:lastRow="0" w:firstColumn="0" w:lastColumn="0" w:oddVBand="0" w:evenVBand="0" w:oddHBand="1" w:evenHBand="0" w:firstRowFirstColumn="0" w:firstRowLastColumn="0" w:lastRowFirstColumn="0" w:lastRowLastColumn="0"/>
+        </w:trPr>
+        <w:tc>
+          <w:tcPr>
+            <w:cnfStyle w:val="001000000000" w:firstRow="0" w:lastRow="0" w:firstColumn="1" w:lastColumn="0" w:oddVBand="0" w:evenVBand="0" w:oddHBand="0" w:evenHBand="0" w:firstRowFirstColumn="0" w:firstRowLastColumn="0" w:lastRowFirstColumn="0" w:lastRowLastColumn="0"/>
+            <w:tcW w:w="0" w:type="auto"/>
+            <w:hideMark/>
+          </w:tcPr>
+          <w:p>
+            <w:pPr>
+              <w:spacing w:after="160" w:line="259" w:lineRule="auto"/>
+            </w:pPr>
+            <w:r>
+              <w:t>System.out.printf()</w:t>
+            </w:r>
+          </w:p>
+        </w:tc>
+        <w:tc>
+          <w:tcPr>
+            <w:tcW w:w="0" w:type="auto"/>
+            <w:hideMark/>
+          </w:tcPr>
+          <w:p>
+            <w:pPr>
+              <w:spacing w:after="160" w:line="259" w:lineRule="auto"/>
+              <w:cnfStyle w:val="000000100000" w:firstRow="0" w:lastRow="0" w:firstColumn="0" w:lastColumn="0" w:oddVBand="0" w:evenVBand="0" w:oddHBand="1" w:evenHBand="0" w:firstRowFirstColumn="0" w:firstRowLastColumn="0" w:lastRowFirstColumn="0" w:lastRowLastColumn="0"/>
+            </w:pPr>
+            <w:r>
+              <w:t>Prints formatted output using format specifiers.</w:t>
+            </w:r>
+          </w:p>
+        </w:tc>
+      </w:tr>
+    </w:tbl>
+    <w:p/>
+    <w:p/>
     <w:sectPr>
       <w:pgSz w:w="11906" w:h="16838"/>
       <w:pgMar w:top="709" w:right="1274" w:bottom="709" w:left="851" w:header="708" w:footer="708" w:gutter="0"/>
@@ -6002,7 +7700,7 @@
   <w:abstractNum w:abstractNumId="4" w15:restartNumberingAfterBreak="0">
     <w:nsid w:val="3A923EF0"/>
     <w:multiLevelType w:val="hybridMultilevel"/>
-    <w:tmpl w:val="A544AB08"/>
+    <w:tmpl w:val="A5B825A2"/>
     <w:lvl w:ilvl="0" w:tplc="4C090001">
       <w:start w:val="1"/>
       <w:numFmt w:val="bullet"/>
@@ -6113,6 +7811,155 @@
     </w:lvl>
   </w:abstractNum>
   <w:abstractNum w:abstractNumId="5" w15:restartNumberingAfterBreak="0">
+    <w:nsid w:val="4258595E"/>
+    <w:multiLevelType w:val="multilevel"/>
+    <w:tmpl w:val="68805932"/>
+    <w:lvl w:ilvl="0">
+      <w:start w:val="1"/>
+      <w:numFmt w:val="bullet"/>
+      <w:lvlText w:val=""/>
+      <w:lvlJc w:val="left"/>
+      <w:pPr>
+        <w:tabs>
+          <w:tab w:val="num" w:pos="720"/>
+        </w:tabs>
+        <w:ind w:left="720" w:hanging="360"/>
+      </w:pPr>
+      <w:rPr>
+        <w:rFonts w:ascii="Symbol" w:hAnsi="Symbol" w:hint="default"/>
+        <w:sz w:val="20"/>
+      </w:rPr>
+    </w:lvl>
+    <w:lvl w:ilvl="1" w:tentative="1">
+      <w:start w:val="1"/>
+      <w:numFmt w:val="bullet"/>
+      <w:lvlText w:val="o"/>
+      <w:lvlJc w:val="left"/>
+      <w:pPr>
+        <w:tabs>
+          <w:tab w:val="num" w:pos="1440"/>
+        </w:tabs>
+        <w:ind w:left="1440" w:hanging="360"/>
+      </w:pPr>
+      <w:rPr>
+        <w:rFonts w:ascii="Courier New" w:hAnsi="Courier New" w:hint="default"/>
+        <w:sz w:val="20"/>
+      </w:rPr>
+    </w:lvl>
+    <w:lvl w:ilvl="2" w:tentative="1">
+      <w:start w:val="1"/>
+      <w:numFmt w:val="bullet"/>
+      <w:lvlText w:val=""/>
+      <w:lvlJc w:val="left"/>
+      <w:pPr>
+        <w:tabs>
+          <w:tab w:val="num" w:pos="2160"/>
+        </w:tabs>
+        <w:ind w:left="2160" w:hanging="360"/>
+      </w:pPr>
+      <w:rPr>
+        <w:rFonts w:ascii="Wingdings" w:hAnsi="Wingdings" w:hint="default"/>
+        <w:sz w:val="20"/>
+      </w:rPr>
+    </w:lvl>
+    <w:lvl w:ilvl="3" w:tentative="1">
+      <w:start w:val="1"/>
+      <w:numFmt w:val="bullet"/>
+      <w:lvlText w:val=""/>
+      <w:lvlJc w:val="left"/>
+      <w:pPr>
+        <w:tabs>
+          <w:tab w:val="num" w:pos="2880"/>
+        </w:tabs>
+        <w:ind w:left="2880" w:hanging="360"/>
+      </w:pPr>
+      <w:rPr>
+        <w:rFonts w:ascii="Wingdings" w:hAnsi="Wingdings" w:hint="default"/>
+        <w:sz w:val="20"/>
+      </w:rPr>
+    </w:lvl>
+    <w:lvl w:ilvl="4" w:tentative="1">
+      <w:start w:val="1"/>
+      <w:numFmt w:val="bullet"/>
+      <w:lvlText w:val=""/>
+      <w:lvlJc w:val="left"/>
+      <w:pPr>
+        <w:tabs>
+          <w:tab w:val="num" w:pos="3600"/>
+        </w:tabs>
+        <w:ind w:left="3600" w:hanging="360"/>
+      </w:pPr>
+      <w:rPr>
+        <w:rFonts w:ascii="Wingdings" w:hAnsi="Wingdings" w:hint="default"/>
+        <w:sz w:val="20"/>
+      </w:rPr>
+    </w:lvl>
+    <w:lvl w:ilvl="5" w:tentative="1">
+      <w:start w:val="1"/>
+      <w:numFmt w:val="bullet"/>
+      <w:lvlText w:val=""/>
+      <w:lvlJc w:val="left"/>
+      <w:pPr>
+        <w:tabs>
+          <w:tab w:val="num" w:pos="4320"/>
+        </w:tabs>
+        <w:ind w:left="4320" w:hanging="360"/>
+      </w:pPr>
+      <w:rPr>
+        <w:rFonts w:ascii="Wingdings" w:hAnsi="Wingdings" w:hint="default"/>
+        <w:sz w:val="20"/>
+      </w:rPr>
+    </w:lvl>
+    <w:lvl w:ilvl="6" w:tentative="1">
+      <w:start w:val="1"/>
+      <w:numFmt w:val="bullet"/>
+      <w:lvlText w:val=""/>
+      <w:lvlJc w:val="left"/>
+      <w:pPr>
+        <w:tabs>
+          <w:tab w:val="num" w:pos="5040"/>
+        </w:tabs>
+        <w:ind w:left="5040" w:hanging="360"/>
+      </w:pPr>
+      <w:rPr>
+        <w:rFonts w:ascii="Wingdings" w:hAnsi="Wingdings" w:hint="default"/>
+        <w:sz w:val="20"/>
+      </w:rPr>
+    </w:lvl>
+    <w:lvl w:ilvl="7" w:tentative="1">
+      <w:start w:val="1"/>
+      <w:numFmt w:val="bullet"/>
+      <w:lvlText w:val=""/>
+      <w:lvlJc w:val="left"/>
+      <w:pPr>
+        <w:tabs>
+          <w:tab w:val="num" w:pos="5760"/>
+        </w:tabs>
+        <w:ind w:left="5760" w:hanging="360"/>
+      </w:pPr>
+      <w:rPr>
+        <w:rFonts w:ascii="Wingdings" w:hAnsi="Wingdings" w:hint="default"/>
+        <w:sz w:val="20"/>
+      </w:rPr>
+    </w:lvl>
+    <w:lvl w:ilvl="8" w:tentative="1">
+      <w:start w:val="1"/>
+      <w:numFmt w:val="bullet"/>
+      <w:lvlText w:val=""/>
+      <w:lvlJc w:val="left"/>
+      <w:pPr>
+        <w:tabs>
+          <w:tab w:val="num" w:pos="6480"/>
+        </w:tabs>
+        <w:ind w:left="6480" w:hanging="360"/>
+      </w:pPr>
+      <w:rPr>
+        <w:rFonts w:ascii="Wingdings" w:hAnsi="Wingdings" w:hint="default"/>
+        <w:sz w:val="20"/>
+      </w:rPr>
+    </w:lvl>
+  </w:abstractNum>
+  <w:abstractNum w:abstractNumId="6" w15:restartNumberingAfterBreak="0">
     <w:nsid w:val="4E71180A"/>
     <w:multiLevelType w:val="hybridMultilevel"/>
     <w:tmpl w:val="9DB477EA"/>
@@ -6201,7 +8048,7 @@
       </w:pPr>
     </w:lvl>
   </w:abstractNum>
-  <w:abstractNum w:abstractNumId="6" w15:restartNumberingAfterBreak="0">
+  <w:abstractNum w:abstractNumId="7" w15:restartNumberingAfterBreak="0">
     <w:nsid w:val="58381389"/>
     <w:multiLevelType w:val="hybridMultilevel"/>
     <w:tmpl w:val="56489F34"/>
@@ -6290,7 +8137,7 @@
       </w:pPr>
     </w:lvl>
   </w:abstractNum>
-  <w:abstractNum w:abstractNumId="7" w15:restartNumberingAfterBreak="0">
+  <w:abstractNum w:abstractNumId="8" w15:restartNumberingAfterBreak="0">
     <w:nsid w:val="770B2AED"/>
     <w:multiLevelType w:val="hybridMultilevel"/>
     <w:tmpl w:val="E334FAA2"/>
@@ -6403,7 +8250,7 @@
       </w:rPr>
     </w:lvl>
   </w:abstractNum>
-  <w:abstractNum w:abstractNumId="8" w15:restartNumberingAfterBreak="0">
+  <w:abstractNum w:abstractNumId="9" w15:restartNumberingAfterBreak="0">
     <w:nsid w:val="7BE67E43"/>
     <w:multiLevelType w:val="hybridMultilevel"/>
     <w:tmpl w:val="4F446838"/>
@@ -6517,7 +8364,7 @@
     </w:lvl>
   </w:abstractNum>
   <w:num w:numId="1" w16cid:durableId="1995210616">
-    <w:abstractNumId w:val="5"/>
+    <w:abstractNumId w:val="6"/>
   </w:num>
   <w:num w:numId="2" w16cid:durableId="1510365078">
     <w:abstractNumId w:val="3"/>
@@ -6529,10 +8376,10 @@
     <w:abstractNumId w:val="4"/>
   </w:num>
   <w:num w:numId="5" w16cid:durableId="1167330143">
-    <w:abstractNumId w:val="8"/>
+    <w:abstractNumId w:val="9"/>
   </w:num>
   <w:num w:numId="6" w16cid:durableId="2061400478">
-    <w:abstractNumId w:val="7"/>
+    <w:abstractNumId w:val="8"/>
   </w:num>
   <w:num w:numId="7" w16cid:durableId="1402633030">
     <w:abstractNumId w:val="1"/>
@@ -6541,7 +8388,10 @@
     <w:abstractNumId w:val="0"/>
   </w:num>
   <w:num w:numId="9" w16cid:durableId="205677">
-    <w:abstractNumId w:val="6"/>
+    <w:abstractNumId w:val="7"/>
+  </w:num>
+  <w:num w:numId="10" w16cid:durableId="866602929">
+    <w:abstractNumId w:val="5"/>
   </w:num>
 </w:numbering>
 </file>
@@ -7593,6 +9443,25 @@
       </w:tcPr>
     </w:tblStylePr>
   </w:style>
+  <w:style w:type="table" w:styleId="TableGridLight">
+    <w:name w:val="Grid Table Light"/>
+    <w:basedOn w:val="TableNormal"/>
+    <w:uiPriority w:val="40"/>
+    <w:rsid w:val="005D4E3A"/>
+    <w:pPr>
+      <w:spacing w:after="0" w:line="240" w:lineRule="auto"/>
+    </w:pPr>
+    <w:tblPr>
+      <w:tblBorders>
+        <w:top w:val="single" w:sz="4" w:space="0" w:color="BFBFBF" w:themeColor="background1" w:themeShade="BF"/>
+        <w:left w:val="single" w:sz="4" w:space="0" w:color="BFBFBF" w:themeColor="background1" w:themeShade="BF"/>
+        <w:bottom w:val="single" w:sz="4" w:space="0" w:color="BFBFBF" w:themeColor="background1" w:themeShade="BF"/>
+        <w:right w:val="single" w:sz="4" w:space="0" w:color="BFBFBF" w:themeColor="background1" w:themeShade="BF"/>
+        <w:insideH w:val="single" w:sz="4" w:space="0" w:color="BFBFBF" w:themeColor="background1" w:themeShade="BF"/>
+        <w:insideV w:val="single" w:sz="4" w:space="0" w:color="BFBFBF" w:themeColor="background1" w:themeShade="BF"/>
+      </w:tblBorders>
+    </w:tblPr>
+  </w:style>
 </w:styles>
 </file>
 

</xml_diff>

<commit_message>
Java Block Scope  #28
</commit_message>
<xml_diff>
--- a/Chapter3/CH3.docx
+++ b/Chapter3/CH3.docx
@@ -105,18 +105,6 @@
       <w:pPr>
         <w:pStyle w:val="ListParagraph"/>
       </w:pPr>
-    </w:p>
-    <w:p>
-      <w:pPr>
-        <w:pStyle w:val="ListParagraph"/>
-        <w:numPr>
-          <w:ilvl w:val="0"/>
-          <w:numId w:val="9"/>
-        </w:numPr>
-      </w:pPr>
-      <w:r>
-        <w:t>Control Flow</w:t>
-      </w:r>
     </w:p>
     <w:p>
       <w:pPr>
@@ -7260,6 +7248,16 @@
       </w:tr>
     </w:tbl>
     <w:p/>
+    <w:p>
+      <w:pPr>
+        <w:rPr>
+          <w:b/>
+          <w:bCs/>
+          <w:u w:val="single"/>
+        </w:rPr>
+      </w:pPr>
+    </w:p>
+    <w:p/>
     <w:p/>
     <w:sectPr>
       <w:pgSz w:w="11906" w:h="16838"/>
@@ -7698,6 +7696,95 @@
     </w:lvl>
   </w:abstractNum>
   <w:abstractNum w:abstractNumId="4" w15:restartNumberingAfterBreak="0">
+    <w:nsid w:val="39CD262B"/>
+    <w:multiLevelType w:val="hybridMultilevel"/>
+    <w:tmpl w:val="56489F34"/>
+    <w:lvl w:ilvl="0" w:tplc="FFFFFFFF">
+      <w:start w:val="1"/>
+      <w:numFmt w:val="decimal"/>
+      <w:lvlText w:val="%1."/>
+      <w:lvlJc w:val="left"/>
+      <w:pPr>
+        <w:ind w:left="405" w:hanging="360"/>
+      </w:pPr>
+      <w:rPr>
+        <w:rFonts w:hint="default"/>
+      </w:rPr>
+    </w:lvl>
+    <w:lvl w:ilvl="1" w:tplc="FFFFFFFF" w:tentative="1">
+      <w:start w:val="1"/>
+      <w:numFmt w:val="lowerLetter"/>
+      <w:lvlText w:val="%2."/>
+      <w:lvlJc w:val="left"/>
+      <w:pPr>
+        <w:ind w:left="1125" w:hanging="360"/>
+      </w:pPr>
+    </w:lvl>
+    <w:lvl w:ilvl="2" w:tplc="FFFFFFFF" w:tentative="1">
+      <w:start w:val="1"/>
+      <w:numFmt w:val="lowerRoman"/>
+      <w:lvlText w:val="%3."/>
+      <w:lvlJc w:val="right"/>
+      <w:pPr>
+        <w:ind w:left="1845" w:hanging="180"/>
+      </w:pPr>
+    </w:lvl>
+    <w:lvl w:ilvl="3" w:tplc="FFFFFFFF" w:tentative="1">
+      <w:start w:val="1"/>
+      <w:numFmt w:val="decimal"/>
+      <w:lvlText w:val="%4."/>
+      <w:lvlJc w:val="left"/>
+      <w:pPr>
+        <w:ind w:left="2565" w:hanging="360"/>
+      </w:pPr>
+    </w:lvl>
+    <w:lvl w:ilvl="4" w:tplc="FFFFFFFF" w:tentative="1">
+      <w:start w:val="1"/>
+      <w:numFmt w:val="lowerLetter"/>
+      <w:lvlText w:val="%5."/>
+      <w:lvlJc w:val="left"/>
+      <w:pPr>
+        <w:ind w:left="3285" w:hanging="360"/>
+      </w:pPr>
+    </w:lvl>
+    <w:lvl w:ilvl="5" w:tplc="FFFFFFFF" w:tentative="1">
+      <w:start w:val="1"/>
+      <w:numFmt w:val="lowerRoman"/>
+      <w:lvlText w:val="%6."/>
+      <w:lvlJc w:val="right"/>
+      <w:pPr>
+        <w:ind w:left="4005" w:hanging="180"/>
+      </w:pPr>
+    </w:lvl>
+    <w:lvl w:ilvl="6" w:tplc="FFFFFFFF" w:tentative="1">
+      <w:start w:val="1"/>
+      <w:numFmt w:val="decimal"/>
+      <w:lvlText w:val="%7."/>
+      <w:lvlJc w:val="left"/>
+      <w:pPr>
+        <w:ind w:left="4725" w:hanging="360"/>
+      </w:pPr>
+    </w:lvl>
+    <w:lvl w:ilvl="7" w:tplc="FFFFFFFF" w:tentative="1">
+      <w:start w:val="1"/>
+      <w:numFmt w:val="lowerLetter"/>
+      <w:lvlText w:val="%8."/>
+      <w:lvlJc w:val="left"/>
+      <w:pPr>
+        <w:ind w:left="5445" w:hanging="360"/>
+      </w:pPr>
+    </w:lvl>
+    <w:lvl w:ilvl="8" w:tplc="FFFFFFFF" w:tentative="1">
+      <w:start w:val="1"/>
+      <w:numFmt w:val="lowerRoman"/>
+      <w:lvlText w:val="%9."/>
+      <w:lvlJc w:val="right"/>
+      <w:pPr>
+        <w:ind w:left="6165" w:hanging="180"/>
+      </w:pPr>
+    </w:lvl>
+  </w:abstractNum>
+  <w:abstractNum w:abstractNumId="5" w15:restartNumberingAfterBreak="0">
     <w:nsid w:val="3A923EF0"/>
     <w:multiLevelType w:val="hybridMultilevel"/>
     <w:tmpl w:val="A5B825A2"/>
@@ -7810,7 +7897,7 @@
       </w:rPr>
     </w:lvl>
   </w:abstractNum>
-  <w:abstractNum w:abstractNumId="5" w15:restartNumberingAfterBreak="0">
+  <w:abstractNum w:abstractNumId="6" w15:restartNumberingAfterBreak="0">
     <w:nsid w:val="4258595E"/>
     <w:multiLevelType w:val="multilevel"/>
     <w:tmpl w:val="68805932"/>
@@ -7959,7 +8046,7 @@
       </w:rPr>
     </w:lvl>
   </w:abstractNum>
-  <w:abstractNum w:abstractNumId="6" w15:restartNumberingAfterBreak="0">
+  <w:abstractNum w:abstractNumId="7" w15:restartNumberingAfterBreak="0">
     <w:nsid w:val="4E71180A"/>
     <w:multiLevelType w:val="hybridMultilevel"/>
     <w:tmpl w:val="9DB477EA"/>
@@ -8048,7 +8135,7 @@
       </w:pPr>
     </w:lvl>
   </w:abstractNum>
-  <w:abstractNum w:abstractNumId="7" w15:restartNumberingAfterBreak="0">
+  <w:abstractNum w:abstractNumId="8" w15:restartNumberingAfterBreak="0">
     <w:nsid w:val="58381389"/>
     <w:multiLevelType w:val="hybridMultilevel"/>
     <w:tmpl w:val="56489F34"/>
@@ -8137,7 +8224,7 @@
       </w:pPr>
     </w:lvl>
   </w:abstractNum>
-  <w:abstractNum w:abstractNumId="8" w15:restartNumberingAfterBreak="0">
+  <w:abstractNum w:abstractNumId="9" w15:restartNumberingAfterBreak="0">
     <w:nsid w:val="770B2AED"/>
     <w:multiLevelType w:val="hybridMultilevel"/>
     <w:tmpl w:val="E334FAA2"/>
@@ -8250,7 +8337,120 @@
       </w:rPr>
     </w:lvl>
   </w:abstractNum>
-  <w:abstractNum w:abstractNumId="9" w15:restartNumberingAfterBreak="0">
+  <w:abstractNum w:abstractNumId="10" w15:restartNumberingAfterBreak="0">
+    <w:nsid w:val="78D600FF"/>
+    <w:multiLevelType w:val="multilevel"/>
+    <w:tmpl w:val="D1288E6C"/>
+    <w:lvl w:ilvl="0">
+      <w:start w:val="1"/>
+      <w:numFmt w:val="decimal"/>
+      <w:lvlText w:val="%1."/>
+      <w:lvlJc w:val="left"/>
+      <w:pPr>
+        <w:tabs>
+          <w:tab w:val="num" w:pos="720"/>
+        </w:tabs>
+        <w:ind w:left="720" w:hanging="360"/>
+      </w:pPr>
+    </w:lvl>
+    <w:lvl w:ilvl="1" w:tentative="1">
+      <w:start w:val="1"/>
+      <w:numFmt w:val="decimal"/>
+      <w:lvlText w:val="%2."/>
+      <w:lvlJc w:val="left"/>
+      <w:pPr>
+        <w:tabs>
+          <w:tab w:val="num" w:pos="1440"/>
+        </w:tabs>
+        <w:ind w:left="1440" w:hanging="360"/>
+      </w:pPr>
+    </w:lvl>
+    <w:lvl w:ilvl="2" w:tentative="1">
+      <w:start w:val="1"/>
+      <w:numFmt w:val="decimal"/>
+      <w:lvlText w:val="%3."/>
+      <w:lvlJc w:val="left"/>
+      <w:pPr>
+        <w:tabs>
+          <w:tab w:val="num" w:pos="2160"/>
+        </w:tabs>
+        <w:ind w:left="2160" w:hanging="360"/>
+      </w:pPr>
+    </w:lvl>
+    <w:lvl w:ilvl="3" w:tentative="1">
+      <w:start w:val="1"/>
+      <w:numFmt w:val="decimal"/>
+      <w:lvlText w:val="%4."/>
+      <w:lvlJc w:val="left"/>
+      <w:pPr>
+        <w:tabs>
+          <w:tab w:val="num" w:pos="2880"/>
+        </w:tabs>
+        <w:ind w:left="2880" w:hanging="360"/>
+      </w:pPr>
+    </w:lvl>
+    <w:lvl w:ilvl="4" w:tentative="1">
+      <w:start w:val="1"/>
+      <w:numFmt w:val="decimal"/>
+      <w:lvlText w:val="%5."/>
+      <w:lvlJc w:val="left"/>
+      <w:pPr>
+        <w:tabs>
+          <w:tab w:val="num" w:pos="3600"/>
+        </w:tabs>
+        <w:ind w:left="3600" w:hanging="360"/>
+      </w:pPr>
+    </w:lvl>
+    <w:lvl w:ilvl="5" w:tentative="1">
+      <w:start w:val="1"/>
+      <w:numFmt w:val="decimal"/>
+      <w:lvlText w:val="%6."/>
+      <w:lvlJc w:val="left"/>
+      <w:pPr>
+        <w:tabs>
+          <w:tab w:val="num" w:pos="4320"/>
+        </w:tabs>
+        <w:ind w:left="4320" w:hanging="360"/>
+      </w:pPr>
+    </w:lvl>
+    <w:lvl w:ilvl="6" w:tentative="1">
+      <w:start w:val="1"/>
+      <w:numFmt w:val="decimal"/>
+      <w:lvlText w:val="%7."/>
+      <w:lvlJc w:val="left"/>
+      <w:pPr>
+        <w:tabs>
+          <w:tab w:val="num" w:pos="5040"/>
+        </w:tabs>
+        <w:ind w:left="5040" w:hanging="360"/>
+      </w:pPr>
+    </w:lvl>
+    <w:lvl w:ilvl="7" w:tentative="1">
+      <w:start w:val="1"/>
+      <w:numFmt w:val="decimal"/>
+      <w:lvlText w:val="%8."/>
+      <w:lvlJc w:val="left"/>
+      <w:pPr>
+        <w:tabs>
+          <w:tab w:val="num" w:pos="5760"/>
+        </w:tabs>
+        <w:ind w:left="5760" w:hanging="360"/>
+      </w:pPr>
+    </w:lvl>
+    <w:lvl w:ilvl="8" w:tentative="1">
+      <w:start w:val="1"/>
+      <w:numFmt w:val="decimal"/>
+      <w:lvlText w:val="%9."/>
+      <w:lvlJc w:val="left"/>
+      <w:pPr>
+        <w:tabs>
+          <w:tab w:val="num" w:pos="6480"/>
+        </w:tabs>
+        <w:ind w:left="6480" w:hanging="360"/>
+      </w:pPr>
+    </w:lvl>
+  </w:abstractNum>
+  <w:abstractNum w:abstractNumId="11" w15:restartNumberingAfterBreak="0">
     <w:nsid w:val="7BE67E43"/>
     <w:multiLevelType w:val="hybridMultilevel"/>
     <w:tmpl w:val="4F446838"/>
@@ -8364,7 +8564,7 @@
     </w:lvl>
   </w:abstractNum>
   <w:num w:numId="1" w16cid:durableId="1995210616">
-    <w:abstractNumId w:val="6"/>
+    <w:abstractNumId w:val="7"/>
   </w:num>
   <w:num w:numId="2" w16cid:durableId="1510365078">
     <w:abstractNumId w:val="3"/>
@@ -8373,13 +8573,13 @@
     <w:abstractNumId w:val="2"/>
   </w:num>
   <w:num w:numId="4" w16cid:durableId="1045134569">
-    <w:abstractNumId w:val="4"/>
+    <w:abstractNumId w:val="5"/>
   </w:num>
   <w:num w:numId="5" w16cid:durableId="1167330143">
-    <w:abstractNumId w:val="9"/>
+    <w:abstractNumId w:val="11"/>
   </w:num>
   <w:num w:numId="6" w16cid:durableId="2061400478">
-    <w:abstractNumId w:val="8"/>
+    <w:abstractNumId w:val="9"/>
   </w:num>
   <w:num w:numId="7" w16cid:durableId="1402633030">
     <w:abstractNumId w:val="1"/>
@@ -8388,10 +8588,16 @@
     <w:abstractNumId w:val="0"/>
   </w:num>
   <w:num w:numId="9" w16cid:durableId="205677">
-    <w:abstractNumId w:val="7"/>
+    <w:abstractNumId w:val="8"/>
   </w:num>
   <w:num w:numId="10" w16cid:durableId="866602929">
-    <w:abstractNumId w:val="5"/>
+    <w:abstractNumId w:val="6"/>
+  </w:num>
+  <w:num w:numId="11" w16cid:durableId="1985236847">
+    <w:abstractNumId w:val="4"/>
+  </w:num>
+  <w:num w:numId="12" w16cid:durableId="496960929">
+    <w:abstractNumId w:val="10"/>
   </w:num>
 </w:numbering>
 </file>

</xml_diff>